<commit_message>
Added a Decision Log item #12 to MVP build plan
Added as Decision Log item #12, built on top of the already-merged doc (so it sits right after item #11, not overwriting it). It records:

Direction: both sending and receiving blocked for a pending-consent minor
Scope: narrowly tied to User.isMinor + Guardian.consentStatus — the exact fields GuardianConsentGuard already reads — not a general "unverified accounts" policy
Why: keeps email-verification and guardian-consent as separate signals with separate enforcement, so a future general anti-abuse feature doesn't get tangled with this safety mechanism
No code change needed now — messaging is still Sprint 3, this just makes sure whoever builds it doesn't have to re-litigate the ambiguity B7 flagged
</commit_message>
<xml_diff>
--- a/docs/Soccernity_MVP_Build_Plan_v1.7.docx
+++ b/docs/Soccernity_MVP_Build_Plan_v1.7.docx
@@ -9307,6 +9307,108 @@
                 <w:szCs w:val="19"/>
               </w:rPr>
               <w:t xml:space="preserve">Resolved (validation gap) — open sub-item: decide whether to add explicit email normalisation across login/register</w:t>
+            </w:r>
+          </w:p>
+        </w:tc>
+      </w:tr>
+      <w:tr>
+        <w:tc>
+          <w:tcPr>
+            <w:tcW w:type="dxa" w:w="500"/>
+            <w:shd w:fill="EFF3EE" w:val="clear"/>
+            <w:tcMar>
+              <w:top w:type="dxa" w:w="90"/>
+              <w:left w:type="dxa" w:w="110"/>
+              <w:bottom w:type="dxa" w:w="90"/>
+              <w:right w:type="dxa" w:w="110"/>
+            </w:tcMar>
+            <w:vAlign w:val="center"/>
+          </w:tcPr>
+          <w:p>
+            <w:r>
+              <w:rPr>
+                <w:b w:val="false"/>
+                <w:bCs w:val="false"/>
+                <w:color w:val="1A1A1A"/>
+                <w:sz w:val="19"/>
+                <w:szCs w:val="19"/>
+              </w:rPr>
+              <w:t xml:space="preserve">12</w:t>
+            </w:r>
+          </w:p>
+        </w:tc>
+        <w:tc>
+          <w:tcPr>
+            <w:tcW w:type="dxa" w:w="4700"/>
+            <w:shd w:fill="EFF3EE" w:val="clear"/>
+            <w:tcMar>
+              <w:top w:type="dxa" w:w="90"/>
+              <w:left w:type="dxa" w:w="110"/>
+              <w:bottom w:type="dxa" w:w="90"/>
+              <w:right w:type="dxa" w:w="110"/>
+            </w:tcMar>
+            <w:vAlign w:val="center"/>
+          </w:tcPr>
+          <w:p>
+            <w:r>
+              <w:rPr>
+                <w:b w:val="false"/>
+                <w:bCs w:val="false"/>
+                <w:color w:val="1A1A1A"/>
+                <w:sz w:val="19"/>
+                <w:szCs w:val="19"/>
+              </w:rPr>
+              <w:t xml:space="preserve">Resolved by the founder: PR B7 (restricted-pending enforcement, GuardianConsentGuard) flagged that Section 8.3 step 5’s “DMs from unverified accounts” wording was ambiguous on two points — direction and scope. Both now settled: (1) Direction — a minor awaiting guardian consent is blocked from both sending and receiving direct messages, not just one direction. (2) Scope — “restricted-pending” applies only to the minor’s own account status (User.isMinor + Guardian.consentStatus, the exact fields GuardianConsentGuard already reads), not to a broader “any unverified account” policy. Email-verification status and guardian-consent status are distinct signals and should stay enforced by distinct mechanisms rather than conflated under one restriction — if a general anti-abuse restriction on unverified accounts messaging anyone is wanted later, that is a separate decision and a separate guard, not an extension of this one. No code change required now: the messaging module is still a Sprint 3 placeholder (services/api/src/modules/messaging), this entry exists so whoever builds it applies GuardianConsentGuard correctly — blocking both directions for a pending-consent minor — without re-litigating the ambiguity.</w:t>
+            </w:r>
+          </w:p>
+        </w:tc>
+        <w:tc>
+          <w:tcPr>
+            <w:tcW w:type="dxa" w:w="1850"/>
+            <w:shd w:fill="EFF3EE" w:val="clear"/>
+            <w:tcMar>
+              <w:top w:type="dxa" w:w="90"/>
+              <w:left w:type="dxa" w:w="110"/>
+              <w:bottom w:type="dxa" w:w="90"/>
+              <w:right w:type="dxa" w:w="110"/>
+            </w:tcMar>
+            <w:vAlign w:val="center"/>
+          </w:tcPr>
+          <w:p>
+            <w:r>
+              <w:rPr>
+                <w:b w:val="false"/>
+                <w:bCs w:val="false"/>
+                <w:color w:val="1A1A1A"/>
+                <w:sz w:val="19"/>
+                <w:szCs w:val="19"/>
+              </w:rPr>
+              <w:t xml:space="preserve">PR B7 (sprint-1/guardian-consent-enforcement) resolution summary</w:t>
+            </w:r>
+          </w:p>
+        </w:tc>
+        <w:tc>
+          <w:tcPr>
+            <w:tcW w:type="dxa" w:w="1850"/>
+            <w:shd w:fill="EFF3EE" w:val="clear"/>
+            <w:tcMar>
+              <w:top w:type="dxa" w:w="90"/>
+              <w:left w:type="dxa" w:w="110"/>
+              <w:bottom w:type="dxa" w:w="90"/>
+              <w:right w:type="dxa" w:w="110"/>
+            </w:tcMar>
+            <w:vAlign w:val="center"/>
+          </w:tcPr>
+          <w:p>
+            <w:r>
+              <w:rPr>
+                <w:b w:val="false"/>
+                <w:bCs w:val="false"/>
+                <w:color w:val="1A1A1A"/>
+                <w:sz w:val="19"/>
+                <w:szCs w:val="19"/>
+              </w:rPr>
+              <w:t xml:space="preserve">Resolved — unblocks Sprint 3 messaging module implementation</w:t>
             </w:r>
           </w:p>
         </w:tc>

</xml_diff>

<commit_message>
Added Decision Log items #13–17 to the build plan
Resolution:

13	Token storage (refresh/email-verification/password-reset) — stays on Redis, revisit only when Section 8.4 (appeals workflow) is actually scheduled
14	Password minimum — formalized at 8 characters platform-wide (already the de facto value, no code change)
15	/users/me alias — not adding one, :id-scoped routes are final
16	Email case-sensitivity — resolved to normalize to lowercase on write for both register and login; flagged as needing a small implementation follow-up (not yet built)
17	Email provider — Postmark selected, with reasoning tied to the safety-critical nature of guardian-consent/reset emails; flagged as needing actual account setup (human action, not code)
</commit_message>
<xml_diff>
--- a/docs/Soccernity_MVP_Build_Plan_v1.7.docx
+++ b/docs/Soccernity_MVP_Build_Plan_v1.7.docx
@@ -9409,6 +9409,516 @@
                 <w:szCs w:val="19"/>
               </w:rPr>
               <w:t xml:space="preserve">Resolved — unblocks Sprint 3 messaging module implementation</w:t>
+            </w:r>
+          </w:p>
+        </w:tc>
+      </w:tr>
+      <w:tr>
+        <w:tc>
+          <w:tcPr>
+            <w:tcW w:type="dxa" w:w="500"/>
+            <w:shd w:fill="EFF3EE" w:val="clear"/>
+            <w:tcMar>
+              <w:top w:type="dxa" w:w="90"/>
+              <w:left w:type="dxa" w:w="110"/>
+              <w:bottom w:type="dxa" w:w="90"/>
+              <w:right w:type="dxa" w:w="110"/>
+            </w:tcMar>
+            <w:vAlign w:val="center"/>
+          </w:tcPr>
+          <w:p>
+            <w:r>
+              <w:rPr>
+                <w:b w:val="false"/>
+                <w:bCs w:val="false"/>
+                <w:color w:val="1A1A1A"/>
+                <w:sz w:val="19"/>
+                <w:szCs w:val="19"/>
+              </w:rPr>
+              <w:t xml:space="preserve">13</w:t>
+            </w:r>
+          </w:p>
+        </w:tc>
+        <w:tc>
+          <w:tcPr>
+            <w:tcW w:type="dxa" w:w="4700"/>
+            <w:shd w:fill="EFF3EE" w:val="clear"/>
+            <w:tcMar>
+              <w:top w:type="dxa" w:w="90"/>
+              <w:left w:type="dxa" w:w="110"/>
+              <w:bottom w:type="dxa" w:w="90"/>
+              <w:right w:type="dxa" w:w="110"/>
+            </w:tcMar>
+            <w:vAlign w:val="center"/>
+          </w:tcPr>
+          <w:p>
+            <w:r>
+              <w:rPr>
+                <w:b w:val="false"/>
+                <w:bCs w:val="false"/>
+                <w:color w:val="1A1A1A"/>
+                <w:sz w:val="19"/>
+                <w:szCs w:val="19"/>
+              </w:rPr>
+              <w:t xml:space="preserve">Resolved by the founder: refresh-token (PR B1), email-verification-token (PR B2), and password-reset-token (PR B4) storage all raised the same underlying question — each flagged “Decision Log candidate” for whether a durable Postgres table should replace its current Redis-backed store, for possible audit/appeals-workflow querying (Section 8.4). Resolved as one decision covering all three: stay on Redis. No Section 8.4 appeals-workflow feature exists yet to actually query these tokens, so adding three speculative Prisma migrations now would be schema churn against a requirement that doesn’t exist. Revisit if/when Section 8.4 is actually scoped for a sprint — at that point the swap point in each of refresh-token.store.ts / email-verification-token.store.ts / reset-token.store.ts is already identified in their own code comments.</w:t>
+            </w:r>
+          </w:p>
+        </w:tc>
+        <w:tc>
+          <w:tcPr>
+            <w:tcW w:type="dxa" w:w="1850"/>
+            <w:shd w:fill="EFF3EE" w:val="clear"/>
+            <w:tcMar>
+              <w:top w:type="dxa" w:w="90"/>
+              <w:left w:type="dxa" w:w="110"/>
+              <w:bottom w:type="dxa" w:w="90"/>
+              <w:right w:type="dxa" w:w="110"/>
+            </w:tcMar>
+            <w:vAlign w:val="center"/>
+          </w:tcPr>
+          <w:p>
+            <w:r>
+              <w:rPr>
+                <w:b w:val="false"/>
+                <w:bCs w:val="false"/>
+                <w:color w:val="1A1A1A"/>
+                <w:sz w:val="19"/>
+                <w:szCs w:val="19"/>
+              </w:rPr>
+              <w:t xml:space="preserve">PR B1, B2, B4 module READMEs</w:t>
+            </w:r>
+          </w:p>
+        </w:tc>
+        <w:tc>
+          <w:tcPr>
+            <w:tcW w:type="dxa" w:w="1850"/>
+            <w:shd w:fill="EFF3EE" w:val="clear"/>
+            <w:tcMar>
+              <w:top w:type="dxa" w:w="90"/>
+              <w:left w:type="dxa" w:w="110"/>
+              <w:bottom w:type="dxa" w:w="90"/>
+              <w:right w:type="dxa" w:w="110"/>
+            </w:tcMar>
+            <w:vAlign w:val="center"/>
+          </w:tcPr>
+          <w:p>
+            <w:r>
+              <w:rPr>
+                <w:b w:val="false"/>
+                <w:bCs w:val="false"/>
+                <w:color w:val="1A1A1A"/>
+                <w:sz w:val="19"/>
+                <w:szCs w:val="19"/>
+              </w:rPr>
+              <w:t xml:space="preserve">Resolved (deferred) — revisit only when Section 8.4 is scheduled</w:t>
+            </w:r>
+          </w:p>
+        </w:tc>
+      </w:tr>
+      <w:tr>
+        <w:tc>
+          <w:tcPr>
+            <w:tcW w:type="dxa" w:w="500"/>
+            <w:shd w:fill="EFF3EE" w:val="clear"/>
+            <w:tcMar>
+              <w:top w:type="dxa" w:w="90"/>
+              <w:left w:type="dxa" w:w="110"/>
+              <w:bottom w:type="dxa" w:w="90"/>
+              <w:right w:type="dxa" w:w="110"/>
+            </w:tcMar>
+            <w:vAlign w:val="center"/>
+          </w:tcPr>
+          <w:p>
+            <w:r>
+              <w:rPr>
+                <w:b w:val="false"/>
+                <w:bCs w:val="false"/>
+                <w:color w:val="1A1A1A"/>
+                <w:sz w:val="19"/>
+                <w:szCs w:val="19"/>
+              </w:rPr>
+              <w:t xml:space="preserve">14</w:t>
+            </w:r>
+          </w:p>
+        </w:tc>
+        <w:tc>
+          <w:tcPr>
+            <w:tcW w:type="dxa" w:w="4700"/>
+            <w:shd w:fill="EFF3EE" w:val="clear"/>
+            <w:tcMar>
+              <w:top w:type="dxa" w:w="90"/>
+              <w:left w:type="dxa" w:w="110"/>
+              <w:bottom w:type="dxa" w:w="90"/>
+              <w:right w:type="dxa" w:w="110"/>
+            </w:tcMar>
+            <w:vAlign w:val="center"/>
+          </w:tcPr>
+          <w:p>
+            <w:r>
+              <w:rPr>
+                <w:b w:val="false"/>
+                <w:bCs w:val="false"/>
+                <w:color w:val="1A1A1A"/>
+                <w:sz w:val="19"/>
+                <w:szCs w:val="19"/>
+              </w:rPr>
+              <w:t xml:space="preserve">Resolved by the founder: PR B4 flagged that no password policy is specified anywhere in Section 5.7 or Section 3, and applied an unreconciled 8-character minimum to /auth/reset-password as a conservative default. Formalized: 8 characters is the platform-wide minimum password length, applying to registration and reset alike. No code change needed — this is already the only value in use across RegisterDto and ResetPasswordDto; this entry closes the “unreconciled” flag by making the existing de facto standard the documented one.</w:t>
+            </w:r>
+          </w:p>
+        </w:tc>
+        <w:tc>
+          <w:tcPr>
+            <w:tcW w:type="dxa" w:w="1850"/>
+            <w:shd w:fill="EFF3EE" w:val="clear"/>
+            <w:tcMar>
+              <w:top w:type="dxa" w:w="90"/>
+              <w:left w:type="dxa" w:w="110"/>
+              <w:bottom w:type="dxa" w:w="90"/>
+              <w:right w:type="dxa" w:w="110"/>
+            </w:tcMar>
+            <w:vAlign w:val="center"/>
+          </w:tcPr>
+          <w:p>
+            <w:r>
+              <w:rPr>
+                <w:b w:val="false"/>
+                <w:bCs w:val="false"/>
+                <w:color w:val="1A1A1A"/>
+                <w:sz w:val="19"/>
+                <w:szCs w:val="19"/>
+              </w:rPr>
+              <w:t xml:space="preserve">PR B4 (auth/README.md)</w:t>
+            </w:r>
+          </w:p>
+        </w:tc>
+        <w:tc>
+          <w:tcPr>
+            <w:tcW w:type="dxa" w:w="1850"/>
+            <w:shd w:fill="EFF3EE" w:val="clear"/>
+            <w:tcMar>
+              <w:top w:type="dxa" w:w="90"/>
+              <w:left w:type="dxa" w:w="110"/>
+              <w:bottom w:type="dxa" w:w="90"/>
+              <w:right w:type="dxa" w:w="110"/>
+            </w:tcMar>
+            <w:vAlign w:val="center"/>
+          </w:tcPr>
+          <w:p>
+            <w:r>
+              <w:rPr>
+                <w:b w:val="false"/>
+                <w:bCs w:val="false"/>
+                <w:color w:val="1A1A1A"/>
+                <w:sz w:val="19"/>
+                <w:szCs w:val="19"/>
+              </w:rPr>
+              <w:t xml:space="preserve">Resolved — 8 characters is the platform standard, already implemented</w:t>
+            </w:r>
+          </w:p>
+        </w:tc>
+      </w:tr>
+      <w:tr>
+        <w:tc>
+          <w:tcPr>
+            <w:tcW w:type="dxa" w:w="500"/>
+            <w:shd w:fill="EFF3EE" w:val="clear"/>
+            <w:tcMar>
+              <w:top w:type="dxa" w:w="90"/>
+              <w:left w:type="dxa" w:w="110"/>
+              <w:bottom w:type="dxa" w:w="90"/>
+              <w:right w:type="dxa" w:w="110"/>
+            </w:tcMar>
+            <w:vAlign w:val="center"/>
+          </w:tcPr>
+          <w:p>
+            <w:r>
+              <w:rPr>
+                <w:b w:val="false"/>
+                <w:bCs w:val="false"/>
+                <w:color w:val="1A1A1A"/>
+                <w:sz w:val="19"/>
+                <w:szCs w:val="19"/>
+              </w:rPr>
+              <w:t xml:space="preserve">15</w:t>
+            </w:r>
+          </w:p>
+        </w:tc>
+        <w:tc>
+          <w:tcPr>
+            <w:tcW w:type="dxa" w:w="4700"/>
+            <w:shd w:fill="EFF3EE" w:val="clear"/>
+            <w:tcMar>
+              <w:top w:type="dxa" w:w="90"/>
+              <w:left w:type="dxa" w:w="110"/>
+              <w:bottom w:type="dxa" w:w="90"/>
+              <w:right w:type="dxa" w:w="110"/>
+            </w:tcMar>
+            <w:vAlign w:val="center"/>
+          </w:tcPr>
+          <w:p>
+            <w:r>
+              <w:rPr>
+                <w:b w:val="false"/>
+                <w:bCs w:val="false"/>
+                <w:color w:val="1A1A1A"/>
+                <w:sz w:val="19"/>
+                <w:szCs w:val="19"/>
+              </w:rPr>
+              <w:t xml:space="preserve">Resolved by the founder: PR B6 flagged a discrepancy between its task brief (GET/PATCH /users/me) and Build Plan Section 4.2’s actual spec (:id-scoped routes only, self-403-checked). No /me alias will be added — the existing GET/PATCH /users/:id routes already satisfy “view/edit my own profile” with a fresh-JWT self-check, and an additional alias route would be pure surface-area growth with no functional benefit. Closed as resolved by the status quo.</w:t>
+            </w:r>
+          </w:p>
+        </w:tc>
+        <w:tc>
+          <w:tcPr>
+            <w:tcW w:type="dxa" w:w="1850"/>
+            <w:shd w:fill="EFF3EE" w:val="clear"/>
+            <w:tcMar>
+              <w:top w:type="dxa" w:w="90"/>
+              <w:left w:type="dxa" w:w="110"/>
+              <w:bottom w:type="dxa" w:w="90"/>
+              <w:right w:type="dxa" w:w="110"/>
+            </w:tcMar>
+            <w:vAlign w:val="center"/>
+          </w:tcPr>
+          <w:p>
+            <w:r>
+              <w:rPr>
+                <w:b w:val="false"/>
+                <w:bCs w:val="false"/>
+                <w:color w:val="1A1A1A"/>
+                <w:sz w:val="19"/>
+                <w:szCs w:val="19"/>
+              </w:rPr>
+              <w:t xml:space="preserve">PR B6 (users/README.md)</w:t>
+            </w:r>
+          </w:p>
+        </w:tc>
+        <w:tc>
+          <w:tcPr>
+            <w:tcW w:type="dxa" w:w="1850"/>
+            <w:shd w:fill="EFF3EE" w:val="clear"/>
+            <w:tcMar>
+              <w:top w:type="dxa" w:w="90"/>
+              <w:left w:type="dxa" w:w="110"/>
+              <w:bottom w:type="dxa" w:w="90"/>
+              <w:right w:type="dxa" w:w="110"/>
+            </w:tcMar>
+            <w:vAlign w:val="center"/>
+          </w:tcPr>
+          <w:p>
+            <w:r>
+              <w:rPr>
+                <w:b w:val="false"/>
+                <w:bCs w:val="false"/>
+                <w:color w:val="1A1A1A"/>
+                <w:sz w:val="19"/>
+                <w:szCs w:val="19"/>
+              </w:rPr>
+              <w:t xml:space="preserve">Resolved — no /me alias added, :id-scoped routes are final</w:t>
+            </w:r>
+          </w:p>
+        </w:tc>
+      </w:tr>
+      <w:tr>
+        <w:tc>
+          <w:tcPr>
+            <w:tcW w:type="dxa" w:w="500"/>
+            <w:shd w:fill="EFF3EE" w:val="clear"/>
+            <w:tcMar>
+              <w:top w:type="dxa" w:w="90"/>
+              <w:left w:type="dxa" w:w="110"/>
+              <w:bottom w:type="dxa" w:w="90"/>
+              <w:right w:type="dxa" w:w="110"/>
+            </w:tcMar>
+            <w:vAlign w:val="center"/>
+          </w:tcPr>
+          <w:p>
+            <w:r>
+              <w:rPr>
+                <w:b w:val="false"/>
+                <w:bCs w:val="false"/>
+                <w:color w:val="1A1A1A"/>
+                <w:sz w:val="19"/>
+                <w:szCs w:val="19"/>
+              </w:rPr>
+              <w:t xml:space="preserve">16</w:t>
+            </w:r>
+          </w:p>
+        </w:tc>
+        <w:tc>
+          <w:tcPr>
+            <w:tcW w:type="dxa" w:w="4700"/>
+            <w:shd w:fill="EFF3EE" w:val="clear"/>
+            <w:tcMar>
+              <w:top w:type="dxa" w:w="90"/>
+              <w:left w:type="dxa" w:w="110"/>
+              <w:bottom w:type="dxa" w:w="90"/>
+              <w:right w:type="dxa" w:w="110"/>
+            </w:tcMar>
+            <w:vAlign w:val="center"/>
+          </w:tcPr>
+          <w:p>
+            <w:r>
+              <w:rPr>
+                <w:b w:val="false"/>
+                <w:bCs w:val="false"/>
+                <w:color w:val="1A1A1A"/>
+                <w:sz w:val="19"/>
+                <w:szCs w:val="19"/>
+              </w:rPr>
+              <w:t xml:space="preserve">Resolved by the founder: the DTO-validation cleanup PR flagged that removing LoginDto’s old hand-rolled email trim/lowercase (in favor of plain @IsEmail()) made /auth/login consistent with /auth/register’s pre-existing lack of normalization — but left open whether email matching should be case-insensitive at all. Resolved: yes, normalize email to lowercase on write, for both /auth/register and /auth/login. This is the near-universal real-world standard regardless of what RFC 5321/5322 technically permits, and avoids support tickets from a guardian or player who registered with mixed-case email casing being unable to log in with the same address typed differently. Implementation follow-up needed: lowercase-on-write at the DTO or service layer for both endpoints — not yet built as of this entry.</w:t>
+            </w:r>
+          </w:p>
+        </w:tc>
+        <w:tc>
+          <w:tcPr>
+            <w:tcW w:type="dxa" w:w="1850"/>
+            <w:shd w:fill="EFF3EE" w:val="clear"/>
+            <w:tcMar>
+              <w:top w:type="dxa" w:w="90"/>
+              <w:left w:type="dxa" w:w="110"/>
+              <w:bottom w:type="dxa" w:w="90"/>
+              <w:right w:type="dxa" w:w="110"/>
+            </w:tcMar>
+            <w:vAlign w:val="center"/>
+          </w:tcPr>
+          <w:p>
+            <w:r>
+              <w:rPr>
+                <w:b w:val="false"/>
+                <w:bCs w:val="false"/>
+                <w:color w:val="1A1A1A"/>
+                <w:sz w:val="19"/>
+                <w:szCs w:val="19"/>
+              </w:rPr>
+              <w:t xml:space="preserve">sprint-1/auth-dto-validation PR; Decision Log #11</w:t>
+            </w:r>
+          </w:p>
+        </w:tc>
+        <w:tc>
+          <w:tcPr>
+            <w:tcW w:type="dxa" w:w="1850"/>
+            <w:shd w:fill="EFF3EE" w:val="clear"/>
+            <w:tcMar>
+              <w:top w:type="dxa" w:w="90"/>
+              <w:left w:type="dxa" w:w="110"/>
+              <w:bottom w:type="dxa" w:w="90"/>
+              <w:right w:type="dxa" w:w="110"/>
+            </w:tcMar>
+            <w:vAlign w:val="center"/>
+          </w:tcPr>
+          <w:p>
+            <w:r>
+              <w:rPr>
+                <w:b w:val="false"/>
+                <w:bCs w:val="false"/>
+                <w:color w:val="1A1A1A"/>
+                <w:sz w:val="19"/>
+                <w:szCs w:val="19"/>
+              </w:rPr>
+              <w:t xml:space="preserve">Resolved (decision) — open implementation ticket: lowercase-on-write normalization for register + login</w:t>
+            </w:r>
+          </w:p>
+        </w:tc>
+      </w:tr>
+      <w:tr>
+        <w:tc>
+          <w:tcPr>
+            <w:tcW w:type="dxa" w:w="500"/>
+            <w:shd w:fill="EFF3EE" w:val="clear"/>
+            <w:tcMar>
+              <w:top w:type="dxa" w:w="90"/>
+              <w:left w:type="dxa" w:w="110"/>
+              <w:bottom w:type="dxa" w:w="90"/>
+              <w:right w:type="dxa" w:w="110"/>
+            </w:tcMar>
+            <w:vAlign w:val="center"/>
+          </w:tcPr>
+          <w:p>
+            <w:r>
+              <w:rPr>
+                <w:b w:val="false"/>
+                <w:bCs w:val="false"/>
+                <w:color w:val="1A1A1A"/>
+                <w:sz w:val="19"/>
+                <w:szCs w:val="19"/>
+              </w:rPr>
+              <w:t xml:space="preserve">17</w:t>
+            </w:r>
+          </w:p>
+        </w:tc>
+        <w:tc>
+          <w:tcPr>
+            <w:tcW w:type="dxa" w:w="4700"/>
+            <w:shd w:fill="EFF3EE" w:val="clear"/>
+            <w:tcMar>
+              <w:top w:type="dxa" w:w="90"/>
+              <w:left w:type="dxa" w:w="110"/>
+              <w:bottom w:type="dxa" w:w="90"/>
+              <w:right w:type="dxa" w:w="110"/>
+            </w:tcMar>
+            <w:vAlign w:val="center"/>
+          </w:tcPr>
+          <w:p>
+            <w:r>
+              <w:rPr>
+                <w:b w:val="false"/>
+                <w:bCs w:val="false"/>
+                <w:color w:val="1A1A1A"/>
+                <w:sz w:val="19"/>
+                <w:szCs w:val="19"/>
+              </w:rPr>
+              <w:t xml:space="preserve">Resolved by the founder: PR B2 and B4 both flagged EMAIL_PROVIDER_API_KEY as an unconfigured .env.example placeholder — verify-email, guardian-consent, and password-reset emails are all currently “wired, not live” (logged, not delivered). Provider selected: Postmark. Two of Soccernity’s three transactional email types (guardian consent, password reset) are safety- and security-critical, and Postmark’s strict separation of transactional from bulk/marketing sending plus its deliverability-speed reputation outweigh its higher per-email cost at this volume (roughly $15/10K emails — trivial at MVP scale). Actual account creation and swapping the real API key into EMAIL_PROVIDER_API_KEY requires a human (billing, domain verification) and is not done as of this entry — the single call site each email service already isolates is the integration point once the account exists.</w:t>
+            </w:r>
+          </w:p>
+        </w:tc>
+        <w:tc>
+          <w:tcPr>
+            <w:tcW w:type="dxa" w:w="1850"/>
+            <w:shd w:fill="EFF3EE" w:val="clear"/>
+            <w:tcMar>
+              <w:top w:type="dxa" w:w="90"/>
+              <w:left w:type="dxa" w:w="110"/>
+              <w:bottom w:type="dxa" w:w="90"/>
+              <w:right w:type="dxa" w:w="110"/>
+            </w:tcMar>
+            <w:vAlign w:val="center"/>
+          </w:tcPr>
+          <w:p>
+            <w:r>
+              <w:rPr>
+                <w:b w:val="false"/>
+                <w:bCs w:val="false"/>
+                <w:color w:val="1A1A1A"/>
+                <w:sz w:val="19"/>
+                <w:szCs w:val="19"/>
+              </w:rPr>
+              <w:t xml:space="preserve">PR B2, B4 module READMEs; .env.example</w:t>
+            </w:r>
+          </w:p>
+        </w:tc>
+        <w:tc>
+          <w:tcPr>
+            <w:tcW w:type="dxa" w:w="1850"/>
+            <w:shd w:fill="EFF3EE" w:val="clear"/>
+            <w:tcMar>
+              <w:top w:type="dxa" w:w="90"/>
+              <w:left w:type="dxa" w:w="110"/>
+              <w:bottom w:type="dxa" w:w="90"/>
+              <w:right w:type="dxa" w:w="110"/>
+            </w:tcMar>
+            <w:vAlign w:val="center"/>
+          </w:tcPr>
+          <w:p>
+            <w:r>
+              <w:rPr>
+                <w:b w:val="false"/>
+                <w:bCs w:val="false"/>
+                <w:color w:val="1A1A1A"/>
+                <w:sz w:val="19"/>
+                <w:szCs w:val="19"/>
+              </w:rPr>
+              <w:t xml:space="preserve">Resolved (provider chosen: Postmark) — open action: account setup + real API key still needed</w:t>
             </w:r>
           </w:p>
         </w:tc>

</xml_diff>

<commit_message>
Add missing verify-email route stub (F7), update CLAUDE.md status
Cleanup review found /auth/verify-email had no frontend route or page
at all -- unlike F5/F6, which are wired placeholder stubs, this route
didn't exist in router.tsx until now. Added VerifyEmailPage.tsx
following the same PlaceholderPage pattern as GuardianConsentPage/
ProfilePage, wired into router.tsx as F7, and updated CLAUDE.md's
status section to track F5/F6/F7 as outstanding frontend work (they'd
fallen off the status list) and reflect B5/B7 and Decision Log #16/#17
as merged.
</commit_message>
<xml_diff>
--- a/docs/Soccernity_MVP_Build_Plan_v1.7.docx
+++ b/docs/Soccernity_MVP_Build_Plan_v1.7.docx
@@ -9919,6 +9919,108 @@
                 <w:szCs w:val="19"/>
               </w:rPr>
               <w:t xml:space="preserve">Resolved (provider chosen: Postmark) — open action: account setup + real API key still needed</w:t>
+            </w:r>
+          </w:p>
+        </w:tc>
+      </w:tr>
+      <w:tr>
+        <w:tc>
+          <w:tcPr>
+            <w:tcW w:type="dxa" w:w="500"/>
+            <w:shd w:fill="EFF3EE" w:val="clear"/>
+            <w:tcMar>
+              <w:top w:type="dxa" w:w="90"/>
+              <w:left w:type="dxa" w:w="110"/>
+              <w:bottom w:type="dxa" w:w="90"/>
+              <w:right w:type="dxa" w:w="110"/>
+            </w:tcMar>
+            <w:vAlign w:val="center"/>
+          </w:tcPr>
+          <w:p>
+            <w:r>
+              <w:rPr>
+                <w:b w:val="false"/>
+                <w:bCs w:val="false"/>
+                <w:color w:val="1A1A1A"/>
+                <w:sz w:val="19"/>
+                <w:szCs w:val="19"/>
+              </w:rPr>
+              <w:t xml:space="preserve">18</w:t>
+            </w:r>
+          </w:p>
+        </w:tc>
+        <w:tc>
+          <w:tcPr>
+            <w:tcW w:type="dxa" w:w="4700"/>
+            <w:shd w:fill="EFF3EE" w:val="clear"/>
+            <w:tcMar>
+              <w:top w:type="dxa" w:w="90"/>
+              <w:left w:type="dxa" w:w="110"/>
+              <w:bottom w:type="dxa" w:w="90"/>
+              <w:right w:type="dxa" w:w="110"/>
+            </w:tcMar>
+            <w:vAlign w:val="center"/>
+          </w:tcPr>
+          <w:p>
+            <w:r>
+              <w:rPr>
+                <w:b w:val="false"/>
+                <w:bCs w:val="false"/>
+                <w:color w:val="1A1A1A"/>
+                <w:sz w:val="19"/>
+                <w:szCs w:val="19"/>
+              </w:rPr>
+              <w:t xml:space="preserve">Open, surfaced during a Sprint 1 cleanup review, not yet resolved: the PR implementing Decision Log #16 (email lowercase normalization) correctly flagged that its fix is write-time only — any User row created with a mixed-case email before that PR merged stays exactly as stored, and won't match a post-fix, lowercased login() lookup unless separately backfilled (UPDATE "User" SET email = LOWER(email), after checking for resulting duplicate-key collisions). Whether this backfill is actually needed depends on whether any real user rows existed in a production or shared database before PR #32 merged — nothing in the codebase confirms or rules that out, and this entry does not assume a clean slate. Needs a founder/engineering check of the actual current User table before closing.</w:t>
+            </w:r>
+          </w:p>
+        </w:tc>
+        <w:tc>
+          <w:tcPr>
+            <w:tcW w:type="dxa" w:w="1850"/>
+            <w:shd w:fill="EFF3EE" w:val="clear"/>
+            <w:tcMar>
+              <w:top w:type="dxa" w:w="90"/>
+              <w:left w:type="dxa" w:w="110"/>
+              <w:bottom w:type="dxa" w:w="90"/>
+              <w:right w:type="dxa" w:w="110"/>
+            </w:tcMar>
+            <w:vAlign w:val="center"/>
+          </w:tcPr>
+          <w:p>
+            <w:r>
+              <w:rPr>
+                <w:b w:val="false"/>
+                <w:bCs w:val="false"/>
+                <w:color w:val="1A1A1A"/>
+                <w:sz w:val="19"/>
+                <w:szCs w:val="19"/>
+              </w:rPr>
+              <w:t xml:space="preserve">auth/README.md (Decision Log #16 implementation PR)</w:t>
+            </w:r>
+          </w:p>
+        </w:tc>
+        <w:tc>
+          <w:tcPr>
+            <w:tcW w:type="dxa" w:w="1850"/>
+            <w:shd w:fill="EFF3EE" w:val="clear"/>
+            <w:tcMar>
+              <w:top w:type="dxa" w:w="90"/>
+              <w:left w:type="dxa" w:w="110"/>
+              <w:bottom w:type="dxa" w:w="90"/>
+              <w:right w:type="dxa" w:w="110"/>
+            </w:tcMar>
+            <w:vAlign w:val="center"/>
+          </w:tcPr>
+          <w:p>
+            <w:r>
+              <w:rPr>
+                <w:b w:val="false"/>
+                <w:bCs w:val="false"/>
+                <w:color w:val="1A1A1A"/>
+                <w:sz w:val="19"/>
+                <w:szCs w:val="19"/>
+              </w:rPr>
+              <w:t xml:space="preserve">Open — check whether any pre-existing mixed-case User rows exist before deciding if a backfill migration is needed</w:t>
             </w:r>
           </w:p>
         </w:tc>

</xml_diff>

<commit_message>
Updated Build plan to resolve Decision Log #18
Given there's never been production/shared data, I closed out Decision Log #18 — updated its status from "Open" to "Resolved: no backfill needed," with the reasoning preserved (and the backfill SQL kept for reference in case an external data import ever pre-dates this fix down the line). Updated CLAUDE.md's status section to match.
</commit_message>
<xml_diff>
--- a/docs/Soccernity_MVP_Build_Plan_v1.7.docx
+++ b/docs/Soccernity_MVP_Build_Plan_v1.7.docx
@@ -9970,7 +9970,7 @@
                 <w:sz w:val="19"/>
                 <w:szCs w:val="19"/>
               </w:rPr>
-              <w:t xml:space="preserve">Open, surfaced during a Sprint 1 cleanup review, not yet resolved: the PR implementing Decision Log #16 (email lowercase normalization) correctly flagged that its fix is write-time only — any User row created with a mixed-case email before that PR merged stays exactly as stored, and won't match a post-fix, lowercased login() lookup unless separately backfilled (UPDATE "User" SET email = LOWER(email), after checking for resulting duplicate-key collisions). Whether this backfill is actually needed depends on whether any real user rows existed in a production or shared database before PR #32 merged — nothing in the codebase confirms or rules that out, and this entry does not assume a clean slate. Needs a founder/engineering check of the actual current User table before closing.</w:t>
+              <w:t xml:space="preserve">Resolved by the founder: the PR implementing Decision Log #16 (email lowercase normalization) correctly flagged that its fix is write-time only — any User row created with a mixed-case email before that PR merged would stay exactly as stored, un-matchable by a post-fix, lowercased login() lookup unless separately backfilled. Confirmed: no backfill is needed. Soccernity has never had production or shared user data — still in the building stage as of PR #32 merging — so no pre-existing mixed-case User row can exist. Closed without a migration. If this ever needs revisiting (e.g. a data import from an external source pre-dating this fix), the backfill SQL this entry considered is preserved in the git history of this row for reference: UPDATE "User" SET email = LOWER(email), after checking for resulting duplicate-key collisions.</w:t>
             </w:r>
           </w:p>
         </w:tc>
@@ -10020,7 +10020,7 @@
                 <w:sz w:val="19"/>
                 <w:szCs w:val="19"/>
               </w:rPr>
-              <w:t xml:space="preserve">Open — check whether any pre-existing mixed-case User rows exist before deciding if a backfill migration is needed</w:t>
+              <w:t xml:space="preserve">Resolved — no backfill needed, confirmed no pre-existing user data exists</w:t>
             </w:r>
           </w:p>
         </w:tc>

</xml_diff>

<commit_message>
Added a Decision Log #19, resolving the age floor
Added as Decision Log #19, resolving the age-5 floor with reasoning.

Recommendation: age 5. UK grassroots football's own entry point (The FA's "Future Fit" pathway, mini-soccer, and typical club intake) starts around age 5–6 — before that, there's no meaningful "grassroots player" for a platform built around player identity and career pathway to represent. Nigeria's informal youth football landscape follows a similar pattern. This isn't a legal minimum (as confirmed, GDPR/NDPA don't set one) — it's a product-fit floor: below age 5, a Soccernity profile wouldn't correspond to anything real about the child as a player yet.

Adding this as Decision Log #19, then implementing it in AgeGateStep.tsx.
</commit_message>
<xml_diff>
--- a/docs/Soccernity_MVP_Build_Plan_v1.7.docx
+++ b/docs/Soccernity_MVP_Build_Plan_v1.7.docx
@@ -10021,6 +10021,108 @@
                 <w:szCs w:val="19"/>
               </w:rPr>
               <w:t xml:space="preserve">Resolved — no backfill needed, confirmed no pre-existing user data exists</w:t>
+            </w:r>
+          </w:p>
+        </w:tc>
+      </w:tr>
+      <w:tr>
+        <w:tc>
+          <w:tcPr>
+            <w:tcW w:type="dxa" w:w="500"/>
+            <w:shd w:fill="EFF3EE" w:val="clear"/>
+            <w:tcMar>
+              <w:top w:type="dxa" w:w="90"/>
+              <w:left w:type="dxa" w:w="110"/>
+              <w:bottom w:type="dxa" w:w="90"/>
+              <w:right w:type="dxa" w:w="110"/>
+            </w:tcMar>
+            <w:vAlign w:val="center"/>
+          </w:tcPr>
+          <w:p>
+            <w:r>
+              <w:rPr>
+                <w:b w:val="false"/>
+                <w:bCs w:val="false"/>
+                <w:color w:val="1A1A1A"/>
+                <w:sz w:val="19"/>
+                <w:szCs w:val="19"/>
+              </w:rPr>
+              <w:t xml:space="preserve">19</w:t>
+            </w:r>
+          </w:p>
+        </w:tc>
+        <w:tc>
+          <w:tcPr>
+            <w:tcW w:type="dxa" w:w="4700"/>
+            <w:shd w:fill="EFF3EE" w:val="clear"/>
+            <w:tcMar>
+              <w:top w:type="dxa" w:w="90"/>
+              <w:left w:type="dxa" w:w="110"/>
+              <w:bottom w:type="dxa" w:w="90"/>
+              <w:right w:type="dxa" w:w="110"/>
+            </w:tcMar>
+            <w:vAlign w:val="center"/>
+          </w:tcPr>
+          <w:p>
+            <w:r>
+              <w:rPr>
+                <w:b w:val="false"/>
+                <w:bCs w:val="false"/>
+                <w:color w:val="1A1A1A"/>
+                <w:sz w:val="19"/>
+                <w:szCs w:val="19"/>
+              </w:rPr>
+              <w:t xml:space="preserve">Resolved by the founder: Build Plan Section 8.3 step 1 says the age gate should “block signup outright below the applicable regional minimum age,” but no numeric floor was ever defined — Decision Log #8 only resolved the parental-consent threshold (full under-18 band), not an absolute rejection floor. AgeGateStep.tsx (Sprint 1, PR F3) correctly implemented only the under-18/18+ branch and flagged the missing floor as a Decision Log candidate rather than inventing one. Confirmed via research: neither UK GDPR Article 8 (parental-consent threshold of 13, already broader in Soccernity’s case per Decision Log #8) nor Nigeria’s NDPA 2023 (Decision Log #10) sets an absolute floor below which guardian-consented signup is legally prohibited — this is a product/duty-of-care decision, not a compliance gap. Resolved: signup is hard-blocked below age 5, regardless of guardian consent. Rationale: UK grassroots football’s own entry point (The FA’s youth pathway, mini-soccer, typical club intake) starts around age 5–6; below that, a Soccernity profile wouldn’t correspond to anything real about the child as a grassroots player yet, regardless of what the guardian consents to. Not yet implemented in code as of this entry — AgeGateStep.tsx currently has no lower bound at all.</w:t>
+            </w:r>
+          </w:p>
+        </w:tc>
+        <w:tc>
+          <w:tcPr>
+            <w:tcW w:type="dxa" w:w="1850"/>
+            <w:shd w:fill="EFF3EE" w:val="clear"/>
+            <w:tcMar>
+              <w:top w:type="dxa" w:w="90"/>
+              <w:left w:type="dxa" w:w="110"/>
+              <w:bottom w:type="dxa" w:w="90"/>
+              <w:right w:type="dxa" w:w="110"/>
+            </w:tcMar>
+            <w:vAlign w:val="center"/>
+          </w:tcPr>
+          <w:p>
+            <w:r>
+              <w:rPr>
+                <w:b w:val="false"/>
+                <w:bCs w:val="false"/>
+                <w:color w:val="1A1A1A"/>
+                <w:sz w:val="19"/>
+                <w:szCs w:val="19"/>
+              </w:rPr>
+              <w:t xml:space="preserve">PR F3 (AgeGateStep.tsx); Build Plan Section 8.3 step 1</w:t>
+            </w:r>
+          </w:p>
+        </w:tc>
+        <w:tc>
+          <w:tcPr>
+            <w:tcW w:type="dxa" w:w="1850"/>
+            <w:shd w:fill="EFF3EE" w:val="clear"/>
+            <w:tcMar>
+              <w:top w:type="dxa" w:w="90"/>
+              <w:left w:type="dxa" w:w="110"/>
+              <w:bottom w:type="dxa" w:w="90"/>
+              <w:right w:type="dxa" w:w="110"/>
+            </w:tcMar>
+            <w:vAlign w:val="center"/>
+          </w:tcPr>
+          <w:p>
+            <w:r>
+              <w:rPr>
+                <w:b w:val="false"/>
+                <w:bCs w:val="false"/>
+                <w:color w:val="1A1A1A"/>
+                <w:sz w:val="19"/>
+                <w:szCs w:val="19"/>
+              </w:rPr>
+              <w:t xml:space="preserve">Resolved (decision: age 5 floor) — open implementation ticket: AgeGateStep.tsx has no lower bound yet</w:t>
             </w:r>
           </w:p>
         </w:tc>

</xml_diff>

<commit_message>
Decision Log entries (#16, #19) updated in B plan
The two stale Decision Log entries (#16, #19) are real and are on me. I updated #18's status after it resolved but never circled back on #16/#19 after their implementation PRs shipped. Fixing this now.

The two stale Decision Log entries were real — confirmed directly in the merged docx, and I found the issue went slightly deeper than the report caught: not just the Status cells, but the tail sentences of the Decision text itself for both #16 and #19 also still said "not yet built." Fixed all four spots.
</commit_message>
<xml_diff>
--- a/docs/Soccernity_MVP_Build_Plan_v1.7.docx
+++ b/docs/Soccernity_MVP_Build_Plan_v1.7.docx
@@ -9766,7 +9766,7 @@
                 <w:sz w:val="19"/>
                 <w:szCs w:val="19"/>
               </w:rPr>
-              <w:t xml:space="preserve">Resolved by the founder: the DTO-validation cleanup PR flagged that removing LoginDto’s old hand-rolled email trim/lowercase (in favor of plain @IsEmail()) made /auth/login consistent with /auth/register’s pre-existing lack of normalization — but left open whether email matching should be case-insensitive at all. Resolved: yes, normalize email to lowercase on write, for both /auth/register and /auth/login. This is the near-universal real-world standard regardless of what RFC 5321/5322 technically permits, and avoids support tickets from a guardian or player who registered with mixed-case email casing being unable to log in with the same address typed differently. Implementation follow-up needed: lowercase-on-write at the DTO or service layer for both endpoints — not yet built as of this entry.</w:t>
+              <w:t xml:space="preserve">Resolved by the founder: the DTO-validation cleanup PR flagged that removing LoginDto’s old hand-rolled email trim/lowercase (in favor of plain @IsEmail()) made /auth/login consistent with /auth/register’s pre-existing lack of normalization — but left open whether email matching should be case-insensitive at all. Resolved: yes, normalize email to lowercase on write, for both /auth/register and /auth/login. This is the near-universal real-world standard regardless of what RFC 5321/5322 technically permits, and avoids support tickets from a guardian or player who registered with mixed-case email casing being unable to log in with the same address typed differently. Implemented in PR #32 (registration.service.ts and auth.service.ts, service-layer normalization as specified, backed by tests proving both the case-insensitive duplicate check and case-insensitive login).</w:t>
             </w:r>
           </w:p>
         </w:tc>
@@ -9816,7 +9816,7 @@
                 <w:sz w:val="19"/>
                 <w:szCs w:val="19"/>
               </w:rPr>
-              <w:t xml:space="preserve">Resolved (decision) — open implementation ticket: lowercase-on-write normalization for register + login</w:t>
+              <w:t xml:space="preserve">Resolved and implemented — PR #32 shipped the lowercase-on-write normalization for both register and login</w:t>
             </w:r>
           </w:p>
         </w:tc>
@@ -10072,7 +10072,7 @@
                 <w:sz w:val="19"/>
                 <w:szCs w:val="19"/>
               </w:rPr>
-              <w:t xml:space="preserve">Resolved by the founder: Build Plan Section 8.3 step 1 says the age gate should “block signup outright below the applicable regional minimum age,” but no numeric floor was ever defined — Decision Log #8 only resolved the parental-consent threshold (full under-18 band), not an absolute rejection floor. AgeGateStep.tsx (Sprint 1, PR F3) correctly implemented only the under-18/18+ branch and flagged the missing floor as a Decision Log candidate rather than inventing one. Confirmed via research: neither UK GDPR Article 8 (parental-consent threshold of 13, already broader in Soccernity’s case per Decision Log #8) nor Nigeria’s NDPA 2023 (Decision Log #10) sets an absolute floor below which guardian-consented signup is legally prohibited — this is a product/duty-of-care decision, not a compliance gap. Resolved: signup is hard-blocked below age 5, regardless of guardian consent. Rationale: UK grassroots football’s own entry point (The FA’s youth pathway, mini-soccer, typical club intake) starts around age 5–6; below that, a Soccernity profile wouldn’t correspond to anything real about the child as a grassroots player yet, regardless of what the guardian consents to. Not yet implemented in code as of this entry — AgeGateStep.tsx currently has no lower bound at all.</w:t>
+              <w:t xml:space="preserve">Resolved by the founder: Build Plan Section 8.3 step 1 says the age gate should “block signup outright below the applicable regional minimum age,” but no numeric floor was ever defined — Decision Log #8 only resolved the parental-consent threshold (full under-18 band), not an absolute rejection floor. AgeGateStep.tsx (Sprint 1, PR F3) correctly implemented only the under-18/18+ branch and flagged the missing floor as a Decision Log candidate rather than inventing one. Confirmed via research: neither UK GDPR Article 8 (parental-consent threshold of 13, already broader in Soccernity’s case per Decision Log #8) nor Nigeria’s NDPA 2023 (Decision Log #10) sets an absolute floor below which guardian-consented signup is legally prohibited — this is a product/duty-of-care decision, not a compliance gap. Resolved: signup is hard-blocked below age 5, regardless of guardian consent. Rationale: UK grassroots football’s own entry point (The FA’s youth pathway, mini-soccer, typical club intake) starts around age 5–6; below that, a Soccernity profile wouldn’t correspond to anything real about the child as a grassroots player yet, regardless of what the guardian consents to. Implemented in PR #38 (AgeGateStep.tsx: MINIMUM_SIGNUP_AGE = 5, blocking below that age regardless of guardian consent, backed by 7 passing tests including the exact-age-5 boundary case).</w:t>
             </w:r>
           </w:p>
         </w:tc>
@@ -10122,7 +10122,7 @@
                 <w:sz w:val="19"/>
                 <w:szCs w:val="19"/>
               </w:rPr>
-              <w:t xml:space="preserve">Resolved (decision: age 5 floor) — open implementation ticket: AgeGateStep.tsx has no lower bound yet</w:t>
+              <w:t xml:space="preserve">Resolved and implemented — PR #38 shipped MINIMUM_SIGNUP_AGE = 5 in AgeGateStep.tsx, backed by 7 tests</w:t>
             </w:r>
           </w:p>
         </w:tc>

</xml_diff>

<commit_message>
Adding Decision Log #20 to document the triage
Now adding Decision Log #20 to document the full triage and the Tier 2/3 deferral, so it's tracked rather than silently dropped.
Decision Log #20 (attached) — documents the full triage rationale so Tier 2/3 are tracked as deliberate, reasoned deferrals rather than things that just fell off the radar.
</commit_message>
<xml_diff>
--- a/docs/Soccernity_MVP_Build_Plan_v1.7.docx
+++ b/docs/Soccernity_MVP_Build_Plan_v1.7.docx
@@ -10123,6 +10123,108 @@
                 <w:szCs w:val="19"/>
               </w:rPr>
               <w:t xml:space="preserve">Resolved and implemented — PR #38 shipped MINIMUM_SIGNUP_AGE = 5 in AgeGateStep.tsx, backed by 7 tests</w:t>
+            </w:r>
+          </w:p>
+        </w:tc>
+      </w:tr>
+      <w:tr>
+        <w:tc>
+          <w:tcPr>
+            <w:tcW w:type="dxa" w:w="500"/>
+            <w:shd w:fill="EFF3EE" w:val="clear"/>
+            <w:tcMar>
+              <w:top w:type="dxa" w:w="90"/>
+              <w:left w:type="dxa" w:w="110"/>
+              <w:bottom w:type="dxa" w:w="90"/>
+              <w:right w:type="dxa" w:w="110"/>
+            </w:tcMar>
+            <w:vAlign w:val="center"/>
+          </w:tcPr>
+          <w:p>
+            <w:r>
+              <w:rPr>
+                <w:b w:val="false"/>
+                <w:bCs w:val="false"/>
+                <w:color w:val="1A1A1A"/>
+                <w:sz w:val="19"/>
+                <w:szCs w:val="19"/>
+              </w:rPr>
+              <w:t xml:space="preserve">20</w:t>
+            </w:r>
+          </w:p>
+        </w:tc>
+        <w:tc>
+          <w:tcPr>
+            <w:tcW w:type="dxa" w:w="4700"/>
+            <w:shd w:fill="EFF3EE" w:val="clear"/>
+            <w:tcMar>
+              <w:top w:type="dxa" w:w="90"/>
+              <w:left w:type="dxa" w:w="110"/>
+              <w:bottom w:type="dxa" w:w="90"/>
+              <w:right w:type="dxa" w:w="110"/>
+            </w:tcMar>
+            <w:vAlign w:val="center"/>
+          </w:tcPr>
+          <w:p>
+            <w:r>
+              <w:rPr>
+                <w:b w:val="false"/>
+                <w:bCs w:val="false"/>
+                <w:color w:val="1A1A1A"/>
+                <w:sz w:val="19"/>
+                <w:szCs w:val="19"/>
+              </w:rPr>
+              <w:t xml:space="preserve">Resolved by the founder: a Sprint 1 cleanup review triaged all 42 npm audit findings (3 low, 24 moderate, 14 high, 1 critical) by actual production exposure rather than raw severity labels. Three tiers: Tier 1 (react-router/react-router-dom's XSS advisory, plus dev-tooling-only transitive deps) — safe, non-breaking fixes via npm audit fix, actioned immediately. Tier 2 (multer, lodash, qs, body-parser, express, the @nestjs/* family, and react-router's separate constructor-injection advisory) — real production dependencies of services/api and apps/web, but multer and lodash are confirmed unused by any current application code (no upload endpoints exist yet; lodash is only used internally by @nestjs/config). Fixing this tier requires a coordinated NestJS 10→11 major upgrade or a React Router 6→7 major upgrade — deliberately deferred to a scoped Sprint 2 ticket rather than rushed now. Tier 3 (the 1 critical — vitest, dev-only test runner, never in production — and the ~12 react-native/metro advisories) — confirmed zero current exposure: apps/mobile has no application code yet (no src directory). Not actionable until apps/mobile has real code to protect.</w:t>
+            </w:r>
+          </w:p>
+        </w:tc>
+        <w:tc>
+          <w:tcPr>
+            <w:tcW w:type="dxa" w:w="1850"/>
+            <w:shd w:fill="EFF3EE" w:val="clear"/>
+            <w:tcMar>
+              <w:top w:type="dxa" w:w="90"/>
+              <w:left w:type="dxa" w:w="110"/>
+              <w:bottom w:type="dxa" w:w="90"/>
+              <w:right w:type="dxa" w:w="110"/>
+            </w:tcMar>
+            <w:vAlign w:val="center"/>
+          </w:tcPr>
+          <w:p>
+            <w:r>
+              <w:rPr>
+                <w:b w:val="false"/>
+                <w:bCs w:val="false"/>
+                <w:color w:val="1A1A1A"/>
+                <w:sz w:val="19"/>
+                <w:szCs w:val="19"/>
+              </w:rPr>
+              <w:t xml:space="preserve">Sprint 1 cleanup review; npm audit</w:t>
+            </w:r>
+          </w:p>
+        </w:tc>
+        <w:tc>
+          <w:tcPr>
+            <w:tcW w:type="dxa" w:w="1850"/>
+            <w:shd w:fill="EFF3EE" w:val="clear"/>
+            <w:tcMar>
+              <w:top w:type="dxa" w:w="90"/>
+              <w:left w:type="dxa" w:w="110"/>
+              <w:bottom w:type="dxa" w:w="90"/>
+              <w:right w:type="dxa" w:w="110"/>
+            </w:tcMar>
+            <w:vAlign w:val="center"/>
+          </w:tcPr>
+          <w:p>
+            <w:r>
+              <w:rPr>
+                <w:b w:val="false"/>
+                <w:bCs w:val="false"/>
+                <w:color w:val="1A1A1A"/>
+                <w:sz w:val="19"/>
+                <w:szCs w:val="19"/>
+              </w:rPr>
+              <w:t xml:space="preserve">Resolved (triaged) — Tier 1 fixed immediately; Tier 2 open, scheduled for a Sprint 2 NestJS/React-Router major-upgrade ticket; Tier 3 deferred until apps/mobile has real code</w:t>
             </w:r>
           </w:p>
         </w:tc>

</xml_diff>

<commit_message>
Updating decision logs 21 to 23
</commit_message>
<xml_diff>
--- a/docs/Soccernity_MVP_Build_Plan_v1.7.docx
+++ b/docs/Soccernity_MVP_Build_Plan_v1.7.docx
@@ -4197,20 +4197,6 @@
           <w:szCs w:val="19"/>
         </w:rPr>
         <w:t xml:space="preserve">POST   /auth/guardian-consent          — minor account guardian email + relationship</w:t>
-      </w:r>
-    </w:p>
-    <w:p>
-      <w:pPr>
-        <w:spacing w:after="40"/>
-      </w:pPr>
-      <w:r>
-        <w:rPr>
-          <w:rFonts w:ascii="Consolas" w:cs="Consolas" w:eastAsia="Consolas" w:hAnsi="Consolas"/>
-          <w:color w:val="12213A"/>
-          <w:sz w:val="19"/>
-          <w:szCs w:val="19"/>
-        </w:rPr>
-        <w:t xml:space="preserve">GET    /auth/me</w:t>
       </w:r>
     </w:p>
     <w:p>
@@ -10225,6 +10211,312 @@
                 <w:szCs w:val="19"/>
               </w:rPr>
               <w:t xml:space="preserve">Resolved (triaged) — Tier 1 fixed immediately; Tier 2 open, scheduled for a Sprint 2 NestJS/React-Router major-upgrade ticket; Tier 3 deferred until apps/mobile has real code</w:t>
+            </w:r>
+          </w:p>
+        </w:tc>
+      </w:tr>
+      <w:tr>
+        <w:tc>
+          <w:tcPr>
+            <w:tcW w:type="dxa" w:w="500"/>
+            <w:shd w:fill="EFF3EE" w:val="clear"/>
+            <w:tcMar>
+              <w:top w:type="dxa" w:w="90"/>
+              <w:left w:type="dxa" w:w="110"/>
+              <w:bottom w:type="dxa" w:w="90"/>
+              <w:right w:type="dxa" w:w="110"/>
+            </w:tcMar>
+            <w:vAlign w:val="center"/>
+          </w:tcPr>
+          <w:p>
+            <w:r>
+              <w:rPr>
+                <w:b w:val="false"/>
+                <w:bCs w:val="false"/>
+                <w:color w:val="1A1A1A"/>
+                <w:sz w:val="19"/>
+                <w:szCs w:val="19"/>
+              </w:rPr>
+              <w:t xml:space="preserve">21</w:t>
+            </w:r>
+          </w:p>
+        </w:tc>
+        <w:tc>
+          <w:tcPr>
+            <w:tcW w:type="dxa" w:w="4700"/>
+            <w:shd w:fill="EFF3EE" w:val="clear"/>
+            <w:tcMar>
+              <w:top w:type="dxa" w:w="90"/>
+              <w:left w:type="dxa" w:w="110"/>
+              <w:bottom w:type="dxa" w:w="90"/>
+              <w:right w:type="dxa" w:w="110"/>
+            </w:tcMar>
+            <w:vAlign w:val="center"/>
+          </w:tcPr>
+          <w:p>
+            <w:r>
+              <w:rPr>
+                <w:b w:val="false"/>
+                <w:bCs w:val="false"/>
+                <w:color w:val="1A1A1A"/>
+                <w:sz w:val="19"/>
+                <w:szCs w:val="19"/>
+              </w:rPr>
+              <w:t xml:space="preserve">Resolved by the founder: PR #53 (feed slice one) flagged that gating POST /posts with GuardianConsentGuard (in addition to JwtAuthGuard) was a judgment call, not a literal reading of Section 8.3 step 5 — whose own enumerated restricted-pending list ("no public profile visibility, no DMs from unverified accounts, no participation in Banter Rooms beyond read-only") doesn’t name general feed posting by name. The guard’s actual basis was Section 5.7’s separate, broader instruction to re-check consent status on every "posting" action. The same open question resurfaced identically in PR #54 (feed slice two) when POST /posts/:id/comments was also gated the same way. Resolved: the broad Section 5.7 reading stands as final, not narrowed to Section 8.3 step 5’s literal list. Section 8.3 step 5’s enumeration was written to be illustrative of restricted-pending’s spirit, not an exhaustive ceiling on what counts as content creation — and given safeguarding is this platform’s core differentiator (Log Book Section 24.5), the more conservative reading is the correct default absent a specific reason to narrow it. No code change required — GuardianConsentGuard’s placement on both POST /posts and POST /posts/:id/comments is already correct as built; this entry closes the open Decision Log candidate flagged in feed/README.md and CLAUDE.md by making the status quo the documented standard. Future content-creation endpoints (Banter Room posts in Sprint 3, Community Group posts, etc.) should default to this same broad reading unless a specific reason exists to diverge — that would be a new decision, not an extension of this one.</w:t>
+            </w:r>
+          </w:p>
+        </w:tc>
+        <w:tc>
+          <w:tcPr>
+            <w:tcW w:type="dxa" w:w="1850"/>
+            <w:shd w:fill="EFF3EE" w:val="clear"/>
+            <w:tcMar>
+              <w:top w:type="dxa" w:w="90"/>
+              <w:left w:type="dxa" w:w="110"/>
+              <w:bottom w:type="dxa" w:w="90"/>
+              <w:right w:type="dxa" w:w="110"/>
+            </w:tcMar>
+            <w:vAlign w:val="center"/>
+          </w:tcPr>
+          <w:p>
+            <w:r>
+              <w:rPr>
+                <w:b w:val="false"/>
+                <w:bCs w:val="false"/>
+                <w:color w:val="1A1A1A"/>
+                <w:sz w:val="19"/>
+                <w:szCs w:val="19"/>
+              </w:rPr>
+              <w:t xml:space="preserve">feed/README.md (PR #53, PR #54); CLAUDE.md</w:t>
+            </w:r>
+          </w:p>
+        </w:tc>
+        <w:tc>
+          <w:tcPr>
+            <w:tcW w:type="dxa" w:w="1850"/>
+            <w:shd w:fill="EFF3EE" w:val="clear"/>
+            <w:tcMar>
+              <w:top w:type="dxa" w:w="90"/>
+              <w:left w:type="dxa" w:w="110"/>
+              <w:bottom w:type="dxa" w:w="90"/>
+              <w:right w:type="dxa" w:w="110"/>
+            </w:tcMar>
+            <w:vAlign w:val="center"/>
+          </w:tcPr>
+          <w:p>
+            <w:r>
+              <w:rPr>
+                <w:b w:val="false"/>
+                <w:bCs w:val="false"/>
+                <w:color w:val="1A1A1A"/>
+                <w:sz w:val="19"/>
+                <w:szCs w:val="19"/>
+              </w:rPr>
+              <w:t xml:space="preserve">Resolved — GuardianConsentGuard’s current broad scope is final, no code change</w:t>
+            </w:r>
+          </w:p>
+        </w:tc>
+      </w:tr>
+      <w:tr>
+        <w:tc>
+          <w:tcPr>
+            <w:tcW w:type="dxa" w:w="500"/>
+            <w:shd w:fill="EFF3EE" w:val="clear"/>
+            <w:tcMar>
+              <w:top w:type="dxa" w:w="90"/>
+              <w:left w:type="dxa" w:w="110"/>
+              <w:bottom w:type="dxa" w:w="90"/>
+              <w:right w:type="dxa" w:w="110"/>
+            </w:tcMar>
+            <w:vAlign w:val="center"/>
+          </w:tcPr>
+          <w:p>
+            <w:r>
+              <w:rPr>
+                <w:b w:val="false"/>
+                <w:bCs w:val="false"/>
+                <w:color w:val="1A1A1A"/>
+                <w:sz w:val="19"/>
+                <w:szCs w:val="19"/>
+              </w:rPr>
+              <w:t xml:space="preserve">22</w:t>
+            </w:r>
+          </w:p>
+        </w:tc>
+        <w:tc>
+          <w:tcPr>
+            <w:tcW w:type="dxa" w:w="4700"/>
+            <w:shd w:fill="EFF3EE" w:val="clear"/>
+            <w:tcMar>
+              <w:top w:type="dxa" w:w="90"/>
+              <w:left w:type="dxa" w:w="110"/>
+              <w:bottom w:type="dxa" w:w="90"/>
+              <w:right w:type="dxa" w:w="110"/>
+            </w:tcMar>
+            <w:vAlign w:val="center"/>
+          </w:tcPr>
+          <w:p>
+            <w:r>
+              <w:rPr>
+                <w:b w:val="false"/>
+                <w:bCs w:val="false"/>
+                <w:color w:val="1A1A1A"/>
+                <w:sz w:val="19"/>
+                <w:szCs w:val="19"/>
+              </w:rPr>
+              <w:t xml:space="preserve">Resolved by the founder: PR #54 (feed slice two) flagged that GET /users/:id/saved-posts defaulting to self-only/403-on-mismatch was a conservative guess, since Section 4.3 never states whether a user’s saved posts are private or publicly viewable — the same kind of spec silence Decision Log #15 already resolved to self-only for GET/PATCH /users/:id. Resolved: saved posts stay private, self-only. A saved-posts list functions as a personal bookmark/reading list, not public activity in the way a post, like, or follow is — exposing it would reveal a user’s browsing and interest signals with no corresponding product benefit to making that list visible to others. No code change required — the existing self-only implementation is already correct; this entry closes the open flag by making the status quo the documented standard, consistent with the reasoning Decision Log #15 already applied to profile visibility.</w:t>
+            </w:r>
+          </w:p>
+        </w:tc>
+        <w:tc>
+          <w:tcPr>
+            <w:tcW w:type="dxa" w:w="1850"/>
+            <w:shd w:fill="EFF3EE" w:val="clear"/>
+            <w:tcMar>
+              <w:top w:type="dxa" w:w="90"/>
+              <w:left w:type="dxa" w:w="110"/>
+              <w:bottom w:type="dxa" w:w="90"/>
+              <w:right w:type="dxa" w:w="110"/>
+            </w:tcMar>
+            <w:vAlign w:val="center"/>
+          </w:tcPr>
+          <w:p>
+            <w:r>
+              <w:rPr>
+                <w:b w:val="false"/>
+                <w:bCs w:val="false"/>
+                <w:color w:val="1A1A1A"/>
+                <w:sz w:val="19"/>
+                <w:szCs w:val="19"/>
+              </w:rPr>
+              <w:t xml:space="preserve">feed/README.md (PR #54); CLAUDE.md</w:t>
+            </w:r>
+          </w:p>
+        </w:tc>
+        <w:tc>
+          <w:tcPr>
+            <w:tcW w:type="dxa" w:w="1850"/>
+            <w:shd w:fill="EFF3EE" w:val="clear"/>
+            <w:tcMar>
+              <w:top w:type="dxa" w:w="90"/>
+              <w:left w:type="dxa" w:w="110"/>
+              <w:bottom w:type="dxa" w:w="90"/>
+              <w:right w:type="dxa" w:w="110"/>
+            </w:tcMar>
+            <w:vAlign w:val="center"/>
+          </w:tcPr>
+          <w:p>
+            <w:r>
+              <w:rPr>
+                <w:b w:val="false"/>
+                <w:bCs w:val="false"/>
+                <w:color w:val="1A1A1A"/>
+                <w:sz w:val="19"/>
+                <w:szCs w:val="19"/>
+              </w:rPr>
+              <w:t xml:space="preserve">Resolved — saved posts remain self-only/private, no code change</w:t>
+            </w:r>
+          </w:p>
+        </w:tc>
+      </w:tr>
+      <w:tr>
+        <w:tc>
+          <w:tcPr>
+            <w:tcW w:type="dxa" w:w="500"/>
+            <w:shd w:fill="EFF3EE" w:val="clear"/>
+            <w:tcMar>
+              <w:top w:type="dxa" w:w="90"/>
+              <w:left w:type="dxa" w:w="110"/>
+              <w:bottom w:type="dxa" w:w="90"/>
+              <w:right w:type="dxa" w:w="110"/>
+            </w:tcMar>
+            <w:vAlign w:val="center"/>
+          </w:tcPr>
+          <w:p>
+            <w:r>
+              <w:rPr>
+                <w:b w:val="false"/>
+                <w:bCs w:val="false"/>
+                <w:color w:val="1A1A1A"/>
+                <w:sz w:val="19"/>
+                <w:szCs w:val="19"/>
+              </w:rPr>
+              <w:t xml:space="preserve">23</w:t>
+            </w:r>
+          </w:p>
+        </w:tc>
+        <w:tc>
+          <w:tcPr>
+            <w:tcW w:type="dxa" w:w="4700"/>
+            <w:shd w:fill="EFF3EE" w:val="clear"/>
+            <w:tcMar>
+              <w:top w:type="dxa" w:w="90"/>
+              <w:left w:type="dxa" w:w="110"/>
+              <w:bottom w:type="dxa" w:w="90"/>
+              <w:right w:type="dxa" w:w="110"/>
+            </w:tcMar>
+            <w:vAlign w:val="center"/>
+          </w:tcPr>
+          <w:p>
+            <w:r>
+              <w:rPr>
+                <w:b w:val="false"/>
+                <w:bCs w:val="false"/>
+                <w:color w:val="1A1A1A"/>
+                <w:sz w:val="19"/>
+                <w:szCs w:val="19"/>
+              </w:rPr>
+              <w:t xml:space="preserve">Resolved by the founder: Section 4.1’s API Contract Sketch lists GET /auth/me, but it was never built across Sprint 1 or Sprint 2 — every reference to it in auth/README.md, users/README.md, and users.controller.ts’s own header comment is a note that it’s a separate, unbuilt endpoint. PR #59 (the e2e test infrastructure work) surfaced this directly: its auth e2e spec’s brief called for a register -&gt; login -&gt; GET /auth/me round trip, and confirmed by grep across the entire codebase that no such route exists anywhere, substituting GET /users/:id (Section 4.2, self-scoped, genuinely built) for the equivalent real verification. Resolved: GET /auth/me is formally dropped from the spec, not deferred as still-pending. GET /users/:id already satisfies "fetch my own profile" with a fresh-JWT self-check — the identical precedent Decision Log #15 already established when it rejected adding a separate /users/me alias for the same reason (pure surface-area growth with no functional benefit over the existing :id-scoped route). Section 4.1’s API Contract Sketch (Section 4) has had its GET /auth/me line removed in this revision to match this resolution — no backend code change was needed, since nothing currently implements or depends on that route existing.</w:t>
+            </w:r>
+          </w:p>
+        </w:tc>
+        <w:tc>
+          <w:tcPr>
+            <w:tcW w:type="dxa" w:w="1850"/>
+            <w:shd w:fill="EFF3EE" w:val="clear"/>
+            <w:tcMar>
+              <w:top w:type="dxa" w:w="90"/>
+              <w:left w:type="dxa" w:w="110"/>
+              <w:bottom w:type="dxa" w:w="90"/>
+              <w:right w:type="dxa" w:w="110"/>
+            </w:tcMar>
+            <w:vAlign w:val="center"/>
+          </w:tcPr>
+          <w:p>
+            <w:r>
+              <w:rPr>
+                <w:b w:val="false"/>
+                <w:bCs w:val="false"/>
+                <w:color w:val="1A1A1A"/>
+                <w:sz w:val="19"/>
+                <w:szCs w:val="19"/>
+              </w:rPr>
+              <w:t xml:space="preserve">Section 4.1; PR #59 (test/auth.e2e-spec.ts, test/README.md); Decision Log #15</w:t>
+            </w:r>
+          </w:p>
+        </w:tc>
+        <w:tc>
+          <w:tcPr>
+            <w:tcW w:type="dxa" w:w="1850"/>
+            <w:shd w:fill="EFF3EE" w:val="clear"/>
+            <w:tcMar>
+              <w:top w:type="dxa" w:w="90"/>
+              <w:left w:type="dxa" w:w="110"/>
+              <w:bottom w:type="dxa" w:w="90"/>
+              <w:right w:type="dxa" w:w="110"/>
+            </w:tcMar>
+            <w:vAlign w:val="center"/>
+          </w:tcPr>
+          <w:p>
+            <w:r>
+              <w:rPr>
+                <w:b w:val="false"/>
+                <w:bCs w:val="false"/>
+                <w:color w:val="1A1A1A"/>
+                <w:sz w:val="19"/>
+                <w:szCs w:val="19"/>
+              </w:rPr>
+              <w:t xml:space="preserve">Resolved — GET /auth/me dropped from spec, Section 4.1 updated to match, no code change</w:t>
             </w:r>
           </w:p>
         </w:tc>

</xml_diff>

<commit_message>
Updating the backlogs of decision logs
Redone against the actual GitHub file this time, not the stale one. Decision Log now runs #1–33, sequential, no gaps:

#1–25 — exactly as they already existed in your real file, byte-for-byte untouched.
#26–28 (hosting, React 19, Router 7→8) — newly added, since this file didn't have them yet.
#29–33 — the five new ratifications from this round, #31 carrying the private-account follow-up note as flagged-not-scheduled.
</commit_message>
<xml_diff>
--- a/docs/Soccernity_MVP_Build_Plan_v1.7.docx
+++ b/docs/Soccernity_MVP_Build_Plan_v1.7.docx
@@ -10661,6 +10661,342 @@
           <w:p>
             <w:r>
               <w:t>Resolved (interim) — React Router 7 (7.18.2) shipped, React 18 compatibility confirmed; React Router 8 remains a tracked follow-up blocked on a separate React 19 upgrade</w:t>
+            </w:r>
+          </w:p>
+        </w:tc>
+      </w:tr>
+      <w:tr>
+        <w:tc>
+          <w:tcPr>
+            <w:tcW w:type="dxa" w:w="500"/>
+          </w:tcPr>
+          <w:p>
+            <w:r>
+              <w:t>26</w:t>
+            </w:r>
+          </w:p>
+        </w:tc>
+        <w:tc>
+          <w:tcPr>
+            <w:tcW w:type="dxa" w:w="4700"/>
+          </w:tcPr>
+          <w:p>
+            <w:r>
+              <w:t>Resolved by the founder: hosting is Render (API) + Neon (Postgres) + Upstash (Redis), unbundled rather than a single all-in-one platform — resolving Decision Log #9. Chosen for cost alignment with a pre-launch MVP's near-zero traffic: Neon and Upstash both have genuinely permanent free tiers that scale to zero, and Render's $7/month Starter tier (production only, not staging) avoids cold-start delay specifically on safety-critical flows like the guardian-consent email link (Build Plan Section 8.3). This was also chosen to avoid a specific reliability concern with Railway for Node.js/Prisma/Postgres production workloads — that specific concern was given by the founder, not independently verified or sourced by the implementing agent, and should not be read as an independently confirmed citation. sprint-2/deployment-setup then prepared services/api for this stack: schema.prisma's datasource block gained a directUrl field (pooled DATABASE_URL via Neon's PgBouncer for runtime, unpooled DIRECT_URL for prisma migrate deploy/dev, since PgBouncer's transaction-pooling mode can interfere with Prisma Migrate's advisory locks/prepared statements); a render.yaml Blueprint defines staging and production web services; ci.yml gained one additive DIRECT_URL line after reproducing a real P1012 failure without it. Configuration and documentation only — no application code changed, and live deployment is entirely unverified pending real Neon/Upstash/Render accounts.</w:t>
+            </w:r>
+          </w:p>
+        </w:tc>
+        <w:tc>
+          <w:tcPr>
+            <w:tcW w:type="dxa" w:w="1850"/>
+          </w:tcPr>
+          <w:p>
+            <w:r>
+              <w:t>sprint-2/deployment-setup; docs/deployment.md; Decision Log #9</w:t>
+            </w:r>
+          </w:p>
+        </w:tc>
+        <w:tc>
+          <w:tcPr>
+            <w:tcW w:type="dxa" w:w="2300"/>
+          </w:tcPr>
+          <w:p>
+            <w:r>
+              <w:t>Resolved (platform chosen, config prepared) — open action: real Neon/Upstash/Render accounts still needed before any live deploy</w:t>
+            </w:r>
+          </w:p>
+        </w:tc>
+      </w:tr>
+      <w:tr>
+        <w:tc>
+          <w:tcPr>
+            <w:tcW w:type="dxa" w:w="500"/>
+          </w:tcPr>
+          <w:p>
+            <w:r>
+              <w:t>27</w:t>
+            </w:r>
+          </w:p>
+        </w:tc>
+        <w:tc>
+          <w:tcPr>
+            <w:tcW w:type="dxa" w:w="4700"/>
+          </w:tcPr>
+          <w:p>
+            <w:r>
+              <w:t>Resolved by the founder: apps/web is upgraded from React 18 to React 19 (19.2.8), closing the blocker Decision Log #25 recorded against React Router 8. apps/admin is untouched — stays on React 18 and React Router 6, the same leave-it-alone treatment it got during the Router 6→7 migration. Re-confirmed this was a low-risk version bump, not a rewrite: a grep across apps/web/src for every React 19 removed/breaking legacy API found zero matches, and the official react-19-migration-recipe codemod was actually run non-interactively and modified 0 of 169 files. Version bumps: react/react-dom ^18.2.0 → ^19.2.8, @types/react → ^19.2.18, @types/react-dom → ^19.2.4, @testing-library/react → ^16.3.2 (the first major with real React 19 support), plus a new devDependency @testing-library/dom ^10.4.1. A full clean reinstall surfaced a real, confirmed regression, not just a version bump: npm's own hoisting resolved react-router/@testing-library/react's internal React peer to the root-hoisted React 18.3.1 (from apps/admin/apps/mobile) instead of apps/web's own nested React 19.2.8 — two live React copies in one app, reproduced as a real test failure (the textbook "Objects are not valid as a React child" symptom). Fixed via scoped npm overrides keyed to the @soccernity/web workspace only; verified apps/admin's entire tree stays fully deduped to React 18.3.1, untouched. Verified: apps/web vitest suite 1 suite / 7 tests, 0 failures; npx tsc --noEmit clean under the stricter @types/react v19 types; npm run build clean; &lt;React.StrictMode&gt; re-checked for new double-invocation warnings, none found; all 14 real routes smoke-tested (a temporary Vitest spec, deleted before commit, mounting the real route tree — all 14 rendered clean with zero console.error/console.warn); the dev server was actually started and real pages actually requested via curl, all returning clean HTTP 200s. This unblocks Decision Log #25's own React Router 8 follow-up — react-router versions were deliberately left untouched here, out of scope by design.</w:t>
+            </w:r>
+          </w:p>
+        </w:tc>
+        <w:tc>
+          <w:tcPr>
+            <w:tcW w:type="dxa" w:w="1850"/>
+          </w:tcPr>
+          <w:p>
+            <w:r>
+              <w:t>sprint-2/react-19-upgrade; Decision Log #25</w:t>
+            </w:r>
+          </w:p>
+        </w:tc>
+        <w:tc>
+          <w:tcPr>
+            <w:tcW w:type="dxa" w:w="2300"/>
+          </w:tcPr>
+          <w:p>
+            <w:r>
+              <w:t>Resolved and implemented — React 19 (19.2.8) shipped, a real hoisting regression found and fixed via scoped overrides, React Router 8's blocker now cleared</w:t>
+            </w:r>
+          </w:p>
+        </w:tc>
+      </w:tr>
+      <w:tr>
+        <w:tc>
+          <w:tcPr>
+            <w:tcW w:type="dxa" w:w="500"/>
+          </w:tcPr>
+          <w:p>
+            <w:r>
+              <w:t>28</w:t>
+            </w:r>
+          </w:p>
+        </w:tc>
+        <w:tc>
+          <w:tcPr>
+            <w:tcW w:type="dxa" w:w="4700"/>
+          </w:tcPr>
+          <w:p>
+            <w:r>
+              <w:t>Resolved by the founder: apps/web is upgraded from React Router 7 (7.18.2) to React Router 8 (8.3.0), closing Decision Log #25's originally-recorded blocker now that Decision Log #27 (React 19) has landed. apps/admin is untouched — stays on react-router-dom ^6.22.0/React 18, confirmed by a clean git diff scoped to apps/admin/. What the real v7→v8 changelog actually required was read directly from the upstream CHANGELOG.md, not assumed from the version number alone: the headline baseline-support bump is Node 22.22.0+ (previously 20.0.0+), React 19.2.7+ (already satisfied by Decision Log #27), and Vite 7+; the package is now published ESM-only, fully removing react-router-dom (not just deprecating it) and removing every future.v8_* flag now that they're default-on. A grep found zero real code matches for any changed/removed API — router.tsx's own createBrowserRouter/RouterProvider usage never opted into any future flag, so v8's flag removal needed no code changes; the only touch was a comment update. The mandatory hoisting check (per Decision Log #27's own precedent that this exact kind of upgrade can silently regress) confirmed apps/web cleanly resolves to react-router@8.3.0/React 19.2.8 and apps/admin cleanly resolves to react-router-dom@6.30.6/React 18 fully deduped — Decision Log #27's existing scoped override already covered this, so no new override was needed. One real, flagged risk was caught and folded into this same PR rather than left as a silent gap: react-router@8.3.0 declares engines.node &gt;=22.22.0, but the root package.json still declared &gt;=20 and ci.yml still pinned Node 20 — meaning CI had never actually proven green on the floor this package requires. Two fix-up commits bumped the root engines.node and ci.yml's node-version to 22.22.0 and confirmed the real GitHub Actions run completed with conclusion: success on that floor, not just that the YAML was edited. A full repo sweep for any other Node-version references (deploy.yml, render.yaml, every workspace package.json, .nvmrc, Dockerfile) found nothing else inconsistent. Verified: vitest 7/7 passing, npx tsc --noEmit clean, npm run build clean, a manual dev-server smoke test against all 14 real routes returning clean HTTP 200s with zero console errors/warnings.</w:t>
+            </w:r>
+          </w:p>
+        </w:tc>
+        <w:tc>
+          <w:tcPr>
+            <w:tcW w:type="dxa" w:w="1850"/>
+          </w:tcPr>
+          <w:p>
+            <w:r>
+              <w:t>sprint-2/react-router-8-upgrade; Decision Log #25, #27</w:t>
+            </w:r>
+          </w:p>
+        </w:tc>
+        <w:tc>
+          <w:tcPr>
+            <w:tcW w:type="dxa" w:w="2300"/>
+          </w:tcPr>
+          <w:p>
+            <w:r>
+              <w:t>Resolved and implemented — React Router 8 (8.3.0) shipped; Decision Log #25's original blocker fully closed; repo Node floor honestly bumped to &gt;=22.22.0 with CI proven green on it</w:t>
+            </w:r>
+          </w:p>
+        </w:tc>
+      </w:tr>
+      <w:tr>
+        <w:tc>
+          <w:tcPr>
+            <w:tcW w:type="dxa" w:w="500"/>
+          </w:tcPr>
+          <w:p>
+            <w:r>
+              <w:t>29</w:t>
+            </w:r>
+          </w:p>
+        </w:tc>
+        <w:tc>
+          <w:tcPr>
+            <w:tcW w:type="dxa" w:w="4700"/>
+          </w:tcPr>
+          <w:p>
+            <w:r>
+              <w:t>Resolved by the founder: Section 8.3 step 5's restricted-pending list enumerates three specific restrictions, but doesn't literally name every content-creation action a minor might take — feed/README.md flagged this as unresolved tension against Section 5.7's broader "posting" language for both POST /posts (Sprint 2 slice one, PR #53) and POST /posts/:id/comments (slice two, PR #54). Resolved: Section 5.7's broader language controls. Both endpoints correctly stay GuardianConsentGuard-gated (JwtAuthGuard alone is not sufficient) — a post and a comment are both genuine, other-visible user-generated content, materially closer to "posting" in Section 5.7's sense than liking, saving, or following are (none of which produce visible content of their own). This resolution governs any future content-creation endpoint the same way, including Banter Room posts in Sprint 3 — whoever builds those should not re-litigate this question, just apply it.</w:t>
+            </w:r>
+          </w:p>
+        </w:tc>
+        <w:tc>
+          <w:tcPr>
+            <w:tcW w:type="dxa" w:w="1850"/>
+          </w:tcPr>
+          <w:p>
+            <w:r>
+              <w:t>feed/README.md (points 1 and 4); PR #53, #54; Build Plan Section 8.3, 5.7</w:t>
+            </w:r>
+          </w:p>
+        </w:tc>
+        <w:tc>
+          <w:tcPr>
+            <w:tcW w:type="dxa" w:w="2300"/>
+          </w:tcPr>
+          <w:p>
+            <w:r>
+              <w:t>Resolved — GuardianConsentGuard stays required on all content-creation endpoints (posts, comments, and future equivalents); current implementation confirmed correct, no code change needed</w:t>
+            </w:r>
+          </w:p>
+        </w:tc>
+      </w:tr>
+      <w:tr>
+        <w:tc>
+          <w:tcPr>
+            <w:tcW w:type="dxa" w:w="500"/>
+          </w:tcPr>
+          <w:p>
+            <w:r>
+              <w:t>30</w:t>
+            </w:r>
+          </w:p>
+        </w:tc>
+        <w:tc>
+          <w:tcPr>
+            <w:tcW w:type="dxa" w:w="4700"/>
+          </w:tcPr>
+          <w:p>
+            <w:r>
+              <w:t>Resolved by the founder: Section 4.3 doesn't say whether GET /users/:id/saved-posts is self-only or publicly viewable. PR #54 defaulted to the conservative reading — self-only, 403 on mismatch, the same precedent users/README.md already established for GET/PATCH /users/:id — and flagged it as an open Decision Log candidate rather than letting the conservative default calcify into permanent behaviour by omission. Resolved: self-only stands as the permanent behaviour, not just an interim default. "Saved" plausibly implies a private bookmark list, and no product signal argues the other way the way it did for followers/following (Decision Log #31).</w:t>
+            </w:r>
+          </w:p>
+        </w:tc>
+        <w:tc>
+          <w:tcPr>
+            <w:tcW w:type="dxa" w:w="1850"/>
+          </w:tcPr>
+          <w:p>
+            <w:r>
+              <w:t>feed/README.md (point 8); PR #54</w:t>
+            </w:r>
+          </w:p>
+        </w:tc>
+        <w:tc>
+          <w:tcPr>
+            <w:tcW w:type="dxa" w:w="2300"/>
+          </w:tcPr>
+          <w:p>
+            <w:r>
+              <w:t>Resolved — GET /users/:id/saved-posts stays self-only/403-on-mismatch; current implementation confirmed correct, no code change needed</w:t>
+            </w:r>
+          </w:p>
+        </w:tc>
+      </w:tr>
+      <w:tr>
+        <w:tc>
+          <w:tcPr>
+            <w:tcW w:type="dxa" w:w="500"/>
+          </w:tcPr>
+          <w:p>
+            <w:r>
+              <w:t>31</w:t>
+            </w:r>
+          </w:p>
+        </w:tc>
+        <w:tc>
+          <w:tcPr>
+            <w:tcW w:type="dxa" w:w="4700"/>
+          </w:tcPr>
+          <w:p>
+            <w:r>
+              <w:t>Resolved by the founder: Section 4.2 is silent on whether GET /users/:id/followers and GET /users/:id/following are self-scoped or public — the identical kind of spec silence Decision Log #30 (saved-posts) faced. PR #56 reached the opposite default from saved-posts: public, not self-scoped, because followers/following lists are standard, publicly visible social graph data on essentially every mainstream platform this product is modelled after, and neither Section 8.3 step 5 nor Section 5.7 names follower/following visibility as something to restrict. Resolved: public stands as the permanent behaviour. Founder note: if Soccernity ever wants a "private account" feature (a real, common pattern on the exact platforms this default is modelled after), this decision would need to be revisited then — no such feature exists in schema.prisma or anywhere else in the codebase today, and none is scoped into any current or upcoming sprint. Flagged here explicitly so it isn't rediscovered as a surprise gap later; not an action item for now.</w:t>
+            </w:r>
+          </w:p>
+        </w:tc>
+        <w:tc>
+          <w:tcPr>
+            <w:tcW w:type="dxa" w:w="1850"/>
+          </w:tcPr>
+          <w:p>
+            <w:r>
+              <w:t>users/README.md (point 2); PR #56</w:t>
+            </w:r>
+          </w:p>
+        </w:tc>
+        <w:tc>
+          <w:tcPr>
+            <w:tcW w:type="dxa" w:w="2300"/>
+          </w:tcPr>
+          <w:p>
+            <w:r>
+              <w:t>Resolved — GET /users/:id/followers and /following stay public, not self-scoped; current implementation confirmed correct. Follow-up flagged, not scheduled: a future "private account" feature would need to revisit this decision — none exists today</w:t>
+            </w:r>
+          </w:p>
+        </w:tc>
+      </w:tr>
+      <w:tr>
+        <w:tc>
+          <w:tcPr>
+            <w:tcW w:type="dxa" w:w="500"/>
+          </w:tcPr>
+          <w:p>
+            <w:r>
+              <w:t>32</w:t>
+            </w:r>
+          </w:p>
+        </w:tc>
+        <w:tc>
+          <w:tcPr>
+            <w:tcW w:type="dxa" w:w="4700"/>
+          </w:tcPr>
+          <w:p>
+            <w:r>
+              <w:t>Resolved by the founder: schema.prisma's own comment on Post.commentCount flagged, since PR #54, that whoever eventually adds comment deletion must add the matching decrement — a genuine addition beyond Section 4.3's originally-written nine-endpoint list, not a literal spec line item. PR #69 built DELETE /posts/:id/comments/:commentId, closing that gap: comment-author-or-post-author authorization (no moderator role exists yet in this codebase's guards), JwtAuthGuard only (removing content produces no new visible content, unlike creating it), and — a deliberate departure from every other DELETE in this module — genuinely not idempotent, since a Comment has its own single-row primary-key identity (a second delete of the same commentId is a real 404, proven by an explicit delete-twice test at both the mocked-unit and real-Postgres layers). Resolved: Section 4.3's own written endpoint list should be updated to explicitly include this endpoint, so the spec document matches what has shipped — a documentation-sync action, not a product decision.</w:t>
+            </w:r>
+          </w:p>
+        </w:tc>
+        <w:tc>
+          <w:tcPr>
+            <w:tcW w:type="dxa" w:w="1850"/>
+          </w:tcPr>
+          <w:p>
+            <w:r>
+              <w:t>feed/README.md; schema.prisma (Post.commentCount comment); PR #54, #69</w:t>
+            </w:r>
+          </w:p>
+        </w:tc>
+        <w:tc>
+          <w:tcPr>
+            <w:tcW w:type="dxa" w:w="2300"/>
+          </w:tcPr>
+          <w:p>
+            <w:r>
+              <w:t>Resolved and implemented — DELETE /posts/:id/comments/:commentId shipped; Section 4.3's endpoint list to be updated to match (doc-sync only)</w:t>
+            </w:r>
+          </w:p>
+        </w:tc>
+      </w:tr>
+      <w:tr>
+        <w:tc>
+          <w:tcPr>
+            <w:tcW w:type="dxa" w:w="500"/>
+          </w:tcPr>
+          <w:p>
+            <w:r>
+              <w:t>33</w:t>
+            </w:r>
+          </w:p>
+        </w:tc>
+        <w:tc>
+          <w:tcPr>
+            <w:tcW w:type="dxa" w:w="4700"/>
+          </w:tcPr>
+          <w:p>
+            <w:r>
+              <w:t>Resolved by the founder: building club fan pages (PR #58) required two new Prisma relations beyond Section 3's literal field list — User.clubMemberships and ClubPage.affiliatedPlayers — flagged as a Decision Log candidate since CLAUDE.md's own "the data model is a fixed spec" non-negotiable makes any schema addition worth confirming explicitly, not assuming. Confirmed: unlike Follow.createdAt or Like/SavedPost's own precedent (genuine new business data needed for pagination), these two relations carry no new information on their own — they're the unavoidable mechanical cost of Prisma correctly modelling two distinct relations that already existed in Section 3's intent (User.clubAffiliationId, and ClubPage's member list) but were accidentally merged into one relation by omission. Resolved: the migration and its reasoning are confirmed correct as implemented, no schema change needed.</w:t>
+            </w:r>
+          </w:p>
+        </w:tc>
+        <w:tc>
+          <w:tcPr>
+            <w:tcW w:type="dxa" w:w="1850"/>
+          </w:tcPr>
+          <w:p>
+            <w:r>
+              <w:t>clubs/README.md; schema.prisma; PR #58</w:t>
+            </w:r>
+          </w:p>
+        </w:tc>
+        <w:tc>
+          <w:tcPr>
+            <w:tcW w:type="dxa" w:w="2300"/>
+          </w:tcPr>
+          <w:p>
+            <w:r>
+              <w:t>Resolved — clubMemberships/affiliatedPlayers relations confirmed correct as implemented, no code or schema change needed</w:t>
             </w:r>
           </w:p>
         </w:tc>

</xml_diff>

<commit_message>
Added the resolve for F5, F6, F7 and Club Picker
</commit_message>
<xml_diff>
--- a/docs/Soccernity_MVP_Build_Plan_v1.7.docx
+++ b/docs/Soccernity_MVP_Build_Plan_v1.7.docx
@@ -10997,6 +10997,300 @@
           <w:p>
             <w:r>
               <w:t>Resolved — clubMemberships/affiliatedPlayers relations confirmed correct as implemented, no code or schema change needed</w:t>
+            </w:r>
+          </w:p>
+        </w:tc>
+      </w:tr>
+      <w:tr>
+        <w:tc>
+          <w:tcPr>
+            <w:tcW w:type="dxa" w:w="500"/>
+          </w:tcPr>
+          <w:p>
+            <w:r>
+              <w:t>34</w:t>
+            </w:r>
+          </w:p>
+        </w:tc>
+        <w:tc>
+          <w:tcPr>
+            <w:tcW w:type="dxa" w:w="4700"/>
+          </w:tcPr>
+          <w:p>
+            <w:r>
+              <w:t>PR #79 (sprint-1/f5-f6-real-screens) found the pre-existing /guardian-consent route conflated two structurally different audiences — an unauthenticated guardian confirming via an emailed token, and the authenticated minor checking their own status. Resolved by splitting into /guardian-consent (unchanged path, minor's own authenticated status view, GET /auth/guardian-consent/status) and a new /guardian-consent/confirm (public/unauthenticated, POST /auth/guardian-consent, reached via the emailed token link) — mirroring the backend's own status/confirm split exactly. Two Figma-vs-spec gaps flagged rather than silently resolved: (a) the confirm screen's Figma frame shows a personalized “Request Summary” panel needing a GET-by-consent-token lookup endpoint that doesn't exist in Section 4.1 — omitted, not fabricated; (b) the frame's “I do not consent” button has no matching backend decline/reject endpoint — modeled as take-no-action with an explicit acknowledgement message, not a silent no-op.</w:t>
+            </w:r>
+          </w:p>
+        </w:tc>
+        <w:tc>
+          <w:tcPr>
+            <w:tcW w:type="dxa" w:w="1850"/>
+          </w:tcPr>
+          <w:p>
+            <w:r>
+              <w:t>PR #79; GuardianConsentPage.tsx; GuardianConsentConfirmPage.tsx</w:t>
+            </w:r>
+          </w:p>
+        </w:tc>
+        <w:tc>
+          <w:tcPr>
+            <w:tcW w:type="dxa" w:w="2300"/>
+          </w:tcPr>
+          <w:p>
+            <w:r>
+              <w:t>Implemented as described (route split; both gaps flagged in code comments) — pending founder confirmation, particularly whether a consent-token lookup endpoint and a decline endpoint should be built</w:t>
+            </w:r>
+          </w:p>
+        </w:tc>
+      </w:tr>
+      <w:tr>
+        <w:tc>
+          <w:tcPr>
+            <w:tcW w:type="dxa" w:w="500"/>
+          </w:tcPr>
+          <w:p>
+            <w:r>
+              <w:t>35</w:t>
+            </w:r>
+          </w:p>
+        </w:tc>
+        <w:tc>
+          <w:tcPr>
+            <w:tcW w:type="dxa" w:w="4700"/>
+          </w:tcPr>
+          <w:p>
+            <w:r>
+              <w:t>PR #79 built ProfilePage's edit flow against PATCH /users/:id's actual accepted fields only. `phone` was added as a real functional field even though the Figma “Edit Profile” frame doesn't include it — flagged rather than silently added. Bio, Location, Preferred Club, and Date of Birth are rendered visibly but disabled: Bio/Location have no column on User at all; Date of Birth is deliberately excluded server-side (could flip isMinor); Preferred Club's clubAffiliationId exists on the schema but no endpoint writes it (club membership goes through ClubPage.members / POST /clubs/:id/join instead). “Manage Account” (change password, forgotten password, deactivate, delete) has no Figma screen anywhere in the file — built plain, same precedent ClubPickerStep.tsx already established. Delete's success copy deliberately says “your request has been received… processed for deletion,” matching POST /auth/delete-account's real pending_deletion behavior, not instant/permanent deletion.</w:t>
+            </w:r>
+          </w:p>
+        </w:tc>
+        <w:tc>
+          <w:tcPr>
+            <w:tcW w:type="dxa" w:w="1850"/>
+          </w:tcPr>
+          <w:p>
+            <w:r>
+              <w:t>PR #79; ProfilePage.tsx</w:t>
+            </w:r>
+          </w:p>
+        </w:tc>
+        <w:tc>
+          <w:tcPr>
+            <w:tcW w:type="dxa" w:w="2300"/>
+          </w:tcPr>
+          <w:p>
+            <w:r>
+              <w:t>Implemented as described — phone field addition and all four disabled fields flagged in code comments; pending founder confirmation on whether Bio/Location/Preferred-Club-write/DOB-edit should get real backend fields in a future sprint</w:t>
+            </w:r>
+          </w:p>
+        </w:tc>
+      </w:tr>
+      <w:tr>
+        <w:tc>
+          <w:tcPr>
+            <w:tcW w:type="dxa" w:w="500"/>
+          </w:tcPr>
+          <w:p>
+            <w:r>
+              <w:t>36</w:t>
+            </w:r>
+          </w:p>
+        </w:tc>
+        <w:tc>
+          <w:tcPr>
+            <w:tcW w:type="dxa" w:w="4700"/>
+          </w:tcPr>
+          <w:p>
+            <w:r>
+              <w:t>PR #82 (sprint-1/f7-club-picker-code) found the Figma Verify Email frame's primary “Continue to Soccernity” button (Verified state) has no single obvious real destination in the app today: HomePage.tsx (route “/”) is still a PlaceholderPage stub (“a future sprint, not yet scheduled”), not a real authenticated landing page. Resolved: the CTA routes to /profile instead, the one real, fully-built authenticated destination that exists right now.</w:t>
+            </w:r>
+          </w:p>
+        </w:tc>
+        <w:tc>
+          <w:tcPr>
+            <w:tcW w:type="dxa" w:w="1850"/>
+          </w:tcPr>
+          <w:p>
+            <w:r>
+              <w:t>PR #82; VerifyEmailPage.tsx</w:t>
+            </w:r>
+          </w:p>
+        </w:tc>
+        <w:tc>
+          <w:tcPr>
+            <w:tcW w:type="dxa" w:w="2300"/>
+          </w:tcPr>
+          <w:p>
+            <w:r>
+              <w:t>Implemented — CTA routes to /profile; decision flagged in code comment; will need revisiting once HomePage.tsx is actually built in a later sprint</w:t>
+            </w:r>
+          </w:p>
+        </w:tc>
+      </w:tr>
+      <w:tr>
+        <w:tc>
+          <w:tcPr>
+            <w:tcW w:type="dxa" w:w="500"/>
+          </w:tcPr>
+          <w:p>
+            <w:r>
+              <w:t>37</w:t>
+            </w:r>
+          </w:p>
+        </w:tc>
+        <w:tc>
+          <w:tcPr>
+            <w:tcW w:type="dxa" w:w="4700"/>
+          </w:tcPr>
+          <w:p>
+            <w:r>
+              <w:t>PR #82 found the Figma Verify Email frames for states 3 (“Link Invalid Or Expired”) and 4 (“Missing Token”) both show a secondary “Contact support” button, but no resend-verification endpoint and no support/contact destination (mailto, /contact route, etc.) exist anywhere in the codebase — confirmed by grepping services/api/src for “resend” (only unrelated hit: POST /auth/guardian-consent/resend) and apps/web/src for “mailto:”/“support@”/“contact” (zero matches). Rendered as a disabled button (with an explanatory title/tooltip) rather than a dead link or one bound to nothing — visually present per the Figma layout, but explicitly inert.</w:t>
+            </w:r>
+          </w:p>
+        </w:tc>
+        <w:tc>
+          <w:tcPr>
+            <w:tcW w:type="dxa" w:w="1850"/>
+          </w:tcPr>
+          <w:p>
+            <w:r>
+              <w:t>PR #82; VerifyEmailPage.tsx</w:t>
+            </w:r>
+          </w:p>
+        </w:tc>
+        <w:tc>
+          <w:tcPr>
+            <w:tcW w:type="dxa" w:w="2300"/>
+          </w:tcPr>
+          <w:p>
+            <w:r>
+              <w:t>Open — button shipped disabled by design; no resend-verification endpoint or support/contact channel exists yet, real destination needed in a future sprint</w:t>
+            </w:r>
+          </w:p>
+        </w:tc>
+      </w:tr>
+      <w:tr>
+        <w:tc>
+          <w:tcPr>
+            <w:tcW w:type="dxa" w:w="500"/>
+          </w:tcPr>
+          <w:p>
+            <w:r>
+              <w:t>38</w:t>
+            </w:r>
+          </w:p>
+        </w:tc>
+        <w:tc>
+          <w:tcPr>
+            <w:tcW w:type="dxa" w:w="4700"/>
+          </w:tcPr>
+          <w:p>
+            <w:r>
+              <w:t>PR #82 found the Verified state's “Under-18 accounts may still be waiting” row is disclosure-only: { verified, userId }, the real POST /auth/verify-email response shape, carries no consent-status field to branch on, so every successful verification renders the same state regardless of isMinor/consent status — nothing redirects a pending-consent minor to a different view. Carried forward rather than resolved, matching the already-merged Figma design PR's own report.</w:t>
+            </w:r>
+          </w:p>
+        </w:tc>
+        <w:tc>
+          <w:tcPr>
+            <w:tcW w:type="dxa" w:w="1850"/>
+          </w:tcPr>
+          <w:p>
+            <w:r>
+              <w:t>PR #82; VerifyEmailPage.tsx</w:t>
+            </w:r>
+          </w:p>
+        </w:tc>
+        <w:tc>
+          <w:tcPr>
+            <w:tcW w:type="dxa" w:w="2300"/>
+          </w:tcPr>
+          <w:p>
+            <w:r>
+              <w:t>Open — whether a pending-consent minor should see a different post-verification view is undecided</w:t>
+            </w:r>
+          </w:p>
+        </w:tc>
+      </w:tr>
+      <w:tr>
+        <w:tc>
+          <w:tcPr>
+            <w:tcW w:type="dxa" w:w="500"/>
+          </w:tcPr>
+          <w:p>
+            <w:r>
+              <w:t>39</w:t>
+            </w:r>
+          </w:p>
+        </w:tc>
+        <w:tc>
+          <w:tcPr>
+            <w:tcW w:type="dxa" w:w="4700"/>
+          </w:tcPr>
+          <w:p>
+            <w:r>
+              <w:t>PR #82 found the Figma Club Picker frames are full-bleed dark and single-column — structurally incompatible with the light two-panel SignupSplitScreen shell ClubPickerStep.tsx used to render inside. Resolved: ClubPickerStep.tsx now renders its own self-contained full-bleed dark shell (the same negative-margin technique GuardianConsent.css / VerifyEmail.css already use), and RegisterStep.tsx renders it as a sibling/replacement instead of nesting it inside SignupSplitScreen. A new, optional, additive confirmationMessage prop carries the former “Account created” text that used to live in that nesting — no existing caller passed it before, so this is backward compatible.</w:t>
+            </w:r>
+          </w:p>
+        </w:tc>
+        <w:tc>
+          <w:tcPr>
+            <w:tcW w:type="dxa" w:w="1850"/>
+          </w:tcPr>
+          <w:p>
+            <w:r>
+              <w:t>PR #82; ClubPickerStep.tsx; RegisterStep.tsx</w:t>
+            </w:r>
+          </w:p>
+        </w:tc>
+        <w:tc>
+          <w:tcPr>
+            <w:tcW w:type="dxa" w:w="2300"/>
+          </w:tcPr>
+          <w:p>
+            <w:r>
+              <w:t>Implemented as described — shell decision and prop addition flagged in code comments; pending founder confirmation</w:t>
+            </w:r>
+          </w:p>
+        </w:tc>
+      </w:tr>
+      <w:tr>
+        <w:tc>
+          <w:tcPr>
+            <w:tcW w:type="dxa" w:w="500"/>
+          </w:tcPr>
+          <w:p>
+            <w:r>
+              <w:t>40</w:t>
+            </w:r>
+          </w:p>
+        </w:tc>
+        <w:tc>
+          <w:tcPr>
+            <w:tcW w:type="dxa" w:w="4700"/>
+          </w:tcPr>
+          <w:p>
+            <w:r>
+              <w:t>PR #82's visual-only retrofit of ClubPickerStep.tsx surfaced two Figma-vs-shipped-code text conflicts, both kept rather than fixed since the task's brief was markup/CSS only, not behavior: (a) the Figma frame labels the idle “Load More” button just “Load more,” but the already-shipped, tested behavior uses “Load more clubs” — kept verbatim since ClubPickerStep.test.tsx's own assertions depend on the exact text; (b) the empty-state card uses the identical “No clubs match that filter.” string for both “zero clubs total” and “filter matched nothing” — the Figma frame's own Design Notes flag this same ambiguity as inherited from shipped code, not something to split into two messages here.</w:t>
+            </w:r>
+          </w:p>
+        </w:tc>
+        <w:tc>
+          <w:tcPr>
+            <w:tcW w:type="dxa" w:w="1850"/>
+          </w:tcPr>
+          <w:p>
+            <w:r>
+              <w:t>PR #82; ClubPickerStep.tsx; ClubPickerStep.test.tsx</w:t>
+            </w:r>
+          </w:p>
+        </w:tc>
+        <w:tc>
+          <w:tcPr>
+            <w:tcW w:type="dxa" w:w="2300"/>
+          </w:tcPr>
+          <w:p>
+            <w:r>
+              <w:t>Open — both text mismatches kept as-is; would need a Figma update or a deliberate copy decision (and a test update) to resolve either direction</w:t>
             </w:r>
           </w:p>
         </w:tc>

</xml_diff>

<commit_message>
Decision Logs superseding updates
scanned all 42 Decision Log entries for cross-references, filtered out PR-number false positives, and manually checked every genuine hit. Found one more real one you didn't know about: #24 (NestJS 10→11) had a stale parenthetical baked directly into its own Status text — "(React Router 6→7 remains open, separate work)" — which stopped being true the moment #27/#28 shipped. Now fixed the same way: original text untouched, forward-pointer appended.

Everything else I checked (7→4, 18→16, 19→8/10, 22→15, 23→15, 30↔31) turned out to be genuine cross-references or companion decisions on related topics, not one superseding another — no fix needed there, since those targets aren't actually wrong or stale.

Final state: 5 entries now carry forward-pointers — #9, #20, #24, #25, #31. All point at their actual resolving entry, none rewrite the original text. 43 rows total, verified by rendering to PDF (page count, header, end marker all unchanged).
</commit_message>
<xml_diff>
--- a/docs/Soccernity_MVP_Build_Plan_v1.7.docx
+++ b/docs/Soccernity_MVP_Build_Plan_v1.7.docx
@@ -9088,7 +9088,10 @@
                 <w:sz w:val="19"/>
                 <w:szCs w:val="19"/>
               </w:rPr>
-              <w:t xml:space="preserve">Open — blocks deploy.yml; the workflow fails on purpose until this is resolved</w:t>
+              <w:t>Open — blocks deploy.yml; the workflow fails on purpose until this is resolved</w:t>
+              <w:br/>
+              <w:br/>
+              <w:t>SUPERSEDED by Decision Log #26 (founder-resolved): hosting is Render (API) + Neon (Postgres) + Upstash (Redis), unbundled. Config prepared (render.yaml, directUrl, CI); real accounts and a live deploy are the only remaining open action, tracked under #26, not here.</w:t>
             </w:r>
           </w:p>
         </w:tc>
@@ -10211,6 +10214,9 @@
                 <w:szCs w:val="19"/>
               </w:rPr>
               <w:t>Resolved (triaged) — Tier 1 fixed immediately; Tier 2 open, scheduled for a Sprint 2 NestJS/React-Router major-upgrade ticket; Tier 3 deferred until apps/mobile has real code -- NestJS 10-&gt;11 sub-item closed by Decision Log #24 (see below); React Router 6-&gt;7 remains open.</w:t>
+              <w:br/>
+              <w:br/>
+              <w:t>SUPERSEDED IN PART by Decision Log #27/#28: the “React Router 6→7 remains open” line above is no longer accurate — #27 shipped React 19 (clearing the blocker #25 recorded), and #28 shipped React Router 8 on top of it. Tier 2's react-router sub-item is now fully closed; see #25/#27/#28 for the resolution chain.</w:t>
             </w:r>
           </w:p>
         </w:tc>
@@ -10619,6 +10625,9 @@
                 <w:szCs w:val="19"/>
               </w:rPr>
               <w:t>Resolved and implemented — NestJS 10→11 shipped, Decision Log #20’s Tier 2 NestJS portion closed (React Router 6→7 remains open, separate work)</w:t>
+              <w:br/>
+              <w:br/>
+              <w:t>SUPERSEDED IN PART by Decision Log #27/#28: the parenthetical “(React Router 6→7 remains open, separate work)” above is no longer accurate — #27 shipped React 19 and #28 shipped React Router 8. This entry's own NestJS resolution still stands; only that trailing note is stale.</w:t>
             </w:r>
           </w:p>
         </w:tc>
@@ -10661,6 +10670,9 @@
           <w:p>
             <w:r>
               <w:t>Resolved (interim) — React Router 7 (7.18.2) shipped, React 18 compatibility confirmed; React Router 8 remains a tracked follow-up blocked on a separate React 19 upgrade</w:t>
+              <w:br/>
+              <w:br/>
+              <w:t>SUPERSEDED by Decision Log #27 and #28 (founder-resolved): the “blocked on React 19” line above is no longer accurate — #27 shipped React 19 (19.2.8), clearing the blocker recorded here, and #28 shipped React Router 8 (8.3.0) on top of it. This entry's blocker is fully closed.</w:t>
             </w:r>
           </w:p>
         </w:tc>
@@ -10913,6 +10925,9 @@
           <w:p>
             <w:r>
               <w:t>Resolved — GET /users/:id/followers and /following stay public, not self-scoped; current implementation confirmed correct. Follow-up flagged, not scheduled: a future "private account" feature would need to revisit this decision — none exists today</w:t>
+              <w:br/>
+              <w:br/>
+              <w:t>SUPERSEDED IN PART by Decision Log #41 (PR #84, sprint-2/followers-scope-fix): public-scope stands as the general rule, but a restricted-pending minor as the TARGET (:id) is now hidden from both endpoints for every caller, closing a gap this entry's own reasoning never checked. See #41.</w:t>
             </w:r>
           </w:p>
         </w:tc>
@@ -11291,6 +11306,90 @@
           <w:p>
             <w:r>
               <w:t>Open — both text mismatches kept as-is; would need a Figma update or a deliberate copy decision (and a test update) to resolve either direction</w:t>
+            </w:r>
+          </w:p>
+        </w:tc>
+      </w:tr>
+      <w:tr>
+        <w:tc>
+          <w:tcPr>
+            <w:tcW w:type="dxa" w:w="500"/>
+          </w:tcPr>
+          <w:p>
+            <w:r>
+              <w:t>41</w:t>
+            </w:r>
+          </w:p>
+        </w:tc>
+        <w:tc>
+          <w:tcPr>
+            <w:tcW w:type="dxa" w:w="4700"/>
+          </w:tcPr>
+          <w:p>
+            <w:r>
+              <w:t>PR #84 (sprint-2/followers-scope-fix) revisited Decision Log #31, not to overturn it but to close a gap it never checked: #31 reasoned entirely from product-parity with mainstream social apps and only tested whether Section 8.3 step 5's ‘enumerated’ restricted-pending list named followers/following (it doesn't) — it never cross-checked Section 8.3's broader principle that a minor's profile shouldn't be visible outside the guardian relationship before consent is recorded. Result before this fix: GET /users/:id/followers and GET /users/:id/following never read isMinor/consentStatus for the target :id, so a restricted-pending minor's full social graph was visible to any authenticated caller regardless of who was asking. GuardianConsentGuard wasn't reusable (it gates the caller's own restricted status, not another user's), so a new service-level check, UsersService.assertFollowGraphVisible, reads the target :id instead: a minor with no Guardian row, or with consentStatus still ‘pending’, 404s on both endpoints for every caller — indistinguishable from a non-existent user, matching this codebase's established ‘hide via 404, never a distinct 403 that confirms a restricted account exists’ convention. Three options were written up in users/README.md at the same depth #31 used (hide entirely regardless of caller; hide unless caller is self; hide only from others' lists) — the most conservative, (a), was implemented, per CLAUDE.md's non-negotiable stance that minors' data safety outranks product-parity reasoning when the two conflict.</w:t>
+            </w:r>
+          </w:p>
+        </w:tc>
+        <w:tc>
+          <w:tcPr>
+            <w:tcW w:type="dxa" w:w="1850"/>
+          </w:tcPr>
+          <w:p>
+            <w:r>
+              <w:t>PR #84; users/README.md; users.controller.ts; users.service.ts; users.service.spec.ts</w:t>
+            </w:r>
+          </w:p>
+        </w:tc>
+        <w:tc>
+          <w:tcPr>
+            <w:tcW w:type="dxa" w:w="2300"/>
+          </w:tcPr>
+          <w:p>
+            <w:r>
+              <w:t>Resolved by the founder: implemented and merged — a restricted-pending minor's followers/following are hidden (404) from every caller on both endpoints; non-restricted users' followers/following remain public per #31's original conclusion, which otherwise still stands</w:t>
+            </w:r>
+          </w:p>
+        </w:tc>
+      </w:tr>
+      <w:tr>
+        <w:tc>
+          <w:tcPr>
+            <w:tcW w:type="dxa" w:w="500"/>
+          </w:tcPr>
+          <w:p>
+            <w:r>
+              <w:t>42</w:t>
+            </w:r>
+          </w:p>
+        </w:tc>
+        <w:tc>
+          <w:tcPr>
+            <w:tcW w:type="dxa" w:w="4700"/>
+          </w:tcPr>
+          <w:p>
+            <w:r>
+              <w:t>PR #78 (sprint-1/f5-f6-missing-endpoints) added POST /auth/deactivate-account and POST /auth/delete-account, backed by a new User.accountStatus field ("active" | "deactivated" | "pending_deletion", migration 20260823011617_add_user_account_status) — flagged in auth/README.md as a genuine schema addition beyond Section 3's literal field list, per CLAUDE.md's "the data model is a fixed spec" rule. POST /auth/delete-account deliberately does NOT hard-delete the User row — it only flips accountStatus to "pending_deletion" and revokes all sessions (proven by an e2e assertion that the row still exists and is still findable by email immediately after). This is a minors' data platform with real UK GDPR / Nigeria NDPA 2023 implications (this project's own DPIA history, CLAUDE.md's safeguarding non-negotiables), and retention/erasure policy was explicitly left undecided by that PR's own brief: how long does a "pending_deletion" row persist, what triggers actual hard deletion or anonymization, and does any data (safeguarding/consent records in particular) need a longer legal-hold retention period than the rest of the account. No entry existed in this log for this until now, despite being flagged in code since PR #78.</w:t>
+            </w:r>
+          </w:p>
+        </w:tc>
+        <w:tc>
+          <w:tcPr>
+            <w:tcW w:type="dxa" w:w="1850"/>
+          </w:tcPr>
+          <w:p>
+            <w:r>
+              <w:t>PR #78; auth/README.md; schema.prisma (User.accountStatus)</w:t>
+            </w:r>
+          </w:p>
+        </w:tc>
+        <w:tc>
+          <w:tcPr>
+            <w:tcW w:type="dxa" w:w="2300"/>
+          </w:tcPr>
+          <w:p>
+            <w:r>
+              <w:t>Open — real founder/legal input needed on retention window and hard-deletion/anonymization trigger for pending_deletion accounts; a hard blocker candidate for Section 7's Definition of Done (DPIA legal review) before MVP v1 launch, not a Sprint backlog nice-to-have</w:t>
             </w:r>
           </w:p>
         </w:tc>

</xml_diff>

<commit_message>
Admin Panel shell unification (Phases 1-3) + 9 new Admin screens (Figma)
One-time combined-scope PR (figma-design-system + figma-screen-builder
in one pass) — normal split resumes after this.

- Phase 1: "Categories" sidebar item added above "Contest" on both
  Contest tab frames; disclosed token cleanup of both Contest shells.
- Phase 2: 13 Admin screens re-shelled to the unified top bar + sidebar,
  per-screen primary-action relabels, content areas untouched.
- Phase 3: 7 named new screens (Contest Create/Schedule/Edit/Search/
  Delete Task, Settings Delete Role, Admin Profile) + 2 audit-pass
  screens. Schedule Task reuses calendar component 2365:2033.
- Build Plan Decision Log #49-#54 added; CLAUDE.md status updated.

Co-Authored-By: Claude Sonnet 5 <noreply@anthropic.com>
</commit_message>
<xml_diff>
--- a/docs/Soccernity_MVP_Build_Plan_v1.7.docx
+++ b/docs/Soccernity_MVP_Build_Plan_v1.7.docx
@@ -11603,6 +11603,258 @@
           <w:p>
             <w:r>
               <w:t>Resolved: sprint-2/mobile-navbar-variant added two variants to the same set — Property 1=header 7 — mobile (5386:6575, logged-out) and Property 1=header 4 — mobile (5386:6576, logged-in), single-property naming so they stay paired with the desktop pair (a second "Breakpoint" property was rejected — would have required renaming the existing desktop variants). Built at 428px (the mobile-screen convention already in this file: community mobile 1-5 and Messages mobile window 2/4 are all 428 wide); 64px tall. All fills bound to Soccernity Theme Light tokens (color/background/surface, brand/green, color/text/primary, brand/navy, color/text/on-navy, brand/green-tint 12% — NOT green-tint-28 per Decision Log #47), no new colour, no dark-mode. The full 6-icon nav row + search pill are dropped on mobile (that nav lives in the separate bottom tab bar, Mobile App Nav Icons 2230:4328); logo + search icon + right-side action (Login button logged-out / messages glyph + avatar logged-in) are kept. Applied to all five Auth Pages mobile frames (which are 390px wide — instances resized to 390, navbar auto-layout reflows); same logged-in/out judgment as PR #100's desktop counterparts. Full detail: docs/sprint-2-mobile-navbar-variant-report.md.</w:t>
+            </w:r>
+          </w:p>
+        </w:tc>
+      </w:tr>
+      <w:tr>
+        <w:tc>
+          <w:tcPr>
+            <w:tcW w:type="dxa" w:w="500"/>
+          </w:tcPr>
+          <w:p>
+            <w:r>
+              <w:t>49</w:t>
+            </w:r>
+          </w:p>
+        </w:tc>
+        <w:tc>
+          <w:tcPr>
+            <w:tcW w:type="dxa" w:w="4700"/>
+          </w:tcPr>
+          <w:p>
+            <w:r>
+              <w:t>The new "Categories" Admin sidebar item uses a hand-drawn 2×2-grid glyph (u:apps); the Admin Panel's sidebar icons otherwise remain a mix of icon libraries (u:*, fi:*, carbon:*, ic:*, clarity:*, akar-icons:*). Separately: the unified "Admin Shell" (top bar + sidebar) was applied as a cloned + grouped layer per screen, not as a single Figma component with instances.</w:t>
+            </w:r>
+          </w:p>
+        </w:tc>
+        <w:tc>
+          <w:tcPr>
+            <w:tcW w:type="dxa" w:w="1850"/>
+          </w:tcPr>
+          <w:p>
+            <w:r>
+              <w:t>PR sprint-2/admin-panel-shell-unification report §3, §8</w:t>
+            </w:r>
+          </w:p>
+        </w:tc>
+        <w:tc>
+          <w:tcPr>
+            <w:tcW w:type="dxa" w:w="2300"/>
+          </w:tcPr>
+          <w:p>
+            <w:r>
+              <w:t>Open — Categories icon accepted as interim. Admin Panel icon-library standardisation still open (flagged by every prior retrofit round). Converting the Admin Shell into a real component/instance set recommended as a follow-up, deferred here.</w:t>
+            </w:r>
+          </w:p>
+        </w:tc>
+      </w:tr>
+      <w:tr>
+        <w:tc>
+          <w:tcPr>
+            <w:tcW w:type="dxa" w:w="500"/>
+          </w:tcPr>
+          <w:p>
+            <w:r>
+              <w:t>50</w:t>
+            </w:r>
+          </w:p>
+        </w:tc>
+        <w:tc>
+          <w:tcPr>
+            <w:tcW w:type="dxa" w:w="4700"/>
+          </w:tcPr>
+          <w:p>
+            <w:r>
+              <w:t>Unified shell vertical placement on the 1024-tall Phase 2 Admin frames: the shell top bar was placed at y 95 (vs the Contest reference frame's y 186) so it clears each screen's content without shifting content down or resizing frames. Consequence: slightly tighter top-bar-to-title spacing than the Contest reference.</w:t>
+            </w:r>
+          </w:p>
+        </w:tc>
+        <w:tc>
+          <w:tcPr>
+            <w:tcW w:type="dxa" w:w="1850"/>
+          </w:tcPr>
+          <w:p>
+            <w:r>
+              <w:t>PR sprint-2/admin-panel-shell-unification report §4, §8</w:t>
+            </w:r>
+          </w:p>
+        </w:tc>
+        <w:tc>
+          <w:tcPr>
+            <w:tcW w:type="dxa" w:w="2300"/>
+          </w:tcPr>
+          <w:p>
+            <w:r>
+              <w:t>Open — normalise all Admin Panel frames to 1184 tall and shift content, or accept the y-95 adaptation as canon.</w:t>
+            </w:r>
+          </w:p>
+        </w:tc>
+      </w:tr>
+      <w:tr>
+        <w:tc>
+          <w:tcPr>
+            <w:tcW w:type="dxa" w:w="500"/>
+          </w:tcPr>
+          <w:p>
+            <w:r>
+              <w:t>51</w:t>
+            </w:r>
+          </w:p>
+        </w:tc>
+        <w:tc>
+          <w:tcPr>
+            <w:tcW w:type="dxa" w:w="4700"/>
+          </w:tcPr>
+          <w:p>
+            <w:r>
+              <w:t>Per-screen top-bar primary-action labels on the unified Admin shell (Create Article, Add Media, Add Role, Save Category, Save Role, Save Changes, Publish Post, Schedule Task, Add Member, etc.); the top-bar button was removed entirely on Dashboard and Media Preview (no primary action) and Users gained an "Add Member" button it previously lacked.</w:t>
+            </w:r>
+          </w:p>
+        </w:tc>
+        <w:tc>
+          <w:tcPr>
+            <w:tcW w:type="dxa" w:w="1850"/>
+          </w:tcPr>
+          <w:p>
+            <w:r>
+              <w:t>PR sprint-2/admin-panel-shell-unification report §4, §8</w:t>
+            </w:r>
+          </w:p>
+        </w:tc>
+        <w:tc>
+          <w:tcPr>
+            <w:tcW w:type="dxa" w:w="2300"/>
+          </w:tcPr>
+          <w:p>
+            <w:r>
+              <w:t>Open — confirm the per-screen labels, and confirm whether form/sub-screens should carry a top-bar action at all when they already have an in-content submit button.</w:t>
+            </w:r>
+          </w:p>
+        </w:tc>
+      </w:tr>
+      <w:tr>
+        <w:tc>
+          <w:tcPr>
+            <w:tcW w:type="dxa" w:w="500"/>
+          </w:tcPr>
+          <w:p>
+            <w:r>
+              <w:t>52</w:t>
+            </w:r>
+          </w:p>
+        </w:tc>
+        <w:tc>
+          <w:tcPr>
+            <w:tcW w:type="dxa" w:w="4700"/>
+          </w:tcPr>
+          <w:p>
+            <w:r>
+              <w:t>Admin Panel content areas are still not light-mode-retrofitted. PR #99 (round-2 retrofit) explicitly deferred the Admin Panel; this PR unified the shell only. Content layers across all 15 + the 9 new screens still carry #4F46E5/#3539DF indigo buttons, #1E1E1E, #FF0000 reds, #000000 table text and unbound page titles. Re-surfaces the standing "no color/action/destructive token" question (3 distinct reds file-wide) — the Phase 3 delete confirmations use navy "Delete" buttons because no destructive token exists and non-negotiable #3 forbids inventing a red.</w:t>
+            </w:r>
+          </w:p>
+        </w:tc>
+        <w:tc>
+          <w:tcPr>
+            <w:tcW w:type="dxa" w:w="1850"/>
+          </w:tcPr>
+          <w:p>
+            <w:r>
+              <w:t>PR sprint-2/admin-panel-shell-unification report §4.2, §8; PR #99 report</w:t>
+            </w:r>
+          </w:p>
+        </w:tc>
+        <w:tc>
+          <w:tcPr>
+            <w:tcW w:type="dxa" w:w="2300"/>
+          </w:tcPr>
+          <w:p>
+            <w:r>
+              <w:t>Open — needs a dedicated "Admin Panel content light-mode retrofit" task; destructive-colour-token question unresolved.</w:t>
+            </w:r>
+          </w:p>
+        </w:tc>
+      </w:tr>
+      <w:tr>
+        <w:tc>
+          <w:tcPr>
+            <w:tcW w:type="dxa" w:w="500"/>
+          </w:tcPr>
+          <w:p>
+            <w:r>
+              <w:t>53</w:t>
+            </w:r>
+          </w:p>
+        </w:tc>
+        <w:tc>
+          <w:tcPr>
+            <w:tcW w:type="dxa" w:w="4700"/>
+          </w:tcPr>
+          <w:p>
+            <w:r>
+              <w:t>The reused "Calendar for scheduled task" component (2365:2033), instanced on the new Contest — Schedule Task screen as instructed, is not token-bound: ~54 internal paints (month/year heading, weekday labels, day numbers, #E4E5E7 grid lines, #7E818C muted text, a #0F2552 heading) are unbound / off-palette. Any screen instancing it inherits those paints.</w:t>
+            </w:r>
+          </w:p>
+        </w:tc>
+        <w:tc>
+          <w:tcPr>
+            <w:tcW w:type="dxa" w:w="1850"/>
+          </w:tcPr>
+          <w:p>
+            <w:r>
+              <w:t>PR sprint-2/admin-panel-shell-unification report §6.3, §8</w:t>
+            </w:r>
+          </w:p>
+        </w:tc>
+        <w:tc>
+          <w:tcPr>
+            <w:tcW w:type="dxa" w:w="2300"/>
+          </w:tcPr>
+          <w:p>
+            <w:r>
+              <w:t>Open — the calendar component needs its own token-retrofit pass.</w:t>
+            </w:r>
+          </w:p>
+        </w:tc>
+      </w:tr>
+      <w:tr>
+        <w:tc>
+          <w:tcPr>
+            <w:tcW w:type="dxa" w:w="500"/>
+          </w:tcPr>
+          <w:p>
+            <w:r>
+              <w:t>54</w:t>
+            </w:r>
+          </w:p>
+        </w:tc>
+        <w:tc>
+          <w:tcPr>
+            <w:tcW w:type="dxa" w:w="4700"/>
+          </w:tcPr>
+          <w:p>
+            <w:r>
+              <w:t>The new "Admin Profile" screen (Full name / Email / Role / Phone, plus "Edit Profile" and "Change Password" affordances) implies an admin-account data model that does not exist in Build Plan Section 3/4. The closest existing concept is User + the member-facing POST /auth/change-password / account-lifecycle routes, which are not an admin-console concept.</w:t>
+            </w:r>
+          </w:p>
+        </w:tc>
+        <w:tc>
+          <w:tcPr>
+            <w:tcW w:type="dxa" w:w="1850"/>
+          </w:tcPr>
+          <w:p>
+            <w:r>
+              <w:t>PR sprint-2/admin-panel-shell-unification report §6.1, §8</w:t>
+            </w:r>
+          </w:p>
+        </w:tc>
+        <w:tc>
+          <w:tcPr>
+            <w:tcW w:type="dxa" w:w="2300"/>
+          </w:tcPr>
+          <w:p>
+            <w:r>
+              <w:t>Open — does the Admin Console get its own account entity, or reuse User with a role check? Not a design-token question; flagged for founder/backend.</w:t>
             </w:r>
           </w:p>
         </w:tc>

</xml_diff>

<commit_message>
Fix-up: rebind off-navy blue button fills to brand/navy across Admin Panel screens
Scan of all 24 Admin frames found only #3539df in use (no #4F46E5/#034694).
12 in-content submit/upload button pills across 9 screens rebound from
#3539df to brand/navy with color/text/on-navy labels. Non-button #3539df
(action-icon strokes, Dashboard chart line) left as Decision Log #52
follow-ups. Decision Log #52 status amended to "Partially resolved".

Co-Authored-By: Claude Sonnet 5 <noreply@anthropic.com>
</commit_message>
<xml_diff>
--- a/docs/Soccernity_MVP_Build_Plan_v1.7.docx
+++ b/docs/Soccernity_MVP_Build_Plan_v1.7.docx
@@ -11750,7 +11750,7 @@
           </w:tcPr>
           <w:p>
             <w:r>
-              <w:t>Admin Panel content areas are still not light-mode-retrofitted. PR #99 (round-2 retrofit) explicitly deferred the Admin Panel; this PR unified the shell only. Content layers across all 15 + the 9 new screens still carry #4F46E5/#3539DF indigo buttons, #1E1E1E, #FF0000 reds, #000000 table text and unbound page titles. Re-surfaces the standing "no color/action/destructive token" question (3 distinct reds file-wide) — the Phase 3 delete confirmations use navy "Delete" buttons because no destructive token exists and non-negotiable #3 forbids inventing a red.</w:t>
+              <w:t>Admin Panel content areas are still not light-mode-retrofitted. PR #99 (round-2 retrofit) explicitly deferred the Admin Panel; this PR unified the shell only. Content layers across all 15 + the 9 new screens still carry #3539df indigo buttons (an earlier draft mis-listed #4F46E5), #1E1E1E, #FF0000 reds, #000000 table text and unbound page titles. Re-surfaces the standing "no color/action/destructive token" question (3 distinct reds file-wide) — the Phase 3 delete confirmations use navy "Delete" buttons because no destructive token exists and non-negotiable #3 forbids inventing a red.</w:t>
             </w:r>
           </w:p>
         </w:tc>
@@ -11770,7 +11770,7 @@
           </w:tcPr>
           <w:p>
             <w:r>
-              <w:t>Open — needs a dedicated "Admin Panel content light-mode retrofit" task; destructive-colour-token question unresolved.</w:t>
+              <w:t>Partially resolved (fix-up commit on PR #102): the button subset of the off-navy / indigo problem is fixed — all 12 in-content submit/upload buttons across 9 Admin screens (#3539df pills) rebound to brand/navy with color/text/on-navy labels. Scan found only #3539df in use (no #4F46E5 / #034694 on any Admin frame). Still open: the rest of the Admin Panel content retrofit — #3539df action-icon strokes (Media / Media Preview / Users / Dashboard chart line), #1E1E1E card fill, #FF0000/#FF0808 reds, #000000 table body text, and unbound content page-titles — plus the standing "no color/action/destructive token" question.</w:t>
             </w:r>
           </w:p>
         </w:tc>

</xml_diff>

<commit_message>
Add Google/Apple/Facebook sign-in UI to Login + Register (Figma)
Visual/UI only on 4 existing frames (Login/Register, desktop + mobile) —
no backend, no OAuth, no click behaviour. "Or continue with" divider +
three secondary-style provider buttons below the primary email/password
CTA, identical across all four frames, scaled for desktop/mobile.

- All button chrome bound to Soccernity Theme Light-mode tokens; only
  unbound fills are the provider brand marks (disclosed exception to
  brand non-negotiable #3).
- Google + Facebook logos reused as-is from the in-file Brand Guide
  social-icon demo; Apple mark created new (none existed in the file).
- Build Plan Decision Log #55 added (placement / hierarchy / provider
  order / Apple-button-guidelines flag for the OAuth pass).
- CLAUDE.md "Where things stand right now" updated.

Report: docs/sprint-2-auth-social-signin-report.md

Co-Authored-By: Claude Sonnet 5 <noreply@anthropic.com>
</commit_message>
<xml_diff>
--- a/docs/Soccernity_MVP_Build_Plan_v1.7.docx
+++ b/docs/Soccernity_MVP_Build_Plan_v1.7.docx
@@ -11855,6 +11855,52 @@
           <w:p>
             <w:r>
               <w:t>Open — does the Admin Console get its own account entity, or reuse User with a role check? Not a design-token question; flagged for founder/backend.</w:t>
+            </w:r>
+          </w:p>
+        </w:tc>
+      </w:tr>
+      <w:tr>
+        <w:tc>
+          <w:tcPr>
+            <w:tcW w:type="dxa" w:w="500"/>
+          </w:tcPr>
+          <w:p>
+            <w:r/>
+            <w:r>
+              <w:t>55</w:t>
+            </w:r>
+          </w:p>
+        </w:tc>
+        <w:tc>
+          <w:tcPr>
+            <w:tcW w:type="dxa" w:w="4700"/>
+          </w:tcPr>
+          <w:p>
+            <w:r/>
+            <w:r>
+              <w:t>Third-party sign-in (Google / Apple / Facebook) on Login &amp; Register (desktop + mobile). Placement relative to the email/password form, visual hierarchy between the two auth paths, and the order of the three providers.</w:t>
+            </w:r>
+          </w:p>
+        </w:tc>
+        <w:tc>
+          <w:tcPr>
+            <w:tcW w:type="dxa" w:w="1850"/>
+          </w:tcPr>
+          <w:p>
+            <w:r/>
+            <w:r>
+              <w:t>sprint-2/auth-social-signin report section 7</w:t>
+            </w:r>
+          </w:p>
+        </w:tc>
+        <w:tc>
+          <w:tcPr>
+            <w:tcW w:type="dxa" w:w="2300"/>
+          </w:tcPr>
+          <w:p>
+            <w:r/>
+            <w:r>
+              <w:t>Resolved (design only — backend/OAuth wiring is a separate future task). Social sign-in sits BELOW the email/password form and its primary submit button, under an "Or continue with" divider; email/password stays the visually primary path (solid brand/navy CTA), the three provider buttons are secondary-style (white color/background/surface fill, 1px color/icon/inactive border). Provider order top-to-bottom: Google, Apple, Facebook — identical on all four frames; Apple is not buried because App Store review requires "Sign in with Apple" wherever other third-party sign-in is offered. Provider marks follow each provider's own brand guidelines (multicolour Google G, black Apple mark, Facebook blue) — a disclosed exception to brand non-negotiable #3, same category as the undraw illustration and club crests. Reused in-file Facebook asset uses the older #3C5A9A blue, left as-is pending the OAuth pass. FOR THE OAUTH-WIRING TASK: Apple's HIG has specific "Sign in with Apple" button styling/sizing/localisation rules for production; this mock uses one unified button treatment for all three providers — whether the production Apple button must diverge is an open question for that task.</w:t>
             </w:r>
           </w:p>
         </w:tc>

</xml_diff>

<commit_message>
Notification bell: ship Settings copy + Bants/Navbar token fixes; bell slot blocked on avatar-component finding
Tasks 4/5/6 + Task 3 audit shipped in Figma. Tasks 1-3 (notification
bell components + shared Navbar bell slot, DL #88 follow-up) BLOCKED:
Notification Bell Icon/no notification (2819:4090) and /notification
(2819:4089) are the live user-avatar component (~85 instances), not
empty bell components. Building bell art into them would break every
avatar in the file.

- Task 6: header 4 Navbar messages-glyph 2 unbound paints -> brand/navy
- Task 5: Bants desktop room-row status dot #DBA111 -> brand/green
- Task 4: 9 Settings desktop copy fixes (2922:5832/5602/5382)
- Task 3: file-wide #fa0606 audit; unrelated uses flagged (DL #97)
- Decision Log: #88 forward-pointer (follow-up blocked); new #93-#98
- CLAUDE.md + report md updated

Co-Authored-By: Claude Sonnet 5 <noreply@anthropic.com>
</commit_message>
<xml_diff>
--- a/docs/Soccernity_MVP_Build_Plan_v1.7.docx
+++ b/docs/Soccernity_MVP_Build_Plan_v1.7.docx
@@ -13317,6 +13317,9 @@
             <w:r>
               <w:t>Resolved (design) with a flagged follow-up. Verified live: NO Navbar variant (2824:4309, all 4) contains a bell — the action cluster is a messages glyph + avatar. Bell + navy unread badge built as an ABSOLUTE overlay on each Notification Centre frame's own Navbar instance (a Figma instance can't take new children; editing the component would touch every screen — out of scope). Badge reuses the navy count-pill from Dropdown menu/notification on (2841:5376), NOT the off-palette red #fa0606 dot on Notification Bell Icon/notification (2819:4089). Real fix (follow-up): add a genuine bell slot to the Navbar component set — a figma-design-system task touching every screen — and decide the red dot's fate then.</w:t>
             </w:r>
+            <w:r>
+              <w:t xml:space="preserve">  [Follow-up update, sprint-2/notification-bell-navbar-slot]: the "add a genuine bell slot to the Navbar component set" follow-up is BLOCKED — Notification Bell Icon/no notification (2819:4090) and /notification (2819:4089) are not empty bell components, they are the live user-avatar component (2819:4090 has ~85 instances across every Navbar in the file). See #93.</w:t>
+            </w:r>
           </w:p>
         </w:tc>
       </w:tr>
@@ -13484,6 +13487,282 @@
           <w:p>
             <w:r>
               <w:t>Resolved (design), partial by design. Built mobile equivalents for the 5 category screens the Settings Overview's Category Nav actually links to — Security &amp; Account (5649:8074), Privacy &amp; Safety (5649:8092), Notification Preferences By Type (5649:8116), Display/Language &amp; Region (5649:8140), Account Information Edit (5649:8176). The 12 deeper leaf screens (Confirm/Change Password, Deactivate, Security Overview, 2FA SMS/App, DMs &amp; Read Receipts, Sensitive Content, Mute &amp; Filter, Mute New Accounts, Notification Preferences, Push, Email) are a flagged, deliberately unbundled follow-up. Admin-side role screens (1658:2303, 5403:7205) confirmed out of scope, untouched. Copy divergence disclosed: six real copy bugs on the desktop frames (incl. a leftover 'how X content is displayed' from a Twitter/X template and an 'Accessibilty' typo) were corrected on the new mobile frames and left on desktop — desktop and mobile copy now disagree, on purpose; desktop needs the same corrections (figma-design-system). Also flagged: Settings — Account Information (Edit) renders Username and Country, neither of which has a User column (Decision Log #58) — labelled '(no backend field yet)' on-canvas.</w:t>
+            </w:r>
+          </w:p>
+        </w:tc>
+      </w:tr>
+      <w:tr>
+        <w:tc>
+          <w:tcPr>
+            <w:tcW w:type="dxa" w:w="500"/>
+          </w:tcPr>
+          <w:p>
+            <w:r/>
+            <w:r>
+              <w:t>93</w:t>
+            </w:r>
+          </w:p>
+        </w:tc>
+        <w:tc>
+          <w:tcPr>
+            <w:tcW w:type="dxa" w:w="4700"/>
+          </w:tcPr>
+          <w:p>
+            <w:r/>
+            <w:r>
+              <w:t>Notification Bell Icon/no notification (2819:4090) and /notification (2819:4089) are misnamed — they are the user-avatar component, not bell components. 2819:4090 has ~85 instances across every Navbar; 2819:4089 (avatar + #fa0606 status dot) has 0. What should replace them, and where does the real Navbar bell slot live?</w:t>
+            </w:r>
+          </w:p>
+        </w:tc>
+        <w:tc>
+          <w:tcPr>
+            <w:tcW w:type="dxa" w:w="1850"/>
+          </w:tcPr>
+          <w:p>
+            <w:r/>
+            <w:r>
+              <w:t>sprint-2/notification-bell-navbar-slot report</w:t>
+            </w:r>
+          </w:p>
+        </w:tc>
+        <w:tc>
+          <w:tcPr>
+            <w:tcW w:type="dxa" w:w="2300"/>
+          </w:tcPr>
+          <w:p>
+            <w:r/>
+            <w:r>
+              <w:t>Open. Discovered while attempting DL #88’s follow-up. Building bell artwork into these node IDs (the brief’s Task 1 as written) would turn ~85 avatars file-wide into bells-behind-photos, so it was not done. Recommended: (a) rename 2819:4090 / 2819:4089 to Avatar/plain and Avatar/with status dot; retire the #fa0606 dot on 2819:4089 — replace with a brand/green presence dot (matching the room-row status-dot precedent) or drop it; (b) build the Navbar bell as a NEW Notification Bell component set (see #95), added to the logged-in Navbar action cluster between the messages glyph and the avatar. Blocked on founder/design-lead confirmation that the round Navbar photo is the user avatar (it opens the account-style Dropdown menu/* menu, so it clearly is).</w:t>
+            </w:r>
+          </w:p>
+        </w:tc>
+      </w:tr>
+      <w:tr>
+        <w:tc>
+          <w:tcPr>
+            <w:tcW w:type="dxa" w:w="500"/>
+          </w:tcPr>
+          <w:p>
+            <w:r/>
+            <w:r>
+              <w:t>94</w:t>
+            </w:r>
+          </w:p>
+        </w:tc>
+        <w:tc>
+          <w:tcPr>
+            <w:tcW w:type="dxa" w:w="4700"/>
+          </w:tcPr>
+          <w:p>
+            <w:r/>
+            <w:r>
+              <w:t>Should the notification bell appear on the logged-out Navbar variants (header 7, header 7 — mobile)?</w:t>
+            </w:r>
+          </w:p>
+        </w:tc>
+        <w:tc>
+          <w:tcPr>
+            <w:tcW w:type="dxa" w:w="1850"/>
+          </w:tcPr>
+          <w:p>
+            <w:r/>
+            <w:r>
+              <w:t>sprint-2/notification-bell-navbar-slot report</w:t>
+            </w:r>
+          </w:p>
+        </w:tc>
+        <w:tc>
+          <w:tcPr>
+            <w:tcW w:type="dxa" w:w="2300"/>
+          </w:tcPr>
+          <w:p>
+            <w:r/>
+            <w:r>
+              <w:t>Proposed (recommend accept): bell on logged-in variants only (header 4, header 4 — mobile). Notifications require an account. Not yet built — depends on #93. Separately flagged: header 7 currently carries a covered/overlapping avatar instance (2841:4177), likely a pre-existing bug worth its own check.</w:t>
+            </w:r>
+          </w:p>
+        </w:tc>
+      </w:tr>
+      <w:tr>
+        <w:tc>
+          <w:tcPr>
+            <w:tcW w:type="dxa" w:w="500"/>
+          </w:tcPr>
+          <w:p>
+            <w:r/>
+            <w:r>
+              <w:t>95</w:t>
+            </w:r>
+          </w:p>
+        </w:tc>
+        <w:tc>
+          <w:tcPr>
+            <w:tcW w:type="dxa" w:w="4700"/>
+          </w:tcPr>
+          <w:p>
+            <w:r/>
+            <w:r>
+              <w:t>How does the Navbar bell express read vs unread state?</w:t>
+            </w:r>
+          </w:p>
+        </w:tc>
+        <w:tc>
+          <w:tcPr>
+            <w:tcW w:type="dxa" w:w="1850"/>
+          </w:tcPr>
+          <w:p>
+            <w:r/>
+            <w:r>
+              <w:t>sprint-2/notification-bell-navbar-slot report</w:t>
+            </w:r>
+          </w:p>
+        </w:tc>
+        <w:tc>
+          <w:tcPr>
+            <w:tcW w:type="dxa" w:w="2300"/>
+          </w:tcPr>
+          <w:p>
+            <w:r/>
+            <w:r>
+              <w:t>Proposed (recommend accept): a Has Unread boolean variant property (False default / True) on a new Notification Bell component set, swappable per instance. True variant adds the navy count-pill (frame brand/navy + number text color/text/on-navy) copied from Dropdown menu/notification on (Frame 5882 / 2841:5375-6) and PR #112’s Unread Count Badge (5640:7915). Bell glyph stroke = brand/navy. No #fa0606. Not yet built — depends on #93.</w:t>
+            </w:r>
+          </w:p>
+        </w:tc>
+      </w:tr>
+      <w:tr>
+        <w:tc>
+          <w:tcPr>
+            <w:tcW w:type="dxa" w:w="500"/>
+          </w:tcPr>
+          <w:p>
+            <w:r/>
+            <w:r>
+              <w:t>96</w:t>
+            </w:r>
+          </w:p>
+        </w:tc>
+        <w:tc>
+          <w:tcPr>
+            <w:tcW w:type="dxa" w:w="4700"/>
+          </w:tcPr>
+          <w:p>
+            <w:r/>
+            <w:r>
+              <w:t>Does the Navbar bell open the existing account-style Dropdown menu/* components, or does it need a dedicated notification-preview dropdown? And what does "See all notifications" link to?</w:t>
+            </w:r>
+          </w:p>
+        </w:tc>
+        <w:tc>
+          <w:tcPr>
+            <w:tcW w:type="dxa" w:w="1850"/>
+          </w:tcPr>
+          <w:p>
+            <w:r/>
+            <w:r>
+              <w:t>sprint-2/notification-bell-navbar-slot report</w:t>
+            </w:r>
+          </w:p>
+        </w:tc>
+        <w:tc>
+          <w:tcPr>
+            <w:tcW w:type="dxa" w:w="2300"/>
+          </w:tcPr>
+          <w:p>
+            <w:r/>
+            <w:r>
+              <w:t>Open. Dropdown menu/no notification (2841:5361) and Dropdown menu/notification on (2841:5363) have 0 instances and no prototype wiring anywhere — there is no existing interaction pattern to mirror, and both are account menus (Profile / Message / Notification / Settings / Log out), not notification lists. If reused: bell state maps to dropdown state (empty bell → no notification, badged bell → notification on), and a "See all notifications" row is added to the notification-on dropdown navigating to the PR #112 Notification Centre — 5640:7815 (desktop) / 5643:8003 (mobile). Founder may prefer a purpose-built notification-preview list instead.</w:t>
+            </w:r>
+          </w:p>
+        </w:tc>
+      </w:tr>
+      <w:tr>
+        <w:tc>
+          <w:tcPr>
+            <w:tcW w:type="dxa" w:w="500"/>
+          </w:tcPr>
+          <w:p>
+            <w:r/>
+            <w:r>
+              <w:t>97</w:t>
+            </w:r>
+          </w:p>
+        </w:tc>
+        <w:tc>
+          <w:tcPr>
+            <w:tcW w:type="dxa" w:w="4700"/>
+          </w:tcPr>
+          <w:p>
+            <w:r/>
+            <w:r>
+              <w:t>File-wide off-palette red #fa0606 / near-red usages outside the notification bell — what token replaces them, given there is no color/action/destructive token (non-negotiable #3)?</w:t>
+            </w:r>
+          </w:p>
+        </w:tc>
+        <w:tc>
+          <w:tcPr>
+            <w:tcW w:type="dxa" w:w="1850"/>
+          </w:tcPr>
+          <w:p>
+            <w:r/>
+            <w:r>
+              <w:t>sprint-2/notification-bell-navbar-slot report</w:t>
+            </w:r>
+          </w:p>
+        </w:tc>
+        <w:tc>
+          <w:tcPr>
+            <w:tcW w:type="dxa" w:w="2300"/>
+          </w:tcPr>
+          <w:p>
+            <w:r/>
+            <w:r>
+              <w:t>Open (flag only — not touched this pass, per the task’s instruction to flag rather than change unrelated content). Found in: Sports Hub H2H (756:11) &amp; Standing (756:6433) win/loss form indicators (Rectangle 99, ~36 nodes); Admin Categories (128:488), Categories - Add Category (138:93), Users - team members (917:218) table-cell blocks (Rectangle 43, ~3); Mobile Drop Down Components (1870:2753) &amp; Messages mobile window 3 "Block User" labels (~4). All predate this task. Needs its own sweep + a decision on introducing a negative/destructive semantic token vs. deriving from the two-colour palette.</w:t>
+            </w:r>
+          </w:p>
+        </w:tc>
+      </w:tr>
+      <w:tr>
+        <w:tc>
+          <w:tcPr>
+            <w:tcW w:type="dxa" w:w="500"/>
+          </w:tcPr>
+          <w:p>
+            <w:r/>
+            <w:r>
+              <w:t>98</w:t>
+            </w:r>
+          </w:p>
+        </w:tc>
+        <w:tc>
+          <w:tcPr>
+            <w:tcW w:type="dxa" w:w="4700"/>
+          </w:tcPr>
+          <w:p>
+            <w:r/>
+            <w:r>
+              <w:t>Bants desktop room rows have a single status dot; mobile rows (PR #112) have an active/inactive distinction (Status Dot — active / — inactive).</w:t>
+            </w:r>
+          </w:p>
+        </w:tc>
+        <w:tc>
+          <w:tcPr>
+            <w:tcW w:type="dxa" w:w="1850"/>
+          </w:tcPr>
+          <w:p>
+            <w:r/>
+            <w:r>
+              <w:t>sprint-2/notification-bell-navbar-slot report</w:t>
+            </w:r>
+          </w:p>
+        </w:tc>
+        <w:tc>
+          <w:tcPr>
+            <w:tcW w:type="dxa" w:w="2300"/>
+          </w:tcPr>
+          <w:p>
+            <w:r/>
+            <w:r>
+              <w:t>Partially addressed: the desktop dot (Ellipse 67 in Group 403 / 2353:1610, 102 instances) was off-palette amber #DBA111 and is now bound to brand/green. Giving desktop rows a real active/inactive variant/boolean (to match mobile’s color/icon/inactive treatment for inactive rooms) is out of scope here — flagged for follow-up.</w:t>
             </w:r>
           </w:p>
         </w:tc>

</xml_diff>

<commit_message>
Avatar notification dropdown wiring + semantic/alert token; close #fa0606 sweep
Corrects PR #113's bell-slot plan per founder override: no new bell
component — the existing avatar IS the notification indicator.

- Task 1: rename 2819:4090/4089 -> Avatar/no notification, Avatar/notification (name only)
- Task 2: new semantic/alert token (#FA0606, Light=Dark), bound to Ellipse 98
- Task 3: ON_CLICK OPEN_OVERLAY on logged-in navbar avatars (2838:3579, 5387:7675)
- Task 4: Notification row -> NAVIGATE to Notification Centre 5640:7815
- Task 5: 110 loose #fa0606 paints bound to semantic/alert (1 YouTube-logo excluded)
- Decision Log: #93-96 SUPERSEDED, #97 RESOLVED; new #99-#103
- All 4 Navbar variants checked (header 7 desktop stray avatar 2841:4177 flagged)
- CLAUDE.md + report md + Build Plan Section 9 updated

Stacks on PR #113 (sprint-2/notification-bell-navbar-slot).

Co-Authored-By: Claude Sonnet 5 <noreply@anthropic.com>
</commit_message>
<xml_diff>
--- a/docs/Soccernity_MVP_Build_Plan_v1.7.docx
+++ b/docs/Soccernity_MVP_Build_Plan_v1.7.docx
@@ -13534,6 +13534,9 @@
             <w:r>
               <w:t>Open. Discovered while attempting DL #88’s follow-up. Building bell artwork into these node IDs (the brief’s Task 1 as written) would turn ~85 avatars file-wide into bells-behind-photos, so it was not done. Recommended: (a) rename 2819:4090 / 2819:4089 to Avatar/plain and Avatar/with status dot; retire the #fa0606 dot on 2819:4089 — replace with a brand/green presence dot (matching the room-row status-dot precedent) or drop it; (b) build the Navbar bell as a NEW Notification Bell component set (see #95), added to the logged-in Navbar action cluster between the messages glyph and the avatar. Blocked on founder/design-lead confirmation that the round Navbar photo is the user avatar (it opens the account-style Dropdown menu/* menu, so it clearly is).</w:t>
             </w:r>
+            <w:r>
+              <w:t xml:space="preserve">  [SUPERSEDED by sprint-2/avatar-notification-dropdown-wiring]: founder override — NO new Notification Bell component is built; the existing round avatar component IS the notification indicator (click opens the account dropdown; its Notification row carries the unread counter and links to the Notification Centre). See #99–#103.</w:t>
+            </w:r>
           </w:p>
         </w:tc>
       </w:tr>
@@ -13580,6 +13583,9 @@
             <w:r>
               <w:t>Proposed (recommend accept): bell on logged-in variants only (header 4, header 4 — mobile). Notifications require an account. Not yet built — depends on #93. Separately flagged: header 7 currently carries a covered/overlapping avatar instance (2841:4177), likely a pre-existing bug worth its own check.</w:t>
             </w:r>
+            <w:r>
+              <w:t xml:space="preserve">  [SUPERSEDED by sprint-2/avatar-notification-dropdown-wiring]: founder override — NO new Notification Bell component is built; the existing round avatar component IS the notification indicator (click opens the account dropdown; its Notification row carries the unread counter and links to the Notification Centre). See #99–#103.</w:t>
+            </w:r>
           </w:p>
         </w:tc>
       </w:tr>
@@ -13626,6 +13632,9 @@
             <w:r>
               <w:t>Proposed (recommend accept): a Has Unread boolean variant property (False default / True) on a new Notification Bell component set, swappable per instance. True variant adds the navy count-pill (frame brand/navy + number text color/text/on-navy) copied from Dropdown menu/notification on (Frame 5882 / 2841:5375-6) and PR #112’s Unread Count Badge (5640:7915). Bell glyph stroke = brand/navy. No #fa0606. Not yet built — depends on #93.</w:t>
             </w:r>
+            <w:r>
+              <w:t xml:space="preserve">  [SUPERSEDED by sprint-2/avatar-notification-dropdown-wiring]: founder override — NO new Notification Bell component is built; the existing round avatar component IS the notification indicator (click opens the account dropdown; its Notification row carries the unread counter and links to the Notification Centre). See #99–#103.</w:t>
+            </w:r>
           </w:p>
         </w:tc>
       </w:tr>
@@ -13672,6 +13681,9 @@
             <w:r>
               <w:t>Open. Dropdown menu/no notification (2841:5361) and Dropdown menu/notification on (2841:5363) have 0 instances and no prototype wiring anywhere — there is no existing interaction pattern to mirror, and both are account menus (Profile / Message / Notification / Settings / Log out), not notification lists. If reused: bell state maps to dropdown state (empty bell → no notification, badged bell → notification on), and a "See all notifications" row is added to the notification-on dropdown navigating to the PR #112 Notification Centre — 5640:7815 (desktop) / 5643:8003 (mobile). Founder may prefer a purpose-built notification-preview list instead.</w:t>
             </w:r>
+            <w:r>
+              <w:t xml:space="preserve">  [SUPERSEDED by sprint-2/avatar-notification-dropdown-wiring]: founder override — NO new Notification Bell component is built; the existing round avatar component IS the notification indicator (click opens the account dropdown; its Notification row carries the unread counter and links to the Notification Centre). See #99–#103.</w:t>
+            </w:r>
           </w:p>
         </w:tc>
       </w:tr>
@@ -13718,6 +13730,9 @@
             <w:r>
               <w:t>Open (flag only — not touched this pass, per the task’s instruction to flag rather than change unrelated content). Found in: Sports Hub H2H (756:11) &amp; Standing (756:6433) win/loss form indicators (Rectangle 99, ~36 nodes); Admin Categories (128:488), Categories - Add Category (138:93), Users - team members (917:218) table-cell blocks (Rectangle 43, ~3); Mobile Drop Down Components (1870:2753) &amp; Messages mobile window 3 "Block User" labels (~4). All predate this task. Needs its own sweep + a decision on introducing a negative/destructive semantic token vs. deriving from the two-colour palette.</w:t>
             </w:r>
+            <w:r>
+              <w:t xml:space="preserve">  [RESOLVED by sprint-2/avatar-notification-dropdown-wiring]: founder authorised a semantic/alert COLOR token (VariableID:5670:8226, #FA0606, same value Light and Dark) as a deliberate exception to non-negotiable #3 — red retained ONLY as a semantic loss/destructive/alert colour. All loose #fa0606 paints (110) rebound to it: Sports Hub H2H/Standing loss dots (Rectangle 99 ×29 + Rectangle 101 ×1), Admin table-cell blocks (Rectangle 43 ×3), Block User labels ×4 + block icons ×3, and 70 ant-design:delete-outlined trash-icon vectors found in the same audit. Excluded: 1 — the #fa0606 fill inside the YouTube-logo vector (761:13), an external brand mark. See #99.</w:t>
+            </w:r>
           </w:p>
         </w:tc>
       </w:tr>
@@ -13763,6 +13778,236 @@
             <w:r/>
             <w:r>
               <w:t>Partially addressed: the desktop dot (Ellipse 67 in Group 403 / 2353:1610, 102 instances) was off-palette amber #DBA111 and is now bound to brand/green. Giving desktop rows a real active/inactive variant/boolean (to match mobile’s color/icon/inactive treatment for inactive rooms) is out of scope here — flagged for follow-up.</w:t>
+            </w:r>
+          </w:p>
+        </w:tc>
+      </w:tr>
+      <w:tr>
+        <w:tc>
+          <w:tcPr>
+            <w:tcW w:type="dxa" w:w="500"/>
+          </w:tcPr>
+          <w:p>
+            <w:r/>
+            <w:r>
+              <w:t>99</w:t>
+            </w:r>
+          </w:p>
+        </w:tc>
+        <w:tc>
+          <w:tcPr>
+            <w:tcW w:type="dxa" w:w="4700"/>
+          </w:tcPr>
+          <w:p>
+            <w:r/>
+            <w:r>
+              <w:t>Naming and Light/Dark values for the semantic red token retained as a founder-authorised exception to non-negotiable #3.</w:t>
+            </w:r>
+          </w:p>
+        </w:tc>
+        <w:tc>
+          <w:tcPr>
+            <w:tcW w:type="dxa" w:w="1850"/>
+          </w:tcPr>
+          <w:p>
+            <w:r/>
+            <w:r>
+              <w:t>sprint-2/avatar-notification-dropdown-wiring report</w:t>
+            </w:r>
+          </w:p>
+        </w:tc>
+        <w:tc>
+          <w:tcPr>
+            <w:tcW w:type="dxa" w:w="2300"/>
+          </w:tcPr>
+          <w:p>
+            <w:r/>
+            <w:r>
+              <w:t>Resolved. Token: semantic/alert (VariableID:5670:8226) in the Soccernity Theme collection (VariableCollectionId:5096:2). Value #FA0606 kept as-is (it is already the value in ~110 places — a pure hex→token rebind, zero visual change) in BOTH Light and Dark modes: every use is a small non-text indicator, and a distinct dark red would risk reading as a different state; revisit the Dark value only if a future contrast pass finds a specific text use failing, and disclose it then. This is a deliberate, founder-authorised exception to the two-colour palette rule — red is permitted ONLY as a semantic loss / destructive / alert colour, now a single auditable bound token rather than loose hex. Bound at 2819:4084 (avatar unread dot) and across the 110 paints listed in #97.</w:t>
+            </w:r>
+          </w:p>
+        </w:tc>
+      </w:tr>
+      <w:tr>
+        <w:tc>
+          <w:tcPr>
+            <w:tcW w:type="dxa" w:w="500"/>
+          </w:tcPr>
+          <w:p>
+            <w:r/>
+            <w:r>
+              <w:t>100</w:t>
+            </w:r>
+          </w:p>
+        </w:tc>
+        <w:tc>
+          <w:tcPr>
+            <w:tcW w:type="dxa" w:w="4700"/>
+          </w:tcPr>
+          <w:p>
+            <w:r/>
+            <w:r>
+              <w:t>Should the avatar→account-dropdown click interaction live on the shared Avatar component or per Navbar instance?</w:t>
+            </w:r>
+          </w:p>
+        </w:tc>
+        <w:tc>
+          <w:tcPr>
+            <w:tcW w:type="dxa" w:w="1850"/>
+          </w:tcPr>
+          <w:p>
+            <w:r/>
+            <w:r>
+              <w:t>sprint-2/avatar-notification-dropdown-wiring report</w:t>
+            </w:r>
+          </w:p>
+        </w:tc>
+        <w:tc>
+          <w:tcPr>
+            <w:tcW w:type="dxa" w:w="2300"/>
+          </w:tcPr>
+          <w:p>
+            <w:r/>
+            <w:r>
+              <w:t>Resolved: per Navbar instance. The Avatar component has ~85 instances across the file (post authors, comment authors, member lists, etc.) — wiring the overlay on the component would make every one of them open the current user's account menu. ON_CLICK → OPEN_OVERLAY was wired only on the logged-in Navbar avatar instances: 2838:3579 (header 4 desktop) and 5387:7675 (header 4 — mobile), → Dropdown menu/no notification (2841:5361). The Avatar/notification component's own stale overlay target was corrected 2841:5361 → 2841:5363 (0 instances today, so harmless — makes a future instance swap inherit the right dropdown).</w:t>
+            </w:r>
+          </w:p>
+        </w:tc>
+      </w:tr>
+      <w:tr>
+        <w:tc>
+          <w:tcPr>
+            <w:tcW w:type="dxa" w:w="500"/>
+          </w:tcPr>
+          <w:p>
+            <w:r/>
+            <w:r>
+              <w:t>101</w:t>
+            </w:r>
+          </w:p>
+        </w:tc>
+        <w:tc>
+          <w:tcPr>
+            <w:tcW w:type="dxa" w:w="4700"/>
+          </w:tcPr>
+          <w:p>
+            <w:r/>
+            <w:r>
+              <w:t>The two Dropdown menu components are shared between desktop and mobile; a prototype reaction carries one target. Where does the Notification row route?</w:t>
+            </w:r>
+          </w:p>
+        </w:tc>
+        <w:tc>
+          <w:tcPr>
+            <w:tcW w:type="dxa" w:w="1850"/>
+          </w:tcPr>
+          <w:p>
+            <w:r/>
+            <w:r>
+              <w:t>sprint-2/avatar-notification-dropdown-wiring report</w:t>
+            </w:r>
+          </w:p>
+        </w:tc>
+        <w:tc>
+          <w:tcPr>
+            <w:tcW w:type="dxa" w:w="2300"/>
+          </w:tcPr>
+          <w:p>
+            <w:r/>
+            <w:r>
+              <w:t>Resolved for now, with a follow-up. ON_CLICK → NAVIGATE from the Notification row of both dropdowns (2841:5368 in "notification on", 2819:4077 in "no notification") routes to the DESKTOP Notification Centre 5640:7815 only. Routing mobile contexts to 5643:8003 needs a mobile-specific dropdown variant — open follow-up, not built here.</w:t>
+            </w:r>
+          </w:p>
+        </w:tc>
+      </w:tr>
+      <w:tr>
+        <w:tc>
+          <w:tcPr>
+            <w:tcW w:type="dxa" w:w="500"/>
+          </w:tcPr>
+          <w:p>
+            <w:r/>
+            <w:r>
+              <w:t>102</w:t>
+            </w:r>
+          </w:p>
+        </w:tc>
+        <w:tc>
+          <w:tcPr>
+            <w:tcW w:type="dxa" w:w="4700"/>
+          </w:tcPr>
+          <w:p>
+            <w:r/>
+            <w:r>
+              <w:t>The logged-out desktop Navbar variant "header 7" (2841:4104) carries a stray avatar instance (2841:4177).</w:t>
+            </w:r>
+          </w:p>
+        </w:tc>
+        <w:tc>
+          <w:tcPr>
+            <w:tcW w:type="dxa" w:w="1850"/>
+          </w:tcPr>
+          <w:p>
+            <w:r/>
+            <w:r>
+              <w:t>sprint-2/avatar-notification-dropdown-wiring report</w:t>
+            </w:r>
+          </w:p>
+        </w:tc>
+        <w:tc>
+          <w:tcPr>
+            <w:tcW w:type="dxa" w:w="2300"/>
+          </w:tcPr>
+          <w:p>
+            <w:r/>
+            <w:r>
+              <w:t>Open — recommend removal, pending founder OK. It contradicts the confirmed model (logged-out variants have no avatar and no account dropdown — "header 7 — mobile" correctly has none). Left in place and unwired (0 reactions) this pass rather than deleted from a shared component without confirmation.</w:t>
+            </w:r>
+          </w:p>
+        </w:tc>
+      </w:tr>
+      <w:tr>
+        <w:tc>
+          <w:tcPr>
+            <w:tcW w:type="dxa" w:w="500"/>
+          </w:tcPr>
+          <w:p>
+            <w:r/>
+            <w:r>
+              <w:t>103</w:t>
+            </w:r>
+          </w:p>
+        </w:tc>
+        <w:tc>
+          <w:tcPr>
+            <w:tcW w:type="dxa" w:w="4700"/>
+          </w:tcPr>
+          <w:p>
+            <w:r/>
+            <w:r>
+              <w:t>Combine the two Avatar/* components and the two Dropdown menu/* components into variant sets with a Has Unread boolean.</w:t>
+            </w:r>
+          </w:p>
+        </w:tc>
+        <w:tc>
+          <w:tcPr>
+            <w:tcW w:type="dxa" w:w="1850"/>
+          </w:tcPr>
+          <w:p>
+            <w:r/>
+            <w:r>
+              <w:t>sprint-2/avatar-notification-dropdown-wiring report</w:t>
+            </w:r>
+          </w:p>
+        </w:tc>
+        <w:tc>
+          <w:tcPr>
+            <w:tcW w:type="dxa" w:w="2300"/>
+          </w:tcPr>
+          <w:p>
+            <w:r/>
+            <w:r>
+              <w:t>Open follow-up. Today the read/unread states are two loose components each, and switching an instance means a manual component swap plus retargeting the overlay reaction. A Has Unread boolean variant on each set would let one instance-level toggle flip both the avatar dot and which dropdown opens. Supersedes PR #113's DL #95 (which proposed the same boolean on a NEW bell component that is no longer being built). Also open from the same area: overlayBackgroundInteraction = CLOSE_ON_CLICK_OUTSIDE could not be set (read-only on COMPONENT nodes) — click-outside-to-dismiss is a follow-up.</w:t>
             </w:r>
           </w:p>
         </w:tc>

</xml_diff>

<commit_message>
Avatar variant set + mobile account-dropdown family; close DL #101/#102/#103
- DL #101: mobile Notification row -> mobile Notification Centre (5643:8003)
  via new Dropdown menu/mobile - * pair (5685:9300/9312); desktop unchanged
- DL #102: removed stray hidden avatar 2841:4177 from logged-out header 7
- DL #103: Avatar/* -> Avatar COMPONENT_SET (5685:9241, Has Unread boolean),
  78 instances re-point cleanly; Dropdown menu/* kept as slash family
  (Figma rejects a variant as an OPEN_OVERLAY destination)
- click-outside-dismiss: not writable via plugin API; manual Figma-UI step
- Decision Log: #101/#102/#103 RESOLVED; new #104/#105/#106
- CLAUDE.md + report md updated

Stacks on PR #114 (sprint-2/avatar-notification-dropdown-wiring) -> PR #113.

Co-Authored-By: Claude Sonnet 5 <noreply@anthropic.com>
</commit_message>
<xml_diff>
--- a/docs/Soccernity_MVP_Build_Plan_v1.7.docx
+++ b/docs/Soccernity_MVP_Build_Plan_v1.7.docx
@@ -13917,6 +13917,9 @@
             <w:r>
               <w:t>Resolved for now, with a follow-up. ON_CLICK → NAVIGATE from the Notification row of both dropdowns (2841:5368 in "notification on", 2819:4077 in "no notification") routes to the DESKTOP Notification Centre 5640:7815 only. Routing mobile contexts to 5643:8003 needs a mobile-specific dropdown variant — open follow-up, not built here.</w:t>
             </w:r>
+            <w:r>
+              <w:t xml:space="preserve">  [RESOLVED by sprint-2/avatar-dropdown-variant-sets]: the mobile account-dropdown Notification row now navigates to the MOBILE Notification Centre (5643:8003) via a dedicated Dropdown menu/mobile - * component pair (5685:9300 / 5685:9312); the header 4 - mobile avatar overlay (5387:7675) points at it. Desktop keeps 5640:7815. Dropdown sizing: no mobile-resized variant needed - the 146x142 anchored menu fits the 390/428px mobile navbar; only the nav target differs. See #105.</w:t>
+            </w:r>
           </w:p>
         </w:tc>
       </w:tr>
@@ -13963,6 +13966,9 @@
             <w:r>
               <w:t>Open — recommend removal, pending founder OK. It contradicts the confirmed model (logged-out variants have no avatar and no account dropdown — "header 7 — mobile" correctly has none). Left in place and unwired (0 reactions) this pass rather than deleted from a shared component without confirmation.</w:t>
             </w:r>
+            <w:r>
+              <w:t xml:space="preserve">  [RESOLVED by sprint-2/avatar-dropdown-variant-sets]: the stray absolutely-positioned, z-order-hidden avatar instance 2841:4177 was removed from header 7 (2841:4104). Zero visual/layout change (screenshot diff clean on header 7 + Login/Register/Home/Forgot-Password-Sent; Login button and nav icons are absolute-positioned and did not move).</w:t>
+            </w:r>
           </w:p>
         </w:tc>
       </w:tr>
@@ -14008,6 +14014,147 @@
             <w:r/>
             <w:r>
               <w:t>Open follow-up. Today the read/unread states are two loose components each, and switching an instance means a manual component swap plus retargeting the overlay reaction. A Has Unread boolean variant on each set would let one instance-level toggle flip both the avatar dot and which dropdown opens. Supersedes PR #113's DL #95 (which proposed the same boolean on a NEW bell component that is no longer being built). Also open from the same area: overlayBackgroundInteraction = CLOSE_ON_CLICK_OUTSIDE could not be set (read-only on COMPONENT nodes) — click-outside-to-dismiss is a follow-up.</w:t>
+            </w:r>
+            <w:r>
+              <w:t xml:space="preserve">  [RESOLVED (partial by design) by sprint-2/avatar-dropdown-variant-sets]: Avatar/no notification (2819:4090) + Avatar/notification (2819:4089) are now the Avatar COMPONENT_SET (5685:9241), property Has Unread (boolean, default false); all 78 live instances on page 0:1 re-point cleanly, appearance and per-instance overlay reactions unchanged. Dropdown menu/* was deliberately NOT combined - Figma rejects a COMPONENT that is a variant inside a COMPONENT_SET as an OPEN_OVERLAY destination (see #104), which broke every avatar-&gt;dropdown overlay; it stays a slash-named family (see #105). Click-outside-dismiss: not settable via the plugin API (overlayBackgroundInteraction is readonly on every node type) - it is a one-checkbox manual step in the Figma desktop UI on the 3 avatar Open Overlay interactions (2838:3579, 5387:7675, 2819:4089) and a non-issue for figma-to-code (standard backdrop / useOnClickOutside). See #106.</w:t>
+            </w:r>
+          </w:p>
+        </w:tc>
+      </w:tr>
+      <w:tr>
+        <w:tc>
+          <w:tcPr>
+            <w:tcW w:type="dxa" w:w="500"/>
+          </w:tcPr>
+          <w:p>
+            <w:r/>
+            <w:r>
+              <w:t>104</w:t>
+            </w:r>
+          </w:p>
+        </w:tc>
+        <w:tc>
+          <w:tcPr>
+            <w:tcW w:type="dxa" w:w="4700"/>
+          </w:tcPr>
+          <w:p>
+            <w:r/>
+            <w:r>
+              <w:t>Figma limitation for future component work: can a COMPONENT that is a variant inside a COMPONENT_SET be an OPEN_OVERLAY destination?</w:t>
+            </w:r>
+          </w:p>
+        </w:tc>
+        <w:tc>
+          <w:tcPr>
+            <w:tcW w:type="dxa" w:w="1850"/>
+          </w:tcPr>
+          <w:p>
+            <w:r/>
+            <w:r>
+              <w:t>sprint-2/avatar-dropdown-variant-sets report</w:t>
+            </w:r>
+          </w:p>
+        </w:tc>
+        <w:tc>
+          <w:tcPr>
+            <w:tcW w:type="dxa" w:w="2300"/>
+          </w:tcPr>
+          <w:p>
+            <w:r/>
+            <w:r>
+              <w:t>Resolved (recorded as a constraint). No - Figma rejects it ("destination ... was rejected ... not reachable from this source"). Overlay-target components (menus, popovers, dropdowns, toasts) must stay standalone / slash-named, NOT variant sets. A variant used as an overlay SOURCE is fine (verified: the Avatar set's Has Unread=true variant re-set its own overlay reaction cleanly). Discovered while attempting DL #103 - the two account dropdowns were tried as a set and reverted.</w:t>
+            </w:r>
+          </w:p>
+        </w:tc>
+      </w:tr>
+      <w:tr>
+        <w:tc>
+          <w:tcPr>
+            <w:tcW w:type="dxa" w:w="500"/>
+          </w:tcPr>
+          <w:p>
+            <w:r/>
+            <w:r>
+              <w:t>105</w:t>
+            </w:r>
+          </w:p>
+        </w:tc>
+        <w:tc>
+          <w:tcPr>
+            <w:tcW w:type="dxa" w:w="4700"/>
+          </w:tcPr>
+          <w:p>
+            <w:r/>
+            <w:r>
+              <w:t>The account dropdown is a 4-member slash-named family, not a Breakpoint x Has Unread variant set.</w:t>
+            </w:r>
+          </w:p>
+        </w:tc>
+        <w:tc>
+          <w:tcPr>
+            <w:tcW w:type="dxa" w:w="1850"/>
+          </w:tcPr>
+          <w:p>
+            <w:r/>
+            <w:r>
+              <w:t>sprint-2/avatar-dropdown-variant-sets report</w:t>
+            </w:r>
+          </w:p>
+        </w:tc>
+        <w:tc>
+          <w:tcPr>
+            <w:tcW w:type="dxa" w:w="2300"/>
+          </w:tcPr>
+          <w:p>
+            <w:r/>
+            <w:r>
+              <w:t>Resolved (accepted, with a revisit condition). Dropdown menu/{,mobile - }{no notification,notification on} (2841:5361 / 2841:5363 / 5685:9300 / 5685:9312) - four loose components purely to carry desktop vs mobile NAVIGATE targets (5640:7815 vs 5643:8003), because #104 blocks a variant set here. If Figma later allows variant-set overlay destinations, collapse to a Breakpoint x Has Unread set.</w:t>
+            </w:r>
+          </w:p>
+        </w:tc>
+      </w:tr>
+      <w:tr>
+        <w:tc>
+          <w:tcPr>
+            <w:tcW w:type="dxa" w:w="500"/>
+          </w:tcPr>
+          <w:p>
+            <w:r/>
+            <w:r>
+              <w:t>106</w:t>
+            </w:r>
+          </w:p>
+        </w:tc>
+        <w:tc>
+          <w:tcPr>
+            <w:tcW w:type="dxa" w:w="4700"/>
+          </w:tcPr>
+          <w:p>
+            <w:r/>
+            <w:r>
+              <w:t>Click-outside-to-dismiss on the account dropdown overlay.</w:t>
+            </w:r>
+          </w:p>
+        </w:tc>
+        <w:tc>
+          <w:tcPr>
+            <w:tcW w:type="dxa" w:w="1850"/>
+          </w:tcPr>
+          <w:p>
+            <w:r/>
+            <w:r>
+              <w:t>sprint-2/avatar-dropdown-variant-sets report</w:t>
+            </w:r>
+          </w:p>
+        </w:tc>
+        <w:tc>
+          <w:tcPr>
+            <w:tcW w:type="dxa" w:w="2300"/>
+          </w:tcPr>
+          <w:p>
+            <w:r/>
+            <w:r>
+              <w:t>Open (manual follow-up). overlayBackgroundInteraction is declared readonly across the use_figma plugin API on every node type tested (COMPONENT and FRAME both throw; .d.ts confirms) - PR #114's note that it is "settable only on instances" is inaccurate for this environment; it is writable nowhere via the API, and the dropdowns have no instances. It is NOT blocked in Figma itself - a designer ticks "Close when clicking outside" on the 3 avatar Open Overlay interactions (2838:3579, 5387:7675, 2819:4089) in the desktop UI. Non-issue for figma-to-code (standard backdrop onClick / useOnClickOutside).</w:t>
             </w:r>
           </w:p>
         </w:tc>

</xml_diff>

<commit_message>
Mobile Settings leaves + Community 390px rebuild + Message pillar rebuild (Figma design only)
- 12 deeper Settings leaf mobile screens at 390px (5695:8213-5696:8384)
  + new Settings Toggle component set (5694:8219); 24 desktop copy bugs
  fixed and mirrored on mobile
- Community mobile 1-5 rebuilt at 390px with real auto-layout
  (5701:8239, 5703:8250, 5701:8328, 5702:8250, 5702:8317); originals archived
- Message pillar rebuilt desktop + mobile (5706:8271/5708:8184/5708:8362,
  5709:8354/5709:8419/5709:8461); window 3 -> component (5706:8270),
  closes DL #89 open item
- Colour audit: 945 paints / 99.4% bound, 0 off-palette, 0 green-tint-28
- Decision Log: #107-#120 added; #89 forward-pointer
- CLAUDE.md + report md updated

Design only, no app/backend code. Not merged.

Co-Authored-By: Claude Sonnet 5 <noreply@anthropic.com>
</commit_message>
<xml_diff>
--- a/docs/Soccernity_MVP_Build_Plan_v1.7.docx
+++ b/docs/Soccernity_MVP_Build_Plan_v1.7.docx
@@ -13362,6 +13362,9 @@
             <w:r>
               <w:t>Resolved (design). Windows 1 (1761:2342), 2 (1761:2321) and 4 (1762:2645) are list-of-chats / chat-window screens genuinely superseded by Message - List of chats / single chat page - mobile app (2067:3006 / 2067:3176) — renamed 'ARCHIVED — …', set visible:false, moved to an archive strip at y 26200 (not deleted). Window 3 (1762:2833, 311×177) is NOT a screen — it is a unique Mark as Read / View Profile / Block / Delete Chat context menu with no replacement anywhere — deliberately left live and untouched. Open: window 3 should become a proper component attached to the current mobile chat screens; the surviving 360px pair conflicts with #86's proposed 390 canon.</w:t>
             </w:r>
+            <w:r>
+              <w:t xml:space="preserve">  [Follow-up, sprint-2/mobile-settings-community-message-rebuild]: window 3 (1762:2833) is now a real component - Message - Conversation Actions Menu (5706:8270) instanced onto the rebuilt mobile chat screen. Open item CLOSED. See #115.</w:t>
+            </w:r>
           </w:p>
         </w:tc>
       </w:tr>
@@ -14155,6 +14158,650 @@
             <w:r/>
             <w:r>
               <w:t>Open (manual follow-up). overlayBackgroundInteraction is declared readonly across the use_figma plugin API on every node type tested (COMPONENT and FRAME both throw; .d.ts confirms) - PR #114's note that it is "settable only on instances" is inaccurate for this environment; it is writable nowhere via the API, and the dropdowns have no instances. It is NOT blocked in Figma itself - a designer ticks "Close when clicking outside" on the 3 avatar Open Overlay interactions (2838:3579, 5387:7675, 2819:4089) in the desktop UI. Non-issue for figma-to-code (standard backdrop onClick / useOnClickOutside).</w:t>
+            </w:r>
+          </w:p>
+        </w:tc>
+      </w:tr>
+      <w:tr>
+        <w:tc>
+          <w:tcPr>
+            <w:tcW w:type="dxa" w:w="500"/>
+          </w:tcPr>
+          <w:p>
+            <w:r/>
+            <w:r>
+              <w:t>107</w:t>
+            </w:r>
+          </w:p>
+        </w:tc>
+        <w:tc>
+          <w:tcPr>
+            <w:tcW w:type="dxa" w:w="4700"/>
+          </w:tcPr>
+          <w:p>
+            <w:r/>
+            <w:r>
+              <w:t>New Settings Toggle component vs. reusing the existing Toggle Switch (2927:10195).</w:t>
+            </w:r>
+          </w:p>
+        </w:tc>
+        <w:tc>
+          <w:tcPr>
+            <w:tcW w:type="dxa" w:w="1850"/>
+          </w:tcPr>
+          <w:p>
+            <w:r/>
+            <w:r>
+              <w:t>sprint-2/mobile-settings-community-message-rebuild report</w:t>
+            </w:r>
+          </w:p>
+        </w:tc>
+        <w:tc>
+          <w:tcPr>
+            <w:tcW w:type="dxa" w:w="2300"/>
+          </w:tcPr>
+          <w:p>
+            <w:r/>
+            <w:r>
+              <w:t>Resolved: built a new Settings Toggle COMPONENT_SET (5694:8219, State=On/Off) reusing only the visual language (green-wash rail, navy knob). 2927:10195 is a broken orphan - 92x87, two stacked instances not variants, a 10px rail, a child outside its own bounds, 0 instances file-wide. Recommend deleting 2927:10195.</w:t>
+            </w:r>
+          </w:p>
+        </w:tc>
+      </w:tr>
+      <w:tr>
+        <w:tc>
+          <w:tcPr>
+            <w:tcW w:type="dxa" w:w="500"/>
+          </w:tcPr>
+          <w:p>
+            <w:r/>
+            <w:r>
+              <w:t>108</w:t>
+            </w:r>
+          </w:p>
+        </w:tc>
+        <w:tc>
+          <w:tcPr>
+            <w:tcW w:type="dxa" w:w="4700"/>
+          </w:tcPr>
+          <w:p>
+            <w:r/>
+            <w:r>
+              <w:t>Deactivate Account destructive button colour.</w:t>
+            </w:r>
+          </w:p>
+        </w:tc>
+        <w:tc>
+          <w:tcPr>
+            <w:tcW w:type="dxa" w:w="1850"/>
+          </w:tcPr>
+          <w:p>
+            <w:r/>
+            <w:r>
+              <w:t>sprint-2/mobile-settings-community-message-rebuild report</w:t>
+            </w:r>
+          </w:p>
+        </w:tc>
+        <w:tc>
+          <w:tcPr>
+            <w:tcW w:type="dxa" w:w="2300"/>
+          </w:tcPr>
+          <w:p>
+            <w:r/>
+            <w:r>
+              <w:t>Resolved: navy button, not red. White on semantic/alert #FA0606 measures 4.12:1 (below the 4.5:1 AA threshold for a 14px label); navy + color/text/on-navy measures 12.6:1. semantic/alert is used only as a non-text left accent bar on the "What to know" card - same non-text scoping already applied to green.</w:t>
+            </w:r>
+          </w:p>
+        </w:tc>
+      </w:tr>
+      <w:tr>
+        <w:tc>
+          <w:tcPr>
+            <w:tcW w:type="dxa" w:w="500"/>
+          </w:tcPr>
+          <w:p>
+            <w:r/>
+            <w:r>
+              <w:t>109</w:t>
+            </w:r>
+          </w:p>
+        </w:tc>
+        <w:tc>
+          <w:tcPr>
+            <w:tcW w:type="dxa" w:w="4700"/>
+          </w:tcPr>
+          <w:p>
+            <w:r/>
+            <w:r>
+              <w:t>24 desktop copy fixes applied to already-built Settings leaf frames.</w:t>
+            </w:r>
+          </w:p>
+        </w:tc>
+        <w:tc>
+          <w:tcPr>
+            <w:tcW w:type="dxa" w:w="1850"/>
+          </w:tcPr>
+          <w:p>
+            <w:r/>
+            <w:r>
+              <w:t>sprint-2/mobile-settings-community-message-rebuild report</w:t>
+            </w:r>
+          </w:p>
+        </w:tc>
+        <w:tc>
+          <w:tcPr>
+            <w:tcW w:type="dxa" w:w="2300"/>
+          </w:tcPr>
+          <w:p>
+            <w:r/>
+            <w:r>
+              <w:t>Resolved (authorised by the task brief). 24 bugs fixed on the 12 source desktop frames and mirrored on the new mobile frames so the two do not diverge again - incl. a three-fragment unreadable list on Mute New Accounts, "Soccernity page" to "sessions", lowercase "soccernity.com", and five singular/plural/casing errors. Full list in the report section 4.</w:t>
+            </w:r>
+          </w:p>
+        </w:tc>
+      </w:tr>
+      <w:tr>
+        <w:tc>
+          <w:tcPr>
+            <w:tcW w:type="dxa" w:w="500"/>
+          </w:tcPr>
+          <w:p>
+            <w:r/>
+            <w:r>
+              <w:t>110</w:t>
+            </w:r>
+          </w:p>
+        </w:tc>
+        <w:tc>
+          <w:tcPr>
+            <w:tcW w:type="dxa" w:w="4700"/>
+          </w:tcPr>
+          <w:p>
+            <w:r/>
+            <w:r>
+              <w:t>Three Settings desktop leaves carry structural content leakage (live-control rows pasted from the wrong screen; overlapping duplicate headings).</w:t>
+            </w:r>
+          </w:p>
+        </w:tc>
+        <w:tc>
+          <w:tcPr>
+            <w:tcW w:type="dxa" w:w="1850"/>
+          </w:tcPr>
+          <w:p>
+            <w:r/>
+            <w:r>
+              <w:t>sprint-2/mobile-settings-community-message-rebuild report</w:t>
+            </w:r>
+          </w:p>
+        </w:tc>
+        <w:tc>
+          <w:tcPr>
+            <w:tcW w:type="dxa" w:w="2300"/>
+          </w:tcPr>
+          <w:p>
+            <w:r/>
+            <w:r>
+              <w:t>Open - flagged, NOT fixed this pass. (a) 2926:8764 Direct Messages and 2926:8996 Sensitive Content each carry a full "Authentication app" 2FA row copy-pasted from 2926:8294 where it belongs. (b) 2926:9721 / 2927:9954 / 2927:10205 each have an fs18 heading overlapping an fs16 labelled row at the same coords; 2927:10205 (Email) carries a "Push notification" row. These are rows with live checkbox controls - fixing them is layout surgery on built screens (figma-design-system domain) plus a product decision on what belongs there. The new mobile screens omit the leaked blocks, so desktop and mobile deliberately diverge on these three until resolved. Also rename 2926:8996 once resolved - its name describes the leaked content.</w:t>
+            </w:r>
+          </w:p>
+        </w:tc>
+      </w:tr>
+      <w:tr>
+        <w:tc>
+          <w:tcPr>
+            <w:tcW w:type="dxa" w:w="500"/>
+          </w:tcPr>
+          <w:p>
+            <w:r/>
+            <w:r>
+              <w:t>111</w:t>
+            </w:r>
+          </w:p>
+        </w:tc>
+        <w:tc>
+          <w:tcPr>
+            <w:tcW w:type="dxa" w:w="4700"/>
+          </w:tcPr>
+          <w:p>
+            <w:r/>
+            <w:r>
+              <w:t>PR #112 recorded "Community Home Page Template (1306:7149) renders nothing" - is that accurate?</w:t>
+            </w:r>
+          </w:p>
+        </w:tc>
+        <w:tc>
+          <w:tcPr>
+            <w:tcW w:type="dxa" w:w="1850"/>
+          </w:tcPr>
+          <w:p>
+            <w:r/>
+            <w:r>
+              <w:t>sprint-2/mobile-settings-community-message-rebuild report</w:t>
+            </w:r>
+          </w:p>
+        </w:tc>
+        <w:tc>
+          <w:tcPr>
+            <w:tcW w:type="dxa" w:w="2300"/>
+          </w:tcPr>
+          <w:p>
+            <w:r/>
+            <w:r>
+              <w:t>Resolved (correction). No - the COMPONENT_SET and its instance 1308:11643 are visible:false, but both variants are fully populated (100/102 children, 111 text nodes each). Read programmatically; visibility left exactly as found. No fallback content source was needed for the Community mobile rebuild. Whether the template should be unhidden, promoted, or archived is a founder call.</w:t>
+            </w:r>
+          </w:p>
+        </w:tc>
+      </w:tr>
+      <w:tr>
+        <w:tc>
+          <w:tcPr>
+            <w:tcW w:type="dxa" w:w="500"/>
+          </w:tcPr>
+          <w:p>
+            <w:r/>
+            <w:r>
+              <w:t>112</w:t>
+            </w:r>
+          </w:p>
+        </w:tc>
+        <w:tc>
+          <w:tcPr>
+            <w:tcW w:type="dxa" w:w="4700"/>
+          </w:tcPr>
+          <w:p>
+            <w:r/>
+            <w:r>
+              <w:t>Community mobile rebuild - placeholder (lorem ipsum) post bodies in the legacy frames.</w:t>
+            </w:r>
+          </w:p>
+        </w:tc>
+        <w:tc>
+          <w:tcPr>
+            <w:tcW w:type="dxa" w:w="1850"/>
+          </w:tcPr>
+          <w:p>
+            <w:r/>
+            <w:r>
+              <w:t>sprint-2/mobile-settings-community-message-rebuild report</w:t>
+            </w:r>
+          </w:p>
+        </w:tc>
+        <w:tc>
+          <w:tcPr>
+            <w:tcW w:type="dxa" w:w="2300"/>
+          </w:tcPr>
+          <w:p>
+            <w:r/>
+            <w:r>
+              <w:t>Resolved: replaced with plausible grassroots-football sample copy (Sunday league at Rowe Park; a five-a-side pitch booking question). Illustrative sample content, not approved product copy. Reproducing lorem ipsum in a rebuild would present placeholder as design intent.</w:t>
+            </w:r>
+          </w:p>
+        </w:tc>
+      </w:tr>
+      <w:tr>
+        <w:tc>
+          <w:tcPr>
+            <w:tcW w:type="dxa" w:w="500"/>
+          </w:tcPr>
+          <w:p>
+            <w:r/>
+            <w:r>
+              <w:t>113</w:t>
+            </w:r>
+          </w:p>
+        </w:tc>
+        <w:tc>
+          <w:tcPr>
+            <w:tcW w:type="dxa" w:w="4700"/>
+          </w:tcPr>
+          <w:p>
+            <w:r/>
+            <w:r>
+              <w:t>Avatars in the new frames - photographs vs. tokenised initial discs.</w:t>
+            </w:r>
+          </w:p>
+        </w:tc>
+        <w:tc>
+          <w:tcPr>
+            <w:tcW w:type="dxa" w:w="1850"/>
+          </w:tcPr>
+          <w:p>
+            <w:r/>
+            <w:r>
+              <w:t>sprint-2/mobile-settings-community-message-rebuild report</w:t>
+            </w:r>
+          </w:p>
+        </w:tc>
+        <w:tc>
+          <w:tcPr>
+            <w:tcW w:type="dxa" w:w="2300"/>
+          </w:tcPr>
+          <w:p>
+            <w:r/>
+            <w:r>
+              <w:t>Resolved: every avatar authored in this delivery is a brand/green-tint disc with navy initials, so the new frames carry zero unbound image paints. Only image fills left are inside shared Navbar instances. Precedent: PR #112 Notification Centre avatar discs.</w:t>
+            </w:r>
+          </w:p>
+        </w:tc>
+      </w:tr>
+      <w:tr>
+        <w:tc>
+          <w:tcPr>
+            <w:tcW w:type="dxa" w:w="500"/>
+          </w:tcPr>
+          <w:p>
+            <w:r/>
+            <w:r>
+              <w:t>114</w:t>
+            </w:r>
+          </w:p>
+        </w:tc>
+        <w:tc>
+          <w:tcPr>
+            <w:tcW w:type="dxa" w:w="4700"/>
+          </w:tcPr>
+          <w:p>
+            <w:r/>
+            <w:r>
+              <w:t>Which Message frames are canonical after the rebuild?</w:t>
+            </w:r>
+          </w:p>
+        </w:tc>
+        <w:tc>
+          <w:tcPr>
+            <w:tcW w:type="dxa" w:w="1850"/>
+          </w:tcPr>
+          <w:p>
+            <w:r/>
+            <w:r>
+              <w:t>sprint-2/mobile-settings-community-message-rebuild report</w:t>
+            </w:r>
+          </w:p>
+        </w:tc>
+        <w:tc>
+          <w:tcPr>
+            <w:tcW w:type="dxa" w:w="2300"/>
+          </w:tcPr>
+          <w:p>
+            <w:r/>
+            <w:r>
+              <w:t>Open - founder call. Nothing was deleted: legacy 1871:2762, 2025:8112, 2067:3006, 2067:3176 are hidden and prefixed "ARCHIVED -". Same three-frames-coexist shape as the homepage (Decision Log #46). Recommend confirming the 6 new Message frames (5706:8271 / 5708:8184 / 5708:8362 desktop; 5709:8354 / 5709:8419 / 5709:8461 mobile) as canonical, then deciding whether the archived Message frames - and the 5 archived Community mobile frames - should be deleted outright.</w:t>
+            </w:r>
+          </w:p>
+        </w:tc>
+      </w:tr>
+      <w:tr>
+        <w:tc>
+          <w:tcPr>
+            <w:tcW w:type="dxa" w:w="500"/>
+          </w:tcPr>
+          <w:p>
+            <w:r/>
+            <w:r>
+              <w:t>115</w:t>
+            </w:r>
+          </w:p>
+        </w:tc>
+        <w:tc>
+          <w:tcPr>
+            <w:tcW w:type="dxa" w:w="4700"/>
+          </w:tcPr>
+          <w:p>
+            <w:r/>
+            <w:r>
+              <w:t>Messages mobile window 3 (1762:2833) - DL #89 left open that it should become a proper component attached to the mobile chat screen.</w:t>
+            </w:r>
+          </w:p>
+        </w:tc>
+        <w:tc>
+          <w:tcPr>
+            <w:tcW w:type="dxa" w:w="1850"/>
+          </w:tcPr>
+          <w:p>
+            <w:r/>
+            <w:r>
+              <w:t>sprint-2/mobile-settings-community-message-rebuild report</w:t>
+            </w:r>
+          </w:p>
+        </w:tc>
+        <w:tc>
+          <w:tcPr>
+            <w:tcW w:type="dxa" w:w="2300"/>
+          </w:tcPr>
+          <w:p>
+            <w:r/>
+            <w:r>
+              <w:t>Resolved - closes DL #89 open item. Built as Message - Conversation Actions Menu (5706:8270), instanced onto Message - Conversation (Actions Menu Open) - Mobile. Two real defects fixed in the process: it had no usable background (only ever looked right on white canvas) and a navy-on-navy row highlight. "Block User" stays semantic/alert.</w:t>
+            </w:r>
+          </w:p>
+        </w:tc>
+      </w:tr>
+      <w:tr>
+        <w:tc>
+          <w:tcPr>
+            <w:tcW w:type="dxa" w:w="500"/>
+          </w:tcPr>
+          <w:p>
+            <w:r/>
+            <w:r>
+              <w:t>116</w:t>
+            </w:r>
+          </w:p>
+        </w:tc>
+        <w:tc>
+          <w:tcPr>
+            <w:tcW w:type="dxa" w:w="4700"/>
+          </w:tcPr>
+          <w:p>
+            <w:r/>
+            <w:r>
+              <w:t>Message desktop states.</w:t>
+            </w:r>
+          </w:p>
+        </w:tc>
+        <w:tc>
+          <w:tcPr>
+            <w:tcW w:type="dxa" w:w="1850"/>
+          </w:tcPr>
+          <w:p>
+            <w:r/>
+            <w:r>
+              <w:t>sprint-2/mobile-settings-community-message-rebuild report</w:t>
+            </w:r>
+          </w:p>
+        </w:tc>
+        <w:tc>
+          <w:tcPr>
+            <w:tcW w:type="dxa" w:w="2300"/>
+          </w:tcPr>
+          <w:p>
+            <w:r/>
+            <w:r>
+              <w:t>Resolved: split from 2 into 3. The original "no message page" conflated "no conversation selected" with "empty inbox" and showed a populated 8-conversation list beside empty-inbox copy. Now three distinct, non-contradictory states.</w:t>
+            </w:r>
+          </w:p>
+        </w:tc>
+      </w:tr>
+      <w:tr>
+        <w:tc>
+          <w:tcPr>
+            <w:tcW w:type="dxa" w:w="500"/>
+          </w:tcPr>
+          <w:p>
+            <w:r/>
+            <w:r>
+              <w:t>117</w:t>
+            </w:r>
+          </w:p>
+        </w:tc>
+        <w:tc>
+          <w:tcPr>
+            <w:tcW w:type="dxa" w:w="4700"/>
+          </w:tcPr>
+          <w:p>
+            <w:r/>
+            <w:r>
+              <w:t>File-wide authoring gotcha: a variable-bound paint takes its alpha from the variable, not from the paint’s own opacity.</w:t>
+            </w:r>
+          </w:p>
+        </w:tc>
+        <w:tc>
+          <w:tcPr>
+            <w:tcW w:type="dxa" w:w="1850"/>
+          </w:tcPr>
+          <w:p>
+            <w:r/>
+            <w:r>
+              <w:t>sprint-2/mobile-settings-community-message-rebuild report</w:t>
+            </w:r>
+          </w:p>
+        </w:tc>
+        <w:tc>
+          <w:tcPr>
+            <w:tcW w:type="dxa" w:w="2300"/>
+          </w:tcPr>
+          <w:p>
+            <w:r/>
+            <w:r>
+              <w:t>Recorded (belongs in the file Figma notes alongside the existing setBoundVariableForPaint warning). Setting {opacity: 0.3} then setBoundVariableForPaint(..., brand/navy) yields a fully opaque paint (brand/navy is #282E65 alpha 1) - it silently produced two solid-navy scrims here. Consequences: (a) translucency must come from a token that carries its own alpha (brand/green-tint 12%, color/icon/inactive 15%, color/text/secondary 70%) or opacity re-applied to a copy of the paint AFTER binding; (b) a prior "0 unbound paints" audit may have passed while a paint still rendered at the wrong alpha.</w:t>
+            </w:r>
+          </w:p>
+        </w:tc>
+      </w:tr>
+      <w:tr>
+        <w:tc>
+          <w:tcPr>
+            <w:tcW w:type="dxa" w:w="500"/>
+          </w:tcPr>
+          <w:p>
+            <w:r/>
+            <w:r>
+              <w:t>118</w:t>
+            </w:r>
+          </w:p>
+        </w:tc>
+        <w:tc>
+          <w:tcPr>
+            <w:tcW w:type="dxa" w:w="4700"/>
+          </w:tcPr>
+          <w:p>
+            <w:r/>
+            <w:r>
+              <w:t>No elevation/shadow token exists in the file.</w:t>
+            </w:r>
+          </w:p>
+        </w:tc>
+        <w:tc>
+          <w:tcPr>
+            <w:tcW w:type="dxa" w:w="1850"/>
+          </w:tcPr>
+          <w:p>
+            <w:r/>
+            <w:r>
+              <w:t>sprint-2/mobile-settings-community-message-rebuild report</w:t>
+            </w:r>
+          </w:p>
+        </w:tc>
+        <w:tc>
+          <w:tcPr>
+            <w:tcW w:type="dxa" w:w="2300"/>
+          </w:tcPr>
+          <w:p>
+            <w:r/>
+            <w:r>
+              <w:t>Open (pre-existing, already noted in CLAUDE.md - now with a concrete dependent). The Message Actions Menu overlay uses a 1px color/icon/inactive border instead of a drop shadow. A shadow/elevation token convention is still unresolved.</w:t>
+            </w:r>
+          </w:p>
+        </w:tc>
+      </w:tr>
+      <w:tr>
+        <w:tc>
+          <w:tcPr>
+            <w:tcW w:type="dxa" w:w="500"/>
+          </w:tcPr>
+          <w:p>
+            <w:r/>
+            <w:r>
+              <w:t>119</w:t>
+            </w:r>
+          </w:p>
+        </w:tc>
+        <w:tc>
+          <w:tcPr>
+            <w:tcW w:type="dxa" w:w="4700"/>
+          </w:tcPr>
+          <w:p>
+            <w:r/>
+            <w:r>
+              <w:t>Mobile frame height convention is inconsistent.</w:t>
+            </w:r>
+          </w:p>
+        </w:tc>
+        <w:tc>
+          <w:tcPr>
+            <w:tcW w:type="dxa" w:w="1850"/>
+          </w:tcPr>
+          <w:p>
+            <w:r/>
+            <w:r>
+              <w:t>sprint-2/mobile-settings-community-message-rebuild report</w:t>
+            </w:r>
+          </w:p>
+        </w:tc>
+        <w:tc>
+          <w:tcPr>
+            <w:tcW w:type="dxa" w:w="2300"/>
+          </w:tcPr>
+          <w:p>
+            <w:r/>
+            <w:r>
+              <w:t>Open. The two Message conversation screens and the Community drawer are fixed 844px viewports (pinned composer, full-height overlays); the other new mobile frames hug their content, matching the existing Settings mobile family; the retained empty state 5648:8054 is 602. Worth settling one convention.</w:t>
+            </w:r>
+          </w:p>
+        </w:tc>
+      </w:tr>
+      <w:tr>
+        <w:tc>
+          <w:tcPr>
+            <w:tcW w:type="dxa" w:w="500"/>
+          </w:tcPr>
+          <w:p>
+            <w:r/>
+            <w:r>
+              <w:t>120</w:t>
+            </w:r>
+          </w:p>
+        </w:tc>
+        <w:tc>
+          <w:tcPr>
+            <w:tcW w:type="dxa" w:w="4700"/>
+          </w:tcPr>
+          <w:p>
+            <w:r/>
+            <w:r>
+              <w:t>Section "banners" on page 0:1 are display-size TEXT nodes (font size 770), not coverage rectangles / SECTION nodes.</w:t>
+            </w:r>
+          </w:p>
+        </w:tc>
+        <w:tc>
+          <w:tcPr>
+            <w:tcW w:type="dxa" w:w="1850"/>
+          </w:tcPr>
+          <w:p>
+            <w:r/>
+            <w:r>
+              <w:t>sprint-2/mobile-settings-community-message-rebuild report</w:t>
+            </w:r>
+          </w:p>
+        </w:tc>
+        <w:tc>
+          <w:tcPr>
+            <w:tcW w:type="dxa" w:w="2300"/>
+          </w:tcPr>
+          <w:p>
+            <w:r/>
+            <w:r>
+              <w:t>Recorded. "Widening a banner to cover" new frames would mean stretching a single word to ~19,000px for no visual effect. Instead added Section Title - Settings (Mobile) (5698:8239) above the mobile strip, matching the newer Section Title - ... convention (Guardian Consent / Club Picker / Notification Centre). New Message desktop frames sit in the slot the archived originals vacated (under the existing "Message" banner); new Message mobile frames fall inside the "Message Mobile" banner span.</w:t>
             </w:r>
           </w:p>
         </w:tc>

</xml_diff>

<commit_message>
Component hygiene: desktop Settings toggles -> Settings Toggle component; archive dead component families
- Task 1: 13 desktop Settings toggle controls (11 raw rects + 2 Component 22
  sliders) swapped to Settings Toggle (5694:8219); dead Toggle Switch
  2927:10195 (+ nested Component 22/23) deleted; 0 broken instances after
- Task 2: sidebar-nav variant "Disolay and language" -> "Display and language"
  (2906:7226); 17 instances auto-migrated, 0 detached
- Task 3: dead Mobile Drop Down Components (1870:2753) -> "Old -" prefix;
  Build Plan Section 6 Sprint 3 DM citation flagged for founder correction
- Task 4: abandoned Mobile App Nav Icons (2230:4328) -> "Old -" prefix
- Decision Log: #121-#124 added
- CLAUDE.md + report md updated

Stacks on PR #116. Design only, no app/backend code. Not merged.

Co-Authored-By: Claude Sonnet 5 <noreply@anthropic.com>
</commit_message>
<xml_diff>
--- a/docs/Soccernity_MVP_Build_Plan_v1.7.docx
+++ b/docs/Soccernity_MVP_Build_Plan_v1.7.docx
@@ -14802,6 +14802,190 @@
             <w:r/>
             <w:r>
               <w:t>Recorded. "Widening a banner to cover" new frames would mean stretching a single word to ~19,000px for no visual effect. Instead added Section Title - Settings (Mobile) (5698:8239) above the mobile strip, matching the newer Section Title - ... convention (Guardian Consent / Club Picker / Notification Centre). New Message desktop frames sit in the slot the archived originals vacated (under the existing "Message" banner); new Message mobile frames fall inside the "Message Mobile" banner span.</w:t>
+            </w:r>
+          </w:p>
+        </w:tc>
+      </w:tr>
+      <w:tr>
+        <w:tc>
+          <w:tcPr>
+            <w:tcW w:type="dxa" w:w="500"/>
+          </w:tcPr>
+          <w:p>
+            <w:r/>
+            <w:r>
+              <w:t>121</w:t>
+            </w:r>
+          </w:p>
+        </w:tc>
+        <w:tc>
+          <w:tcPr>
+            <w:tcW w:type="dxa" w:w="4700"/>
+          </w:tcPr>
+          <w:p>
+            <w:r/>
+            <w:r>
+              <w:t>Desktop Settings screens use raw one-off rectangles for toggle switches, not a component.</w:t>
+            </w:r>
+          </w:p>
+        </w:tc>
+        <w:tc>
+          <w:tcPr>
+            <w:tcW w:type="dxa" w:w="1850"/>
+          </w:tcPr>
+          <w:p>
+            <w:r/>
+            <w:r>
+              <w:t>sprint-2/component-hygiene-toggles-nav report</w:t>
+            </w:r>
+          </w:p>
+        </w:tc>
+        <w:tc>
+          <w:tcPr>
+            <w:tcW w:type="dxa" w:w="2300"/>
+          </w:tcPr>
+          <w:p>
+            <w:r/>
+            <w:r>
+              <w:t>Resolved (Figma design). 13 effectively-visible desktop Settings toggle controls (11 raw Rectangle 352 squares + 2 Component 22 sliders) replaced with Settings Toggle (5694:8219) State=Off instances, pixel-pinned to the original slot (component swap, not redesign). Settings Toggle instances file-wide 13 -&gt; 26. Dead Toggle Switch 2927:10195 deleted (0 instances file-wide); its nested Component 22 (2927:10191) / Component 23 (2927:10192) definitions went with it (0 external instances after the swap; 0 broken instances file-wide afterwards). 5 effectively-hidden Rectangle 352 squares inside visible:false template scaffolding (Frame 5920 / Frame 5927) left in place - non-rendering; a future Settings-desktop layout pass should remove that abandoned scaffolding wholesale.</w:t>
+            </w:r>
+          </w:p>
+        </w:tc>
+      </w:tr>
+      <w:tr>
+        <w:tc>
+          <w:tcPr>
+            <w:tcW w:type="dxa" w:w="500"/>
+          </w:tcPr>
+          <w:p>
+            <w:r/>
+            <w:r>
+              <w:t>122</w:t>
+            </w:r>
+          </w:p>
+        </w:tc>
+        <w:tc>
+          <w:tcPr>
+            <w:tcW w:type="dxa" w:w="4700"/>
+          </w:tcPr>
+          <w:p>
+            <w:r/>
+            <w:r>
+              <w:t>Settings sidebar-nav component (Frame 5904 / 2906:7170) has a variant property value literally misspelled "Disolay and language" (2906:7226).</w:t>
+            </w:r>
+          </w:p>
+        </w:tc>
+        <w:tc>
+          <w:tcPr>
+            <w:tcW w:type="dxa" w:w="1850"/>
+          </w:tcPr>
+          <w:p>
+            <w:r/>
+            <w:r>
+              <w:t>sprint-2/component-hygiene-toggles-nav report</w:t>
+            </w:r>
+          </w:p>
+        </w:tc>
+        <w:tc>
+          <w:tcPr>
+            <w:tcW w:type="dxa" w:w="2300"/>
+          </w:tcPr>
+          <w:p>
+            <w:r/>
+            <w:r>
+              <w:t>Resolved (variant value); label wording follow-up open. Variant value Property 1=Disolay and language -&gt; Property 1=Display and language. NOT renamed to the standardised visible label "Display, Language and Region" because a comma in a single-property Figma variant value is parsed as a property separator and would corrupt instance-&gt;variant resolution. All 17 instances auto-migrated to the corrected value (same IDs), 0 detached, set total unchanged at 90. Open sub-item: the component internal visible label still renders "Display, Languages And Region" (plural) vs PR #114 standardised "Display, Language and Region" - a ~90-instance text change, deferred to its own pass.</w:t>
+            </w:r>
+          </w:p>
+        </w:tc>
+      </w:tr>
+      <w:tr>
+        <w:tc>
+          <w:tcPr>
+            <w:tcW w:type="dxa" w:w="500"/>
+          </w:tcPr>
+          <w:p>
+            <w:r/>
+            <w:r>
+              <w:t>123</w:t>
+            </w:r>
+          </w:p>
+        </w:tc>
+        <w:tc>
+          <w:tcPr>
+            <w:tcW w:type="dxa" w:w="4700"/>
+          </w:tcPr>
+          <w:p>
+            <w:r/>
+            <w:r>
+              <w:t>Build Plan Section 6 Sprint 3 messaging bullet cites "the existing Drop Down Components chat frames" as the DM source; that component family is dead and PR #116 built the real Message pillar without it.</w:t>
+            </w:r>
+          </w:p>
+        </w:tc>
+        <w:tc>
+          <w:tcPr>
+            <w:tcW w:type="dxa" w:w="1850"/>
+          </w:tcPr>
+          <w:p>
+            <w:r/>
+            <w:r>
+              <w:t>sprint-2/component-hygiene-toggles-nav report</w:t>
+            </w:r>
+          </w:p>
+        </w:tc>
+        <w:tc>
+          <w:tcPr>
+            <w:tcW w:type="dxa" w:w="2300"/>
+          </w:tcPr>
+          <w:p>
+            <w:r/>
+            <w:r>
+              <w:t>Component archived (Resolved); Section 6 citation correction OPEN - founder sign-off. Mobile Drop Down Components set (1870:2753, 8 variants: 1870:2745-2752) has 0 instances file-wide -&gt; renamed "Old - Mobile Drop Down Components", left in place. OPEN: Build Plan Section 6 Sprint 3 messaging bullet must be corrected to reference PR #116 live Message pillar (Message - Conversation Actions Menu 5706:8270 + the 6 new Message frames) instead of the dead Drop Down Components family. To be actioned in a separate documentation pass once approved - this pass deliberately did not edit the .docx Section 6 text.</w:t>
+            </w:r>
+          </w:p>
+        </w:tc>
+      </w:tr>
+      <w:tr>
+        <w:tc>
+          <w:tcPr>
+            <w:tcW w:type="dxa" w:w="500"/>
+          </w:tcPr>
+          <w:p>
+            <w:r/>
+            <w:r>
+              <w:t>124</w:t>
+            </w:r>
+          </w:p>
+        </w:tc>
+        <w:tc>
+          <w:tcPr>
+            <w:tcW w:type="dxa" w:w="4700"/>
+          </w:tcPr>
+          <w:p>
+            <w:r/>
+            <w:r>
+              <w:t>Abandoned 7-variant bottom-nav icon component set (2230:4321-4327).</w:t>
+            </w:r>
+          </w:p>
+        </w:tc>
+        <w:tc>
+          <w:tcPr>
+            <w:tcW w:type="dxa" w:w="1850"/>
+          </w:tcPr>
+          <w:p>
+            <w:r/>
+            <w:r>
+              <w:t>sprint-2/component-hygiene-toggles-nav report</w:t>
+            </w:r>
+          </w:p>
+        </w:tc>
+        <w:tc>
+          <w:tcPr>
+            <w:tcW w:type="dxa" w:w="2300"/>
+          </w:tcPr>
+          <w:p>
+            <w:r/>
+            <w:r>
+              <w:t>Resolved (Figma design). Mobile App Nav Icons set (2230:4328, 7 variants: fixture/leaderboard/settings/home/news/message/notification) has 0 instances on page 0:1 (2 home-variant instances exist only on the ignored dump scratch page) -&gt; renamed "Old - Mobile App Nav Icons", not deleted. An alternate bottom-tab mobile-nav concept never adopted; every real mobile screen uses the top Navbar.</w:t>
             </w:r>
           </w:p>
         </w:tc>

</xml_diff>

<commit_message>
Settings sidebar-nav label -> singular; delete 5 dead rects; apply DL #123 docx correction
- Task 1: sidebar-nav Display-row label characters "display, languages and
  region" -> "Display, Language and Region" on all 3 states (2906:7227,
  2906:7232, 2922:6352); textCase TITLE kept; 90 instances intact, 0 detach
- Task 2: deleted 5 dead visible:false Rectangle 352 rects (2926:8175,
  2926:9351, 2926:9844, 2927:10080, 2926:9605) - confirmed 0 reactions,
  input-bg leftovers in live Frame 5914 rows (not hidden scaffolding)
- Task 3: Build Plan Section 6 Sprint 3 messaging bullet rewritten to cite
  the PR #116 Message pillar; DL #123 status appended RESOLVED
  (founder-approved); DL #125/#126 added
- CLAUDE.md + report md updated

Stacks on PR #117 -> PR #116. Design + docs only, no app/backend code. Not merged.

Co-Authored-By: Claude Sonnet 5 <noreply@anthropic.com>
</commit_message>
<xml_diff>
--- a/docs/Soccernity_MVP_Build_Plan_v1.7.docx
+++ b/docs/Soccernity_MVP_Build_Plan_v1.7.docx
@@ -6784,7 +6784,7 @@
         <w:spacing w:after="90"/>
       </w:pPr>
       <w:r>
-        <w:t xml:space="preserve">Build direct messaging (conversations, message threads) from the existing Drop Down Components chat frames.</w:t>
+        <w:t>Build direct messaging (conversations, message threads) from the Message pillar (desktop + mobile conversation screens and the Conversation Actions Menu component, node 5706:8270) shipped in PR #116 — the earlier "Drop Down Components chat frames" family is dead (0 live instances) and has been archived (Old — Mobile Drop Down Components). Corrected per DL #123.</w:t>
       </w:r>
     </w:p>
     <w:p>
@@ -14939,7 +14939,7 @@
           <w:p>
             <w:r/>
             <w:r>
-              <w:t>Component archived (Resolved); Section 6 citation correction OPEN - founder sign-off. Mobile Drop Down Components set (1870:2753, 8 variants: 1870:2745-2752) has 0 instances file-wide -&gt; renamed "Old - Mobile Drop Down Components", left in place. OPEN: Build Plan Section 6 Sprint 3 messaging bullet must be corrected to reference PR #116 live Message pillar (Message - Conversation Actions Menu 5706:8270 + the 6 new Message frames) instead of the dead Drop Down Components family. To be actioned in a separate documentation pass once approved - this pass deliberately did not edit the .docx Section 6 text.</w:t>
+              <w:t>Component archived (Resolved); Section 6 citation correction OPEN - founder sign-off. Mobile Drop Down Components set (1870:2753, 8 variants: 1870:2745-2752) has 0 instances file-wide -&gt; renamed "Old - Mobile Drop Down Components", left in place. OPEN: Build Plan Section 6 Sprint 3 messaging bullet must be corrected to reference PR #116 live Message pillar (Message - Conversation Actions Menu 5706:8270 + the 6 new Message frames) instead of the dead Drop Down Components family. To be actioned in a separate documentation pass once approved - this pass deliberately did not edit the .docx Section 6 text. RESOLVED (founder-approved) — Section 6 Sprint 3 messaging bullet corrected to cite the Message pillar (PR #116) instead of the dead Drop Down Components family.</w:t>
             </w:r>
           </w:p>
         </w:tc>
@@ -14986,6 +14986,98 @@
             <w:r/>
             <w:r>
               <w:t>Resolved (Figma design). Mobile App Nav Icons set (2230:4328, 7 variants: fixture/leaderboard/settings/home/news/message/notification) has 0 instances on page 0:1 (2 home-variant instances exist only on the ignored dump scratch page) -&gt; renamed "Old - Mobile App Nav Icons", not deleted. An alternate bottom-tab mobile-nav concept never adopted; every real mobile screen uses the top Navbar.</w:t>
+            </w:r>
+          </w:p>
+        </w:tc>
+      </w:tr>
+      <w:tr>
+        <w:tc>
+          <w:tcPr>
+            <w:tcW w:type="dxa" w:w="500"/>
+          </w:tcPr>
+          <w:p>
+            <w:r/>
+            <w:r>
+              <w:t>125</w:t>
+            </w:r>
+          </w:p>
+        </w:tc>
+        <w:tc>
+          <w:tcPr>
+            <w:tcW w:type="dxa" w:w="4700"/>
+          </w:tcPr>
+          <w:p>
+            <w:r/>
+            <w:r>
+              <w:t>Settings sidebar-nav component visible label still read "Display, Languages And Region" (plural) after PR #117 fixed only the variant-value typo.</w:t>
+            </w:r>
+          </w:p>
+        </w:tc>
+        <w:tc>
+          <w:tcPr>
+            <w:tcW w:type="dxa" w:w="1850"/>
+          </w:tcPr>
+          <w:p>
+            <w:r/>
+            <w:r>
+              <w:t>sprint-2/settings-label-align-docx-dl123 report</w:t>
+            </w:r>
+          </w:p>
+        </w:tc>
+        <w:tc>
+          <w:tcPr>
+            <w:tcW w:type="dxa" w:w="2300"/>
+          </w:tcPr>
+          <w:p>
+            <w:r/>
+            <w:r>
+              <w:t>RESOLVED. The Frame 5904 sidebar-nav set (2906:7170), Display row, rendered "Display, Languages And Region" (plural). The label TEXT nodes for all three Display-row states - 2906:7227 (Property 1=Display and language), 2906:7232 (Display hover), 2922:6352 (clicked display) - had underlying characters "display, languages and region" rendered title-cased by a pre-existing textCase: TITLE. characters set to "Display, Language and Region" (singular); textCase: TITLE left in place, so the on-canvas render is "Display, Language And Region" (capital "And"), matching how page heading 2922:5832 was handled in an earlier pass. Edited at component level: 90 set instances before = 90 after, all resolving to real variants, 0 detachments, 0 stale overrides. Other nav rows untouched. All three Display-row states edited (not just the resting state) for within-row consistency - flagged as a judgment call.</w:t>
+            </w:r>
+          </w:p>
+        </w:tc>
+      </w:tr>
+      <w:tr>
+        <w:tc>
+          <w:tcPr>
+            <w:tcW w:type="dxa" w:w="500"/>
+          </w:tcPr>
+          <w:p>
+            <w:r/>
+            <w:r>
+              <w:t>126</w:t>
+            </w:r>
+          </w:p>
+        </w:tc>
+        <w:tc>
+          <w:tcPr>
+            <w:tcW w:type="dxa" w:w="4700"/>
+          </w:tcPr>
+          <w:p>
+            <w:r/>
+            <w:r>
+              <w:t>PR #117 flagged 5 visible:false Rectangle 352 squares in Settings desktop rows and left them for a later pass.</w:t>
+            </w:r>
+          </w:p>
+        </w:tc>
+        <w:tc>
+          <w:tcPr>
+            <w:tcW w:type="dxa" w:w="1850"/>
+          </w:tcPr>
+          <w:p>
+            <w:r/>
+            <w:r>
+              <w:t>sprint-2/settings-label-align-docx-dl123 report</w:t>
+            </w:r>
+          </w:p>
+        </w:tc>
+        <w:tc>
+          <w:tcPr>
+            <w:tcW w:type="dxa" w:w="2300"/>
+          </w:tcPr>
+          <w:p>
+            <w:r/>
+            <w:r>
+              <w:t>RESOLVED. Confirmed genuinely dead: visible:false, fill bound to brand/green-tint, no strokes, no componentPropertyReferences, no prototype reactions (file-wide scan: 0 reactions target these IDs), not overlay/scroll targets, not inside any component; sibling Frame 5920 text blocks are the live rendered row content. They are leftover form-input background rectangles from row duplication (this file names input backgrounds Rectangle 352, 536x31 - identical geometry), not toggle-squares, and sit as direct children of a visible Frame 5914 (not inside hidden scaffolding as PR #117 described). Deleted: 2926:8175, 2926:9351, 2926:9844, 2927:10080, 2926:9605. Parent Frame 5914 rows remain live and were not removed; each still carries a separate hidden Frame 5926 scaffolding leftover, flagged for a future Settings-desktop layout pass.</w:t>
             </w:r>
           </w:p>
         </w:tc>

</xml_diff>

<commit_message>
Decision Log #128–#130 added
Decision Log #128–#130 added (club axis, public visibility, points model), CLAUDE.md's current status note updated with the forward-pointer.
</commit_message>
<xml_diff>
--- a/docs/Soccernity_MVP_Build_Plan_v1.7.docx
+++ b/docs/Soccernity_MVP_Build_Plan_v1.7.docx
@@ -15166,6 +15166,132 @@
             <w:r/>
             <w:r>
               <w:t>RESOLVED (Figma design) - sprint-2/settings-desktop-scaffolding-sweep. One consolidated sweep of hidden, non-rendering row-duplication leftovers across all 18 user-facing Settings desktop frames, replacing the piecemeal PR #117 / PR #118 / DL #110 passes. 17 hidden nodes deleted, each confirmed dead by 4 checks (visible:false; 0 file-wide prototype reactions target it; not inside any COMPONENT/COMPONENT_SET/INSTANCE; not a componentPropertyReferences target): 9 x hidden "Submit" Frame 5926 (each with a dead ON_CLICK to 2924:6870); 3 x hidden Frame 5920-&gt;Frame 5933 duplicate "Push notification" headings on the trio (all visible:false - never a live render bug); 2 x hidden Frame 5928 leaked "Email Notification"+2FA-blurb blocks; 2 x hidden Frame 5927 leaked "Authentication App" blocks (DL #110); 1 x hidden 536x31 Rectangle 352 input-field background on Email (a 6th instance of the leftover PR #118 deleted five of). No Frame 5914 row emptied; no live row touched; screenshots confirm zero visual change. Kept + flagged for a follow-up text-hygiene micro-pass (all 4-check-clean but hidden TEXT, not FRAMEs): "See information about your account" template subtitle x12; leaked "Help protect your account..." 2FA blurb x4 and "Choose to filter out content..." blurb x2 inside visible notification rows; hidden information-circle-sharp icon x2; and hidden leftover "Confirm your Password" labels x7 + sample values (@mitch, a phone number, an email) inside the LIVE input rows of Change Password (2924:6870) and Account Information (Edit) (2924:7112), both out of scope here. Kept, out of scope: ph:soccer-ball-fill decorative-background FRAMEs x2 per frame (a deliberately-hidden decor layer, present on the clean category screens too - not duplication scaffolding).</w:t>
+            </w:r>
+          </w:p>
+        </w:tc>
+      </w:tr>
+      <w:tr>
+        <w:tc>
+          <w:tcPr>
+            <w:tcW w:type="dxa" w:w="500"/>
+          </w:tcPr>
+          <w:p>
+            <w:r>
+              <w:t>128</w:t>
+            </w:r>
+          </w:p>
+        </w:tc>
+        <w:tc>
+          <w:tcPr>
+            <w:tcW w:type="dxa" w:w="4700"/>
+          </w:tcPr>
+          <w:p>
+            <w:r>
+              <w:t>Leaderboard club axis: which mechanism does the Leaderboard's Per-Club scope filter by — ClubPage membership (many-to-many, unlimited clubs per user) or a single represented club? Flagged as open in CLAUDE.md since PR #97/#108/#109 ("which club does the club axis mean?"), even though Decision Log #74 already built the UI selector for it.</w:t>
+            </w:r>
+          </w:p>
+        </w:tc>
+        <w:tc>
+          <w:tcPr>
+            <w:tcW w:type="dxa" w:w="1850"/>
+          </w:tcPr>
+          <w:p>
+            <w:r>
+              <w:t>PR #97; PR #108; PR #109; Decision Log #74; sprint-2-leaderboard-page-design-report.md</w:t>
+            </w:r>
+          </w:p>
+        </w:tc>
+        <w:tc>
+          <w:tcPr>
+            <w:tcW w:type="dxa" w:w="2300"/>
+          </w:tcPr>
+          <w:p>
+            <w:r>
+              <w:t>Resolved by the founder: the Per-Club Leaderboard scope filters by the single represented club chosen on the "Which Club Do I Represent" selector (Decision Log #74), backed by User.clubMemberships — not raw ClubPage membership, and not User.clubAffiliationId. A user with multiple club-page memberships still only scores/ranks under the one club they've explicitly chosen to represent; joining or leaving other club pages never changes which club's Leaderboard they count toward. Backend requirement (parked, not yet built — backend is paused): a real field persisting the represented club and an endpoint to set/change it, distinct from ClubPage membership itself.</w:t>
+            </w:r>
+          </w:p>
+        </w:tc>
+      </w:tr>
+      <w:tr>
+        <w:tc>
+          <w:tcPr>
+            <w:tcW w:type="dxa" w:w="500"/>
+          </w:tcPr>
+          <w:p>
+            <w:r>
+              <w:t>129</w:t>
+            </w:r>
+          </w:p>
+        </w:tc>
+        <w:tc>
+          <w:tcPr>
+            <w:tcW w:type="dxa" w:w="4700"/>
+          </w:tcPr>
+          <w:p>
+            <w:r>
+              <w:t>Leaderboard public visibility: is the Leaderboard visible to logged-out visitors (relevant given minors' real display names are shown per Decision Log #45, and scouts/clubs — the feature's stated audience — may not have accounts), or login-gated?</w:t>
+            </w:r>
+          </w:p>
+        </w:tc>
+        <w:tc>
+          <w:tcPr>
+            <w:tcW w:type="dxa" w:w="1850"/>
+          </w:tcPr>
+          <w:p>
+            <w:r>
+              <w:t>PR #95; sprint-2-leaderboard-page-design-report.md §5; CLAUDE.md "Founder-blocked" notes</w:t>
+            </w:r>
+          </w:p>
+        </w:tc>
+        <w:tc>
+          <w:tcPr>
+            <w:tcW w:type="dxa" w:w="2300"/>
+          </w:tcPr>
+          <w:p>
+            <w:r>
+              <w:t>Resolved by the founder: the Leaderboard requires login. Visible to any logged-in user, not exposed to logged-out visitors. Scout/club access therefore requires an account — no separate public/unauthenticated view is built. No code implication yet (Leaderboard has no backend endpoint); this sets the auth-guard expectation (JwtAuthGuard-only, matching the pattern already used for read endpoints like GET /clubs) for whoever builds it once backend work resumes.</w:t>
+            </w:r>
+          </w:p>
+        </w:tc>
+      </w:tr>
+      <w:tr>
+        <w:tc>
+          <w:tcPr>
+            <w:tcW w:type="dxa" w:w="500"/>
+          </w:tcPr>
+          <w:p>
+            <w:r>
+              <w:t>130</w:t>
+            </w:r>
+          </w:p>
+        </w:tc>
+        <w:tc>
+          <w:tcPr>
+            <w:tcW w:type="dxa" w:w="4700"/>
+          </w:tcPr>
+          <w:p>
+            <w:r>
+              <w:t>Leaderboard points model: the board ranks by a plain integer (Decision Log #61 confirmed the display format — rank + badge for 1st/2nd/3rd, Decision Log #69) but nothing has ever defined what generates that integer. Flagged as open in every Leaderboard/Contest design pass since PR #95.</w:t>
+            </w:r>
+          </w:p>
+        </w:tc>
+        <w:tc>
+          <w:tcPr>
+            <w:tcW w:type="dxa" w:w="1850"/>
+          </w:tcPr>
+          <w:p>
+            <w:r>
+              <w:t>PR #95; PR #107–#109; sprint-2-leaderboard-page-design-report.md</w:t>
+            </w:r>
+          </w:p>
+        </w:tc>
+        <w:tc>
+          <w:tcPr>
+            <w:tcW w:type="dxa" w:w="2300"/>
+          </w:tcPr>
+          <w:p>
+            <w:r>
+              <w:t>Resolved by the founder: points are earned two ways, combined into one running total per represented club (Decision Log #128) and time period: (1) Contest/Competition results — weekly Contest wins and Competition-type scores (Prediction accuracy, Commentary votes) convert to points via each competition's own scoring mechanism (Decision Log #72’s generic SCORE column); and (2) baseline platform engagement — likes, follows, and posts also contribute a smaller, ongoing point trickle outside of any competition. Exact per-action weights (points per like/follow/post, and the Contest/Competition-to-points conversion formula) are a real, not-yet-specified backend detail — parked as a backend-api task for when backend work resumes, not resolved here. This unblocks Leaderboard/Contest/Competition screens from being treated as a real, data-driven feature rather than a founder-blocked placeholder; figma-to-code may now build against these boards once backend delivers the real points field and scoring endpoint.</w:t>
             </w:r>
           </w:p>
         </w:tc>

</xml_diff>

<commit_message>
Decision Log #138–#139 added
Decision Log #138–#139 added, CLAUDE.md updated with the resolution as a post-merge addendum on PR #124's bullet
</commit_message>
<xml_diff>
--- a/docs/Soccernity_MVP_Build_Plan_v1.7.docx
+++ b/docs/Soccernity_MVP_Build_Plan_v1.7.docx
@@ -15501,7 +15501,7 @@
           </w:tcPr>
           <w:p>
             <w:r>
-              <w:t>Open — deferred to Sprint 5. Admin Console + moderation queue is Sprint 5. These are net-new screens (figma-screen-builder territory) that need founder input on the §8.4 appeal-routing model ("a second reviewer, not the same admin") — a product/policy decision, not something to invent unilaterally. Admin Panel is desktop-only so no mobile dimension. Admin Panel colour/token treatment was NOT touched by this audit (hard constraint).</w:t>
+              <w:t>Open — deferred to Sprint 5. Admin Console + moderation queue is Sprint 5. These are net-new screens (figma-screen-builder territory) that need founder input on the §8.4 appeal-routing model ("a second reviewer, not the same admin") — a product/policy decision, not something to invent unilaterally. Admin Panel is desktop-only so no mobile dimension. Admin Panel colour/token treatment was NOT touched by this audit (hard constraint).  RESOLVED (founder decision): appeal reviewed by a second admin/moderator, never the original reviewer who made the moderation decision. See Decision Log #138.</w:t>
             </w:r>
           </w:p>
         </w:tc>
@@ -15543,7 +15543,7 @@
           </w:tcPr>
           <w:p>
             <w:r>
-              <w:t>Open — deferred to Sprint 3. DMs are Sprint 3. A recipient picker depends on an unresolved choice between a GET /search?q= people-search and a follow-graph list — flagged rather than invented. The restricted-pending rule (§8.3 step 5, "no DMs from unverified accounts", Decision Log #12) also needs a state here eventually.</w:t>
+              <w:t>Open — deferred to Sprint 3. DMs are Sprint 3. A recipient picker depends on an unresolved choice between a GET /search?q= people-search and a follow-graph list — flagged rather than invented. The restricted-pending rule (§8.3 step 5, "no DMs from unverified accounts", Decision Log #12) also needs a state here eventually.  RESOLVED (founder decision): both — a search bar (by username/name) plus a default follow-list section, so a user can either search or pick from people they already follow. See Decision Log #139.</w:t>
             </w:r>
           </w:p>
         </w:tc>
@@ -15586,6 +15586,90 @@
           <w:p>
             <w:r>
               <w:t>Open — minor. Conservative single-state kept this pass. A distinct "No clubs available yet" empty state (a copy/one-frame change) would resolve it; best done in the next pass that opens the Club Picker frames rather than as a one-off. Low urgency — the beachhead city will have seeded clubs (Build Plan §7).</w:t>
+            </w:r>
+          </w:p>
+        </w:tc>
+      </w:tr>
+      <w:tr>
+        <w:tc>
+          <w:tcPr>
+            <w:tcW w:type="dxa" w:w="500"/>
+          </w:tcPr>
+          <w:p>
+            <w:r>
+              <w:t>138</w:t>
+            </w:r>
+          </w:p>
+        </w:tc>
+        <w:tc>
+          <w:tcPr>
+            <w:tcW w:type="dxa" w:w="4700"/>
+          </w:tcPr>
+          <w:p>
+            <w:r>
+              <w:t>Admin moderation appeal routing (Decision Log #135) — §8.4 defines a report review workflow with an appeal step but never specified who reviews the appeal.</w:t>
+            </w:r>
+          </w:p>
+        </w:tc>
+        <w:tc>
+          <w:tcPr>
+            <w:tcW w:type="dxa" w:w="1850"/>
+          </w:tcPr>
+          <w:p>
+            <w:r>
+              <w:t>Decision Log #135; PR #124 report; Build Plan §8.4</w:t>
+            </w:r>
+          </w:p>
+        </w:tc>
+        <w:tc>
+          <w:tcPr>
+            <w:tcW w:type="dxa" w:w="2300"/>
+          </w:tcPr>
+          <w:p>
+            <w:r>
+              <w:t>Resolved by the founder: an appeal is reviewed by a SECOND admin/moderator, never the same reviewer who made the original moderation decision. This is a real routing/assignment requirement, not just a UI label — whoever builds the moderation-queue screens (Decision Log #135, still deferred to Sprint 5) must design the queue so an appealed report is excluded from (or clearly marked against) the original reviewer's own queue view, and whoever builds the backend (AdminUser/Report relations, still unbuilt) must enforce this server-side, not just rely on the UI to hide it. No code or schema change in this pass — design-direction only, unblocking the moderation-queue screens for their own dedicated Sprint 5 pass.</w:t>
+            </w:r>
+          </w:p>
+        </w:tc>
+      </w:tr>
+      <w:tr>
+        <w:tc>
+          <w:tcPr>
+            <w:tcW w:type="dxa" w:w="500"/>
+          </w:tcPr>
+          <w:p>
+            <w:r>
+              <w:t>139</w:t>
+            </w:r>
+          </w:p>
+        </w:tc>
+        <w:tc>
+          <w:tcPr>
+            <w:tcW w:type="dxa" w:w="4700"/>
+          </w:tcPr>
+          <w:p>
+            <w:r>
+              <w:t>Message recipient picker (Decision Log #136) — §4.7 defines POST /conversations but no screen designs starting a new conversation; the choice was between a GET /search?q= people-search and a follow-graph list.</w:t>
+            </w:r>
+          </w:p>
+        </w:tc>
+        <w:tc>
+          <w:tcPr>
+            <w:tcW w:type="dxa" w:w="1850"/>
+          </w:tcPr>
+          <w:p>
+            <w:r>
+              <w:t>Decision Log #136; PR #124 report; Build Plan §4.7</w:t>
+            </w:r>
+          </w:p>
+        </w:tc>
+        <w:tc>
+          <w:tcPr>
+            <w:tcW w:type="dxa" w:w="2300"/>
+          </w:tcPr>
+          <w:p>
+            <w:r>
+              <w:t>Resolved by the founder: both. The recipient picker combines a search bar (by username/display name, backed by a real people-search endpoint — no such endpoint exists yet, a genuine backend requirement to park alongside the rest of Decision Log #136) with a default follow-list section shown before any search term is entered, so a user can either search directly or pick from people they already follow without typing. The restricted-pending rule (§8.3 step 5, no DMs from/to unverified accounts) still applies to both paths equally — restricted-pending users are excluded from the follow-list section and from search results the same way. Design-direction only in this entry; the screen itself is built in the Decision-Log-#136/#139 follow-up pass.</w:t>
             </w:r>
           </w:p>
         </w:tc>

</xml_diff>

<commit_message>
Decision Log #138–#139 added to build plan
Decision Log #138–#139 added, CLAUDE.md updated with the resolution as a post-merge addendum on PR #124's bullet
</commit_message>
<xml_diff>
--- a/docs/Soccernity_MVP_Build_Plan_v1.7.docx
+++ b/docs/Soccernity_MVP_Build_Plan_v1.7.docx
@@ -15501,7 +15501,7 @@
           </w:tcPr>
           <w:p>
             <w:r>
-              <w:t>Open — deferred to Sprint 5. Admin Console + moderation queue is Sprint 5. These are net-new screens (figma-screen-builder territory) that need founder input on the §8.4 appeal-routing model ("a second reviewer, not the same admin") — a product/policy decision, not something to invent unilaterally. Admin Panel is desktop-only so no mobile dimension. Admin Panel colour/token treatment was NOT touched by this audit (hard constraint).</w:t>
+              <w:t>Open — deferred to Sprint 5. Admin Console + moderation queue is Sprint 5. These are net-new screens (figma-screen-builder territory) that need founder input on the §8.4 appeal-routing model ("a second reviewer, not the same admin") — a product/policy decision, not something to invent unilaterally. Admin Panel is desktop-only so no mobile dimension. Admin Panel colour/token treatment was NOT touched by this audit (hard constraint).  RESOLVED (founder decision): appeal reviewed by a second admin/moderator, never the original reviewer who made the moderation decision. See Decision Log #138.</w:t>
             </w:r>
           </w:p>
         </w:tc>
@@ -15543,7 +15543,7 @@
           </w:tcPr>
           <w:p>
             <w:r>
-              <w:t>Open — deferred to Sprint 3. DMs are Sprint 3. A recipient picker depends on an unresolved choice between a GET /search?q= people-search and a follow-graph list — flagged rather than invented. The restricted-pending rule (§8.3 step 5, "no DMs from unverified accounts", Decision Log #12) also needs a state here eventually.</w:t>
+              <w:t>Open — deferred to Sprint 3. DMs are Sprint 3. A recipient picker depends on an unresolved choice between a GET /search?q= people-search and a follow-graph list — flagged rather than invented. The restricted-pending rule (§8.3 step 5, "no DMs from unverified accounts", Decision Log #12) also needs a state here eventually.  RESOLVED (founder decision): both — a search bar (by username/name) plus a default follow-list section, so a user can either search or pick from people they already follow. See Decision Log #139.</w:t>
             </w:r>
           </w:p>
         </w:tc>
@@ -15586,6 +15586,90 @@
           <w:p>
             <w:r>
               <w:t>Open — minor. Conservative single-state kept this pass. A distinct "No clubs available yet" empty state (a copy/one-frame change) would resolve it; best done in the next pass that opens the Club Picker frames rather than as a one-off. Low urgency — the beachhead city will have seeded clubs (Build Plan §7).</w:t>
+            </w:r>
+          </w:p>
+        </w:tc>
+      </w:tr>
+      <w:tr>
+        <w:tc>
+          <w:tcPr>
+            <w:tcW w:type="dxa" w:w="500"/>
+          </w:tcPr>
+          <w:p>
+            <w:r>
+              <w:t>138</w:t>
+            </w:r>
+          </w:p>
+        </w:tc>
+        <w:tc>
+          <w:tcPr>
+            <w:tcW w:type="dxa" w:w="4700"/>
+          </w:tcPr>
+          <w:p>
+            <w:r>
+              <w:t>Admin moderation appeal routing (Decision Log #135) — §8.4 defines a report review workflow with an appeal step but never specified who reviews the appeal.</w:t>
+            </w:r>
+          </w:p>
+        </w:tc>
+        <w:tc>
+          <w:tcPr>
+            <w:tcW w:type="dxa" w:w="1850"/>
+          </w:tcPr>
+          <w:p>
+            <w:r>
+              <w:t>Decision Log #135; PR #124 report; Build Plan §8.4</w:t>
+            </w:r>
+          </w:p>
+        </w:tc>
+        <w:tc>
+          <w:tcPr>
+            <w:tcW w:type="dxa" w:w="2300"/>
+          </w:tcPr>
+          <w:p>
+            <w:r>
+              <w:t>Resolved by the founder: an appeal is reviewed by a SECOND admin/moderator, never the same reviewer who made the original moderation decision. This is a real routing/assignment requirement, not just a UI label — whoever builds the moderation-queue screens (Decision Log #135, still deferred to Sprint 5) must design the queue so an appealed report is excluded from (or clearly marked against) the original reviewer's own queue view, and whoever builds the backend (AdminUser/Report relations, still unbuilt) must enforce this server-side, not just rely on the UI to hide it. No code or schema change in this pass — design-direction only, unblocking the moderation-queue screens for their own dedicated Sprint 5 pass.</w:t>
+            </w:r>
+          </w:p>
+        </w:tc>
+      </w:tr>
+      <w:tr>
+        <w:tc>
+          <w:tcPr>
+            <w:tcW w:type="dxa" w:w="500"/>
+          </w:tcPr>
+          <w:p>
+            <w:r>
+              <w:t>139</w:t>
+            </w:r>
+          </w:p>
+        </w:tc>
+        <w:tc>
+          <w:tcPr>
+            <w:tcW w:type="dxa" w:w="4700"/>
+          </w:tcPr>
+          <w:p>
+            <w:r>
+              <w:t>Message recipient picker (Decision Log #136) — §4.7 defines POST /conversations but no screen designs starting a new conversation; the choice was between a GET /search?q= people-search and a follow-graph list.</w:t>
+            </w:r>
+          </w:p>
+        </w:tc>
+        <w:tc>
+          <w:tcPr>
+            <w:tcW w:type="dxa" w:w="1850"/>
+          </w:tcPr>
+          <w:p>
+            <w:r>
+              <w:t>Decision Log #136; PR #124 report; Build Plan §4.7</w:t>
+            </w:r>
+          </w:p>
+        </w:tc>
+        <w:tc>
+          <w:tcPr>
+            <w:tcW w:type="dxa" w:w="2300"/>
+          </w:tcPr>
+          <w:p>
+            <w:r>
+              <w:t>Resolved by the founder: both. The recipient picker combines a search bar (by username/display name, backed by a real people-search endpoint — no such endpoint exists yet, a genuine backend requirement to park alongside the rest of Decision Log #136) with a default follow-list section shown before any search term is entered, so a user can either search directly or pick from people they already follow without typing. The restricted-pending rule (§8.3 step 5, no DMs from/to unverified accounts) still applies to both paths equally — restricted-pending users are excluded from the follow-list section and from search results the same way. Design-direction only in this entry; the screen itself is built in the Decision-Log-#136/#139 follow-up pass.</w:t>
             </w:r>
           </w:p>
         </w:tc>

</xml_diff>

<commit_message>
Missing  decision log added
Decision Log #152 added — homepage routing is formally resolved: / is exclusively the logged-out marketing page, logged-in users route to Community. Closes the gap the sweep found (a decision made in practice but never logged).

Fixed directly in Figma — the stale "BLOCKER, unresolved" annotation on the Homepage frame (5204:6728's own annotation zone) now reads "RESOLVED," with the reasoning and Decision Log reference written in. I verified this with a screenshot before finishing. This matters because that annotation would have misled whoever eventually runs figma-to-code on this frame.
</commit_message>
<xml_diff>
--- a/docs/Soccernity_MVP_Build_Plan_v1.7.docx
+++ b/docs/Soccernity_MVP_Build_Plan_v1.7.docx
@@ -16184,6 +16184,48 @@
           <w:p>
             <w:r>
               <w:t>Open -- minor; conservative choice (preserve each screen's existing sidebar geometry) made meanwhile.</w:t>
+            </w:r>
+          </w:p>
+        </w:tc>
+      </w:tr>
+      <w:tr>
+        <w:tc>
+          <w:tcPr>
+            <w:tcW w:type="dxa" w:w="500"/>
+          </w:tcPr>
+          <w:p>
+            <w:r>
+              <w:t>152</w:t>
+            </w:r>
+          </w:p>
+        </w:tc>
+        <w:tc>
+          <w:tcPr>
+            <w:tcW w:type="dxa" w:w="4700"/>
+          </w:tcPr>
+          <w:p>
+            <w:r>
+              <w:t>Homepage routing: is "/" the marketing landing page (logged-out) or the authenticated home feed? Raised as an unresolved BLOCKER annotation directly on the canonical Homepage Figma frame (5204:6728, "Note — BLOCKER, carried forward unresolved from Pass 1") and repeated on its Pass 1 predecessor (5191:6652). Discovered during the Sprint 2 sweep to still be unresolved in the Decision Log despite appearing settled in practice — create-a-post, suggested follows, and feed posts all live in the Community pillar (1306:7149), not on any homepage frame, and the Homepage's Header instance is header 7 (logged-out, Login button), consistent with a marketing-page reading.</w:t>
+            </w:r>
+          </w:p>
+        </w:tc>
+        <w:tc>
+          <w:tcPr>
+            <w:tcW w:type="dxa" w:w="1850"/>
+          </w:tcPr>
+          <w:p>
+            <w:r>
+              <w:t>Homepage Figma annotation zone (5204:6728, 5191:6652); Sprint 2 sweep</w:t>
+            </w:r>
+          </w:p>
+        </w:tc>
+        <w:tc>
+          <w:tcPr>
+            <w:tcW w:type="dxa" w:w="2300"/>
+          </w:tcPr>
+          <w:p>
+            <w:r>
+              <w:t>Resolved by the founder: "/" is exclusively the logged-out marketing landing page. Logged-in users route to the Community feed (1306:7149) instead — there is no separate authenticated-homepage design, and none is needed. This closes the BLOCKER note on 5204:6728 and 5191:6652; whoever runs figma-to-code on either frame should disregard that annotation as stale and build the logged-out marketing page it already is. No routing code exists yet (frontend is still 0% converted) — this settles the design/product question only; the actual React Router route guard (unauthenticated → "/", authenticated → Community feed) is implementation work for whoever runs figma-to-code.</w:t>
             </w:r>
           </w:p>
         </w:tc>

</xml_diff>

<commit_message>
sprint-2: wire real user data into the NavDrawer identity block (DL #168)
- Header.tsx fetches the signed-in user's profile once per session via
  getUser(accessToken, decodeAccessToken(token).sub), keyed on the token
  (no refetch on drawer open/close), and passes it to NavDrawer.
- NavDrawer renders the real displayName + an initials avatar; falls back
  to the generic "Signed in" row while the fetch is pending or if it
  fails, so navigation is never blocked/broken.
- No @handle/username row — no such field on UserProfile, no backend
  column (Decision Log #58); the Figma handle is decorative.
- Header.test.tsx +5 tests (success / pending / failure / fetch-once /
  no-handle). Full suite: 12 files / 84 tests, 0 failures.
- Decision Log #168 resolved; #166 / #167 confirmed out of scope
  (separate Sprint 3/6 Messaging/Notifications/Settings builds).

Co-Authored-By: Claude Sonnet 5 <noreply@anthropic.com>
</commit_message>
<xml_diff>
--- a/docs/Soccernity_MVP_Build_Plan_v1.7.docx
+++ b/docs/Soccernity_MVP_Build_Plan_v1.7.docx
@@ -16821,6 +16821,9 @@
             <w:r>
               <w:t>Open -- flagged, conservative choice made meanwhile. Those items render as non-navigating, visibly-disabled rows (aria-disabled, "Not available yet" title) rather than as links that fall through to the 404 page -- per the task brief's own "render the item but flag the missing route rather than linking to a 404" instruction. The header messages icon (Figma "header 4" cluster) is likewise rendered disabled. Whoever builds the Notification Centre / Messages / Settings screens should add the routes and flip navigation.ts's `available` flag.</w:t>
             </w:r>
+            <w:r>
+              <w:t xml:space="preserve"> Confirmed OUT OF SCOPE of the navbar work by explicit founder decision -- /messages, /notifications and /settings are real Sprint 3/6 feature builds (Messaging, Notifications, Settings), scoped as separate later work, not a navbar follow-up. The disabled-row treatment stays as the interim; not overlooked.</w:t>
+            </w:r>
           </w:p>
         </w:tc>
       </w:tr>
@@ -16863,6 +16866,9 @@
             <w:r>
               <w:t>Open -- flagged. The Notification row renders with no number rather than a hardcoded fake one (per the task brief). Needs a real notifications endpoint (Build Plan Section 4 defines Notification rows written by follow/like/comment triggers -- see the Sprint 2 follow-and-notifications work -- but no GET/unread-count route exists) before the badge can be wired.</w:t>
             </w:r>
+            <w:r>
+              <w:t xml:space="preserve"> Confirmed OUT OF SCOPE of the navbar work by explicit founder decision -- a notifications unread-count source is part of the separate Sprint 3 Notifications build, not a navbar follow-up. The Notification row stays without a count as the interim; not overlooked.</w:t>
+            </w:r>
           </w:p>
         </w:tc>
       </w:tr>
@@ -16904,6 +16910,9 @@
           <w:p>
             <w:r>
               <w:t>Open -- flagged, conservative choice made meanwhile. The drawer identity block renders a generic "Signed in" row with a plain avatar circle rather than fabricating a name/handle. A real identity block needs either an AuthContext that holds the user summary, or the header fetching GET /users/:id the way ProfilePage.tsx does -- both a larger change than this PR's scope.</w:t>
+            </w:r>
+            <w:r>
+              <w:t xml:space="preserve"> RESOLVED (sprint-2/navdrawer-real-identity, figma-to-code): the drawer identity block now shows the real displayName + an initials avatar, fetched once per session by Header via getUser(accessToken, sub) and passed to NavDrawer as a prop (no refetch on open/close). No @handle/username row -- there is no such field on UserProfile and no backend column (Decision Log #58); the Figma "@christine001" is decorative, name renders as a single line. A pending or failed fetch falls back to the generic "Signed in" row -- the drawer's navigation always works.</w:t>
             </w:r>
           </w:p>
         </w:tc>

</xml_diff>

<commit_message>
Transcribe Decision Log #54 resolution + #189-193 into docx; CLAUDE.md status bullet
Documentation-only follow-up to the prior commit's AdminUser/AdminConsole
auth work. Appends a forward-pointer to Decision Log #54's Status cell
recording the resolution, adds new rows #189-193 for the follow-up
candidates modules/admin/README.md surfaced, and adds a CLAUDE.md status
bullet with the same detail. Independently re-verified before writing
this: mocked suite 42 suites / 481 tests 0 failures, e2e suite 9 suites /
65 tests 0 failures, nest build clean, eslint clean.

Co-Authored-By: Claude Sonnet 5 <noreply@anthropic.com>
</commit_message>
<xml_diff>
--- a/docs/Soccernity_MVP_Build_Plan_v1.7.docx
+++ b/docs/Soccernity_MVP_Build_Plan_v1.7.docx
@@ -11905,7 +11905,7 @@
           </w:tcPr>
           <w:p>
             <w:r>
-              <w:t>Open — does the Admin Console get its own account entity, or reuse User with a role check? Not a design-token question; flagged for founder/backend.</w:t>
+              <w:t>Open — does the Admin Console get its own account entity, or reuse User with a role check? Not a design-token question; flagged for founder/backend. RESOLVED by sprint-2/admin-console-account-entity (backend-api): the Admin Console now has a genuinely separate account/auth/profile path, NOT User+role. Real finding made before writing code: AdminUser already existed in schema.prisma as an original Section 3 entity (Article.authorAdmin's target) but only carried {id, email, role, articles} -- this PR's own framing above ('an admin-account data model that does not exist') was not quite accurate. Decision: extend AdminUser in place (passwordHash, fullName, phone, accountStatus, createdAt, updatedAt -- migration 20260904175008_extend_admin_user_for_admin_console) rather than invent a second, competing AdminAccount model, since Article.authorAdmin already points at this name and Section 3 already spec'd it under this name. New AdminTokenService/AdminRefreshTokenStore/AdminJwtAuthGuard are genuinely separate classes from the User-facing TokenService/RefreshTokenStore/JwtAuthGuard -- own JwtService instance keyed on ADMIN_JWT_SECRET (never JWT_SECRET), an aud: "admin-console" discriminator claim as defense-in-depth, and a disjoint admin:refresh:* Redis namespace. Endpoints: POST /admin/auth/{login,refresh,logout,change-password}, GET/PATCH /admin/profile (fullName/phone only -- role/email/accountStatus are never self-editable). Cross-authentication proven impossible in both directions via a real e2e spec (test/admin-auth-isolation.e2e-spec.ts) against a real, single AppModule instance and real Postgres/Redis -- not just argued in a comment. Mocked suite 35-&gt;42 suites / 419-&gt;481 tests, 0 failures; e2e suite 8-&gt;9 suites / 58-&gt;65 tests, 0 failures; nest build and eslint both clean. User's safeguarding fields (isMinor/guardianId/consentStatus/consentToken/consentTimestamp) confirmed untouched. See modules/admin/README.md and Decision Log #189-#193 for the follow-up candidates this surfaced.</w:t>
             </w:r>
           </w:p>
         </w:tc>
@@ -17739,6 +17739,216 @@
           <w:p>
             <w:r>
               <w:t>Open -- blocked on the Contest/Competition data model (see #70-#73, #134). Documentation-only surfacing, not a new blocker beyond what #148 and #70-#73 already record. Not resolvable until backend work on Contest/Competition resumes.</w:t>
+            </w:r>
+          </w:p>
+        </w:tc>
+      </w:tr>
+      <w:tr>
+        <w:tc>
+          <w:tcPr>
+            <w:tcW w:type="dxa" w:w="500"/>
+          </w:tcPr>
+          <w:p>
+            <w:r>
+              <w:t>189</w:t>
+            </w:r>
+          </w:p>
+        </w:tc>
+        <w:tc>
+          <w:tcPr>
+            <w:tcW w:type="dxa" w:w="4700"/>
+          </w:tcPr>
+          <w:p>
+            <w:r>
+              <w:t>Section 4.8's moderation-queue endpoints (Report review, appeal handling -- Decision Log #138's "a second admin/moderator reviews an appeal" rule) still have no code to attach to. This PR built only the Admin Console account/auth/profile slice, not the moderation backend.</w:t>
+            </w:r>
+          </w:p>
+        </w:tc>
+        <w:tc>
+          <w:tcPr>
+            <w:tcW w:type="dxa" w:w="1850"/>
+          </w:tcPr>
+          <w:p>
+            <w:r>
+              <w:t>sprint-2/admin-console-account-entity (backend-api)</w:t>
+            </w:r>
+          </w:p>
+        </w:tc>
+        <w:tc>
+          <w:tcPr>
+            <w:tcW w:type="dxa" w:w="2300"/>
+          </w:tcPr>
+          <w:p>
+            <w:r>
+              <w:t>Open -- unchanged Sprint 5 scope, not expanded or narrowed by this PR. Tracked here so a future sweep doesn't need to rediscover it.</w:t>
+            </w:r>
+          </w:p>
+        </w:tc>
+      </w:tr>
+      <w:tr>
+        <w:tc>
+          <w:tcPr>
+            <w:tcW w:type="dxa" w:w="500"/>
+          </w:tcPr>
+          <w:p>
+            <w:r>
+              <w:t>190</w:t>
+            </w:r>
+          </w:p>
+        </w:tc>
+        <w:tc>
+          <w:tcPr>
+            <w:tcW w:type="dxa" w:w="4700"/>
+          </w:tcPr>
+          <w:p>
+            <w:r>
+              <w:t>No dedicated, stricter rate limit exists for POST /admin/auth/login -- it currently reuses the same shared 'auth' named-throttler bucket/limits as the User-facing POST /auth/login, via the same generic @AuthRateLimit() decorator (own independent per-route counter, same config).</w:t>
+            </w:r>
+          </w:p>
+        </w:tc>
+        <w:tc>
+          <w:tcPr>
+            <w:tcW w:type="dxa" w:w="1850"/>
+          </w:tcPr>
+          <w:p>
+            <w:r>
+              <w:t>sprint-2/admin-console-account-entity (backend-api)</w:t>
+            </w:r>
+          </w:p>
+        </w:tc>
+        <w:tc>
+          <w:tcPr>
+            <w:tcW w:type="dxa" w:w="2300"/>
+          </w:tcPr>
+          <w:p>
+            <w:r>
+              <w:t>Open -- deliberately deferred to keep this PR's verification scope to schema + auth-isolation + CRUD. A real follow-up candidate: admin/moderator accounts are a smaller, higher-value target set and may warrant a lower max-attempts limit than the shared fan-facing bucket.</w:t>
+            </w:r>
+          </w:p>
+        </w:tc>
+      </w:tr>
+      <w:tr>
+        <w:tc>
+          <w:tcPr>
+            <w:tcW w:type="dxa" w:w="500"/>
+          </w:tcPr>
+          <w:p>
+            <w:r>
+              <w:t>191</w:t>
+            </w:r>
+          </w:p>
+        </w:tc>
+        <w:tc>
+          <w:tcPr>
+            <w:tcW w:type="dxa" w:w="4700"/>
+          </w:tcPr>
+          <w:p>
+            <w:r>
+              <w:t>No self-service admin/moderator registration endpoint exists, by design. AdminUser rows must currently be provisioned via direct database insert -- a "create admin" endpoint raises its own access-control question (who is allowed to call it, and how does the very first admin account get bootstrapped) that was judged out of this PR's scope.</w:t>
+            </w:r>
+          </w:p>
+        </w:tc>
+        <w:tc>
+          <w:tcPr>
+            <w:tcW w:type="dxa" w:w="1850"/>
+          </w:tcPr>
+          <w:p>
+            <w:r>
+              <w:t>sprint-2/admin-console-account-entity (backend-api)</w:t>
+            </w:r>
+          </w:p>
+        </w:tc>
+        <w:tc>
+          <w:tcPr>
+            <w:tcW w:type="dxa" w:w="2300"/>
+          </w:tcPr>
+          <w:p>
+            <w:r>
+              <w:t>Open -- founder/backend call for whenever admin-management endpoints are built: a superadmin-only "invite admin/moderator" endpoint, vs. a one-off seed script, vs. something else.</w:t>
+            </w:r>
+          </w:p>
+        </w:tc>
+      </w:tr>
+      <w:tr>
+        <w:tc>
+          <w:tcPr>
+            <w:tcW w:type="dxa" w:w="500"/>
+          </w:tcPr>
+          <w:p>
+            <w:r>
+              <w:t>192</w:t>
+            </w:r>
+          </w:p>
+        </w:tc>
+        <w:tc>
+          <w:tcPr>
+            <w:tcW w:type="dxa" w:w="4700"/>
+          </w:tcPr>
+          <w:p>
+            <w:r>
+              <w:t>Email is treated as read-only via PATCH /admin/profile -- a judgment call, not a literal spec requirement (Section 4.8 has no pre-existing spec line for this endpoint at all; it is a genuine addition). Mirrors UpdateUserDto's own precedent of excluding email from self-edit.</w:t>
+            </w:r>
+          </w:p>
+        </w:tc>
+        <w:tc>
+          <w:tcPr>
+            <w:tcW w:type="dxa" w:w="1850"/>
+          </w:tcPr>
+          <w:p>
+            <w:r>
+              <w:t>sprint-2/admin-console-account-entity (backend-api)</w:t>
+            </w:r>
+          </w:p>
+        </w:tc>
+        <w:tc>
+          <w:tcPr>
+            <w:tcW w:type="dxa" w:w="2300"/>
+          </w:tcPr>
+          <w:p>
+            <w:r>
+              <w:t>Open -- whether admin email should ever be self-service editable (and what re-verification step that would need) is left open, not decided either way.</w:t>
+            </w:r>
+          </w:p>
+        </w:tc>
+      </w:tr>
+      <w:tr>
+        <w:tc>
+          <w:tcPr>
+            <w:tcW w:type="dxa" w:w="500"/>
+          </w:tcPr>
+          <w:p>
+            <w:r>
+              <w:t>193</w:t>
+            </w:r>
+          </w:p>
+        </w:tc>
+        <w:tc>
+          <w:tcPr>
+            <w:tcW w:type="dxa" w:w="4700"/>
+          </w:tcPr>
+          <w:p>
+            <w:r>
+              <w:t>AdminUser.accountStatus ("active" | "deactivated", mirroring User.accountStatus's existing string-enum convention) has no endpoint that writes it in this PR. It exists so a future superadmin-facing "suspend this admin/moderator" action can instantly block login without deleting the row or losing Article.authorAdmin/Report-reviewer attribution history, but nothing here builds that action.</w:t>
+            </w:r>
+          </w:p>
+        </w:tc>
+        <w:tc>
+          <w:tcPr>
+            <w:tcW w:type="dxa" w:w="1850"/>
+          </w:tcPr>
+          <w:p>
+            <w:r>
+              <w:t>sprint-2/admin-console-account-entity (backend-api)</w:t>
+            </w:r>
+          </w:p>
+        </w:tc>
+        <w:tc>
+          <w:tcPr>
+            <w:tcW w:type="dxa" w:w="2300"/>
+          </w:tcPr>
+          <w:p>
+            <w:r>
+              <w:t>Open -- real, named follow-up for whenever admin-management (as opposed to self-service profile) endpoints are built.</w:t>
             </w:r>
           </w:p>
         </w:tc>

</xml_diff>

<commit_message>
Transcribe Decision Log #37/#38/#40 resolutions into docx; CLAUDE.md status bullet
Documentation-only follow-up to the prior commit's VerifyEmailPage/
ClubPickerStep fixes. Appends forward-pointers to Decision Log #37, #38,
and #40's Status cells and adds a matching CLAUDE.md status bullet.
Independently re-verified before writing this: tsc --noEmit exit 0,
vitest 13 files / 92 tests 0 failures, vite build exit 0, lint exit 0.

Co-Authored-By: Claude Sonnet 5 <noreply@anthropic.com>
</commit_message>
<xml_diff>
--- a/docs/Soccernity_MVP_Build_Plan_v1.7.docx
+++ b/docs/Soccernity_MVP_Build_Plan_v1.7.docx
@@ -11185,7 +11185,7 @@
           </w:tcPr>
           <w:p>
             <w:r>
-              <w:t>Open — button shipped disabled by design; no resend-verification endpoint or support/contact channel exists yet, real destination needed in a future sprint</w:t>
+              <w:t>Open — button shipped disabled by design; no resend-verification endpoint or support/contact channel exists yet, real destination needed in a future sprint RESOLVED by sprint-2/verify-email-support-and-consent-view (figma-to-code): the founder confirmed the real support destination, support@soccernity.com. The 'Contact support' button on both the Link Invalid Or Expired and Missing Token states is now a real, enabled mailto:support@soccernity.com?subject=Email%20verification%20help link (a plain subject prefill only, no body -- kept simple per the task's own brief), replacing the disabled placeholder and its explanatory tooltip. Test coverage added confirming the link is real and enabled on both states, replacing the prior disabled-state assertions.</w:t>
             </w:r>
           </w:p>
         </w:tc>
@@ -11227,7 +11227,7 @@
           </w:tcPr>
           <w:p>
             <w:r>
-              <w:t>Open — whether a pending-consent minor should see a different post-verification view is undecided RESOLVED (backend side) by sprint-2/verify-email-consent-status-field (backend-api): POST /auth/verify-email's response now carries an additive guardianConsentStatus field alongside the pre-existing verified/userId -- 'not_applicable' (not a minor, or a minor with no Guardian row -- a data-invariant case, not a real product state), 'pending', or 'confirmed'. Sourced from GuardianConsentService.getConsentStatusForUser(), extracted from the exact same method GET /auth/guardian-consent/status itself already used (made public, not duplicated) -- there is exactly one place in the codebase that queries Guardian-by-minorUserId and shapes the result. Typed as a plain string (not a narrower union), mirroring GuardianConsentStatusResponse.consentStatus's own existing convention, so a future value (e.g. a Decision Log #34 'declined' state) doesn't require a type change here too. Mocked suite 42 suites / 481 tests -&gt; 42 suites / 489 tests, 0 failures (8 new); e2e suite not re-run (plain findUnique-backed enrichment, no raw SQL/transaction/novel relation -- matches the existing no-e2e precedent already set for GET /auth/guardian-consent/status itself); nest build and eslint both clean. User/Guardian safeguarding fields (isMinor, consentStatus, consentToken, consentTimestamp) confirmed untouched -- zero schema.prisma diff. NOT yet resolved: the frontend half -- VerifyEmailPage.tsx does not yet branch on this new field (still Decision Log #38's other open question, now unblocked rather than closed) -- and what a future 'declined' consentStatus value should show here is left open, flagged in registration.service.ts's own comment.</w:t>
+              <w:t>Open — whether a pending-consent minor should see a different post-verification view is undecided RESOLVED (backend side) by sprint-2/verify-email-consent-status-field (backend-api): POST /auth/verify-email's response now carries an additive guardianConsentStatus field alongside the pre-existing verified/userId -- 'not_applicable' (not a minor, or a minor with no Guardian row -- a data-invariant case, not a real product state), 'pending', or 'confirmed'. Sourced from GuardianConsentService.getConsentStatusForUser(), extracted from the exact same method GET /auth/guardian-consent/status itself already used (made public, not duplicated) -- there is exactly one place in the codebase that queries Guardian-by-minorUserId and shapes the result. Typed as a plain string (not a narrower union), mirroring GuardianConsentStatusResponse.consentStatus's own existing convention, so a future value (e.g. a Decision Log #34 'declined' state) doesn't require a type change here too. Mocked suite 42 suites / 481 tests -&gt; 42 suites / 489 tests, 0 failures (8 new); e2e suite not re-run (plain findUnique-backed enrichment, no raw SQL/transaction/novel relation -- matches the existing no-e2e precedent already set for GET /auth/guardian-consent/status itself); nest build and eslint both clean. User/Guardian safeguarding fields (isMinor, consentStatus, consentToken, consentTimestamp) confirmed untouched -- zero schema.prisma diff. NOT yet resolved: the frontend half -- VerifyEmailPage.tsx does not yet branch on this new field (still Decision Log #38's other open question, now unblocked rather than closed) -- and what a future 'declined' consentStatus value should show here is left open, flagged in registration.service.ts's own comment. RESOLVED on the frontend side by sprint-2/verify-email-support-and-consent-view (figma-to-code), closing out the item sprint-2/verify-email-consent-status-field's own backend PR left open. VerifyEmailPage.tsx now branches on the real, additive guardianConsentStatus field: a minor whose status is 'pending' renders a genuinely distinct 'verified-pending-consent' state -- own heading ('Email verified -- approval still pending'), own three-item explanation list, and a CTA linking to /guardian-consent -- never the ordinary Verified state's 'you're all set' framing or its /profile CTA. Figma was checked directly before building anything (get_design_context on 'Verify Email -- 2 Verified', 5143:6648): it renders one single generic Verified layout with no consent-status branch anywhere, confirming no dedicated frame exists for this state (matching PR #107's own prior finding that this was left founder-blocked/never-designed). Built as a CONSERVATIVE INTERIM DESIGN, explicitly flagged as such in VerifyEmailPage.tsx's own code comment -- reuses the ordinary Verified state's icon/card/button CSS scaffolding (the email genuinely was verified) but with entirely distinct copy, never claiming full access. Should be replaced wholesale, not patched, if a real Figma frame for this state is ever designed. apps/web/src/api/auth.ts's VerifyEmailResponse updated to carry guardianConsentStatus: string, mirroring the backend's VerifyEmailResult type exactly including its own plain-string (not narrowed union) reasoning. Verified: tsc --noEmit exit 0, vitest 13 files / 86 -&gt; 92 tests 0 failures, vite build exit 0, lint exit 0.</w:t>
             </w:r>
           </w:p>
         </w:tc>
@@ -11311,7 +11311,7 @@
           </w:tcPr>
           <w:p>
             <w:r>
-              <w:t>Open — both text mismatches kept as-is; would need a Figma update or a deliberate copy decision (and a test update) to resolve either direction</w:t>
+              <w:t>Open — both text mismatches kept as-is; would need a Figma update or a deliberate copy decision (and a test update) to resolve either direction RESOLVED by sprint-2/verify-email-support-and-consent-view (figma-to-code): both text conflicts fixed to match Figma exactly, with a matching ClubPickerStep.test.tsx update -- no stale assertions left. (a) The button now reads 'Load more', matching the Figma frame; the old 'Load more clubs' wording is gone. (b) The single 'No clubs match that filter.' message is split into two real, distinct cases: a catalogue-genuinely-empty case (clubs.length === 0, regardless of whether a filter is active) now reads 'No clubs available yet.' -- sourced verbatim from the real Figma 'Club Picker -- 6 No Clubs Available Yet' frame built for Decision Log #137 (sprint-2/decision-log-133-137-followup), quoted directly in that PR's own report since no node ID was recorded there for a fresh Figma re-read -- and the original 'No clubs match that filter.' is kept for the genuine filter-matched-nothing case (clubs.length &gt; 0 but visibleClubs.length === 0). Verified: tsc --noEmit exit 0, vitest 13 files / 86 -&gt; 92 tests 0 failures, vite build exit 0, lint exit 0.</w:t>
             </w:r>
           </w:p>
         </w:tc>

</xml_diff>

<commit_message>
Admin Shell: componentize into one COMPONENT_SET across all 29 screens (Decision Log #180, Item 2)
Replaces the old 7-loose-node/2-topology shell with a single "Admin
Shell" COMPONENT_SET (10 Active variants + Show Action Button/Action
Label properties), swapped onto all 29 Admin Panel screens with
verified byte-identical content geometry before/after. Items 1/3/4/5
and Decision Log #178 are explicit follow-ups, not attempted here.

Co-Authored-By: Claude Sonnet 5 <noreply@anthropic.com>
</commit_message>
<xml_diff>
--- a/docs/Soccernity_MVP_Build_Plan_v1.7.docx
+++ b/docs/Soccernity_MVP_Build_Plan_v1.7.docx
@@ -17404,6 +17404,9 @@
             <w:r>
               <w:t>Resolved by the founder: dispatch as its own dedicated figma-design-system session, then Items 1/3/4/5 + #178 as its fast-follow -- matching how PRs #102/#110/#130/#131 were each scoped. The executable build+swap plan and 29-screen inventory are in the sprint-2/admin-panel-structural-pass report (sections 2 and 7). All prerequisite founder picks (icons #179, height rule #177) are now made.</w:t>
             </w:r>
+            <w:r>
+              <w:t xml:space="preserve"> UPDATE (sprint-2/admin-shell-componentization): Item 2 (Admin Shell componentization) is now DONE -- one "Admin Shell" COMPONENT_SET (10 Active variants + Show Action Button / Action Label properties) backs all 29 Admin Panel screens, replacing the old 7-loose-node/2-topology shell, with zero content-geometry drift on any screen. See Decision Log #199 for a new Figma-authoring gotcha found mid-build. Items 1/3/4/5 and #178 remain open.</w:t>
+            </w:r>
           </w:p>
         </w:tc>
       </w:tr>
@@ -18159,6 +18162,48 @@
           <w:p>
             <w:r>
               <w:t>Open -- minor visual-consistency question for a future figma-design-system retouch pass, not blocking.</w:t>
+            </w:r>
+          </w:p>
+        </w:tc>
+      </w:tr>
+      <w:tr>
+        <w:tc>
+          <w:tcPr>
+            <w:tcW w:type="dxa" w:w="500"/>
+          </w:tcPr>
+          <w:p>
+            <w:r>
+              <w:t>199</w:t>
+            </w:r>
+          </w:p>
+        </w:tc>
+        <w:tc>
+          <w:tcPr>
+            <w:tcW w:type="dxa" w:w="4700"/>
+          </w:tcPr>
+          <w:p>
+            <w:r>
+              <w:t>New Figma-authoring gotcha, found while building the "Admin Shell" COMPONENT_SET (sprint-2/admin-shell-componentization, Decision Log #180 Item 2): a paint bound to a variable that does NOT itself carry alpha (e.g. brand/navy, a plain opaque RGB), combined with a separate fractional paint-level opacity, silently resets to opacity: 1 specifically at createInstance() time (reproduced with zero other mutations) -- not just at setBoundVariableForPaint() construction time as this project's existing Figma notes describe. Variables that carry their own alpha (brand/green-tint, color/text/secondary) are unaffected. Found and fixed on the Admin Shell sidebar wash (Rectangle 223, all 10 variants) by using a literal, unbound paint at the same resolved value/opacity instead of a bound one -- same visual result, no new colour introduced, immune to the bug. Recommend: (a) fold this into the file's own documented Figma gotchas so future sessions don't lose time rediscovering it, and (b) a file-wide audit for other brand/navy or brand/green (non-tint) variables bound with a separate fractional paint opacity elsewhere in the file -- none other found in this shell, but no exhaustive file-wide check was attempted in this session.</w:t>
+            </w:r>
+          </w:p>
+        </w:tc>
+        <w:tc>
+          <w:tcPr>
+            <w:tcW w:type="dxa" w:w="1850"/>
+          </w:tcPr>
+          <w:p>
+            <w:r>
+              <w:t>sprint-2/admin-shell-componentization (figma-design-system)</w:t>
+            </w:r>
+          </w:p>
+        </w:tc>
+        <w:tc>
+          <w:tcPr>
+            <w:tcW w:type="dxa" w:w="2300"/>
+          </w:tcPr>
+          <w:p>
+            <w:r>
+              <w:t>Open -- fix applied locally to this one component (Admin Shell sidebar wash, all 10 variants); file-wide audit not attempted, out of this session's scope.</w:t>
             </w:r>
           </w:p>
         </w:tc>

</xml_diff>

<commit_message>
Admin Panel fast-follow: icons, heights, sidebar pin, KEEP/LOSE buttons, calendar 1 (Decision Log #180)
Closes out Items 1/3/4/5 of the coordinated Admin Panel structural pass
plus Decision Log #178, following sprint-2/admin-shell-componentization.
Icons redrawn once on the shared component (Carbon style, fixes #147);
16 screens grown 1024->1184 with the 2 legitimately-taller screens left
alone; sidebar bottom-pin confirmed working with no component fix
needed; top-bar action button KEEP/LOSE applied to all 29 screens
including Moderation Queue's two-button case; calendar 1 fully
token-bound alongside calendar 2. One real pre-existing defect found
and flagged, not fixed: Moderation Queue's "Filter" button is correctly
configured but structurally invisible due to unrelated content overlap
(Decision Log #200).

Co-Authored-By: Claude Sonnet 5 <noreply@anthropic.com>
</commit_message>
<xml_diff>
--- a/docs/Soccernity_MVP_Build_Plan_v1.7.docx
+++ b/docs/Soccernity_MVP_Build_Plan_v1.7.docx
@@ -11697,6 +11697,9 @@
             <w:r>
               <w:t>Open — Categories icon accepted as interim. Admin Panel icon-library standardisation still open (flagged by every prior retrofit round). Converting the Admin Shell into a real component/instance set recommended as a follow-up, deferred here. Icon-standardization + shell-componentization plan delivered by sprint-2/admin-panel-structural-pass (report sections 1-2) but NOT executed -- the componentization it all hinges on is a ~45-55-call structural refactor across 29 heterogeneous screens; recommended as its own dedicated session (Decision Log #180, founder-confirmed). Icon carbon: mapping approved (Moderation -&gt; carbon:gavel, Contest -&gt; carbon:trophy, Users -&gt; carbon:user--multiple which also closes #147, Articles -&gt; carbon:document, rest per report section 1.2).</w:t>
             </w:r>
+            <w:r>
+              <w:t xml:space="preserve"> UPDATE (sprint-2/admin-panel-fast-follow): Item 1 (icon standardization) is now DONE -- all 9 sidebar nav icons on the Admin Shell COMPONENT_SET are redrawn as Carbon-style glyphs (Dashboard/Articles/Users/Moderation/Categories/Contest/Media/Settings redrawn; Competitions renamed only, geometry was already correct), applied once on the component and inherited by all 29 screens. See Decision Log #147/#179 for the specific icon resolutions and #201 for a new Figma boolean-operation gotcha found mid-build.</w:t>
+            </w:r>
           </w:p>
         </w:tc>
       </w:tr>
@@ -11739,6 +11742,9 @@
             <w:r>
               <w:t>Open — normalise all Admin Panel frames to 1184 tall and shift content, or accept the y-95 adaptation as canon. Frame-height plan delivered by sprint-2/admin-panel-structural-pass (report §3) but NOT executed (depends on #49/#180 componentization). Founder rule (Decision Log #177): 1184px is a FLOOR not a hard clamp -- grow the 16 screens at 1024 up to 1184; leave Appeal Review (1234) and Create Competition (1530) at their content-driven heights, no screen forced shorter.</w:t>
             </w:r>
+            <w:r>
+              <w:t xml:space="preserve"> UPDATE (sprint-2/admin-panel-fast-follow): Item 3 (frame height) is now DONE -- 16 screens grown 1024 -&gt; 1184 (15 plain + 1 scrim/modal screen with its scrim and dialog explicitly repositioned), with zero content-geometry drift confirmed on every screen. Admin -- Appeal Review (1234) and Admin -- Create Competition (1530) confirmed left untouched, per Decision Log #177's "1184 is a floor, not a hard clamp" resolution.</w:t>
+            </w:r>
           </w:p>
         </w:tc>
       </w:tr>
@@ -11781,6 +11787,9 @@
             <w:r>
               <w:t>Open — confirm the per-screen labels, and confirm whether form/sub-screens should carry a top-bar action at all when they already have an in-content submit button. Per-screen top-bar-button KEEP/LOSE table delivered by sprint-2/admin-panel-structural-pass (report §5: KEEP 11, LOSE 15, already-removed 3) but NOT executed -- becomes a per-instance 'Show Action Button' boolean once the shell is componentized (Decision Log #180).</w:t>
             </w:r>
+            <w:r>
+              <w:t xml:space="preserve"> UPDATE (sprint-2/admin-panel-fast-follow): Item 5 (top-bar action button KEEP/LOSE) is now DONE -- applied to all 29 screens (10 KEEP including Moderation Queue's founder-resolved two-button special case, 16 LOSE with every claimed in-content submit button verified to genuinely exist before removal, 3 already-removed). See Decision Log #200 for a real, pre-existing layout defect found on Admin -- Moderation Queue: its own "Filter" button is correctly configured but structurally invisible due to unrelated content overlap, flagged as its own follow-up rather than fixed in this pass.</w:t>
+            </w:r>
           </w:p>
         </w:tc>
       </w:tr>
@@ -11864,6 +11873,9 @@
           <w:p>
             <w:r>
               <w:t>Open — the calendar component needs its own token-retrofit pass. Partially resolved by sprint-2/admin-panel-structural-pass (figma-design-system): the 'calendar 2' variant (2365:2034) of Calendar for scheduled task (2365:2033) -- the only variant instanced anywhere in the file, on Contest - Schedule Task (5403:6753) -- is fully token-bound (66 paints rebound to Soccernity Theme Light tokens; audit after: 103 bound, 0 unbound-visible). 5 opacity-0 / frosted-panel paints deliberately left unbound and disclosed (a bound paint takes the token's alpha, which would make the invisible adjacent-month days visible). The un-instanced 'calendar 1' variant (2363:2242) is still unbound -- see Decision Log #178, to be done in the same dedicated session as #180.</w:t>
+            </w:r>
+            <w:r>
+              <w:t xml:space="preserve"> UPDATE (sprint-2/admin-panel-fast-follow): the remaining "calendar 1" variant (2363:2242) is now also fully retrofitted -- 100 bound / 4 unbound-visible (disclosed) / 1 unbound-hidden (disclosed), the same shape and precedent as calendar 2's own earlier retrofit. Decision Log #178 is now fully closed -- both calendar variants in the file are token-bound.</w:t>
             </w:r>
           </w:p>
         </w:tc>
@@ -16004,6 +16016,9 @@
             <w:r>
               <w:t>Open -- deferred. Fold into the Admin content-area retrofit family (Decision Log #52). Fix path identified by sprint-2/admin-panel-structural-pass: fi:A_users -&gt; carbon:user--multiple (a real-fill glyph) as part of the Item 1 icon standardization. Still open pending the #180 componentization session that carries that work.</w:t>
             </w:r>
+            <w:r>
+              <w:t xml:space="preserve"> UPDATE (sprint-2/admin-panel-fast-follow): RESOLVED -- the Users nav icon (fi:A_users, previously rendering as empty/invisible fills) has been replaced with a new carbon:user--multiple glyph with real, solid fills, applied on the Admin Shell COMPONENT_SET and inherited by all 29 screens.</w:t>
+            </w:r>
           </w:p>
         </w:tc>
       </w:tr>
@@ -16172,6 +16187,9 @@
             <w:r>
               <w:t>Open -- minor; conservative choice (preserve each screen's existing sidebar geometry) made meanwhile. Sidebar geometry unification falls out of the Admin Shell component definition (sprint-2/admin-panel-structural-pass report §4): one geometry by construction (nav block fills sidebar height, SPACE_BETWEEN, Settings bottom-pinned at any frame height). NOT executed -- part of the #180 componentization session.</w:t>
             </w:r>
+            <w:r>
+              <w:t xml:space="preserve"> UPDATE (sprint-2/admin-panel-fast-follow): CONFIRMED, not redone -- Settings correctly pins to the sidebar's bottom on all 3 tested height variants (an already-1184 screen, a screen that just grew 1024-&gt;1184, and the 1530 screen) via the componentized shell's own SPACE_BETWEEN nav-block constraint from sprint-2/admin-shell-componentization. No component-level fix was needed.</w:t>
+            </w:r>
           </w:p>
         </w:tc>
       </w:tr>
@@ -17362,6 +17380,9 @@
             <w:r>
               <w:t>Resolved by the founder: Moderation -&gt; carbon:gavel (adjudication/review reading, matches the queue's function); Contest -&gt; carbon:trophy (semantic clarity over pennant continuity); Articles -&gt; carbon:document (dropped 'left rule' detail immaterial). Full carbon: mapping in the report §1.2 approved. Execution is part of the Decision Log #180 session.</w:t>
             </w:r>
+            <w:r>
+              <w:t xml:space="preserve"> UPDATE (sprint-2/admin-panel-fast-follow): these founder-approved icon picks (and the other 6 icons in the same pass) are now actually built and applied to all 29 screens via the Admin Shell COMPONENT_SET -- see Decision Log #49/#147 and the full mapping table in docs/sprint-2-admin-panel-fast-follow-report.md.</w:t>
+            </w:r>
           </w:p>
         </w:tc>
       </w:tr>
@@ -17407,6 +17428,9 @@
             <w:r>
               <w:t xml:space="preserve"> UPDATE (sprint-2/admin-shell-componentization): Item 2 (Admin Shell componentization) is now DONE -- one "Admin Shell" COMPONENT_SET (10 Active variants + Show Action Button / Action Label properties) backs all 29 Admin Panel screens, replacing the old 7-loose-node/2-topology shell, with zero content-geometry drift on any screen. See Decision Log #199 for a new Figma-authoring gotcha found mid-build. Items 1/3/4/5 and #178 remain open.</w:t>
             </w:r>
+            <w:r>
+              <w:t xml:space="preserve"> UPDATE (sprint-2/admin-panel-fast-follow): Items 1/3/4/5 and Decision Log #178 are now ALL DONE -- see the dedicated forward-pointers on #49/#50/#51/#53/#147/#151/#179 and the full report in docs/sprint-2-admin-panel-fast-follow-report.md. Decision Log #180 is now fully closed. One new real defect was found and flagged during this pass, not fixed -- see Decision Log #200 (Moderation Queue's structurally-invisible Filter button).</w:t>
+            </w:r>
           </w:p>
         </w:tc>
       </w:tr>
@@ -18204,6 +18228,90 @@
           <w:p>
             <w:r>
               <w:t>Open -- fix applied locally to this one component (Admin Shell sidebar wash, all 10 variants); file-wide audit not attempted, out of this session's scope.</w:t>
+            </w:r>
+          </w:p>
+        </w:tc>
+      </w:tr>
+      <w:tr>
+        <w:tc>
+          <w:tcPr>
+            <w:tcW w:type="dxa" w:w="500"/>
+          </w:tcPr>
+          <w:p>
+            <w:r>
+              <w:t>200</w:t>
+            </w:r>
+          </w:p>
+        </w:tc>
+        <w:tc>
+          <w:tcPr>
+            <w:tcW w:type="dxa" w:w="4700"/>
+          </w:tcPr>
+          <w:p>
+            <w:r>
+              <w:t>A pre-existing, real layout defect on Admin -- Moderation Queue (5794:8635) makes its own top-bar action button structurally invisible -- discovered while implementing this screen's founder-resolved "Filter + Export Queue" two-button design (sprint-2/admin-panel-fast-follow, Decision Log #51). This screen's own Content frame starts at absolute y=45 and its Table sub-frame (opaque rows) spans y=99-424, fully overlapping the shared shell's persistent top-bar row (Frame 5768, y=186-227) both vertically and horizontally; since Content is a later sibling than the shell instance (drawn on top), the entire search bar + action button are rendered underneath the table and never visible. Show Action Button = true / Action Label = "Filter" were set correctly per instruction and are real, live, correctly-bound property values -- they simply produce no visible change on this specific screen today. The same root-cause structure exists on Admin -- Report Detail &amp; Action and Admin -- Appeal Review (both Active=Moderation, same sparse layout), but produces no visible defect there since both are Show Action Button = false by design. Recommendation: a small, scoped follow-up should move this screen's own Content frame down (e.g. to the same y~95 convention other 1024/1184 Admin screens use) so the "Filter" button -- a real, founder-requested feature -- actually renders.</w:t>
+            </w:r>
+          </w:p>
+        </w:tc>
+        <w:tc>
+          <w:tcPr>
+            <w:tcW w:type="dxa" w:w="1850"/>
+          </w:tcPr>
+          <w:p>
+            <w:r>
+              <w:t>sprint-2/admin-panel-fast-follow (figma-design-system)</w:t>
+            </w:r>
+          </w:p>
+        </w:tc>
+        <w:tc>
+          <w:tcPr>
+            <w:tcW w:type="dxa" w:w="2300"/>
+          </w:tcPr>
+          <w:p>
+            <w:r>
+              <w:t>Open -- flagged, not fixed; recommend a scoped follow-up on 5794:8635's (and possibly its two siblings') Content frame position.</w:t>
+            </w:r>
+          </w:p>
+        </w:tc>
+      </w:tr>
+      <w:tr>
+        <w:tc>
+          <w:tcPr>
+            <w:tcW w:type="dxa" w:w="500"/>
+          </w:tcPr>
+          <w:p>
+            <w:r>
+              <w:t>201</w:t>
+            </w:r>
+          </w:p>
+        </w:tc>
+        <w:tc>
+          <w:tcPr>
+            <w:tcW w:type="dxa" w:w="4700"/>
+          </w:tcPr>
+          <w:p>
+            <w:r>
+              <w:t>New Figma-authoring gotcha, worth folding into this project's standing Figma notes: figma.union() / figma.subtract() (and presumably figma.intersect()/figma.exclude()) discard the input shapes' own fills, resetting the resulting BOOLEAN_OPERATION node to Figma's own default gray (#D9D9D9) regardless of what color the input primitives were filled with. The fix must be applied to the resulting boolean node itself, not its (now-irrelevant, consumed) input primitives. Found and fixed while building the 8 new Admin Shell nav icons in sprint-2/admin-panel-fast-follow (Decision Log #49/#147/#179) -- all 8 initially rendered pale gray before this was caught and fixed via a verification screenshot. Distinct from, but adjacent to, this project's already-documented "a variable-bound paint takes its alpha from the variable, not the paint's own opacity" gotcha and the "createInstance() resets fractional-opacity bound paints" gotcha found in sprint-2/admin-shell-componentization (Decision Log #199).</w:t>
+            </w:r>
+          </w:p>
+        </w:tc>
+        <w:tc>
+          <w:tcPr>
+            <w:tcW w:type="dxa" w:w="1850"/>
+          </w:tcPr>
+          <w:p>
+            <w:r>
+              <w:t>sprint-2/admin-panel-fast-follow (figma-design-system)</w:t>
+            </w:r>
+          </w:p>
+        </w:tc>
+        <w:tc>
+          <w:tcPr>
+            <w:tcW w:type="dxa" w:w="2300"/>
+          </w:tcPr>
+          <w:p>
+            <w:r>
+              <w:t>Open -- fix applied locally to all 8 icon builds in this session; recommend folding into the file-wide Figma-notes gotcha list.</w:t>
             </w:r>
           </w:p>
         </w:tc>

</xml_diff>

<commit_message>
Articles/Blog cleanup, Moderation Queue overlap fix, Decision Log hygiene (#195/#196/#198/#200)
Two of the three Articles findings had stale premises caught by
verifying live: the section banner already covers all 4 Article Detail
frames (#195), and the two named frames already had their legacy nav
removed by a prior session (#196) -- but the file-wide sweep that
finding required turned up 3 real, never-retrofitted legacy nav pages
(Contact Us / Terms of Service / Privacy Policy), now Decision Log
#202. Desktop top whitespace tightened to the 81px convention (#198).
Fixed a real, confirmed layout bug on Admin -- Moderation Queue: its
Table was repositioned below the shared shell's top-bar row so the
"Filter" button is no longer hidden underneath it (#200). Also
corrects six stale Decision Log status words (#49/#50/#51/#147/#151/
#197) that had full resolution text appended but still read "Open".

Co-Authored-By: Claude Sonnet 5 <noreply@anthropic.com>
</commit_message>
<xml_diff>
--- a/docs/Soccernity_MVP_Build_Plan_v1.7.docx
+++ b/docs/Soccernity_MVP_Build_Plan_v1.7.docx
@@ -11695,7 +11695,7 @@
           </w:tcPr>
           <w:p>
             <w:r>
-              <w:t>Open — Categories icon accepted as interim. Admin Panel icon-library standardisation still open (flagged by every prior retrofit round). Converting the Admin Shell into a real component/instance set recommended as a follow-up, deferred here. Icon-standardization + shell-componentization plan delivered by sprint-2/admin-panel-structural-pass (report sections 1-2) but NOT executed -- the componentization it all hinges on is a ~45-55-call structural refactor across 29 heterogeneous screens; recommended as its own dedicated session (Decision Log #180, founder-confirmed). Icon carbon: mapping approved (Moderation -&gt; carbon:gavel, Contest -&gt; carbon:trophy, Users -&gt; carbon:user--multiple which also closes #147, Articles -&gt; carbon:document, rest per report section 1.2).</w:t>
+              <w:t>Resolved — Categories icon accepted as interim. Admin Panel icon-library standardisation still open (flagged by every prior retrofit round). Converting the Admin Shell into a real component/instance set recommended as a follow-up, deferred here. Icon-standardization + shell-componentization plan delivered by sprint-2/admin-panel-structural-pass (report sections 1-2) but NOT executed -- the componentization it all hinges on is a ~45-55-call structural refactor across 29 heterogeneous screens; recommended as its own dedicated session (Decision Log #180, founder-confirmed). Icon carbon: mapping approved (Moderation -&gt; carbon:gavel, Contest -&gt; carbon:trophy, Users -&gt; carbon:user--multiple which also closes #147, Articles -&gt; carbon:document, rest per report section 1.2).</w:t>
             </w:r>
             <w:r>
               <w:t xml:space="preserve"> UPDATE (sprint-2/admin-panel-fast-follow): Item 1 (icon standardization) is now DONE -- all 9 sidebar nav icons on the Admin Shell COMPONENT_SET are redrawn as Carbon-style glyphs (Dashboard/Articles/Users/Moderation/Categories/Contest/Media/Settings redrawn; Competitions renamed only, geometry was already correct), applied once on the component and inherited by all 29 screens. See Decision Log #147/#179 for the specific icon resolutions and #201 for a new Figma boolean-operation gotcha found mid-build.</w:t>
@@ -11740,7 +11740,7 @@
           </w:tcPr>
           <w:p>
             <w:r>
-              <w:t>Open — normalise all Admin Panel frames to 1184 tall and shift content, or accept the y-95 adaptation as canon. Frame-height plan delivered by sprint-2/admin-panel-structural-pass (report §3) but NOT executed (depends on #49/#180 componentization). Founder rule (Decision Log #177): 1184px is a FLOOR not a hard clamp -- grow the 16 screens at 1024 up to 1184; leave Appeal Review (1234) and Create Competition (1530) at their content-driven heights, no screen forced shorter.</w:t>
+              <w:t>Resolved — normalise all Admin Panel frames to 1184 tall and shift content, or accept the y-95 adaptation as canon. Frame-height plan delivered by sprint-2/admin-panel-structural-pass (report §3) but NOT executed (depends on #49/#180 componentization). Founder rule (Decision Log #177): 1184px is a FLOOR not a hard clamp -- grow the 16 screens at 1024 up to 1184; leave Appeal Review (1234) and Create Competition (1530) at their content-driven heights, no screen forced shorter.</w:t>
             </w:r>
             <w:r>
               <w:t xml:space="preserve"> UPDATE (sprint-2/admin-panel-fast-follow): Item 3 (frame height) is now DONE -- 16 screens grown 1024 -&gt; 1184 (15 plain + 1 scrim/modal screen with its scrim and dialog explicitly repositioned), with zero content-geometry drift confirmed on every screen. Admin -- Appeal Review (1234) and Admin -- Create Competition (1530) confirmed left untouched, per Decision Log #177's "1184 is a floor, not a hard clamp" resolution.</w:t>
@@ -11785,7 +11785,7 @@
           </w:tcPr>
           <w:p>
             <w:r>
-              <w:t>Open — confirm the per-screen labels, and confirm whether form/sub-screens should carry a top-bar action at all when they already have an in-content submit button. Per-screen top-bar-button KEEP/LOSE table delivered by sprint-2/admin-panel-structural-pass (report §5: KEEP 11, LOSE 15, already-removed 3) but NOT executed -- becomes a per-instance 'Show Action Button' boolean once the shell is componentized (Decision Log #180).</w:t>
+              <w:t>Resolved — confirm the per-screen labels, and confirm whether form/sub-screens should carry a top-bar action at all when they already have an in-content submit button. Per-screen top-bar-button KEEP/LOSE table delivered by sprint-2/admin-panel-structural-pass (report §5: KEEP 11, LOSE 15, already-removed 3) but NOT executed -- becomes a per-instance 'Show Action Button' boolean once the shell is componentized (Decision Log #180).</w:t>
             </w:r>
             <w:r>
               <w:t xml:space="preserve"> UPDATE (sprint-2/admin-panel-fast-follow): Item 5 (top-bar action button KEEP/LOSE) is now DONE -- applied to all 29 screens (10 KEEP including Moderation Queue's founder-resolved two-button special case, 16 LOSE with every claimed in-content submit button verified to genuinely exist before removal, 3 already-removed). See Decision Log #200 for a real, pre-existing layout defect found on Admin -- Moderation Queue: its own "Filter" button is correctly configured but structurally invisible due to unrelated content overlap, flagged as its own follow-up rather than fixed in this pass.</w:t>
@@ -16014,7 +16014,7 @@
           </w:tcPr>
           <w:p>
             <w:r>
-              <w:t>Open -- deferred. Fold into the Admin content-area retrofit family (Decision Log #52). Fix path identified by sprint-2/admin-panel-structural-pass: fi:A_users -&gt; carbon:user--multiple (a real-fill glyph) as part of the Item 1 icon standardization. Still open pending the #180 componentization session that carries that work.</w:t>
+              <w:t>Resolved -- deferred. Fold into the Admin content-area retrofit family (Decision Log #52). Fix path identified by sprint-2/admin-panel-structural-pass: fi:A_users -&gt; carbon:user--multiple (a real-fill glyph) as part of the Item 1 icon standardization. Still open pending the #180 componentization session that carries that work.</w:t>
             </w:r>
             <w:r>
               <w:t xml:space="preserve"> UPDATE (sprint-2/admin-panel-fast-follow): RESOLVED -- the Users nav icon (fi:A_users, previously rendering as empty/invisible fills) has been replaced with a new carbon:user--multiple glyph with real, solid fills, applied on the Admin Shell COMPONENT_SET and inherited by all 29 screens.</w:t>
@@ -16185,7 +16185,7 @@
           </w:tcPr>
           <w:p>
             <w:r>
-              <w:t>Open -- minor; conservative choice (preserve each screen's existing sidebar geometry) made meanwhile. Sidebar geometry unification falls out of the Admin Shell component definition (sprint-2/admin-panel-structural-pass report §4): one geometry by construction (nav block fills sidebar height, SPACE_BETWEEN, Settings bottom-pinned at any frame height). NOT executed -- part of the #180 componentization session.</w:t>
+              <w:t>Resolved -- minor; conservative choice (preserve each screen's existing sidebar geometry) made meanwhile. Sidebar geometry unification falls out of the Admin Shell component definition (sprint-2/admin-panel-structural-pass report §4): one geometry by construction (nav block fills sidebar height, SPACE_BETWEEN, Settings bottom-pinned at any frame height). NOT executed -- part of the #180 componentization session.</w:t>
             </w:r>
             <w:r>
               <w:t xml:space="preserve"> UPDATE (sprint-2/admin-panel-fast-follow): CONFIRMED, not redone -- Settings correctly pins to the sidebar's bottom on all 3 tested height variants (an already-1184 screen, a screen that just grew 1024-&gt;1184, and the 1530 screen) via the componentized shell's own SPACE_BETWEEN nav-block constraint from sprint-2/admin-shell-componentization. No component-level fix was needed.</w:t>
@@ -18059,7 +18059,10 @@
           </w:tcPr>
           <w:p>
             <w:r>
-              <w:t>Open -- needs ~5,620px of banner widening, a small figma-design-system follow-up.</w:t>
+              <w:t>Resolved -- needs ~5,620px of banner widening, a small figma-design-system follow-up.</w:t>
+            </w:r>
+            <w:r>
+              <w:t xml:space="preserve"> UPDATE (sprint-2/articles-cleanup-moderation-fix-hygiene): VERIFIED ALREADY COVERED, no resize performed. Live measurement found the banner (5942:12065, right edge x=-31460) already covers all 4 Article Detail frames (rightmost edge x=-33147) with ~1,687px to spare on each side -- a symmetric strip around the whole Blog + Articles section. The original ~5,620px-short estimate did not match the live file, likely measured before the frames reached their final position. No code/design change needed.</w:t>
             </w:r>
           </w:p>
         </w:tc>
@@ -18101,7 +18104,10 @@
           </w:tcPr>
           <w:p>
             <w:r>
-              <w:t>Open -- worth a targeted sweep confirming no other frame in the file still carries a live, un-consolidated hand-built text nav the PR #147 archival pass missed.</w:t>
+              <w:t>Resolved -- worth a targeted sweep confirming no other frame in the file still carries a live, un-consolidated hand-built text nav the PR #147 archival pass missed.</w:t>
+            </w:r>
+            <w:r>
+              <w:t xml:space="preserve"> UPDATE (sprint-2/articles-cleanup-moderation-fix-hygiene): the 2 named "Blog -- Article Detail Desktop" frames were re-checked and found to have NOTHING to hide -- their own "Group 7" legacy text nav was already removed (not just hidden) by the prior sprint-2/articles-page-split-and-navbar session. A genuine file-wide sweep (14,419 text nodes) found the real gap instead: 3 live, never-retrofitted legacy text-nav instances on Contact Us Desktop, Terms of Service Desktop, and Privacy Policy Desktop (plus their 3 mobile counterparts using an old bx:menu hamburger). See Decision Log #202 for the new candidate raised to retrofit these 6 frames.</w:t>
             </w:r>
           </w:p>
         </w:tc>
@@ -18143,7 +18149,7 @@
           </w:tcPr>
           <w:p>
             <w:r>
-              <w:t>Open -- naming-only question for founder/figma-design-system sign-off; no functional impact.</w:t>
+              <w:t>Resolved by the founder: naming confirmed as "Blog -- Article Detail" -- the 4 frames were renamed directly in Figma to "Blog -- Article Detail Desktop/Mobile -- Logged In/Logged Out" (confirmed live at 5997:10905, 5997:11224, 6000:11346, 6000:11377). No further action needed.</w:t>
             </w:r>
           </w:p>
         </w:tc>
@@ -18185,7 +18191,10 @@
           </w:tcPr>
           <w:p>
             <w:r>
-              <w:t>Open -- minor visual-consistency question for a future figma-design-system retouch pass, not blocking.</w:t>
+              <w:t>Resolved -- minor visual-consistency question for a future figma-design-system retouch pass, not blocking.</w:t>
+            </w:r>
+            <w:r>
+              <w:t xml:space="preserve"> UPDATE (sprint-2/articles-cleanup-moderation-fix-hygiene): RESOLVED -- the gap on both "Blog -- Article Detail Desktop" frames (Logged In and Logged Out) was tightened from 221px to 81px, matching Blog Page Desktop's own measured convention exactly. Content was shifted up 140px and each frame's height was reduced by the same 140px (a disclosed judgment call, not literally requested) to keep the footer flush at the bottom rather than leaving a new empty band. Verified: no overlap, footer flush, both auth states clean.</w:t>
             </w:r>
           </w:p>
         </w:tc>
@@ -18269,7 +18278,10 @@
           </w:tcPr>
           <w:p>
             <w:r>
-              <w:t>Open -- flagged, not fixed; recommend a scoped follow-up on 5794:8635's (and possibly its two siblings') Content frame position.</w:t>
+              <w:t>Resolved -- flagged, not fixed; recommend a scoped follow-up on 5794:8635's (and possibly its two siblings') Content frame position.</w:t>
+            </w:r>
+            <w:r>
+              <w:t xml:space="preserve"> UPDATE (sprint-2/articles-cleanup-moderation-fix-hygiene): RESOLVED -- Admin -- Moderation Queue's Table (5794:8718) was repositioned to sit 9px below the shared shell's top-bar row, matching the measured Articles/Categories convention. Live coordinates were re-derived (not trusted from the older report) against the componentized shell instance (6044:14064). A new Figma-authoring gotcha was found and worked around mid-fix: manually setting `.y` on an AUTO-positioned child of an auto-layout frame is silently discarded by Figma's own layout engine -- fixed by switching the affected children to ABSOLUTE positioning before moving them. Verified: Table no longer overlaps the "Filter" or "Export Queue" buttons. `Admin -- Report Detail &amp; Action` and `Admin -- Appeal Review` share the identical root cause but were deliberately left untouched -- both have Show Action Button = false, so there is no visible defect there today.</w:t>
             </w:r>
           </w:p>
         </w:tc>
@@ -18312,6 +18324,48 @@
           <w:p>
             <w:r>
               <w:t>Open -- fix applied locally to all 8 icon builds in this session; recommend folding into the file-wide Figma-notes gotcha list.</w:t>
+            </w:r>
+          </w:p>
+        </w:tc>
+      </w:tr>
+      <w:tr>
+        <w:tc>
+          <w:tcPr>
+            <w:tcW w:type="dxa" w:w="500"/>
+          </w:tcPr>
+          <w:p>
+            <w:r>
+              <w:t>202</w:t>
+            </w:r>
+          </w:p>
+        </w:tc>
+        <w:tc>
+          <w:tcPr>
+            <w:tcW w:type="dxa" w:w="4700"/>
+          </w:tcPr>
+          <w:p>
+            <w:r>
+              <w:t>3 live, never-retrofitted legacy text-nav instances found file-wide during the sprint-2/articles-cleanup-moderation-fix-hygiene Decision Log #196 sweep: Contact Us Desktop (87:158), Terms of Service Desktop (102:340), and Privacy Policy Desktop (104:444) each still carry the exact pre-redesign "Group 7" Home/Community/Livescores/About Us text nav plus an old-style logo lockup, byte-identical in structure to what Blog/Articles carried before their own navbar retrofit. Their 3 mobile counterparts (Contact Us Mobile, Terms of Service mobile, Privacy Policy mobile) carry an old bx:menu hamburger + logo lockup instead of the canonical mobile navbar -- a related but distinct finding (icon-based, not a text-link row). None of these 6 frames has ever been touched by any navbar-retrofit pass in this project's history. Recommend a scoped figma-design-system follow-up giving these 3 page-pairs the same header 4 / header 7 (desktop) and header 4 -- mobile / header 7 -- mobile (mobile) treatment every other section of the file already has.</w:t>
+            </w:r>
+          </w:p>
+        </w:tc>
+        <w:tc>
+          <w:tcPr>
+            <w:tcW w:type="dxa" w:w="1850"/>
+          </w:tcPr>
+          <w:p>
+            <w:r>
+              <w:t>sprint-2/articles-cleanup-moderation-fix-hygiene (figma-design-system)</w:t>
+            </w:r>
+          </w:p>
+        </w:tc>
+        <w:tc>
+          <w:tcPr>
+            <w:tcW w:type="dxa" w:w="2300"/>
+          </w:tcPr>
+          <w:p>
+            <w:r>
+              <w:t>Open -- recommend a scoped figma-design-system follow-up to retrofit Contact Us / Terms of Service / Privacy Policy (desktop + mobile) onto the canonical navbar.</w:t>
             </w:r>
           </w:p>
         </w:tc>

</xml_diff>

<commit_message>
Legal pages navbar retrofit: Contact Us, Terms of Service, Privacy Policy (Decision Log #202)
Splits the 3 remaining never-retrofitted legacy pages into
Desktop/Mobile x Logged In/Out frames with canonical navbar instances,
matching the Blog and Articles precedent exactly. Mobile rebuilt at
390px via a tested reparent-into-fresh-shell approach (plain resize
would have corrupted absolute-positioned content). 12 new frames, 6
originals archived. Session was interrupted mid-task by a rate limit
and resumed with live-state re-verification before continuing, so
nothing was duplicated or left broken.

Six new Decision Log candidates raised, none fixed here -- most
notably #203: the Terms of Service/Privacy Policy body copy is Lorem
ipsum, a real safeguarding item blocking figma-to-code conversion
until real, counsel-reviewed copy exists.

Co-Authored-By: Claude Sonnet 5 <noreply@anthropic.com>
</commit_message>
<xml_diff>
--- a/docs/Soccernity_MVP_Build_Plan_v1.7.docx
+++ b/docs/Soccernity_MVP_Build_Plan_v1.7.docx
@@ -18365,7 +18365,262 @@
           </w:tcPr>
           <w:p>
             <w:r>
-              <w:t>Open -- recommend a scoped figma-design-system follow-up to retrofit Contact Us / Terms of Service / Privacy Policy (desktop + mobile) onto the canonical navbar.</w:t>
+              <w:t>Resolved -- recommend a scoped figma-design-system follow-up to retrofit Contact Us / Terms of Service / Privacy Policy (desktop + mobile) onto the canonical navbar.</w:t>
+            </w:r>
+            <w:r>
+              <w:t xml:space="preserve"> RESOLVED (sprint-2/legal-pages-navbar-retrofit): all three legal page families (Contact Us, Terms of Service, Privacy Policy) split into Desktop/Mobile x Logged In/Out with canonical navbar instances -- 12 new frames (desktop 1440px, mobile rebuilt at the canonical 390px), 6 originals archived (hidden + renamed, not deleted). 0 brand/green-tint-28, 0 new colours, 0 overlaps; 6 disclosed unbound paints, all the same already-known missing-wordmark defect from Decision Log #174 (see Decision Log #204). See docs/sprint-2-legal-pages-navbar-retrofit-report.md for full detail.</w:t>
+            </w:r>
+          </w:p>
+        </w:tc>
+      </w:tr>
+      <w:tr>
+        <w:tc>
+          <w:tcPr>
+            <w:tcW w:type="dxa" w:w="500"/>
+          </w:tcPr>
+          <w:p>
+            <w:r>
+              <w:t>203</w:t>
+            </w:r>
+          </w:p>
+        </w:tc>
+        <w:tc>
+          <w:tcPr>
+            <w:tcW w:type="dxa" w:w="4700"/>
+          </w:tcPr>
+          <w:p>
+            <w:r>
+              <w:t>Legal body copy is Lorem ipsum: the Terms of Service and Privacy Policy bodies on both the newly-split frames and their archived originals are placeholder Lorem ipsum, inherited unchanged (this session had no mandate to write legal text). This is a minors' platform with real DPIA/GDPR/NDPA obligations, and CLAUDE.md non-negotiable #2 requires counsel review of any policy language. figma-to-code must NOT ship these two screens as though the body text were real -- drafting the real copy is a safeguarding-drafter -&gt; counsel deliverable, not a design task.</w:t>
+            </w:r>
+          </w:p>
+        </w:tc>
+        <w:tc>
+          <w:tcPr>
+            <w:tcW w:type="dxa" w:w="1850"/>
+          </w:tcPr>
+          <w:p>
+            <w:r>
+              <w:t>sprint-2/legal-pages-navbar-retrofit (figma-screen-builder)</w:t>
+            </w:r>
+          </w:p>
+        </w:tc>
+        <w:tc>
+          <w:tcPr>
+            <w:tcW w:type="dxa" w:w="2300"/>
+          </w:tcPr>
+          <w:p>
+            <w:r>
+              <w:t>Open -- blocks figma-to-code conversion of Terms of Service / Privacy Policy until real, counsel-reviewed copy exists. Dispatch safeguarding-drafter for a first-pass draft.</w:t>
+            </w:r>
+          </w:p>
+        </w:tc>
+      </w:tr>
+      <w:tr>
+        <w:tc>
+          <w:tcPr>
+            <w:tcW w:type="dxa" w:w="500"/>
+          </w:tcPr>
+          <w:p>
+            <w:r>
+              <w:t>204</w:t>
+            </w:r>
+          </w:p>
+        </w:tc>
+        <w:tc>
+          <w:tcPr>
+            <w:tcW w:type="dxa" w:w="4700"/>
+          </w:tcPr>
+          <w:p>
+            <w:r>
+              <w:t>The 294x67 #D9D9D9 missing-wordmark footer pill Decision Log #174 already found and fixed on the 4 Blog Page desktop frames (and left open on the Articles Page family) is also present on the 6 new legal-pages desktop frames (Contact Us / Terms of Service / Privacy Policy, Logged In + Logged Out) -- same geometry, same hex, same footer position. Not fixed in sprint-2/legal-pages-navbar-retrofit, deliberately -- that session's scope was the navbar retrofit, not a file-wide wordmark sweep, and widening it unilaterally would break the same scoping discipline #174 itself used.</w:t>
+            </w:r>
+          </w:p>
+        </w:tc>
+        <w:tc>
+          <w:tcPr>
+            <w:tcW w:type="dxa" w:w="1850"/>
+          </w:tcPr>
+          <w:p>
+            <w:r>
+              <w:t>sprint-2/legal-pages-navbar-retrofit (figma-screen-builder)</w:t>
+            </w:r>
+          </w:p>
+        </w:tc>
+        <w:tc>
+          <w:tcPr>
+            <w:tcW w:type="dxa" w:w="2300"/>
+          </w:tcPr>
+          <w:p>
+            <w:r>
+              <w:t>Open -- recommend one scoped figma-design-system pass applying #174's own fix (replace the pill with a real "Soccernity." text node bound to color/text/on-navy, Montserrat ExtraBold, 30px desktop) across all remaining families at once: Articles Page (54:434/87:80) and the 6 new legal desktop frames.</w:t>
+            </w:r>
+          </w:p>
+        </w:tc>
+      </w:tr>
+      <w:tr>
+        <w:tc>
+          <w:tcPr>
+            <w:tcW w:type="dxa" w:w="500"/>
+          </w:tcPr>
+          <w:p>
+            <w:r>
+              <w:t>205</w:t>
+            </w:r>
+          </w:p>
+        </w:tc>
+        <w:tc>
+          <w:tcPr>
+            <w:tcW w:type="dxa" w:w="4700"/>
+          </w:tcPr>
+          <w:p>
+            <w:r>
+              <w:t>Orphaned page-level "Contact Dropdown" group (87:250) -- a top-level GROUP, 415x330 at x=-13944, y=-29514, sitting outside any frame and visually overlapping the now-archived Contact Us Mobile. Appears to be the open-state of the Contact Us form's "Choose a category" select, detached from its parent screen. Not touched by sprint-2/legal-pages-navbar-retrofit (out of scope, no new frame depends on it).</w:t>
+            </w:r>
+          </w:p>
+        </w:tc>
+        <w:tc>
+          <w:tcPr>
+            <w:tcW w:type="dxa" w:w="1850"/>
+          </w:tcPr>
+          <w:p>
+            <w:r>
+              <w:t>sprint-2/legal-pages-navbar-retrofit (figma-screen-builder)</w:t>
+            </w:r>
+          </w:p>
+        </w:tc>
+        <w:tc>
+          <w:tcPr>
+            <w:tcW w:type="dxa" w:w="2300"/>
+          </w:tcPr>
+          <w:p>
+            <w:r>
+              <w:t>Open -- needs a decision: rebuild it as a real open-state on the new Contact Us frames, or delete it as a stray orphan.</w:t>
+            </w:r>
+          </w:p>
+        </w:tc>
+      </w:tr>
+      <w:tr>
+        <w:tc>
+          <w:tcPr>
+            <w:tcW w:type="dxa" w:w="500"/>
+          </w:tcPr>
+          <w:p>
+            <w:r>
+              <w:t>206</w:t>
+            </w:r>
+          </w:p>
+        </w:tc>
+        <w:tc>
+          <w:tcPr>
+            <w:tcW w:type="dxa" w:w="4700"/>
+          </w:tcPr>
+          <w:p>
+            <w:r>
+              <w:t>No section banner exists over the Contact Us / Terms of Service / Privacy Policy row -- unlike Blog/Articles, which have one (5942:12065). Confirmed these 3 legal pages have never had one. The 12 new frames from sprint-2/legal-pages-navbar-retrofit sit in a clean new row at y=-26800 with no section banner or label.</w:t>
+            </w:r>
+          </w:p>
+        </w:tc>
+        <w:tc>
+          <w:tcPr>
+            <w:tcW w:type="dxa" w:w="1850"/>
+          </w:tcPr>
+          <w:p>
+            <w:r>
+              <w:t>sprint-2/legal-pages-navbar-retrofit (figma-screen-builder)</w:t>
+            </w:r>
+          </w:p>
+        </w:tc>
+        <w:tc>
+          <w:tcPr>
+            <w:tcW w:type="dxa" w:w="2300"/>
+          </w:tcPr>
+          <w:p>
+            <w:r>
+              <w:t>Open -- recommend adding a section banner covering the new row, matching how every other section of the file is delimited.</w:t>
+            </w:r>
+          </w:p>
+        </w:tc>
+      </w:tr>
+      <w:tr>
+        <w:tc>
+          <w:tcPr>
+            <w:tcW w:type="dxa" w:w="500"/>
+          </w:tcPr>
+          <w:p>
+            <w:r>
+              <w:t>207</w:t>
+            </w:r>
+          </w:p>
+        </w:tc>
+        <w:tc>
+          <w:tcPr>
+            <w:tcW w:type="dxa" w:w="4700"/>
+          </w:tcPr>
+          <w:p>
+            <w:r>
+              <w:t>Stale "Copyright (c) 2022 Soccernity" text still renders on both the Contact Us / Terms of Service / Privacy Policy footers (inherited verbatim by the new frames, not introduced by sprint-2/legal-pages-navbar-retrofit) -- the same defect class the homepage rebuild already found and fixed on its own footer. Still live on these (and, by inspection, other) legacy footers file-wide.</w:t>
+            </w:r>
+          </w:p>
+        </w:tc>
+        <w:tc>
+          <w:tcPr>
+            <w:tcW w:type="dxa" w:w="1850"/>
+          </w:tcPr>
+          <w:p>
+            <w:r>
+              <w:t>sprint-2/legal-pages-navbar-retrofit (figma-screen-builder)</w:t>
+            </w:r>
+          </w:p>
+        </w:tc>
+        <w:tc>
+          <w:tcPr>
+            <w:tcW w:type="dxa" w:w="2300"/>
+          </w:tcPr>
+          <w:p>
+            <w:r>
+              <w:t>Open -- not fixed, since it recurs across many frames and belongs in one file-wide copy pass rather than a piecemeal fix.</w:t>
+            </w:r>
+          </w:p>
+        </w:tc>
+      </w:tr>
+      <w:tr>
+        <w:tc>
+          <w:tcPr>
+            <w:tcW w:type="dxa" w:w="500"/>
+          </w:tcPr>
+          <w:p>
+            <w:r>
+              <w:t>208</w:t>
+            </w:r>
+          </w:p>
+        </w:tc>
+        <w:tc>
+          <w:tcPr>
+            <w:tcW w:type="dxa" w:w="4700"/>
+          </w:tcPr>
+          <w:p>
+            <w:r>
+              <w:t>No prototype wiring exists on the 12 new legal-page navbar instances, so the footer "Terms of Service" / "Privacy Policy" / "Contact Us" links elsewhere in the file still do not navigate to these screens. This matches the rest of the file (the Blog/Articles retrofits added no prototype wiring either), so it is consistent, not a regression -- but the link targets now genuinely exist as real frames, so wiring them is newly possible.</w:t>
+            </w:r>
+          </w:p>
+        </w:tc>
+        <w:tc>
+          <w:tcPr>
+            <w:tcW w:type="dxa" w:w="1850"/>
+          </w:tcPr>
+          <w:p>
+            <w:r>
+              <w:t>sprint-2/legal-pages-navbar-retrofit (figma-screen-builder)</w:t>
+            </w:r>
+          </w:p>
+        </w:tc>
+        <w:tc>
+          <w:tcPr>
+            <w:tcW w:type="dxa" w:w="2300"/>
+          </w:tcPr>
+          <w:p>
+            <w:r>
+              <w:t>Open -- optional follow-up; not blocking, since the file has no established convention of wiring footer-link prototypes yet either.</w:t>
             </w:r>
           </w:p>
         </w:tc>

</xml_diff>

<commit_message>
Footer standardization: replace 24 non-canonical footer instances (Decision Log #209)
Leaderboard/Contest/Competition-tab frames (22) and Sports/Livescores
mobile (2) all carried older or stub footer patterns instead of the
canonical footer from the Home Page rebuild. Replaced with clones of
the canonical desktop/mobile footer, reparented into each frame's own
auto-layout container; frame heights grew automatically via hug sizing.
File-wide sweep confirms zero non-canonical footer instances remain.

Co-Authored-By: Claude Sonnet 5 <noreply@anthropic.com>
</commit_message>
<xml_diff>
--- a/docs/Soccernity_MVP_Build_Plan_v1.7.docx
+++ b/docs/Soccernity_MVP_Build_Plan_v1.7.docx
@@ -18669,6 +18669,48 @@
             <w:r>
               <w:rPr/>
               <w:t>RESOLVED for all live content (sprint-2/decision-log-204-208-cleanup, figma-design-system). A fresh file-wide scan found 263 occurrences (not the 203 carried over from Decision Log #202's older scan -- re-verified live, the file has grown since) across 71 distinct top-level host frames. 189 wired via ON_CLICK/NAVIGATE to the correct new Legal page frame, branching by breakpoint (frame width) and auth state -- explicit frame-name suffixes where available, or Decision Log cross-reference where not (Leaderboard/Contest/Competition family to Logged In per Decision Log #129; the two canonical Home Page frames to Logged Out per Decision Log #46/#152; Community/Bants family to Logged In per the site-wide login-gating Decision Log #152 establishes). 46 skipped (archived frames, left untouched). 28 correctly left unwired -- same-type self-references (a page's own footer link to itself, or its own H1 heading matching the search string) that Figma's own NAVIGATE action correctly rejects as same-top-level-frame navigation, confirmed via direct re-check this is the right outcome, not a bug. Spot-checked across breakpoints/auth states via fresh reads. See docs/sprint-2-decision-log-204-208-cleanup-report.md.</w:t>
+            </w:r>
+          </w:p>
+        </w:tc>
+      </w:tr>
+      <w:tr>
+        <w:tc>
+          <w:tcPr>
+            <w:tcW w:type="dxa" w:w="500"/>
+          </w:tcPr>
+          <w:p>
+            <w:r>
+              <w:t>209</w:t>
+            </w:r>
+          </w:p>
+        </w:tc>
+        <w:tc>
+          <w:tcPr>
+            <w:tcW w:type="dxa" w:w="4700"/>
+          </w:tcPr>
+          <w:p>
+            <w:r>
+              <w:t>File-wide footer inconsistency: 22 Leaderboard/Contest frames used an older "Footer — Soccernity Global" pattern (plain-text social labels, no icons, an extra "Cookie Policy" link, no hairline rule) instead of the canonical footer established on the Home Page rebuild (Decision Log #46), and both Sports/Livescores mobile frames used a compact 96px stub footer missing the social bar and legal links entirely. A real design-consistency defect, not tied to any single prior numbered item.</w:t>
+            </w:r>
+          </w:p>
+        </w:tc>
+        <w:tc>
+          <w:tcPr>
+            <w:tcW w:type="dxa" w:w="1850"/>
+          </w:tcPr>
+          <w:p>
+            <w:r>
+              <w:t>sprint-2/footer-standardization (figma-design-system)</w:t>
+            </w:r>
+          </w:p>
+        </w:tc>
+        <w:tc>
+          <w:tcPr>
+            <w:tcW w:type="dxa" w:w="2300"/>
+          </w:tcPr>
+          <w:p>
+            <w:r>
+              <w:t>Resolved -- all 24 non-canonical footer instances (22 "Footer — Soccernity Global" on Leaderboard/Contest/Competition frames + 2 compact Sports/Livescores mobile footers) replaced with clones of the canonical footer (desktop source 5213:6816 / mobile source 5543:7662), reparented into each target's own auto-layout frame at the old footer's position, old footer removed. Every target frame uses VERTICAL auto-layout with primaryAxisSizingMode=AUTO, so each frame's own height grew automatically to fit the taller canonical footer -- no manual resize/reposition math was needed, and no frame.resize()-on-GROUPs risk applied since none of these are absolute-layout content. Verified: bound-paint set on every new footer (brand/green, color/text/on-navy, color/icon/inactive, brand/navy) matches the canonical footer's own bindings exactly; screenshots confirmed clean on a sample from every family (Leaderboard desktop + mobile, Contest, Empty State, both Sports Hub mobile states, the latter two the largest single growth at +322px); a file-wide sweep for any remaining "Footer — Soccernity Global" or bare "Footer" (non-Action) instance outside archived/hidden frames returned zero matches. "Footer Action" nodes (unrelated form-action button bars) and Admin Panel frames were confirmed live to carry none of the old pattern and were untouched.</w:t>
             </w:r>
           </w:p>
         </w:tc>

</xml_diff>

<commit_message>
Replace second legacy footer template on Blog/Article Detail/Legal/Sports (Decision Log #210)
A previously-undiscovered footer template (Group 47/Group 55, never
named "Footer") was missed by every earlier footer sweep. Confirmed
live: no hairline divider, missing social icons (0/6 desktop, 3/6
mobile), a duplicated "Terms of Service" label, and a bare wordmark
with no logo icon on most desktop instances. Replaced all 22 instances
with clones of the canonical footer, including a dangling wordmark
instance found and removed on the two Article Detail Mobile frames.

An empirical drift test (556-node deep snapshot, before/after/revert)
confirmed height-only resizes are safe on these absolute-layout frames,
avoiding the heavier reparent-into-fresh-shell method needed for the
width-axis drift bug these frames' siblings hit elsewhere.

Co-Authored-By: Claude Sonnet 5 <noreply@anthropic.com>
</commit_message>
<xml_diff>
--- a/docs/Soccernity_MVP_Build_Plan_v1.7.docx
+++ b/docs/Soccernity_MVP_Build_Plan_v1.7.docx
@@ -18711,6 +18711,48 @@
           <w:p>
             <w:r>
               <w:t>Resolved -- all 24 non-canonical footer instances (22 "Footer — Soccernity Global" on Leaderboard/Contest/Competition frames + 2 compact Sports/Livescores mobile footers) replaced with clones of the canonical footer (desktop source 5213:6816 / mobile source 5543:7662), reparented into each target's own auto-layout frame at the old footer's position, old footer removed. Every target frame uses VERTICAL auto-layout with primaryAxisSizingMode=AUTO, so each frame's own height grew automatically to fit the taller canonical footer -- no manual resize/reposition math was needed, and no frame.resize()-on-GROUPs risk applied since none of these are absolute-layout content. Verified: bound-paint set on every new footer (brand/green, color/text/on-navy, color/icon/inactive, brand/navy) matches the canonical footer's own bindings exactly; screenshots confirmed clean on a sample from every family (Leaderboard desktop + mobile, Contest, Empty State, both Sports Hub mobile states, the latter two the largest single growth at +322px); a file-wide sweep for any remaining "Footer — Soccernity Global" or bare "Footer" (non-Action) instance outside archived/hidden frames returned zero matches. "Footer Action" nodes (unrelated form-action button bars) and Admin Panel frames were confirmed live to carry none of the old pattern and were untouched.</w:t>
+            </w:r>
+          </w:p>
+        </w:tc>
+      </w:tr>
+      <w:tr>
+        <w:tc>
+          <w:tcPr>
+            <w:tcW w:type="dxa" w:w="500"/>
+          </w:tcPr>
+          <w:p>
+            <w:r>
+              <w:t>210</w:t>
+            </w:r>
+          </w:p>
+        </w:tc>
+        <w:tc>
+          <w:tcPr>
+            <w:tcW w:type="dxa" w:w="4700"/>
+          </w:tcPr>
+          <w:p>
+            <w:r>
+              <w:t>A second, previously-undiscovered legacy footer template (internally named "Group 47" desktop / "Group 55" mobile, never wrapped in a node literally named "Footer") was found live on Blog, Blog Article Detail, the 3 Legal pages, and Sports Hub desktop -- 22 frames, missed by every earlier "Footer"-named sweep (#174, #204, #209) precisely because it doesn't carry that name. Confirmed defects: 0 hairline divider anywhere; 0 of 6 social icons on desktop instances, only 3 of 6 (Facebook/Instagram/Twitter) on mobile; every single instance had a duplicated "Terms of Service" label in the Legal Links row (4th slot, between Privacy Settings and Contact Us) -- strong circumstantial evidence (matching the exact 5-link slot order of the OTHER already-documented legacy template, "Footer -- Soccernity Global", whose 4th slot is "Cookie Policy") that this was meant to say "Cookie Policy" before a copy-paste error, though the canonical 4-link footer that replaces it makes the point moot; desktop wordmark was bare "Soccernity." text with no paired logo icon on 10 of 12 instances. Not a duplicate of #204/#209 -- neither of those sweeps' node lists ever included this template.</w:t>
+            </w:r>
+          </w:p>
+        </w:tc>
+        <w:tc>
+          <w:tcPr>
+            <w:tcW w:type="dxa" w:w="1850"/>
+          </w:tcPr>
+          <w:p>
+            <w:r>
+              <w:t>sprint-2/legacy-footer-template-replacement (figma-design-system)</w:t>
+            </w:r>
+          </w:p>
+        </w:tc>
+        <w:tc>
+          <w:tcPr>
+            <w:tcW w:type="dxa" w:w="2300"/>
+          </w:tcPr>
+          <w:p>
+            <w:r>
+              <w:t>Resolved -- all 22 legacy Group 47/Group 55 footer instances replaced with clones of the canonical footer (desktop source 5213:6816 / mobile source 5543:7662), inserted at the old footer's exact position (x=0, same y), old footer removed. On Sports Page desktop, the old footer's paired logo+text lockup (a symbol instance named "Group 103", component 437:3011) was checked directly against Decision Log #194's finding and confirmed to be a DIFFERENT, coincidentally-same-named node that was actually a correct logo+wordmark pairing -- not a recurrence of #194's bug (which was about a different "Group 103" being mistaken for a top-nav logo lockup on a different page). On the two Article Detail Mobile frames specifically, the old footer's wordmark lived as a separate sibling instance (also of component 437:3011) sitting outside the Group 55 boundary rather than embedded inside it -- identified and deleted alongside the old footer so no dangling wordmark was left floating over the new canonical footer. Method note, confirmed live rather than assumed per the task's own instruction: all 22 parent frames are layoutMode=NONE (absolute layout, not auto-layout), so unlike Decision Log #209's auto-layout targets, each parent's height needed an explicit resize. Before committing to this approach across all 22, a direct empirical test (grow, deep-snapshot all 556 descendant nodes, compare, revert) confirmed a height-only resize on these specific frames produces zero drift in any child or nested GROUP leaf -- every relevant node already carries vertical=MIN constraints -- so the reparent-into-fresh-shell technique (needed for the WIDTH-axis drift bug these frames' siblings hit in the Blog/Articles/Legal-pages sessions) was not required here; each parent was resized directly using an exact per-frame delta (new footer height minus old footer height), not a hardcoded assumption, correctly handling the 2 frames (Article Detail Mobile) whose old footer was not flush against the frame's bottom edge. Desktop frames shrank ~15px (canonical 314 vs. old 329); mobile frames grew ~167px (canonical 418 vs. old 251). Verified: bound-paint set on every new footer matches the canonical footer's own bindings exactly; screenshots confirmed clean on a sample from every family (Blog, Article Detail, all 3 Legal pages, Sports, both Article Detail Mobile frames specifically re-checked for the dangling-wordmark risk); a file-wide sweep for any remaining "Group 47"/"Group 55" carrying the broken template's duplicate-ToS marker found 10 matches, all confirmed to sit inside already-archived, hidden top-level frames (the pre-navbar-retrofit originals) -- zero live instances remain.</w:t>
             </w:r>
           </w:p>
         </w:tc>

</xml_diff>

<commit_message>
Convert Leaderboard/Banter/Sports Hub from PlaceholderPage stubs to real code (Decision Log #211)
Converts the last three main-nav PlaceholderPage stubs to real React
pages, matching HomePage/CommunityPage/ClubsPage conventions. Backend
state confirmed live first: leaderboard, banter, and sports modules are
all still bare README placeholders (Sprint 6/3/4, unbuilt), so all
domain content (rankings, rooms, scores) is illustrative dummy data,
same disclosed convention as HomePage's own FIXTURES constant.

LeaderboardPage requires login (Decision Log #129); its CLUB filter uses
real GET /clubs membership data, while the single "represented club"
selection is a disclosed local-state stub (no backend field exists yet).
BanterPage requires login (Decision Log #152) and fetches the caller's
real display name. SportsHubPage has no login gate, matching its own
logged-in/out Figma frame pair.

Co-Authored-By: Claude Sonnet 5 <noreply@anthropic.com>
</commit_message>
<xml_diff>
--- a/docs/Soccernity_MVP_Build_Plan_v1.7.docx
+++ b/docs/Soccernity_MVP_Build_Plan_v1.7.docx
@@ -18753,6 +18753,48 @@
           <w:p>
             <w:r>
               <w:t>Resolved -- all 22 legacy Group 47/Group 55 footer instances replaced with clones of the canonical footer (desktop source 5213:6816 / mobile source 5543:7662), inserted at the old footer's exact position (x=0, same y), old footer removed. On Sports Page desktop, the old footer's paired logo+text lockup (a symbol instance named "Group 103", component 437:3011) was checked directly against Decision Log #194's finding and confirmed to be a DIFFERENT, coincidentally-same-named node that was actually a correct logo+wordmark pairing -- not a recurrence of #194's bug (which was about a different "Group 103" being mistaken for a top-nav logo lockup on a different page). On the two Article Detail Mobile frames specifically, the old footer's wordmark lived as a separate sibling instance (also of component 437:3011) sitting outside the Group 55 boundary rather than embedded inside it -- identified and deleted alongside the old footer so no dangling wordmark was left floating over the new canonical footer. Method note, confirmed live rather than assumed per the task's own instruction: all 22 parent frames are layoutMode=NONE (absolute layout, not auto-layout), so unlike Decision Log #209's auto-layout targets, each parent's height needed an explicit resize. Before committing to this approach across all 22, a direct empirical test (grow, deep-snapshot all 556 descendant nodes, compare, revert) confirmed a height-only resize on these specific frames produces zero drift in any child or nested GROUP leaf -- every relevant node already carries vertical=MIN constraints -- so the reparent-into-fresh-shell technique (needed for the WIDTH-axis drift bug these frames' siblings hit in the Blog/Articles/Legal-pages sessions) was not required here; each parent was resized directly using an exact per-frame delta (new footer height minus old footer height), not a hardcoded assumption, correctly handling the 2 frames (Article Detail Mobile) whose old footer was not flush against the frame's bottom edge. Desktop frames shrank ~15px (canonical 314 vs. old 329); mobile frames grew ~167px (canonical 418 vs. old 251). Verified: bound-paint set on every new footer matches the canonical footer's own bindings exactly; screenshots confirmed clean on a sample from every family (Blog, Article Detail, all 3 Legal pages, Sports, both Article Detail Mobile frames specifically re-checked for the dangling-wordmark risk); a file-wide sweep for any remaining "Group 47"/"Group 55" carrying the broken template's duplicate-ToS marker found 10 matches, all confirmed to sit inside already-archived, hidden top-level frames (the pre-navbar-retrofit originals) -- zero live instances remain.</w:t>
+            </w:r>
+          </w:p>
+        </w:tc>
+      </w:tr>
+      <w:tr>
+        <w:tc>
+          <w:tcPr>
+            <w:tcW w:type="dxa" w:w="500"/>
+          </w:tcPr>
+          <w:p>
+            <w:r>
+              <w:t>211</w:t>
+            </w:r>
+          </w:p>
+        </w:tc>
+        <w:tc>
+          <w:tcPr>
+            <w:tcW w:type="dxa" w:w="4700"/>
+          </w:tcPr>
+          <w:p>
+            <w:r>
+              <w:t>Two real judgment calls made while converting LeaderboardPage.tsx from a PlaceholderPage stub to real code (sprint-2/leaderboard-banter-sportshub-to-code): (1) Decision Log #74/#128 describes a single explicitly-selected 'represented club' for the Leaderboard's per-club scope, but confirmed live that no schema column or endpoint for it exists yet (services/api has no represented-club field anywhere, matching CLAUDE.md's own 'Backend requirements parked' list) -- how should the frontend behave meanwhile? (2) The real Contest mechanic has four distinct phases (Vacant, three weekly-fill states, Live Level-1 Final, Crowned monthly winners -- Decision Log #70), each its own Figma frame; reproducing all four in a first code-conversion pass is materially more scope than converting one board with one representative state per tab.</w:t>
+            </w:r>
+          </w:p>
+        </w:tc>
+        <w:tc>
+          <w:tcPr>
+            <w:tcW w:type="dxa" w:w="1850"/>
+          </w:tcPr>
+          <w:p>
+            <w:r>
+              <w:t>sprint-2/leaderboard-banter-sportshub-to-code (figma-to-code)</w:t>
+            </w:r>
+          </w:p>
+        </w:tc>
+        <w:tc>
+          <w:tcPr>
+            <w:tcW w:type="dxa" w:w="2300"/>
+          </w:tcPr>
+          <w:p>
+            <w:r>
+              <w:t>Resolved for this pass, both disclosed rather than silently decided. (1) The CLUB filter's dropdown OPTIONS are real data -- sourced from the caller's actual GET /clubs response filtered to joined:true (Decision Log #154's real per-caller field), so the list of clubs a user can filter by is genuine, live membership data. WHICH one is treated as 'represented', however, is a typed local-state stub: it defaults to the first real joined club and can be changed in the UI, but the selection is never persisted (no endpoint exists to save it) and resets on reload. This satisfies the task brief's own instruction to wire the UI against a typed stub rather than block the page on the missing endpoint. A real persisted represented-club field/endpoint remains the open item Decision Log #74 already tracks -- once it exists, only this one piece of local state needs to be swapped for a real GET/PATCH call, with no other page structure change needed. (2) The Contest tab ships as a single illustrative 'weekly winners so far' table (dummy data, same discipline as HomePage.tsx's own FIXTURES constant) rather than the full four-phase state machine. This is a deliberate, disclosed scope reduction for the first conversion pass, not a silent omission -- flagged in LeaderboardPage.tsx's own header comment and in leaderboardData.ts. Reproducing the full Contest phase machinery (which itself has no real backing data source either, since the Contest data model still does not exist in the schema) is left as a follow-up candidate for whoever next touches this page, not built here.</w:t>
             </w:r>
           </w:p>
         </w:tc>

</xml_diff>

<commit_message>
Fix Create Post desktop + auth-page navbars in Figma; add 2 Create Post desktop states (Decision Log #214)
Figma design only — no app/backend code.

Part 1: new frames Create Post — Desktop — Active Contest (6171:14797) and
No Active Contest (6171:16994), cloned from the fixed Create-a-post frame in
the page-with-modal-overlay pattern, matching mobile 5982:10905 / 5982:10932.

Part 2: all 5 Create Post desktop frames now use a real Navbar — header 4
instance (logged-in web nav) at z-index 0 under the modal scrim; 9 hand-drawn
nav nodes removed from each of the 3 existing frames.

Part 3: all 12 Login/Register/Forgot Password/Reset Password frames
(desktop + mobile) swapped from the logged-out header 7 navbar to a clone of
the Verify Email Top Bar — Soccernity frame, matching the shipped
AuthChrome/AuthTopBar (Decision Log #172). Verify Email and Guardian Consent
re-verified live and left untouched.

Co-Authored-By: Claude Sonnet 5 <noreply@anthropic.com>
</commit_message>
<xml_diff>
--- a/docs/Soccernity_MVP_Build_Plan_v1.7.docx
+++ b/docs/Soccernity_MVP_Build_Plan_v1.7.docx
@@ -18879,6 +18879,48 @@
           <w:p>
             <w:r>
               <w:t>Resolved by the founder: the footer is a shared component (apps/web/src/layout/Footer.tsx), rendered once by a new pathless layout route FooterLayout nested under AppShell (mirroring the AuthChrome split from Decision Log #172, one layer deeper). FooterLayout children = the pages whose canonical Figma frame carries the footer: Home, Sports Hub, Leaderboard, Blog, Article Detail. Community / Clubs / ClubFanPage / Banter stay direct AppShell children with NO footer — confirmed live that their Figma frames have none. Footer.tsx is built to the CANONICAL footer (desktop 5213:6816 / mobile 5543:7662), not the drifted inline copy — logo mark + 6-icon social bar + bullet-separated legal links + rule + copyright all restored. Legal links / social icons render as non-interactive spans (no /terms, /privacy, /contact routes yet — Decision Log #203; no published social accounts). The Figma rule binds --sn-icon-inactive (navy @ 15%, invisible on navy); shared component uses white @ 15% to keep the intent. HomePage.tsx's inline footer JSX + CSS removed. Legal pages (Decision Log #202/#203) will pick up the shared footer automatically once converted, if added as FooterLayout children.</w:t>
+            </w:r>
+          </w:p>
+        </w:tc>
+      </w:tr>
+      <w:tr>
+        <w:tc>
+          <w:tcPr>
+            <w:tcW w:type="dxa" w:w="500"/>
+          </w:tcPr>
+          <w:p>
+            <w:r>
+              <w:t>214</w:t>
+            </w:r>
+          </w:p>
+        </w:tc>
+        <w:tc>
+          <w:tcPr>
+            <w:tcW w:type="dxa" w:w="4700"/>
+          </w:tcPr>
+          <w:p>
+            <w:r>
+              <w:t>Create Post desktop + core auth pages carried the wrong navbar in Figma, out of sync with the shipped app. (a) The 3 existing Create Post desktop frames (Create a post / For Contest / with attachment) used a hand-drawn bar (plain Rectangle + loose Group logo + fake search + fake icons) instead of a real Navbar component. (b) Login / Register / Forgot Password / Forgot Password — Link Sent / Reset Password / Reset Password — Success (desktop + mobile, 12 frames) still showed the full logged-out header 7 navbar, even though AuthChrome/AuthTopBar (Decision Log #172, shipped PR #152) has rendered the simple Top Bar — Soccernity for those routes since then. (c) Create Post desktop had no Active-Contest / No-Active-Contest states to match the mobile set (Decision Log #148 / #188). (d) On No-Active-Contest desktop, how should the modal header read once the Contest tab is gone?</w:t>
+            </w:r>
+          </w:p>
+        </w:tc>
+        <w:tc>
+          <w:tcPr>
+            <w:tcW w:type="dxa" w:w="1850"/>
+          </w:tcPr>
+          <w:p>
+            <w:r>
+              <w:t>sprint-2/create-post-desktop-and-auth-navbar-fixes (figma-design-system, 2026-09-05)</w:t>
+            </w:r>
+          </w:p>
+        </w:tc>
+        <w:tc>
+          <w:tcPr>
+            <w:tcW w:type="dxa" w:w="2300"/>
+          </w:tcPr>
+          <w:p>
+            <w:r>
+              <w:t>Resolved for this Figma pass (no app/backend code touched). (a) All 5 Create Post desktop frames (3 existing + 2 new) now carry a real Navbar — header 4 instance (logged-in web nav — Create Post requires auth), 1440×90, inserted at the bottom of z-order so it sits under the modal scrim exactly as the hand-drawn bar did; 9 hand-drawn nav nodes removed per existing frame. (b) All 12 auth frames: header 7 / header 7 — mobile instance replaced with a clone of the Verify Email Top Bar — Soccernity frame (desktop 1440×90 from 5143:6636, mobile 390×90 from 5531:7265 — the Verify Email frames are the confirmed-correct reference; mobile keeps the 90px Top Bar height, matching Verify Email mobile and the shipped 90px AuthTopBar, not the old 64px mobile nav). Final sweep: zero header-7 instances remain on any of the 12. Verify Email (all 8 states) and Guardian Consent (intentionally mixed — split-panel + distinct “Minor Account” status bar) re-verified live and deliberately left untouched. (c) New frames Create Post — Desktop — Active Contest (6171:14797) and — No Active Contest (6171:16994), cloned from the fixed Create a post frame in the page-with-overlay pattern (not a 390-wide modal); Active = “Create a Post | Contest” tabs present (matching mobile 5982:10905), No Active = Contest tab + count badge removed (matching mobile 5982:10932). (d) Judgment call, flagged: on No-Active-Contest desktop the “Create a Post” label + its tab-style accent underline is kept as the modal heading (a desktop modal needs a title; mobile’s header-less composer doesn’t translate 1:1). Also left in place, flagged: the hidden (visible=false), inert secondary “Group 103” / “Logo” wordmark lockups still present in the form body of all 12 auth frames — the shipped SignupSplitScreen no longer renders these; removing the dead nodes from Figma is a small optional follow-up, not done here since they render nothing and cause no overlap with the new 90px Top Bar. Merged as PR #&lt;TBD&gt;.</w:t>
             </w:r>
           </w:p>
         </w:tc>

</xml_diff>

<commit_message>
Extend Club Fan Page with club feed + member roster (Decision Log #216)
Figma design only, no app/backend code. Advances (does not close) Decision Log #157.

- Club — Fan Page desktop (5841:9365) + mobile (5841:9431): header section
  (badge / name / join / back-link) carried forward unchanged; stale scope note
  removed.
- Club feed section — post cards cloned from the Community — Home Feed pattern
  (5701:8239), illustrative dummy posts. Closes the DESIGN side of DL #157; the
  club-scoped-posts endpoint still doesn't exist. No composer.
- Members section — roster rows (avatar + name + @handle + Follow) adapted from
  the post-card author block; "View all members" has no destination screen yet.
- Out of scope (founder-confirmed): announcements, fixtures, other content.
- Both frames 0 unbound paints; no new colour, no green-tint-28, Light mode only.

Co-Authored-By: Claude Sonnet 5 <noreply@anthropic.com>
</commit_message>
<xml_diff>
--- a/docs/Soccernity_MVP_Build_Plan_v1.7.docx
+++ b/docs/Soccernity_MVP_Build_Plan_v1.7.docx
@@ -16442,6 +16442,9 @@
             <w:r>
               <w:t>Open -- flagged, not built around and not faked with dummy data (unlike the homepage’s vendor-blocked fixtures/news, this is a genuinely missing endpoint, not blocked external content). The Club -- Fan Page design deliberately shows only real ClubSummary fields (badge, name, league / country, member count, join/leave) plus one honest scope note; whoever runs figma-to-code must not wire a club feed.</w:t>
             </w:r>
+            <w:r>
+              <w:t xml:space="preserve">  [Advanced by #216 (sprint-2/club-fan-page-design): the DESIGN side is now built — Club — Fan Page desktop/mobile now carry a club feed (Community post-card pattern, dummy posts) and a member roster. The endpoint itself is still unbuilt; figma-to-code must NOT wire the feed to real data until GET /posts/feed filters by Post.clubPageId (or a club-scoped route exists).]</w:t>
+            </w:r>
           </w:p>
         </w:tc>
       </w:tr>
@@ -18963,6 +18966,48 @@
           <w:p>
             <w:r>
               <w:t>Built as Settings — Privacy (desktop, cloned from Settings — Overview 2905:4798) and Settings — Privacy — Mobile (cloned from Settings — Overview — Mobile 5607:7813), reusing the family's nav-rail, list-row, Settings Toggle component (5694:8219) and section-header patterns; nav rail shows "Privacy and safety" active. (a) COOKIE / LOCAL-STORAGE PREFERENCES — deliberately NOT built. The counsel-review risk register (item #15, docs/legal-copy-draft-tos-privacy-policy.md) records that the cookie/local-storage audit has not happened; a toggle for something unaudited would misrepresent what is true. Flagged in an on-canvas design note + here — not silently omitted. Add the control once the audit exists. (b) MARKETING / EMAIL OPT-OUT — built as a DISABLED "Coming soon" row, not a working toggle. Verified live: services/api sends only transactional email (verification, guardian-consent, password-reset via Postmark); no marketing/newsletter capability exists anywhere. Becomes a real enabled toggle if/when marketing email is introduced. "Download my data" is a request-style chevron row (no data-export/DSAR endpoint exists yet). "Account status" links to Settings — Deactivate Account (Intro) (2924:7358 / 5695:8262). Guardian-approval block is under-18-only: read-only status pill + link into Guardian Consent — 11 Change Guardian Email (5498:7164 / 5501:8536). Prototype ON_CLICK links wired for both. OPEN, not resolved here: the relationship between this new page and the existing "Settings — Privacy &amp; Safety" screen (2922:5382 / 5649:8092 — the who-can-see-your-posts / who-can-DM-you interaction controls) — merge, nest, or keep separate is a founder IA call. Token discipline: no new colour, no brand/green-tint-28, Light mode only; mobile 0 unbound paints, desktop 1 (pre-existing shell #d9d9d9 cover-plate, inherited from every Settings frame). Opened as PR #175 — not merged, founder's call after review.</w:t>
+            </w:r>
+          </w:p>
+        </w:tc>
+      </w:tr>
+      <w:tr>
+        <w:tc>
+          <w:tcPr>
+            <w:tcW w:type="dxa" w:w="500"/>
+          </w:tcPr>
+          <w:p>
+            <w:r>
+              <w:t>216</w:t>
+            </w:r>
+          </w:p>
+        </w:tc>
+        <w:tc>
+          <w:tcPr>
+            <w:tcW w:type="dxa" w:w="4700"/>
+          </w:tcPr>
+          <w:p>
+            <w:r>
+              <w:t>Club — Fan Page (desktop 5841:9365 / mobile 5841:9431) was deliberately minimal — badge / name / join-button / back-link / scope-note only, an intentional DL #157 placeholder. Extend it into the real page: (1) a club feed (club-scoped posts), (2) a member list / roster. Reopens / advances #157.</w:t>
+            </w:r>
+          </w:p>
+        </w:tc>
+        <w:tc>
+          <w:tcPr>
+            <w:tcW w:type="dxa" w:w="1850"/>
+          </w:tcPr>
+          <w:p>
+            <w:r>
+              <w:t>sprint-2/club-fan-page-design (figma-design-system / figma-screen-builder, 2026-09-05)</w:t>
+            </w:r>
+          </w:p>
+        </w:tc>
+        <w:tc>
+          <w:tcPr>
+            <w:tcW w:type="dxa" w:w="2300"/>
+          </w:tcPr>
+          <w:p>
+            <w:r>
+              <w:t>Built, Figma design only, no app/backend code. The header section (back link, club badge / name / league•country / member-count, Join button) is carried forward UNCHANGED on both frames; only the stale "Member posts and a full member list aren't part of club pages yet" scope note is removed (both are now designed). CLUB FEED — a "Club feed" section with post cards cloned from the Community — Home Feed post-card pattern (Community — Home Feed — Mobile, 5701:8239); illustrative member social posts (dummy data, same convention as every other pre-backend screen). This closes the DESIGN side of Decision Log #157 — the club-scoped-posts endpoint STILL does not exist (GET /posts/feed never reads Post.clubPageId); figma-to-code must not wire the feed to real data until it does. No composer designed (no club-post-creation endpoint; further from backend than reading). MEMBER ROSTER — a "Members" section: rows adapted from the post-card author-identity block (avatar + display name + @handle) + a secondary "Follow" button (POST /users/:id/follow is real). The roster is conceptually "users whose represented club is this club" — that field/endpoint does not exist yet either (DL #74). Dummy members. "View all members -&gt;" has no destination screen (a dedicated full-roster screen is not built) — flagged, not wired. OUT OF SCOPE, founder-confirmed: club announcements, fixtures, any other content — no data source for either, none designed. Token discipline: no new colour, no brand/green-tint-28, Light mode only; both frames 0 unbound paints. On-canvas "Club — Fan Page — Design Notes" annotation added. Opened as PR #&lt;TBD&gt; — not merged, founder's call after review.</w:t>
             </w:r>
           </w:p>
         </w:tc>

</xml_diff>

<commit_message>
Decision Log #218/#219: fill in PR number (#178)
Co-Authored-By: Claude Sonnet 5 <noreply@anthropic.com>
</commit_message>
<xml_diff>
--- a/docs/Soccernity_MVP_Build_Plan_v1.7.docx
+++ b/docs/Soccernity_MVP_Build_Plan_v1.7.docx
@@ -19079,7 +19079,7 @@
           </w:tcPr>
           <w:p>
             <w:r>
-              <w:t>sprint-2/contest-data-model-backend (backend-api, 2026-09-05) -- PR #TBD</w:t>
+              <w:t>sprint-2/contest-data-model-backend (backend-api, 2026-09-05) -- PR #178</w:t>
             </w:r>
           </w:p>
         </w:tc>
@@ -19121,7 +19121,7 @@
           </w:tcPr>
           <w:p>
             <w:r>
-              <w:t>sprint-2/contest-data-model-backend (backend-api, 2026-09-05) -- PR #TBD; delegated by #130</w:t>
+              <w:t>sprint-2/contest-data-model-backend (backend-api, 2026-09-05) -- PR #178; delegated by #130</w:t>
             </w:r>
           </w:p>
         </w:tc>

</xml_diff>

<commit_message>
apps/admin: Dashboard as a disclosed stub (PR 4/10)
Stacks on PR 3. No GET /admin/dashboard/stats endpoint (Build Plan
Section 4.8). Dashboard (Figma 110:5) converted layout-faithfully with no
real data: 4 stat cards (values "—"), by-league breakdown, a CSS
bar-sketch chart placeholder (captioned "Sample — chart not wired to
data", not a chart library), a Latest Posts sample table. Dashed banner
names the missing endpoint. routes.test.tsx placeholder assertion moved
/dashboard -> /settings.

Decision Log #234. CLAUDE.md updated. apps/admin vitest 10 files / 39
tests, 0 failures; tsc / lint / build clean.

Co-Authored-By: Claude Sonnet 5 <noreply@anthropic.com>
</commit_message>
<xml_diff>
--- a/docs/Soccernity_MVP_Build_Plan_v1.7.docx
+++ b/docs/Soccernity_MVP_Build_Plan_v1.7.docx
@@ -19495,6 +19495,48 @@
           <w:p>
             <w:r>
               <w:t>Resolved (disclosed stub -- no production behaviour). Stacks on PR 2. Report: docs/sprint-2-admin-moderation-stub-report.md. The 3 Moderation screens (Figma 5794:8635 / 5796:8635 / 5796:8753) are converted as layout-faithful stubs: Open Reports / Appeals tabs, the report table (sample rows), Report Detail's 4 moderator actions (Dismiss / Remove / Warn / Suspend -- navy not red, no destructive token per non-negotiable #3), and Appeal Review's Uphold / Overturn -- all controls visibly DISABLED, a dashed banner states GET/PATCH /admin/moderation/reports is Sprint 5 (Decision Log #135/#189). The Decision Log #138 appeal-routing rule (an appeal is reviewed by a SECOND admin/moderator, never the original) and the Section 8.4 both-parties-notified rule are rendered as visible on-screen copy so the Sprint 5 backend PR inherits the IA. New shared stub primitives (src/components/stub/AdminStub.tsx: StubBanner / StubTable / StubField / StubButton / AdminStubScreen) that PRs 4-10 reuse. New routes /moderation/reports/:id and /moderation/appeals/:id render the static structure regardless of :id. Verification: apps/admin vitest 9 files / 38 tests, 0 failures; npx tsc --noEmit, npm run lint, npm run build all clean. No real browser check available.</w:t>
+            </w:r>
+          </w:p>
+        </w:tc>
+      </w:tr>
+      <w:tr>
+        <w:tc>
+          <w:tcPr>
+            <w:tcW w:type="dxa" w:w="500"/>
+          </w:tcPr>
+          <w:p>
+            <w:r>
+              <w:t>234</w:t>
+            </w:r>
+          </w:p>
+        </w:tc>
+        <w:tc>
+          <w:tcPr>
+            <w:tcW w:type="dxa" w:w="4700"/>
+          </w:tcPr>
+          <w:p>
+            <w:r>
+              <w:t>apps/admin PR 4 of ~10 -- the Dashboard screen converted as a disclosed stub (no GET /admin/dashboard/stats).</w:t>
+            </w:r>
+          </w:p>
+        </w:tc>
+        <w:tc>
+          <w:tcPr>
+            <w:tcW w:type="dxa" w:w="1850"/>
+          </w:tcPr>
+          <w:p>
+            <w:r>
+              <w:t>sprint-2/admin-dashboard-stub (figma-design-system, 2026-09-06)</w:t>
+            </w:r>
+          </w:p>
+        </w:tc>
+        <w:tc>
+          <w:tcPr>
+            <w:tcW w:type="dxa" w:w="2300"/>
+          </w:tcPr>
+          <w:p>
+            <w:r>
+              <w:t>Resolved (disclosed stub -- no production behaviour). Report: docs/sprint-2-admin-dashboard-stub-report.md. Dashboard (Figma 110:5) is converted as a layout-faithful stub: 4 stat cards (New Users / Total Visits / Total Articles / Community Users -- values render as em-dash), a New-users-by-league breakdown, a visitor-statistics chart placeholder (a plain CSS bar sketch captioned 'Sample -- chart not wired to data', NOT a real chart library), and a Latest Posts table (sample rows). A dashed banner states GET /admin/dashboard/stats is not built (Build Plan Section 4.8). routes.test.tsx's placeholder assertion was repointed from /dashboard to /settings (still a placeholder). Verification: apps/admin vitest 10 files / 39 tests, 0 failures; npx tsc --noEmit, npm run lint, npm run build all clean. No real browser check available.</w:t>
             </w:r>
           </w:p>
         </w:tc>

</xml_diff>

<commit_message>
apps/admin: Articles + Categories as disclosed stubs (PR 5/10)
Stacks on PR 4. No POST/PATCH /admin/articles, no POST /admin/categories,
no list endpoint for either (Section 4.8), no image storage. The 4
screens (Figma 123:56 / 124:313 / 128:488 / 138:93) convert
layout-faithfully: lists show a sample table + a working link to the
create screen; create screens have every field disabled. New routes
/articles/new, /categories/new. Added .admin-stub__linkbtn (enabled
link-as-button for stub-to-stub navigation).

Decision Log #235. CLAUDE.md updated. apps/admin vitest 11 files / 43
tests, 0 failures; tsc / lint / build clean.

Co-Authored-By: Claude Sonnet 5 <noreply@anthropic.com>
</commit_message>
<xml_diff>
--- a/docs/Soccernity_MVP_Build_Plan_v1.7.docx
+++ b/docs/Soccernity_MVP_Build_Plan_v1.7.docx
@@ -19537,6 +19537,48 @@
           <w:p>
             <w:r>
               <w:t>Resolved (disclosed stub -- no production behaviour). Report: docs/sprint-2-admin-dashboard-stub-report.md. Dashboard (Figma 110:5) is converted as a layout-faithful stub: 4 stat cards (New Users / Total Visits / Total Articles / Community Users -- values render as em-dash), a New-users-by-league breakdown, a visitor-statistics chart placeholder (a plain CSS bar sketch captioned 'Sample -- chart not wired to data', NOT a real chart library), and a Latest Posts table (sample rows). A dashed banner states GET /admin/dashboard/stats is not built (Build Plan Section 4.8). routes.test.tsx's placeholder assertion was repointed from /dashboard to /settings (still a placeholder). Verification: apps/admin vitest 10 files / 39 tests, 0 failures; npx tsc --noEmit, npm run lint, npm run build all clean. No real browser check available.</w:t>
+            </w:r>
+          </w:p>
+        </w:tc>
+      </w:tr>
+      <w:tr>
+        <w:tc>
+          <w:tcPr>
+            <w:tcW w:type="dxa" w:w="500"/>
+          </w:tcPr>
+          <w:p>
+            <w:r>
+              <w:t>235</w:t>
+            </w:r>
+          </w:p>
+        </w:tc>
+        <w:tc>
+          <w:tcPr>
+            <w:tcW w:type="dxa" w:w="4700"/>
+          </w:tcPr>
+          <w:p>
+            <w:r>
+              <w:t>apps/admin PR 5 of ~10 -- Articles + Categories screens (4) converted as disclosed stubs (no articles/categories backend).</w:t>
+            </w:r>
+          </w:p>
+        </w:tc>
+        <w:tc>
+          <w:tcPr>
+            <w:tcW w:type="dxa" w:w="1850"/>
+          </w:tcPr>
+          <w:p>
+            <w:r>
+              <w:t>sprint-2/admin-articles-categories-stub (figma-design-system, 2026-09-06)</w:t>
+            </w:r>
+          </w:p>
+        </w:tc>
+        <w:tc>
+          <w:tcPr>
+            <w:tcW w:type="dxa" w:w="2300"/>
+          </w:tcPr>
+          <w:p>
+            <w:r>
+              <w:t>Resolved (disclosed stubs -- no production behaviour). Report: docs/sprint-2-admin-articles-categories-stub-report.md. Articles list (Figma 123:56), Create New Post (124:313), Categories list (128:488), Add Category (138:93) converted layout-faithfully. Lists show a sample table + a working navy link ('Create Article' / 'Add Category') to the create screen; create screens reproduce every form field DISABLED (Title / body textarea / category select / Upload Images / Submit Post; category Name / Submit). Dashed banners state POST/PATCH /admin/articles and POST /admin/categories are not built and Section 4.8 defines no list endpoint for either; also no image storage exists. New routes /articles/new, /categories/new. Added a .admin-stub__linkbtn style -- an ENABLED link styled as a button for navigating between stub screens (destination route exists), distinct from StubButton (genuinely inert). Verification: apps/admin vitest 11 files / 43 tests, 0 failures; npx tsc --noEmit, npm run lint, npm run build all clean. No real browser check available.</w:t>
             </w:r>
           </w:p>
         </w:tc>

</xml_diff>

<commit_message>
apps/admin: Users as a disclosed stub (PR 6/10)
Stacks on PR 5. No GET/PATCH /admin/users (Section 4.8). Users (Figma
917:218) converted layout-faithfully: sample table + disabled Add Member;
an on-screen note repeats Decision Log #142 (platform-user list, not role
management).

Decision Log #236. CLAUDE.md updated. apps/admin vitest 12 files / 44
tests, 0 failures; tsc / lint / build clean.

Co-Authored-By: Claude Sonnet 5 <noreply@anthropic.com>
</commit_message>
<xml_diff>
--- a/docs/Soccernity_MVP_Build_Plan_v1.7.docx
+++ b/docs/Soccernity_MVP_Build_Plan_v1.7.docx
@@ -19579,6 +19579,48 @@
           <w:p>
             <w:r>
               <w:t>Resolved (disclosed stubs -- no production behaviour). Report: docs/sprint-2-admin-articles-categories-stub-report.md. Articles list (Figma 123:56), Create New Post (124:313), Categories list (128:488), Add Category (138:93) converted layout-faithfully. Lists show a sample table + a working navy link ('Create Article' / 'Add Category') to the create screen; create screens reproduce every form field DISABLED (Title / body textarea / category select / Upload Images / Submit Post; category Name / Submit). Dashed banners state POST/PATCH /admin/articles and POST /admin/categories are not built and Section 4.8 defines no list endpoint for either; also no image storage exists. New routes /articles/new, /categories/new. Added a .admin-stub__linkbtn style -- an ENABLED link styled as a button for navigating between stub screens (destination route exists), distinct from StubButton (genuinely inert). Verification: apps/admin vitest 11 files / 43 tests, 0 failures; npx tsc --noEmit, npm run lint, npm run build all clean. No real browser check available.</w:t>
+            </w:r>
+          </w:p>
+        </w:tc>
+      </w:tr>
+      <w:tr>
+        <w:tc>
+          <w:tcPr>
+            <w:tcW w:type="dxa" w:w="500"/>
+          </w:tcPr>
+          <w:p>
+            <w:r>
+              <w:t>236</w:t>
+            </w:r>
+          </w:p>
+        </w:tc>
+        <w:tc>
+          <w:tcPr>
+            <w:tcW w:type="dxa" w:w="4700"/>
+          </w:tcPr>
+          <w:p>
+            <w:r>
+              <w:t>apps/admin PR 6 of ~10 -- the Users screen converted as a disclosed stub (no GET/PATCH /admin/users).</w:t>
+            </w:r>
+          </w:p>
+        </w:tc>
+        <w:tc>
+          <w:tcPr>
+            <w:tcW w:type="dxa" w:w="1850"/>
+          </w:tcPr>
+          <w:p>
+            <w:r>
+              <w:t>sprint-2/admin-users-stub (figma-design-system, 2026-09-06)</w:t>
+            </w:r>
+          </w:p>
+        </w:tc>
+        <w:tc>
+          <w:tcPr>
+            <w:tcW w:type="dxa" w:w="2300"/>
+          </w:tcPr>
+          <w:p>
+            <w:r>
+              <w:t>Resolved (disclosed stub -- no production behaviour). Report: docs/sprint-2-admin-users-stub-report.md. Users (Figma 917:218, 'Users - team members') converted layout-faithfully: sample table (Username / Date Joined / Status / block-delete actions) + a disabled 'Add Member' button, dashed banner naming the missing GET /admin/users and PATCH /admin/users/:id endpoints. An on-screen note repeats Decision Log #142 (this is the platform-user list, not admin/moderator role management -- correcting PR #124's original misread). Verification: apps/admin vitest 12 files / 44 tests, 0 failures; npx tsc --noEmit, npm run lint, npm run build all clean. No real browser check available.</w:t>
             </w:r>
           </w:p>
         </w:tc>

</xml_diff>

<commit_message>
apps/admin: Media screens as disclosed stubs (PR 7/10)
Stacks on PR 6. No GET /admin/media / POST /admin/media/upload and no
file storage configured (Section 4.8; S3 wired-not-live). The 4 screens
(Figma 361:553 / 396:442 / 916:2362 + 917:24) convert layout-faithfully:
library sample table + links, empty preview pane, disabled upload form.
New routes /media/preview, /media/upload.

Decision Log #237. CLAUDE.md updated. apps/admin vitest 13 files / 47
tests, 0 failures; tsc / lint / build clean.

Co-Authored-By: Claude Sonnet 5 <noreply@anthropic.com>
</commit_message>
<xml_diff>
--- a/docs/Soccernity_MVP_Build_Plan_v1.7.docx
+++ b/docs/Soccernity_MVP_Build_Plan_v1.7.docx
@@ -19621,6 +19621,48 @@
           <w:p>
             <w:r>
               <w:t>Resolved (disclosed stub -- no production behaviour). Report: docs/sprint-2-admin-users-stub-report.md. Users (Figma 917:218, 'Users - team members') converted layout-faithfully: sample table (Username / Date Joined / Status / block-delete actions) + a disabled 'Add Member' button, dashed banner naming the missing GET /admin/users and PATCH /admin/users/:id endpoints. An on-screen note repeats Decision Log #142 (this is the platform-user list, not admin/moderator role management -- correcting PR #124's original misread). Verification: apps/admin vitest 12 files / 44 tests, 0 failures; npx tsc --noEmit, npm run lint, npm run build all clean. No real browser check available.</w:t>
+            </w:r>
+          </w:p>
+        </w:tc>
+      </w:tr>
+      <w:tr>
+        <w:tc>
+          <w:tcPr>
+            <w:tcW w:type="dxa" w:w="500"/>
+          </w:tcPr>
+          <w:p>
+            <w:r>
+              <w:t>237</w:t>
+            </w:r>
+          </w:p>
+        </w:tc>
+        <w:tc>
+          <w:tcPr>
+            <w:tcW w:type="dxa" w:w="4700"/>
+          </w:tcPr>
+          <w:p>
+            <w:r>
+              <w:t>apps/admin PR 7 of ~10 -- the 4 Media screens converted as disclosed stubs (no media backend + no file storage).</w:t>
+            </w:r>
+          </w:p>
+        </w:tc>
+        <w:tc>
+          <w:tcPr>
+            <w:tcW w:type="dxa" w:w="1850"/>
+          </w:tcPr>
+          <w:p>
+            <w:r>
+              <w:t>sprint-2/admin-media-stub (figma-design-system, 2026-09-06)</w:t>
+            </w:r>
+          </w:p>
+        </w:tc>
+        <w:tc>
+          <w:tcPr>
+            <w:tcW w:type="dxa" w:w="2300"/>
+          </w:tcPr>
+          <w:p>
+            <w:r>
+              <w:t>Resolved (disclosed stubs -- no production behaviour). Report: docs/sprint-2-admin-media-stub-report.md. Media library (Figma 361:553), Media Preview (396:442), Media Upload step 1 (916:2362) and step 2 (917:24) converted layout-faithfully. Library: sample uploaded-media table + a working 'Add Media' link + a link to the preview screen. Preview: an empty 'Preview -- no media' pane + a sample metadata line. Upload: the two Figma steps shown as one disabled form (dropzone copy + a sample selected-files list + a disabled Upload button). Dashed banners state GET /admin/media / POST /admin/media/upload are not built AND no file storage is configured (Build Plan Section 4.8; S3 wired-not-live per CLAUDE.md) -- so nothing here can be functional even in principle yet. New routes /media/preview, /media/upload. Verification: apps/admin vitest 13 files / 47 tests, 0 failures; npx tsc --noEmit, npm run lint, npm run build all clean. No real browser check available.</w:t>
             </w:r>
           </w:p>
         </w:tc>

</xml_diff>

<commit_message>
apps/admin: Competitions screens as disclosed stubs (PR 8/10)
Stacks on PR 7. No competitions admin endpoint anywhere; the Competition
umbrella is parked (Build Plan 2.2, Decision Log #72/#73). Create
Competition (5566:8033) fully reproduced + disabled; Competition Created
(5569:7813) shown for design fidelity with a not-reachable note. New
route /competitions/created.

Decision Log #238. CLAUDE.md updated. apps/admin vitest 14 files / 49
tests, 0 failures; tsc / lint / build clean.

Co-Authored-By: Claude Sonnet 5 <noreply@anthropic.com>
</commit_message>
<xml_diff>
--- a/docs/Soccernity_MVP_Build_Plan_v1.7.docx
+++ b/docs/Soccernity_MVP_Build_Plan_v1.7.docx
@@ -19663,6 +19663,48 @@
           <w:p>
             <w:r>
               <w:t>Resolved (disclosed stubs -- no production behaviour). Report: docs/sprint-2-admin-media-stub-report.md. Media library (Figma 361:553), Media Preview (396:442), Media Upload step 1 (916:2362) and step 2 (917:24) converted layout-faithfully. Library: sample uploaded-media table + a working 'Add Media' link + a link to the preview screen. Preview: an empty 'Preview -- no media' pane + a sample metadata line. Upload: the two Figma steps shown as one disabled form (dropzone copy + a sample selected-files list + a disabled Upload button). Dashed banners state GET /admin/media / POST /admin/media/upload are not built AND no file storage is configured (Build Plan Section 4.8; S3 wired-not-live per CLAUDE.md) -- so nothing here can be functional even in principle yet. New routes /media/preview, /media/upload. Verification: apps/admin vitest 13 files / 47 tests, 0 failures; npx tsc --noEmit, npm run lint, npm run build all clean. No real browser check available.</w:t>
+            </w:r>
+          </w:p>
+        </w:tc>
+      </w:tr>
+      <w:tr>
+        <w:tc>
+          <w:tcPr>
+            <w:tcW w:type="dxa" w:w="500"/>
+          </w:tcPr>
+          <w:p>
+            <w:r>
+              <w:t>238</w:t>
+            </w:r>
+          </w:p>
+        </w:tc>
+        <w:tc>
+          <w:tcPr>
+            <w:tcW w:type="dxa" w:w="4700"/>
+          </w:tcPr>
+          <w:p>
+            <w:r>
+              <w:t>apps/admin PR 8 of ~10 -- the 2 Competitions screens converted as disclosed stubs (Competition umbrella parked; no endpoint).</w:t>
+            </w:r>
+          </w:p>
+        </w:tc>
+        <w:tc>
+          <w:tcPr>
+            <w:tcW w:type="dxa" w:w="1850"/>
+          </w:tcPr>
+          <w:p>
+            <w:r>
+              <w:t>sprint-2/admin-competitions-stub (figma-design-system, 2026-09-06)</w:t>
+            </w:r>
+          </w:p>
+        </w:tc>
+        <w:tc>
+          <w:tcPr>
+            <w:tcW w:type="dxa" w:w="2300"/>
+          </w:tcPr>
+          <w:p>
+            <w:r>
+              <w:t>Resolved (disclosed stubs -- no production behaviour). Report: docs/sprint-2-admin-competitions-stub-report.md. Create Competition (Figma 5566:8033) and Competition Created / Success (5569:7813) converted layout-faithfully. The create form reproduces every field (name / type / scoring mechanism / custom method / entry brief / entry window / entries-per-player / leaderboard visibility) DISABLED; the success screen is rendered for design fidelity with an explicit note that it is not reachable from a real flow. Dashed banners state there is NO competitions admin endpoint anywhere -- the Competition umbrella (Prediction / Commentary types, votes) is deliberately parked (Build Plan Section 2.2, Decision Log #72/#73); sprint-2/contest-data-model-backend built only the Contest half and PointsLedgerEntry.source reserves 'competition_result' for this. New route /competitions/created. Verification: apps/admin vitest 14 files / 49 tests, 0 failures; npx tsc --noEmit, npm run lint, npm run build all clean. No real browser check available.</w:t>
             </w:r>
           </w:p>
         </w:tc>

</xml_diff>

<commit_message>
apps/admin: Contest admin screens as disclosed stubs (PR 9/10)
Stacks on PR 8. All 9 Contest admin screens (Figma 2363:2244 / 2363:3446
/ 5403:6640 / 5403:6753 / 5403:6866 / 5403:6979 / 5403:7092 / 5405:8277 /
5405:8390) converted as disclosed stubs, not wired to any endpoint.

Backend reality (Decision Log #239, Open — flagged): the Figma 'task'
model has no backend entity (backend uses ContestCycle/ContestRound); 4
real POST /admin/contest/* write endpoints exist but have no admin read
endpoint and no screen. Create-cycle alone deliberately not wired (would
strand the admin mid-workflow). A working Contest admin console needs a
coordinated backend + design + code pass.

New routes /contest/tasks/{new,edit,schedule,search,delete,scheduled}.
CLAUDE.md updated. apps/admin vitest 15 files / 52 tests, 0 failures;
tsc / lint / build clean.

Co-Authored-By: Claude Sonnet 5 <noreply@anthropic.com>
</commit_message>
<xml_diff>
--- a/docs/Soccernity_MVP_Build_Plan_v1.7.docx
+++ b/docs/Soccernity_MVP_Build_Plan_v1.7.docx
@@ -19705,6 +19705,48 @@
           <w:p>
             <w:r>
               <w:t>Resolved (disclosed stubs -- no production behaviour). Report: docs/sprint-2-admin-competitions-stub-report.md. Create Competition (Figma 5566:8033) and Competition Created / Success (5569:7813) converted layout-faithfully. The create form reproduces every field (name / type / scoring mechanism / custom method / entry brief / entry window / entries-per-player / leaderboard visibility) DISABLED; the success screen is rendered for design fidelity with an explicit note that it is not reachable from a real flow. Dashed banners state there is NO competitions admin endpoint anywhere -- the Competition umbrella (Prediction / Commentary types, votes) is deliberately parked (Build Plan Section 2.2, Decision Log #72/#73); sprint-2/contest-data-model-backend built only the Contest half and PointsLedgerEntry.source reserves 'competition_result' for this. New route /competitions/created. Verification: apps/admin vitest 14 files / 49 tests, 0 failures; npx tsc --noEmit, npm run lint, npm run build all clean. No real browser check available.</w:t>
+            </w:r>
+          </w:p>
+        </w:tc>
+      </w:tr>
+      <w:tr>
+        <w:tc>
+          <w:tcPr>
+            <w:tcW w:type="dxa" w:w="500"/>
+          </w:tcPr>
+          <w:p>
+            <w:r>
+              <w:t>239</w:t>
+            </w:r>
+          </w:p>
+        </w:tc>
+        <w:tc>
+          <w:tcPr>
+            <w:tcW w:type="dxa" w:w="4700"/>
+          </w:tcPr>
+          <w:p>
+            <w:r>
+              <w:t>apps/admin PR 9 of ~10 -- the 9 Contest admin screens. The Figma 'task' model has no backend entity, and the 4 real POST /admin/contest/* endpoints have no admin read endpoint and no screen. Is a proper Contest admin console a coordinated backend + design + code pass?</w:t>
+            </w:r>
+          </w:p>
+        </w:tc>
+        <w:tc>
+          <w:tcPr>
+            <w:tcW w:type="dxa" w:w="1850"/>
+          </w:tcPr>
+          <w:p>
+            <w:r>
+              <w:t>sprint-2/admin-contest (figma-design-system, 2026-09-06)</w:t>
+            </w:r>
+          </w:p>
+        </w:tc>
+        <w:tc>
+          <w:tcPr>
+            <w:tcW w:type="dxa" w:w="2300"/>
+          </w:tcPr>
+          <w:p>
+            <w:r>
+              <w:t>Open -- flagged. Report: docs/sprint-2-admin-contest-report.md. All 9 Contest admin screens (Figma 2363:2244, 2363:3446, 5403:6640, 5403:6753, 5403:6866, 5403:6979, 5403:7092, 5405:8277, 5405:8390) are converted as disclosed stubs, NOT wired to any endpoint. Verified against services/api/src/modules/contest/ (sprint-2/contest-data-model-backend, Decision Log #218/#219): (1) the Figma screens model a 'task' (Task Name / Hashtag / Description / Target Entry Count) -- there is NO 'task' entity; the backend models a ContestCycle with weekly ContestRounds. (2) 4 real AdminJwtAuthGuard-protected WRITE endpoints exist (POST /admin/contest/cycles, .../rounds/:week/results, .../final/open, .../crown) but they need entity ids (entryId / userId) the admin cannot discover -- there is NO admin READ endpoint (GET /contest/current and GET /contest/cycles/:id are user-JWT only). (3) None of the 4 real endpoints has a Figma screen. DELIBERATELY NOT wired 'Create cycle' alone -- createCycle rejects when an active cycle exists and there is no follow-up UI (no judge / final / crown screen, no read), so exposing it would strand the admin mid-workflow, worse than not exposing it. A working Contest admin console needs: a GET /admin/contest/* read endpoint (backend-api) + Figma screens for the real cycle/round/judge/final/crown workflow (figma-screen-builder) + the code (figma-to-code) -- a coordinated pass, tracked here. New routes /contest/tasks/{new,edit,schedule,search,delete,scheduled}. Verification: apps/admin vitest 15 files / 52 tests, 0 failures; npx tsc --noEmit, npm run lint, npm run build all clean.</w:t>
             </w:r>
           </w:p>
         </w:tc>

</xml_diff>

<commit_message>
apps/admin: Settings/Roles as disclosed stubs — final PR (10/10)
Stacks on PR 9. No role-management endpoint (Decision Log #191). The 4
screens (Figma 1658:2303 / 1658:2456 / 1658:2592 / 5403:7205) convert
layout-faithfully, every control disabled; 'Add a New Role' really
creates an admin account (disclosed via DL #191); Delete Role navy, not
red. New routes /settings/roles/{new,edit,delete}.

This completes the ~10-PR Admin Console conversion: all 10 sidebar
sections have real screens (Profile + Change Password fully wired, the
rest disclosed stubs). AdminSectionPlaceholder.tsx deleted; routes.tsx /
adminNav.ts / App.tsx comments + routes.test.tsx updated. Full
dev-server smoke: all 16 routes + a 404 -> HTTP 200, clean log.

Decision Log #240. CLAUDE.md updated. apps/admin vitest 16 files / 55
tests, 0 failures; tsc / lint / build clean.

Co-Authored-By: Claude Sonnet 5 <noreply@anthropic.com>
</commit_message>
<xml_diff>
--- a/docs/Soccernity_MVP_Build_Plan_v1.7.docx
+++ b/docs/Soccernity_MVP_Build_Plan_v1.7.docx
@@ -19747,6 +19747,48 @@
           <w:p>
             <w:r>
               <w:t>Open -- flagged. Report: docs/sprint-2-admin-contest-report.md. All 9 Contest admin screens (Figma 2363:2244, 2363:3446, 5403:6640, 5403:6753, 5403:6866, 5403:6979, 5403:7092, 5405:8277, 5405:8390) are converted as disclosed stubs, NOT wired to any endpoint. Verified against services/api/src/modules/contest/ (sprint-2/contest-data-model-backend, Decision Log #218/#219): (1) the Figma screens model a 'task' (Task Name / Hashtag / Description / Target Entry Count) -- there is NO 'task' entity; the backend models a ContestCycle with weekly ContestRounds. (2) 4 real AdminJwtAuthGuard-protected WRITE endpoints exist (POST /admin/contest/cycles, .../rounds/:week/results, .../final/open, .../crown) but they need entity ids (entryId / userId) the admin cannot discover -- there is NO admin READ endpoint (GET /contest/current and GET /contest/cycles/:id are user-JWT only). (3) None of the 4 real endpoints has a Figma screen. DELIBERATELY NOT wired 'Create cycle' alone -- createCycle rejects when an active cycle exists and there is no follow-up UI (no judge / final / crown screen, no read), so exposing it would strand the admin mid-workflow, worse than not exposing it. A working Contest admin console needs: a GET /admin/contest/* read endpoint (backend-api) + Figma screens for the real cycle/round/judge/final/crown workflow (figma-screen-builder) + the code (figma-to-code) -- a coordinated pass, tracked here. New routes /contest/tasks/{new,edit,schedule,search,delete,scheduled}. Verification: apps/admin vitest 15 files / 52 tests, 0 failures; npx tsc --noEmit, npm run lint, npm run build all clean.</w:t>
+            </w:r>
+          </w:p>
+        </w:tc>
+      </w:tr>
+      <w:tr>
+        <w:tc>
+          <w:tcPr>
+            <w:tcW w:type="dxa" w:w="500"/>
+          </w:tcPr>
+          <w:p>
+            <w:r>
+              <w:t>240</w:t>
+            </w:r>
+          </w:p>
+        </w:tc>
+        <w:tc>
+          <w:tcPr>
+            <w:tcW w:type="dxa" w:w="4700"/>
+          </w:tcPr>
+          <w:p>
+            <w:r>
+              <w:t>apps/admin PR 10 of ~10 (final) -- the 4 Settings/Roles screens converted as disclosed stubs (no role-management endpoint); AdminSectionPlaceholder retired.</w:t>
+            </w:r>
+          </w:p>
+        </w:tc>
+        <w:tc>
+          <w:tcPr>
+            <w:tcW w:type="dxa" w:w="1850"/>
+          </w:tcPr>
+          <w:p>
+            <w:r>
+              <w:t>sprint-2/admin-settings-roles-stub (figma-design-system, 2026-09-06)</w:t>
+            </w:r>
+          </w:p>
+        </w:tc>
+        <w:tc>
+          <w:tcPr>
+            <w:tcW w:type="dxa" w:w="2300"/>
+          </w:tcPr>
+          <w:p>
+            <w:r>
+              <w:t>Resolved (disclosed stubs -- no production behaviour). Report: docs/sprint-2-admin-settings-roles-stub-report.md. Roles list (Figma 1658:2303), Add a New Role (1658:2456), Edit Role (1658:2592), Delete Role (5403:7205) converted layout-faithfully, every control disabled. 'Add a New Role' really creates an admin/moderator account (name / email / password) -- disclosed via Decision Log #191 (no self-service admin/moderator registration; accounts are provisioned by direct DB insert; AdminUser.role is a fixed enum). 'Delete Role' is navy, not red -- no destructive token (non-negotiable #3). New routes /settings/roles/{new,edit,delete}. This is the LAST of the ~10-PR Admin Console conversion: all 10 sidebar sections now have real screens -- Profile + Change Password fully wired to /admin/profile + /admin/auth/change-password (Decision Log #54), the other 8 as honest disclosed stubs. src/pages/AdminSectionPlaceholder.tsx deleted (every route now has a real screen); routes.tsx / adminNav.ts / App.tsx header comments updated; routes.test.tsx's placeholder assertion repointed to the Settings/Roles stub banner. Full dev-server smoke test: all 16 real routes + a 404 path served HTTP 200 with a clean dev log. Verification: apps/admin vitest 16 files / 55 tests, 0 failures; npx tsc --noEmit, npm run lint, npm run build all clean. No real browser check available.</w:t>
             </w:r>
           </w:p>
         </w:tc>

</xml_diff>

<commit_message>
Build Settings — Menu — Mobile hub (Decision Log #244, PR 1/6 for #230)
Executes founder decision #7 of the Settings-family consolidation:
mobile Settings gets a standalone hub screen routing to section
sub-pages, matching the shipped /settings -> /settings/privacy shape.

Figma design only — one net-new frame "Settings — Menu — Mobile"
(6289:15068), no app/backend code, no existing frame touched.

- 5 rows, each ON_CLICK -> NAVIGATE wired to a node ID (survives PR 2's
  planned rename of 5607:7813). Labels apply founder decisions #2/#3.
- Routed around a pre-existing invisible-chevron bug on the existing
  Category Nav (bound to color/text/on-navy / white); flagged for PR 5.
- Audit: 40 nodes / 22 paints / 0 unbound / 0 off-palette /
  0 brand/green-tint-28 / 0 new colours / 0 overlaps / 0 sidebar content.

Decision Log #244 added; forward-pointer on #230 (stays Open until PR 6).

Co-Authored-By: Claude Sonnet 5 <noreply@anthropic.com>
</commit_message>
<xml_diff>
--- a/docs/Soccernity_MVP_Build_Plan_v1.7.docx
+++ b/docs/Soccernity_MVP_Build_Plan_v1.7.docx
@@ -19368,7 +19368,7 @@
           </w:tcPr>
           <w:p>
             <w:r>
-              <w:t>Open -- BLOCKING further Settings work until the 10 flagged decisions below are resolved by the founder. Full report: docs/sprint-2-settings-family-consolidation-audit-report.md. FINDINGS: (a) 40 live frames, not 22; the top-level IA (a persistent 5-section left nav rail: Account / Security &amp; account access / Privacy &amp; safety / Notifications / Display, language &amp; region) is already consistent across all 20 desktop frames and needs no fix. (b) 2 genuine duplicate clusters -- SECURITY: 'Settings -- Security &amp; Account' (2922:5143 / 5649:8074) is a dead-end one-row intermediate leading to the real page 'Settings -- Security Overview' (2926:8056 / 5695:8279); NOTIFICATIONS: 'Settings -- Notification Preferences (By Type)' (2922:5602 / 5649:8116, rows Filter/Preference) and 'Settings -- Notification Preferences' (2926:9721 / 5696:8340, rows Push/Email) are two competing entry screens to two different mental models. (c) ROOT CAUSE of the 'duplicate frames' blocker: all 20 desktop frames are independent FRAME copies (43 children each), NOT instances of a component, of one shell that also renders an irrelevant Community-style left sidebar (profile card / Trending News / Suggested follows) on every Settings screen -- so PRs #116-#119 each re-swept the same debt one frame at a time. (d) 'Settings -- Overview' (2905:4798 / 5607:7813) is mislabelled -- it is the Account section page, not a landing; no dedicated top-level Settings landing exists. (e) GAPS (not duplication): the Display section hub (2922:5832 / 5649:8140) lists 4 rows with zero destination sub-page frames; the mobile IA is inconsistent (Overview/Privacy mobile embed the hub list, every other mobile section uses a '&lt; Settings' back bar). PROPOSED (report only, not decided): 32 frames kept and re-based on a shared componentized shell, 4 archived, 10 renamed for role clarity, plus optional new work (4 Display leaves; possibly a standalone mobile hub). 10 DECISIONS FLAGGED FOR FOUNDER (none resolved here; full reasoning in report Section 6): 1. section-2 name (rail says 'Security and account access', pages say 'Security'); 2. section-4 name ('Notifications' vs 'Notification Preferences' vs 'Preferences'); 3. which Notifications hub survives (report recommends 2926:9721); 4. 'Mute New Accounts' scope + name (covers 3 groups, 'Muted accounts' fits better); 5. whether 'Notifications (Mute &amp; Filter)' splits into a Filters leaf + routes muting to Muted accounts; 6. the mobile navigation model (standalone hub screen vs single scroll vs hub-on-every-page); 7. whether Settings needs a dedicated top-level landing distinct from the Account section; 8. keep the Account Info password-gate as its own screen or inline it; 9. build the 4 Display leaves now / inline-expand / leave stub; 10. confirm the Community left sidebar is removed from the Settings pillar entirely. NOTHING is built until these are answered.</w:t>
+              <w:t>Open -- BLOCKING further Settings work until the 10 flagged decisions below are resolved by the founder. Full report: docs/sprint-2-settings-family-consolidation-audit-report.md. FINDINGS: (a) 40 live frames, not 22; the top-level IA (a persistent 5-section left nav rail: Account / Security &amp; account access / Privacy &amp; safety / Notifications / Display, language &amp; region) is already consistent across all 20 desktop frames and needs no fix. (b) 2 genuine duplicate clusters -- SECURITY: 'Settings -- Security &amp; Account' (2922:5143 / 5649:8074) is a dead-end one-row intermediate leading to the real page 'Settings -- Security Overview' (2926:8056 / 5695:8279); NOTIFICATIONS: 'Settings -- Notification Preferences (By Type)' (2922:5602 / 5649:8116, rows Filter/Preference) and 'Settings -- Notification Preferences' (2926:9721 / 5696:8340, rows Push/Email) are two competing entry screens to two different mental models. (c) ROOT CAUSE of the 'duplicate frames' blocker: all 20 desktop frames are independent FRAME copies (43 children each), NOT instances of a component, of one shell that also renders an irrelevant Community-style left sidebar (profile card / Trending News / Suggested follows) on every Settings screen -- so PRs #116-#119 each re-swept the same debt one frame at a time. (d) 'Settings -- Overview' (2905:4798 / 5607:7813) is mislabelled -- it is the Account section page, not a landing; no dedicated top-level Settings landing exists. (e) GAPS (not duplication): the Display section hub (2922:5832 / 5649:8140) lists 4 rows with zero destination sub-page frames; the mobile IA is inconsistent (Overview/Privacy mobile embed the hub list, every other mobile section uses a '&lt; Settings' back bar). PROPOSED (report only, not decided): 32 frames kept and re-based on a shared componentized shell, 4 archived, 10 renamed for role clarity, plus optional new work (4 Display leaves; possibly a standalone mobile hub). 10 DECISIONS FLAGGED FOR FOUNDER (none resolved here; full reasoning in report Section 6): 1. section-2 name (rail says 'Security and account access', pages say 'Security'); 2. section-4 name ('Notifications' vs 'Notification Preferences' vs 'Preferences'); 3. which Notifications hub survives (report recommends 2926:9721); 4. 'Mute New Accounts' scope + name (covers 3 groups, 'Muted accounts' fits better); 5. whether 'Notifications (Mute &amp; Filter)' splits into a Filters leaf + routes muting to Muted accounts; 6. the mobile navigation model (standalone hub screen vs single scroll vs hub-on-every-page); 7. whether Settings needs a dedicated top-level landing distinct from the Account section; 8. keep the Account Info password-gate as its own screen or inline it; 9. build the 4 Display leaves now / inline-expand / leave stub; 10. confirm the Community left sidebar is removed from the Settings pillar entirely. NOTHING is built until these are answered. FOUNDER RESOLVED all 10 flagged decisions (2026-09-06), plus authorised the structural shell-componentization fix; execution is now underway as 6 sequential PRs (sprint-2/settings-*). Resolutions in brief: 1. section-2 label 'Security &amp; Account Settings' everywhere; 2. section-4 label 'Notification Preferences'; 3. Notifications survivor hub = 2926:9721 / 5696:8340 extended to 4 rows (Push / Email / Filters / Muted accounts), archive 2922:5602 / 5649:8116; 4/5. rename 'Mute New Accounts' -&gt; 'Muted accounts', split 'Notifications (Mute &amp; Filter)' -- quality-filter becomes a 'Filters' leaf, its 'Mute notifications' nav row removed, muting reached only via the Muted-accounts leaf; 6/7. mobile nav = standalone hub screen (option a) -- build 'Settings -- Menu -- Mobile' and strip the inline hub-lists from Overview/Privacy mobile; 8. build a genuinely new top-level Settings landing, desktop AND mobile as SEPARATE frames (founder clarification 2026-09-07), rename 'Settings -- Overview' (D1/M1) -&gt; 'Settings -- Account'; 9. Account Info password gate unchanged; 10. remove the Community-style left sidebar from every surviving Settings frame. 6-PR split: PR 1 settings-mobile-menu-hub (#7, see #244); PR 2 settings-landing-screen (#8); PR 3 settings-display-leaves (#10); PR 4 settings-duplicate-clusters-consolidation (#1/#2/#3/#5/#6); PR 5 settings-community-sidebar-removal (#4 + strip inline hub-lists); PR 6 settings-shell-componentization (structural -- nav rail as a real component, content panel as a slot) -- flips this entry Resolved and closes Build Plan Section 7's blocker. #230 stays Open until PR 6.</w:t>
             </w:r>
           </w:p>
         </w:tc>
@@ -19915,6 +19915,48 @@
           <w:p>
             <w:r>
               <w:t>Resolved -- CLOSES #239. Report: docs/sprint-2-admin-contest-to-code-report.md. apps/admin's Contest section is now real: new src/api/contest.ts client (mirrors contest.types.ts Admin* shapes, via adminFetch), and 7 screens replacing the 4 deleted stub files (ContestTasksPage / ContestTaskFormPages / contestBackendNote / old contest.test.tsx). ContestConsolePage (route /contest) is the phase-branching hub (GET /admin/contest/current) and the ONLY entry point to the write actions -- its phase-contextual primary routes to Judge week N (vacant/week_1/weeks_1_2) / Open the final (weeks_1_3) / Crown winners (final_live) / Start a new cycle (crowned), so the sequential-judging rule is enforced by the UI shape before any 409. ContestStartCyclePage (/contest/cycles/new -- POST /admin/contest/cycles; auto or explicit rounds[]; the real 409 renders as a blocked state with a forward action). ContestJudgeWeekPage (/contest/cycles/:id/rounds/:week -- GET cycle + POST .../rounds/:week/results; open-round position selector, already-judged read-only, the supported empty-winners 'thin week', and the out-of-sequence block, all driven by the round's real state not a query param). ContestOpenFinalPage (/contest/cycles/:id/final/open) and ContestCrownWinnersPage (/contest/cycles/:id/crown -- finalist pool DEDUPLICATED by userId per CrownCycleDto; min-1 required, ties allowed). ContestHistoryPage (/contest/history -- GET /admin/contest/cycles). ContestCycleDetailPage (/contest/cycles/:id -- read-only past-cycle view; 404 -&gt; honest not-found state). Nav unchanged (contest item stays /contest). No services/api or apps/web code touched. Grep confirms zero ContestTask / contestBackendNote / 'Target entry count' / Hashtag / /contest/tasks / 'Task name' references remain in apps/admin/src. Verification: apps/admin vitest 16 files / 66 tests, 0 failures (contest.test.tsx 3 -&gt; 14 tests; covers every hub phase branch, create-cycle + 409, judge-week position assign + submit + empty thin week, crown deduped pool, 404); npx tsc --noEmit, npm run lint, npm run build (@soccernity/admin) all clean; dev-server smoke test all 7 Contest routes -&gt; HTTP 200, clean log. The full 3-task arc closing #239: #241 (Task 1, backend reads) + #242 (Task 2, Figma screens) + #243 (Task 3, this pass).</w:t>
+            </w:r>
+          </w:p>
+        </w:tc>
+      </w:tr>
+      <w:tr>
+        <w:tc>
+          <w:tcPr>
+            <w:tcW w:type="dxa" w:w="500"/>
+          </w:tcPr>
+          <w:p>
+            <w:r>
+              <w:t>244</w:t>
+            </w:r>
+          </w:p>
+        </w:tc>
+        <w:tc>
+          <w:tcPr>
+            <w:tcW w:type="dxa" w:w="4700"/>
+          </w:tcPr>
+          <w:p>
+            <w:r>
+              <w:t>Standalone 'Settings -- Menu -- Mobile' hub built -- PR 1 of 6 in the Settings-family consolidation (Decision Log #230). Executes founder decision #7: mobile Settings uses a standalone hub screen routing to section sub-pages (audit Section 6.6 option (a)), matching the shipped /settings -&gt; /settings/privacy route shape, not a single long scroll or a hub list repeated on every section page.</w:t>
+            </w:r>
+          </w:p>
+        </w:tc>
+        <w:tc>
+          <w:tcPr>
+            <w:tcW w:type="dxa" w:w="1850"/>
+          </w:tcPr>
+          <w:p>
+            <w:r>
+              <w:t>sprint-2/settings-mobile-menu-hub (figma-screen-builder, 2026-09-06)</w:t>
+            </w:r>
+          </w:p>
+        </w:tc>
+        <w:tc>
+          <w:tcPr>
+            <w:tcW w:type="dxa" w:w="2300"/>
+          </w:tcPr>
+          <w:p>
+            <w:r>
+              <w:t>Resolved (this PR only -- Figma design only, no app/backend code, no existing frame touched). Report: docs/sprint-2-settings-mobile-menu-hub-report.md. New frame 'Settings -- Menu -- Mobile' (6289:15068), 390 x 551 (Decision Log #86), Light mode only, page 0:1. Structure: cloned 'Top Bar -- Soccernity' (from canonical 6185:14548) + 'Settings' heading + 5 tappable rows (label / one-line factual description / chevron), each with ON_CLICK -&gt; NAVIGATE wired TO NODE IDS (so PR 2's planned rename of 5607:7813 cannot break them): Account -&gt; 5607:7813, Security &amp; Account Settings -&gt; 5695:8279, Privacy -&gt; 6185:14547, Notification Preferences -&gt; 5696:8340, Display, Language &amp; Region -&gt; 5649:8140. Row labels apply founder decisions #2 and #3 verbatim, so they intentionally differ from the stale labels on the existing inline Category Nav -- aligning those is PR 5. Rows 2-5 are clones of row 1 (every binding / font / sizing mode inherited). DELIBERATELY NOT done: the inline 5-row hub list on 'Settings -- Overview -- Mobile' and 'Settings -- Privacy -- Mobile' was left untouched (PR 5); no existing frame was modified. Judgment calls, all disclosed: no back affordance (the two existing hub-list-bearing frames have none; the leaf 'Back to Settings' pattern would be circular on the hub itself; the real mobile entry point 'Navigation Drawer -- Mobile' 5870:10689 is an overlay, which cannot be a NAVIGATE destination -- flagged for founder review rather than invented); no icon column (follows the icon-less Category Nav rather than inventing 5 section glyphs); labels bound to color/text/primary and descriptions to color/text/secondary; frame appended to the END of the mobile Settings row (x 4939, same 500px pitch, same y -8642 baseline) rather than inserted at its head, since inserting would require moving existing frames. A real pre-existing bug was found and routed around, not inherited: the chevrons inside the existing Category Nav bind their stroke to color/text/on-navy (white), making four of five invisible on white rows -- this frame clones the correctly brand/navy-bound chevron from 6186:14569 instead; the bug itself is flagged for PR 5, which already reworks that list. Audit, measured node-by-node: 40 nodes, 22 visible paints, 22 bound / 0 unbound / 0 off-palette / 0 brand/green-tint-28 / 0 new colours, 0 frame overlaps, no clash with the parked Admin Shell zone, 0 Community-style sidebar content (checked programmatically against the frame's full text inventory). Figma writes by the agent (no shell that session); branch / commit / docx transcription / PR finalised in a follow-up session -- same pattern as PRs #98 / #102 / #110 / #130 / #151. Decision Log #230 STAYS OPEN -- 9 of the 10 founder decisions still unexecuted; #230 flips Resolved at PR 6 (shell componentization), which also closes Build Plan Section 7's '22 duplicate Settings frames' blocker.</w:t>
             </w:r>
           </w:p>
         </w:tc>

</xml_diff>

<commit_message>
Admin moderation decision added
</commit_message>
<xml_diff>
--- a/docs/Soccernity_MVP_Build_Plan_v1.7.docx
+++ b/docs/Soccernity_MVP_Build_Plan_v1.7.docx
@@ -20167,6 +20167,90 @@
           <w:p>
             <w:r>
               <w:t>Resolved -- CLOSES the DESIGN HALF of Decision Log #230, and closes Build Plan Section 7's '22 duplicate Settings frames' MVP-launch blocker structurally. Report: docs/sprint-2-settings-shell-componentization-report.md. NEW 'Settings Shell' COMPONENT_SET (6339:16094), parked off-canvas at x 20000, y -16000 (no Admin-zone clash). Active variant property, 6 values -- Account (default) / Security / Privacy / Notifications / Display / None. Each variant contains the header-4 navbar instance, the Frame 5910 nav rail (Settings H1 + 5 rail rows), and the two column dividers Line 106 / Line 107 -- NOT the content panel. Baked in: the decision #2/#3 rail labels (Account . Security &amp; Account Settings . Privacy . Notification Preferences . Display, Language &amp; Region) as instance-level overrides on the Frame 5904 row instances; the real click/clicked active-state variant on the highlighted row; SPACE_BETWEEN chevron alignment (all chevrons at x 305 regardless of label length -- the layout trap PR 2 hit, fixed once at component level); ON_HOVER -&gt; CHANGE_TO preserved on resting rows. NAVIGATE targets could NOT be baked in -- Figma rejects NAVIGATE reactions on any descendant of a COMPONENT as an invalid prototype source (same family as #103). Set instead as per-instance overrides on each re-based frame's shell instance (Account -&gt; 2905:4798, Security -&gt; 2926:8056, Privacy -&gt; 6178:14437, Notifications -&gt; 2926:9721, Display -&gt; 2922:5832), preserving each row's inherited ON_HOVER; the frame's own active section is skipped (no self-NAVIGATE, per PR 4's convention). This matches the pre-existing file convention that every ON_CLICK -&gt; NAVIGATE on these rails is already an instance override. ALL 23 LIVE DESKTOP SETTINGS FRAMES RE-BASED -- D1-D7 (Account), D9-D10 (Security), D11-D13 (Privacy), D15-D19 (Notifications), D20 + the 4 PR 3 Display leaves (Display), the PR 2 landing (None). Per frame: the 4 shell nodes deleted, one Settings Shell instance appended at (0,0). Content-panel geometry verified byte-identical before-&gt;after on all 23 ({x,y,w,h} captured and compared; zero deviation). The PR 2/PR 3 instance-override rail labels are superseded -- those frames now inherit labels from the shell. Frame 5904 set (2906:7170) deliberately NOT edited -- after the re-base its only live-frame instances are inside the shell (correct labels); the stale variant labels are now visible only in archived frames. ON-SCREEN HEADINGS: D9 (2926:8165) + M9 (5695:8289) 'Security' -&gt; 'Security &amp; Account Settings'; D15 (2926:9830) + M15 (5696:8350) 'Preferences' -&gt; 'Notification Preferences'. LEFT-GUTTER RE-BALANCE: KEEP (rail x 344, content x 688), applied uniformly via the component -- all 23 frames geometrically identical, the actual task requirement. Reclaiming the empty x 0-344 band is a cheap, low-risk component-level follow-up now that the shell is a real component; not done here. SECTION BANNERS WIDENED: desktop 'Settings' text (2930:10458) -&gt; x -16469, w 10707, centered, spanning the full live desktop row; its backing strip Rectangle 350 (2930:10457) resized to match and its previously-UNBOUND navy fill bound to brand/navy; mobile 'Settings (Mobile)' text (5698:8239) -&gt; x -4751, w 10580, centered. Detached PR 3 Display-leaf rows (y 6000 / y 8800) still uncovered (pre-existing PR 3 flag). MOBILE: new 'Settings Back Bar -- Mobile' component (6348:16292), swapped onto all 22 live mobile section/leaf frames (the bars were structurally uniform); each instance wired ON_CLICK -&gt; NAVIGATE -&gt; 6289:15068 ('Settings -- Menu -- Mobile'), closing PR 5's 'some wired, some not' inconsistency. Full mobile Top-Bar/Content componentization deferred as a separate pass. AUDIT: Settings Shell set -- 508 paints, 508 bound, 0 unbound / 0 off-palette / 0 brand/green-tint-28 / 0 new colours; back-bar component -- 2/2 bound. Everything else was a deletion / clone-of-bound-node / variant swap / reaction override / text edit. 0 overlaps introduced, no Admin-zone clash. Screenshot-verified all 6 Active states + M1/M9/M15 + both banners. FLAGGED, NOT FIXED: left-gutter reclaim (cheap follow-up); Display-leaf rows have no banner marker; Frame 5904 set still carries stale labels (archived-only impact); mobile Top-Bar/Content not componentized; D15 subtitle 'See information about your account' + Push/Email 2FA-boilerplate row descriptions (pre-existing template junk, text-hygiene scope); navbar avatar IMAGE fill (shared-component debt); Display-merge question untouched (Display stays a 4th leaf, unresolved). use_figma gotchas hit and folded into CLAUDE.md: NAVIGATE rejected on COMPONENT descendants; clone() parents under figma.currentPage (resets to the cover page each call); setProperties() invalidates the node handle for a following .reactions set; component.clone() drops nested-instance reaction overrides. Figma writes by the agent (no shell that session); branch / commit / docx transcription (this entry + #230 flip + Section 7 edits) / PR finalised in a follow-up session. The full 6-PR arc closing the design half of #230: #244 (PR 1, mobile menu hub) + #245 (PR 2, landing) + #246 (PR 3, Display leaves) + #247 (PR 4, duplicate clusters) + #248 (PR 5, sidebar removal) + #249 (PR 6, componentization). The figma-to-code conversion of the consolidated Settings set remains a flagged separate follow-up -- only PrivacySettingsPage.tsx / /settings/privacy is shipped in apps/web today.</w:t>
+            </w:r>
+          </w:p>
+        </w:tc>
+      </w:tr>
+      <w:tr>
+        <w:tc>
+          <w:tcPr>
+            <w:tcW w:type="dxa" w:w="500"/>
+          </w:tcPr>
+          <w:p>
+            <w:r>
+              <w:t>250</w:t>
+            </w:r>
+          </w:p>
+        </w:tc>
+        <w:tc>
+          <w:tcPr>
+            <w:tcW w:type="dxa" w:w="4700"/>
+          </w:tcPr>
+          <w:p>
+            <w:r>
+              <w:t>Admin Users / Moderation / Roles — correcting scope, and naming the real remaining gaps. Re-verified directly against the live repo (apps/admin/src/pages/users/UsersPage.tsx, .../moderation/ModerationQueuePage.tsx, .../settings/SettingsRolesPage.tsx + RoleFormPages.tsx) rather than re-litigating from screenshots alone. The three concerns this raised are already correctly separated at the design/frontend level -- DL #142 already corrected the earlier misread that 917:218 ("Users -- team members") was admin-role management; it is the platform-user list (Username / Date Joined / Status, block/delete), distinct from the Admin Settings &gt; Roles screen (SettingsRolesPage.tsx, RoleFormPages.tsx) which already handles editor/moderator/superadmin role assignment, and distinct again from the Moderation Queue screen (Figma 5794:8635, ModerationQueuePage.tsx) which already has Open Reports / Appeals tabs and the DL #138 second-reviewer appeal routing built into its copy. No screen split is needed -- proposing one would have duplicated existing design work.</w:t>
+            </w:r>
+          </w:p>
+        </w:tc>
+        <w:tc>
+          <w:tcPr>
+            <w:tcW w:type="dxa" w:w="1850"/>
+          </w:tcPr>
+          <w:p>
+            <w:r>
+              <w:t>chat 14 admin review; DL #135, #138, #142, #189</w:t>
+            </w:r>
+          </w:p>
+        </w:tc>
+        <w:tc>
+          <w:tcPr>
+            <w:tcW w:type="dxa" w:w="2300"/>
+          </w:tcPr>
+          <w:p>
+            <w:r>
+              <w:t>Open -- the real gaps are backend + data-model, not screens: (1) all three pages remain STUB -- GET/PATCH /admin/users and GET/PATCH /admin/moderation/reports are unbuilt, Sprint 5 scope per DL #135/#189, unchanged by this entry; (2) DPIA item R8 -- Report.reporterId is a required FK to User, so a non-user (e.g. a parent) has no route to report content depicting a child -- still flagged "significant gap", not resolved; (3) DPIA item R9 -- AdminUser.role is a flat editor|moderator|superadmin with no restriction of child-related reports to specifically designated staff and no escalation path for reports disclosing risk of harm -- still "NOT ASSESSED" per docs/sprint-1-dpia-outline-draft.md; (4) Report has no severity/priority field for triage, and no audit-trail model exists for moderator actions (who actioned what, when). Recommend folding a severity field + an AdminActionLog model into the Sprint 5 backend-api scope alongside R8/R9, rather than opening a further screen-design pass.</w:t>
+            </w:r>
+          </w:p>
+        </w:tc>
+      </w:tr>
+      <w:tr>
+        <w:tc>
+          <w:tcPr>
+            <w:tcW w:type="dxa" w:w="500"/>
+          </w:tcPr>
+          <w:p>
+            <w:r>
+              <w:t>251</w:t>
+            </w:r>
+          </w:p>
+        </w:tc>
+        <w:tc>
+          <w:tcPr>
+            <w:tcW w:type="dxa" w:w="4700"/>
+          </w:tcPr>
+          <w:p>
+            <w:r>
+              <w:t>Mobile Settings nav shell -- confirmed stale, scoped as PR7. Verified directly against the live repo: commit 3b6f2b0 (PR #210, sprint-2/settings-shell-componentization, closing DL #230's design half) componentized the desktop Settings Shell and built a new 'Settings Back Bar -- Mobile' component (6348:16292), swapping it onto all 22 live mobile Settings frames with ON_CLICK -&gt; NAVIGATE wired correctly -- but that same PR's own "flagged, not fixed" list explicitly deferred full mobile Top-Bar/Content componentization as a separate pass, and it remains undone. The desktop rail-label fix (Security -&gt; "Security &amp; Account Settings", Preferences -&gt; "Notification Preferences") was verified against D9/D15/M9/M15 specifically -- not independently re-audited against every one of the 22 mobile frames.</w:t>
+            </w:r>
+          </w:p>
+        </w:tc>
+        <w:tc>
+          <w:tcPr>
+            <w:tcW w:type="dxa" w:w="1850"/>
+          </w:tcPr>
+          <w:p>
+            <w:r>
+              <w:t>chat 14 mobile settings review; PR #210 / DL #249's own flagged list</w:t>
+            </w:r>
+          </w:p>
+        </w:tc>
+        <w:tc>
+          <w:tcPr>
+            <w:tcW w:type="dxa" w:w="2300"/>
+          </w:tcPr>
+          <w:p>
+            <w:r>
+              <w:t>Open -- scoped as PR7 (figma-design-system, same lineage as PR4-PR6), no work started: (1) componentize the mobile Top-Bar + Content structure the way PR6 did for the desktop shell; (2) re-audit that the rail-label fix reaches all 22 mobile Settings frames, not just the four spot-checked in PR6. Figma-design-only, no app/backend code -- apps/mobile has no application code yet (confirmed empty), so this carries no code impact today. Not a DL #230 reopen; #230's design half stays Resolved per DL #249.</w:t>
             </w:r>
           </w:p>
         </w:tc>

</xml_diff>

<commit_message>
Resolved grassroot decision 268 and 269
</commit_message>
<xml_diff>
--- a/docs/Soccernity_MVP_Build_Plan_v1.7.docx
+++ b/docs/Soccernity_MVP_Build_Plan_v1.7.docx
@@ -20936,6 +20936,90 @@
           <w:p>
             <w:r>
               <w:t>Open -- founder + figma-design-system. Not blocking: the flat row shipped in #266 is complete and correct on its own.</w:t>
+            </w:r>
+          </w:p>
+        </w:tc>
+      </w:tr>
+      <w:tr>
+        <w:tc>
+          <w:tcPr>
+            <w:tcW w:type="dxa" w:w="500"/>
+          </w:tcPr>
+          <w:p>
+            <w:r>
+              <w:t>268</w:t>
+            </w:r>
+          </w:p>
+        </w:tc>
+        <w:tc>
+          <w:tcPr>
+            <w:tcW w:type="dxa" w:w="4700"/>
+          </w:tcPr>
+          <w:p>
+            <w:r>
+              <w:t>Navigation Drawer nesting (DL #267) — founder decision: keep the flat row. DL #266 shipped Grassroots as a flat sibling row directly after Clubs in the mobile Navigation Drawer, because no drawer-nesting pattern exists anywhere in the file. DL #267 raised the alternative of an expandable "Clubs" group (Clubs/Grassroots) as a genuine IA conversation, not a mechanical change.</w:t>
+            </w:r>
+          </w:p>
+        </w:tc>
+        <w:tc>
+          <w:tcPr>
+            <w:tcW w:type="dxa" w:w="1850"/>
+          </w:tcPr>
+          <w:p>
+            <w:r>
+              <w:t>chat 14 founder review</w:t>
+            </w:r>
+          </w:p>
+        </w:tc>
+        <w:tc>
+          <w:tcPr>
+            <w:tcW w:type="dxa" w:w="2300"/>
+          </w:tcPr>
+          <w:p>
+            <w:r>
+              <w:t>Resolved — keep the flat row as shipped in #266. No further design or code work needed on the drawer. If a future pillar makes the drawer's linear growth a real problem, the expandable-group option from #267 remains a documented, costed alternative to revisit rather than a rejected idea.</w:t>
+            </w:r>
+          </w:p>
+        </w:tc>
+      </w:tr>
+      <w:tr>
+        <w:tc>
+          <w:tcPr>
+            <w:tcW w:type="dxa" w:w="500"/>
+          </w:tcPr>
+          <w:p>
+            <w:r>
+              <w:t>269</w:t>
+            </w:r>
+          </w:p>
+        </w:tc>
+        <w:tc>
+          <w:tcPr>
+            <w:tcW w:type="dxa" w:w="4700"/>
+          </w:tcPr>
+          <w:p>
+            <w:r>
+              <w:t>Grassroots GET-endpoint auth (raised in DL #259's permission matrix) — founder decision: require login, unchanged. DL #259 built all Grassroots GET reads (teams, fixtures) behind JwtAuthGuard-only and explicitly flagged whether logged-out visitors should be able to view teams/fixtures as an open question tied to #258, left undecided at build time.</w:t>
+            </w:r>
+          </w:p>
+        </w:tc>
+        <w:tc>
+          <w:tcPr>
+            <w:tcW w:type="dxa" w:w="1850"/>
+          </w:tcPr>
+          <w:p>
+            <w:r>
+              <w:t>chat 14 founder review</w:t>
+            </w:r>
+          </w:p>
+        </w:tc>
+        <w:tc>
+          <w:tcPr>
+            <w:tcW w:type="dxa" w:w="2300"/>
+          </w:tcPr>
+          <w:p>
+            <w:r>
+              <w:t>Resolved — no change. Grassroots GET endpoints stay JwtAuthGuard-only, same as every other authenticated read in the app today. No backend-api work needed.</w:t>
             </w:r>
           </w:p>
         </w:tc>

</xml_diff>

<commit_message>
Decision log clean up
</commit_message>
<xml_diff>
--- a/docs/Soccernity_MVP_Build_Plan_v1.7.docx
+++ b/docs/Soccernity_MVP_Build_Plan_v1.7.docx
@@ -9088,7 +9088,7 @@
                 <w:sz w:val="19"/>
                 <w:szCs w:val="19"/>
               </w:rPr>
-              <w:t>Open — blocks deploy.yml; the workflow fails on purpose until this is resolved</w:t>
+              <w:t>Superseded — blocks deploy.yml; the workflow fails on purpose until this is resolved</w:t>
               <w:br/>
               <w:br/>
               <w:t>SUPERSEDED by Decision Log #26 (founder-resolved): hosting is Render (API) + Neon (Postgres) + Upstash (Redis), unbundled. Config prepared (render.yaml, directUrl, CI); real accounts and a live deploy are the only remaining open action, tracked under #26, not here.</w:t>
@@ -11221,7 +11221,7 @@
           </w:tcPr>
           <w:p>
             <w:r>
-              <w:t>Open — whether a pending-consent minor should see a different post-verification view is undecided RESOLVED (backend side) by sprint-2/verify-email-consent-status-field (backend-api): POST /auth/verify-email's response now carries an additive guardianConsentStatus field alongside the pre-existing verified/userId -- 'not_applicable' (not a minor, or a minor with no Guardian row -- a data-invariant case, not a real product state), 'pending', or 'confirmed'. Sourced from GuardianConsentService.getConsentStatusForUser(), extracted from the exact same method GET /auth/guardian-consent/status itself already used (made public, not duplicated) -- there is exactly one place in the codebase that queries Guardian-by-minorUserId and shapes the result. Typed as a plain string (not a narrower union), mirroring GuardianConsentStatusResponse.consentStatus's own existing convention, so a future value (e.g. a Decision Log #34 'declined' state) doesn't require a type change here too. Mocked suite 42 suites / 481 tests -&gt; 42 suites / 489 tests, 0 failures (8 new); e2e suite not re-run (plain findUnique-backed enrichment, no raw SQL/transaction/novel relation -- matches the existing no-e2e precedent already set for GET /auth/guardian-consent/status itself); nest build and eslint both clean. User/Guardian safeguarding fields (isMinor, consentStatus, consentToken, consentTimestamp) confirmed untouched -- zero schema.prisma diff. NOT yet resolved: the frontend half -- VerifyEmailPage.tsx does not yet branch on this new field (still Decision Log #38's other open question, now unblocked rather than closed) -- and what a future 'declined' consentStatus value should show here is left open, flagged in registration.service.ts's own comment. RESOLVED on the frontend side by sprint-2/verify-email-support-and-consent-view (figma-to-code), closing out the item sprint-2/verify-email-consent-status-field's own backend PR left open. VerifyEmailPage.tsx now branches on the real, additive guardianConsentStatus field: a minor whose status is 'pending' renders a genuinely distinct 'verified-pending-consent' state -- own heading ('Email verified -- approval still pending'), own three-item explanation list, and a CTA linking to /guardian-consent -- never the ordinary Verified state's 'you're all set' framing or its /profile CTA. Figma was checked directly before building anything (get_design_context on 'Verify Email -- 2 Verified', 5143:6648): it renders one single generic Verified layout with no consent-status branch anywhere, confirming no dedicated frame exists for this state (matching PR #107's own prior finding that this was left founder-blocked/never-designed). Built as a CONSERVATIVE INTERIM DESIGN, explicitly flagged as such in VerifyEmailPage.tsx's own code comment -- reuses the ordinary Verified state's icon/card/button CSS scaffolding (the email genuinely was verified) but with entirely distinct copy, never claiming full access. Should be replaced wholesale, not patched, if a real Figma frame for this state is ever designed. apps/web/src/api/auth.ts's VerifyEmailResponse updated to carry guardianConsentStatus: string, mirroring the backend's VerifyEmailResult type exactly including its own plain-string (not narrowed union) reasoning. Verified: tsc --noEmit exit 0, vitest 13 files / 86 -&gt; 92 tests 0 failures, vite build exit 0, lint exit 0.</w:t>
+              <w:t>Resolved (one edge case open: what a future 'declined' consentStatus value should display here is not yet designed) — the original question, whether a pending-consent minor should see a different post-verification view, was undecided; RESOLVED (backend side) by sprint-2/verify-email-consent-status-field (backend-api): POST /auth/verify-email's response now carries an additive guardianConsentStatus field alongside the pre-existing verified/userId -- 'not_applicable' (not a minor, or a minor with no Guardian row -- a data-invariant case, not a real product state), 'pending', or 'confirmed'. Sourced from GuardianConsentService.getConsentStatusForUser(), extracted from the exact same method GET /auth/guardian-consent/status itself already used (made public, not duplicated) -- there is exactly one place in the codebase that queries Guardian-by-minorUserId and shapes the result. Typed as a plain string (not a narrower union), mirroring GuardianConsentStatusResponse.consentStatus's own existing convention, so a future value (e.g. a Decision Log #34 'declined' state) doesn't require a type change here too. Mocked suite 42 suites / 481 tests -&gt; 42 suites / 489 tests, 0 failures (8 new); e2e suite not re-run (plain findUnique-backed enrichment, no raw SQL/transaction/novel relation -- matches the existing no-e2e precedent already set for GET /auth/guardian-consent/status itself); nest build and eslint both clean. User/Guardian safeguarding fields (isMinor, consentStatus, consentToken, consentTimestamp) confirmed untouched -- zero schema.prisma diff. NOT yet resolved: the frontend half -- VerifyEmailPage.tsx does not yet branch on this new field (still Decision Log #38's other open question, now unblocked rather than closed) -- and what a future 'declined' consentStatus value should show here is left open, flagged in registration.service.ts's own comment. RESOLVED on the frontend side by sprint-2/verify-email-support-and-consent-view (figma-to-code), closing out the item sprint-2/verify-email-consent-status-field's own backend PR left open. VerifyEmailPage.tsx now branches on the real, additive guardianConsentStatus field: a minor whose status is 'pending' renders a genuinely distinct 'verified-pending-consent' state -- own heading ('Email verified -- approval still pending'), own three-item explanation list, and a CTA linking to /guardian-consent -- never the ordinary Verified state's 'you're all set' framing or its /profile CTA. Figma was checked directly before building anything (get_design_context on 'Verify Email -- 2 Verified', 5143:6648): it renders one single generic Verified layout with no consent-status branch anywhere, confirming no dedicated frame exists for this state (matching PR #107's own prior finding that this was left founder-blocked/never-designed). Built as a CONSERVATIVE INTERIM DESIGN, explicitly flagged as such in VerifyEmailPage.tsx's own code comment -- reuses the ordinary Verified state's icon/card/button CSS scaffolding (the email genuinely was verified) but with entirely distinct copy, never claiming full access. Should be replaced wholesale, not patched, if a real Figma frame for this state is ever designed. apps/web/src/api/auth.ts's VerifyEmailResponse updated to carry guardianConsentStatus: string, mirroring the backend's VerifyEmailResult type exactly including its own plain-string (not narrowed union) reasoning. Verified: tsc --noEmit exit 0, vitest 13 files / 86 -&gt; 92 tests 0 failures, vite build exit 0, lint exit 0.</w:t>
             </w:r>
           </w:p>
         </w:tc>
@@ -15298,7 +15298,7 @@
           </w:tcPr>
           <w:p>
             <w:r>
-              <w:t>Open — deferred to Sprint 5. Admin Console + moderation queue is Sprint 5. These are net-new screens (figma-screen-builder territory) that need founder input on the §8.4 appeal-routing model ("a second reviewer, not the same admin") — a product/policy decision, not something to invent unilaterally. Admin Panel is desktop-only so no mobile dimension. Admin Panel colour/token treatment was NOT touched by this audit (hard constraint).  → RESOLVED (appeal routing) by Decision Log #138: an appeal is reviewed by a SECOND admin/moderator, never the original reviewer; the moderation-queue design must make this routing legible (appealed report excluded from / clearly marked against the original reviewer's own queue).  → Screens now built by sprint-2/decision-log-133-137-followup: Admin — Moderation Queue, Report Detail &amp; Action, and Appeal Review, all on the unified Admin shell, with the Decision Log #138 appeal-routing rule made visible in the queue's own callout. Moderation-outcome/appeal-decision emails remain unbuilt (see #143).</w:t>
+              <w:t>Resolved (design — screens built; moderation-queue backend/API wiring remains open, tracked separately under #189 and #250). Originally deferred to Sprint 5. Admin Console + moderation queue is Sprint 5. These are net-new screens (figma-screen-builder territory) that need founder input on the §8.4 appeal-routing model ("a second reviewer, not the same admin") — a product/policy decision, not something to invent unilaterally. Admin Panel is desktop-only so no mobile dimension. Admin Panel colour/token treatment was NOT touched by this audit (hard constraint).  → RESOLVED (appeal routing) by Decision Log #138: an appeal is reviewed by a SECOND admin/moderator, never the original reviewer; the moderation-queue design must make this routing legible (appealed report excluded from / clearly marked against the original reviewer's own queue).  → Screens now built by sprint-2/decision-log-133-137-followup: Admin — Moderation Queue, Report Detail &amp; Action, and Appeal Review, all on the unified Admin shell, with the Decision Log #138 appeal-routing rule made visible in the queue's own callout. Moderation-outcome/appeal-decision emails remain unbuilt (see #143).</w:t>
             </w:r>
           </w:p>
         </w:tc>
@@ -15340,7 +15340,7 @@
           </w:tcPr>
           <w:p>
             <w:r>
-              <w:t>Open — deferred to Sprint 3. DMs are Sprint 3. A recipient picker depends on an unresolved choice between a GET /search?q= people-search and a follow-graph list — flagged rather than invented. The restricted-pending rule (§8.3 step 5, "no DMs from unverified accounts", Decision Log #12) also needs a state here eventually.  → RESOLVED (recipient-picker shape) by Decision Log #139: ONE recipient-picker screen combining a search bar (by username / display name) with a default follow-list section shown before any search term. Desktop + mobile.  → Screens now built by sprint-2/decision-log-133-137-followup: Message — New Conversation (Recipient Picker), desktop + mobile, combining a search bar and a default follow-list per Decision Log #139.</w:t>
+              <w:t>Resolved (design — screens built; Sprint 3 backend/build remains unstarted as of the most recent sweep). Originally deferred to Sprint 3. DMs are Sprint 3. A recipient picker depends on an unresolved choice between a GET /search?q= people-search and a follow-graph list — flagged rather than invented. The restricted-pending rule (§8.3 step 5, "no DMs from unverified accounts", Decision Log #12) also needs a state here eventually.  → RESOLVED (recipient-picker shape) by Decision Log #139: ONE recipient-picker screen combining a search bar (by username / display name) with a default follow-list section shown before any search term. Desktop + mobile.  → Screens now built by sprint-2/decision-log-133-137-followup: Message — New Conversation (Recipient Picker), desktop + mobile, combining a search bar and a default follow-list per Decision Log #139.</w:t>
             </w:r>
           </w:p>
         </w:tc>
@@ -16733,7 +16733,7 @@
           </w:tcPr>
           <w:p>
             <w:r>
-              <w:t>Open -- dual-variant + logged-in default chosen meanwhile; both trivially reversible. No application code involved (BlogPage.tsx is still a PlaceholderPage stub). RESOLVED (sprint-2/blog-split-and-pinned-post-mobile, figma-screen-builder): Blog now has one frame per auth state matching Sports -- Blog Page Desktop -- Logged In (5953:10771, header 4) / -- Logged Out (5953:11364, header 7), Blog Page Mobile -- Logged In (5956:10960, header 4 -- mobile) / -- Logged Out (5956:11331, header 7 -- mobile). Each carries exactly one navbar instance, visible; the opposite variant is removed, not hidden. The originals 1009:128 / 41:4 are archived (hidden + 'ARCHIVED --' prefix). No app code (BlogPage.tsx still a PlaceholderPage stub).</w:t>
+              <w:t>Resolved -- dual-variant + logged-in default chosen meanwhile; both trivially reversible. No application code involved (BlogPage.tsx is still a PlaceholderPage stub). RESOLVED (sprint-2/blog-split-and-pinned-post-mobile, figma-screen-builder): Blog now has one frame per auth state matching Sports -- Blog Page Desktop -- Logged In (5953:10771, header 4) / -- Logged Out (5953:11364, header 7), Blog Page Mobile -- Logged In (5956:10960, header 4 -- mobile) / -- Logged Out (5956:11331, header 7 -- mobile). Each carries exactly one navbar instance, visible; the opposite variant is removed, not hidden. The originals 1009:128 / 41:4 are archived (hidden + 'ARCHIVED --' prefix). No app code (BlogPage.tsx still a PlaceholderPage stub).</w:t>
             </w:r>
           </w:p>
         </w:tc>
@@ -16775,7 +16775,7 @@
           </w:tcPr>
           <w:p>
             <w:r>
-              <w:t>Open -- caption notes added meanwhile (5933:10771 / 5933:10772 / 5933:10773); 5818:9031 itself left untouched. RESOLVED (sprint-2/blog-split-and-pinned-post-mobile, figma-screen-builder): mobile now has a non-contest counterpart to desktop 2565:3951 -- Community -- Home Feed with Normal Pinned Post -- Mobile (5956:12797), built from 5818:9031 with the pin badge changed from 'Contest post' to 'Pinned post' and the contest chrome removed. Navbar instance 5956:12798 -&gt; component 5386:6576 (header 4 -- mobile), identical to 5818:9031's.</w:t>
+              <w:t>Resolved -- caption notes added meanwhile (5933:10771 / 5933:10772 / 5933:10773); 5818:9031 itself left untouched. RESOLVED (sprint-2/blog-split-and-pinned-post-mobile, figma-screen-builder): mobile now has a non-contest counterpart to desktop 2565:3951 -- Community -- Home Feed with Normal Pinned Post -- Mobile (5956:12797), built from 5818:9031 with the pin badge changed from 'Contest post' to 'Pinned post' and the contest chrome removed. Navbar instance 5956:12798 -&gt; component 5386:6576 (header 4 -- mobile), identical to 5818:9031's.</w:t>
             </w:r>
           </w:p>
         </w:tc>
@@ -16943,7 +16943,7 @@
           </w:tcPr>
           <w:p>
             <w:r>
-              <w:t>Open -- one section-wide rebind by figma-design-system (brand/green-tint for placeholder plates, the PR #128 precedent) rather than a per-frame fix; the visible footer pill needs a design answer (what should it be) before binding. RESOLVED (Blog Page frames only) by sprint-2/blog-badge-token-collision-fixes (figma-design-system): re-audited directly (not spot-checked) -- 92 #d9d9d9 paints found across the 4 named Blog Page frames (40 desktop x2 = combined into 40 per frame confirmed, 6 mobile x2), not the originally-estimated 40+6 total -- 90 of the 92 are image-backing placeholder plates, rebound to brand/green-tint (VariableID:5096:5, resolving the token's real Light-mode RGB/alpha before binding per this file's own gotcha), matching the PR #128 precedent. The remaining 2 are the visible 294x67 pill in the desktop footer (one each in the Logged In and Logged Out frames' own footer groups) -- confirmed by the founder to be a missing wordmark, not decoration -- deleted and replaced with a real 'Soccernity.' text node, styled from the mobile footer's own wordmark (Montserrat ExtraBold, bound to color/text/on-navy, VariableID:5182:6654), scaled from mobile's 15px to 30px matching this page's own established 2x mobile-to-desktop type-scale ratio (no explicit desktop wordmark spec existed to copy exactly -- flagged as a minor judgment call, not a blocking issue). Final re-audit after both fixes: 0 unbound/off-palette #d9d9d9 paints remain in any of the 4 Blog Page frames. NOT resolved by this PR, still open: the 5 #d9d9d9 paints on Articles Page Desktop (54:434) and 4 on Articles Page mobile (87:80) named in this row's own Decision-needed text -- out of this PR's scope (only the 4 Blog Page frames were named in its brief), remains a real follow-up.</w:t>
+              <w:t>Resolved (Blog Page frames; the Articles Page item flagged below was separately resolved by Decision Log #204) -- one section-wide rebind by figma-design-system (brand/green-tint for placeholder plates, the PR #128 precedent) rather than a per-frame fix; the visible footer pill needs a design answer (what should it be) before binding. RESOLVED (Blog Page frames only) by sprint-2/blog-badge-token-collision-fixes (figma-design-system): re-audited directly (not spot-checked) -- 92 #d9d9d9 paints found across the 4 named Blog Page frames (40 desktop x2 = combined into 40 per frame confirmed, 6 mobile x2), not the originally-estimated 40+6 total -- 90 of the 92 are image-backing placeholder plates, rebound to brand/green-tint (VariableID:5096:5, resolving the token's real Light-mode RGB/alpha before binding per this file's own gotcha), matching the PR #128 precedent. The remaining 2 are the visible 294x67 pill in the desktop footer (one each in the Logged In and Logged Out frames' own footer groups) -- confirmed by the founder to be a missing wordmark, not decoration -- deleted and replaced with a real 'Soccernity.' text node, styled from the mobile footer's own wordmark (Montserrat ExtraBold, bound to color/text/on-navy, VariableID:5182:6654), scaled from mobile's 15px to 30px matching this page's own established 2x mobile-to-desktop type-scale ratio (no explicit desktop wordmark spec existed to copy exactly -- flagged as a minor judgment call, not a blocking issue). Final re-audit after both fixes: 0 unbound/off-palette #d9d9d9 paints remain in any of the 4 Blog Page frames. NOT resolved by this PR, still open: the 5 #d9d9d9 paints on Articles Page Desktop (54:434) and 4 on Articles Page mobile (87:80) named in this row's own Decision-needed text -- out of this PR's scope (only the 4 Blog Page frames were named in its brief), remained a real follow-up. UPDATE: resolved by Decision Log #204 -- the stale node IDs above turned out to belong to already-archived frames; #204 found and fixed the real live equivalent (Blog -- Article Detail Desktop, 5997:10905 / 5997:11224).</w:t>
             </w:r>
           </w:p>
         </w:tc>
@@ -17993,7 +17993,9 @@
           </w:tcPr>
           <w:p>
             <w:r>
-              <w:t>Open -- fix applied locally to this one component (Admin Shell sidebar wash, all 10 variants); file-wide audit not attempted, out of this session's scope.</w:t>
+              <w:t>Partially resolved -- fix applied locally to this one component (Admin Shell sidebar wash, all 10 variants); file-wide audit not attempted, out of this session's scope.</w:t>
+              <w:br/>
+              <w:t>FOLDED IN (sprint-2/decision-log-204-208-cleanup, figma-design-system): this gotcha is now recorded in CLAUDE.md's new standing "Figma-authoring gotchas" subsection (under "Figma notes") so future sessions don't lose time rediscovering it. That subsection did not actually exist before this session -- created it, seeded with this entry, Decision Log #201, and the frame.resize()-on-GROUPs gotcha. The file-wide audit for other occurrences of this pattern this entry's own text flagged as not yet attempted remains open.</w:t>
             </w:r>
           </w:p>
           <w:p>
@@ -18083,7 +18085,9 @@
           </w:tcPr>
           <w:p>
             <w:r>
-              <w:t>Open -- fix applied locally to all 8 icon builds in this session; recommend folding into the file-wide Figma-notes gotcha list.</w:t>
+              <w:t>Resolved -- fix applied locally to all 8 icon builds in this session; recommend folding into the file-wide Figma-notes gotcha list.</w:t>
+              <w:br/>
+              <w:t>FOLDED IN (sprint-2/decision-log-204-208-cleanup, figma-design-system): this gotcha is now recorded in CLAUDE.md's new standing "Figma-authoring gotchas" subsection (under "Figma notes"), alongside Decision Log #199 and the frame.resize()-on-GROUPs gotcha -- that subsection did not actually exist before this session.</w:t>
             </w:r>
           </w:p>
           <w:p>
@@ -18221,7 +18225,9 @@
           </w:tcPr>
           <w:p>
             <w:r>
-              <w:t>Open -- recommend one scoped figma-design-system pass applying #174's own fix (replace the pill with a real "Soccernity." text node bound to color/text/on-navy, Montserrat ExtraBold, 30px desktop) across all remaining families at once: Articles Page (54:434/87:80) and the 6 new legal desktop frames.</w:t>
+              <w:t>Resolved -- recommend one scoped figma-design-system pass applying #174's own fix (replace the pill with a real "Soccernity." text node bound to color/text/on-navy, Montserrat ExtraBold, 30px desktop) across all remaining families at once: Articles Page (54:434/87:80) and the 6 new legal desktop frames.</w:t>
+              <w:br/>
+              <w:t>RESOLVED (sprint-2/decision-log-204-208-cleanup, figma-design-system): #174's fix applied identically across all remaining live families -- the 6 new Legal page desktop frames plus, on live re-verification, the real live equivalent of Articles Page (54:434/87:80, which the original brief's node IDs were stale for -- those are now archived/hidden; the live frames needing the fix turned out to be Blog -- Article Detail Desktop -- Logged In/Out, 5997:10905 / 5997:11224). 8 live pills fixed total. File-wide paint audit: 0 remaining live/visible instances; 5 remaining instances all sit inside already-archived, hidden frames and were deliberately left untouched per this project's archived-content precedent. See docs/sprint-2-decision-log-204-208-cleanup-report.md.</w:t>
             </w:r>
           </w:p>
           <w:p>
@@ -18269,7 +18275,9 @@
           </w:tcPr>
           <w:p>
             <w:r>
-              <w:t>Open -- needs a decision: rebuild it as a real open-state on the new Contact Us frames, or delete it as a stray orphan.</w:t>
+              <w:t>Partially resolved -- built and wired; one manual Figma-desktop-UI step still outstanding (see report). Originally needed a decision: rebuild it as a real open-state on the new Contact Us frames, or delete it as a stray orphan.</w:t>
+              <w:br/>
+              <w:t>RESOLVED, with one disclosed plugin-API limitation (sprint-2/decision-log-204-208-cleanup, figma-design-system): rebuilt, not deleted. Two new components -- Contact Category Dropdown -- Desktop (6130:14653, widened to the real 1030px field) and -- Mobile (6130:14664, 2x-scaled to the real 318px field) -- preserve the 5 options verbatim and are wired via ON_CLICK/OPEN_OVERLAY to all 4 Contact Us frames' chevron triggers, confirmed persisted. Limitation: overlayPositionType is read-only on a COMPONENT node via the plugin API (same class of gap as Decision Log #103's overlayBackgroundInteraction finding), so overlayRelativePosition -- needed to anchor the dropdown under the field instead of its default CENTER position -- cannot be set via API. NEW CANDIDATE: someone with Figma desktop UI access needs to set both components' Prototype-tab Overlay position type to Manual by hand; the offset math (desktop {x:-972,y:51}, mobile {x:-293,y:30}) is already computed in the report. The orphan 87:250 was reference-checked (0 hits file-wide) and deleted, not archived -- it was never a real, reachable screen. See docs/sprint-2-decision-log-204-208-cleanup-report.md.</w:t>
             </w:r>
           </w:p>
           <w:p>
@@ -18317,7 +18325,9 @@
           </w:tcPr>
           <w:p>
             <w:r>
-              <w:t>Open -- recommend adding a section banner covering the new row, matching how every other section of the file is delimited.</w:t>
+              <w:t>Resolved (no changes needed) -- recommend adding a section banner covering the new row, matching how every other section of the file is delimited.</w:t>
+              <w:br/>
+              <w:t>RESOLVED -- investigated, found ALREADY RESOLVED, no Figma changes made (sprint-2/decision-log-204-208-cleanup, figma-design-system). The original premise ("never had one") did not hold up on direct verification: Rectangle 194 (1869:2735) already exists, is visible, is bound to the same color/text/on-green variable (resolves to navy in Light mode) Blog's own banner uses, and already spans the live Legal Pages row with margin -- paired with the pre-existing "Company pages" text label (1870:2736) sitting directly within its band. Screenshot-confirmed. No duplicate banner was built. See docs/sprint-2-decision-log-204-208-cleanup-report.md.</w:t>
             </w:r>
           </w:p>
           <w:p>
@@ -18365,7 +18375,9 @@
           </w:tcPr>
           <w:p>
             <w:r>
-              <w:t>Open -- not fixed, since it recurs across many frames and belongs in one file-wide copy pass rather than a piecemeal fix.</w:t>
+              <w:t>Resolved -- was not fixed at the time this row was written, since it recurs across many frames and belongs in one file-wide copy pass rather than a piecemeal fix.</w:t>
+              <w:br/>
+              <w:t>RESOLVED for all live content (sprint-2/decision-log-204-208-cleanup, figma-design-system). File-wide sweep found 32 total "Copyright (c) 2022" instances (not scoped per-page); 22 live/visible instances updated to 2026 via the canonical font-load/mutate/return recipe (only the year digits changed, entity name and rights-reserved language untouched); 10 instances inside already-archived, hidden frames deliberately left untouched, matching the same archived-content precedent Decision Log #204 used. A broader safety sweep confirmed every other stray "2022" hit is unrelated sample/placeholder date content (article/match dates, Admin dashboard timestamps), correctly out of this year-correction's scope. See docs/sprint-2-decision-log-204-208-cleanup-report.md.</w:t>
             </w:r>
           </w:p>
           <w:p>
@@ -18413,7 +18425,9 @@
           </w:tcPr>
           <w:p>
             <w:r>
-              <w:t>Open -- optional follow-up; not blocking, since the file has no established convention of wiring footer-link prototypes yet either.</w:t>
+              <w:t>Resolved -- optional follow-up; not blocking, since the file has no established convention of wiring footer-link prototypes yet either.</w:t>
+              <w:br/>
+              <w:t>RESOLVED for all live content (sprint-2/decision-log-204-208-cleanup, figma-design-system). A fresh file-wide scan found 263 occurrences (not the 203 carried over from Decision Log #202's older scan -- re-verified live, the file has grown since) across 71 distinct top-level host frames. 189 wired via ON_CLICK/NAVIGATE to the correct new Legal page frame, branching by breakpoint (frame width) and auth state -- explicit frame-name suffixes where available, or Decision Log cross-reference where not (Leaderboard/Contest/Competition family to Logged In per Decision Log #129; the two canonical Home Page frames to Logged Out per Decision Log #46/#152; Community/Bants family to Logged In per the site-wide login-gating Decision Log #152 establishes). 46 skipped (archived frames, left untouched). 28 correctly left unwired -- same-type self-references (a page's own footer link to itself, or its own H1 heading matching the search string) that Figma's own NAVIGATE action correctly rejects as same-top-level-frame navigation, confirmed via direct re-check this is the right outcome, not a bug. Spot-checked across breakpoints/auth states via fresh reads. See docs/sprint-2-decision-log-204-208-cleanup-report.md.</w:t>
             </w:r>
           </w:p>
           <w:p>
@@ -20250,10 +20264,7 @@
           </w:tcPr>
           <w:p>
             <w:r>
-              <w:t>Open -- scoped as PR7 (figma-design-system, same lineage as PR4-PR6), no work started: (1) componentize the mobile Top-Bar + Content structure the way PR6 did for the desktop shell; (2) re-audit that the rail-label fix reaches all 22 mobile Settings frames, not just the four spot-checked in PR6. Figma-design-only, no app/backend code -- apps/mobile has no application code yet (confirmed empty), so this carries no code impact today. Not a DL #230 reopen; #230's design half stays Resolved per DL #249.</w:t>
-            </w:r>
-            <w:r>
-              <w:t xml:space="preserve">  Resolved by DL #252 (sprint-2/settings-mobile-shell-componentization, figma-design-system, 2026-09-08 -- PR 7): new 'Settings Top Bar -- Mobile' component (6360:16337), all 24 live mobile Settings frames re-based, content-panel geometry verified byte-identical before-&gt;after on all 24, label fix re-audited across all 24 (clean).</w:t>
+              <w:t>Resolved -- see Decision Log #252 (mobile Top-Bar shell componentized across all 24 frames; point-2 label re-audit found zero stale hits). Originally scoped as PR7 (figma-design-system, same lineage as PR4-PR6), no work started: (1) componentize the mobile Top-Bar + Content structure the way PR6 did for the desktop shell; (2) re-audit that the rail-label fix reaches all 22 mobile Settings frames, not just the four spot-checked in PR6. Figma-design-only, no app/backend code -- apps/mobile has no application code yet (confirmed empty), so this carries no code impact today. Not a DL #230 reopen; #230's design half stays Resolved per DL #249.  Resolved by DL #252 (sprint-2/settings-mobile-shell-componentization, figma-design-system, 2026-09-08 -- PR 7): new 'Settings Top Bar -- Mobile' component (6360:16337), all 24 live mobile Settings frames re-based, content-panel geometry verified byte-identical before-&gt;after on all 24, label fix re-audited across all 24 (clean).</w:t>
             </w:r>
           </w:p>
         </w:tc>
@@ -20936,7 +20947,7 @@
           </w:tcPr>
           <w:p>
             <w:r>
-              <w:t>Open -- founder + figma-design-system. Not blocking: the flat row shipped in #266 is complete and correct on its own.</w:t>
+              <w:t>Resolved -- see Decision Log #268 (founder kept the flat row; no further work). Not blocking: the flat row shipped in #266 is complete and correct on its own.</w:t>
             </w:r>
           </w:p>
         </w:tc>
@@ -21195,6 +21206,48 @@
           <w:p>
             <w:r>
               <w:t>Resolved. nav-grassroots.svg exported from Figma node 6412:18190 ("corner-flag (Grassroots)") via download_assets -- a bare 24x24 navy (#282E65 = brand/navy) stroke glyph, no green-tint tile baked in, matching the nav-clubs.svg / nav-sports-hub.svg export convention exactly (the tint tile is applied in CSS by Header.tsx's sn-header__nav-icon--tinted wrap). navigation.ts: navGrassroots imported alongside the other 6 nav icons; { label: "Grassroots", to: "/grassroots", icon: navGrassroots, tinted: true } added as the 7th and last primaryNavItems entry, after Clubs -- the canonical order and tinted style DL #272 landed, verbatim. tinted: true because the exported SVG is a bare stroke glyph, same as Sports Hub and Clubs (DL #159). Header.test.tsx: the canonical-icon-order test extended to 7 labels, the old "does NOT add Grassroots to the desktop icon nav" test inverted to assert it IS the last item (tinted, -&gt; /grassroots), the stale "six icon nav links" test name -&gt; "seven". Mobile Navigation Drawer NOT touched -- its Grassroots entry was already added by DL #270; the Figma file NOT touched. Verification: npx tsc --noEmit / npm run lint / npm run build all clean; npx vitest run -- 32 files / 215 tests, 0 failures (no test-count change; 3 existing Header.test.tsx assertions updated in place); dev-server smoke test /, /grassroots, /community, /clubs all HTTP 200. Not merged -- founder's call after review.</w:t>
+            </w:r>
+          </w:p>
+        </w:tc>
+      </w:tr>
+      <w:tr>
+        <w:tc>
+          <w:tcPr>
+            <w:tcW w:type="dxa" w:w="500"/>
+          </w:tcPr>
+          <w:p>
+            <w:r>
+              <w:t>274</w:t>
+            </w:r>
+          </w:p>
+        </w:tc>
+        <w:tc>
+          <w:tcPr>
+            <w:tcW w:type="dxa" w:w="4700"/>
+          </w:tcPr>
+          <w:p>
+            <w:r>
+              <w:t>Decision Log forward-pointer hygiene pass -- same class of cleanup as #204-208. Before starting Sprint 3, swept all 273 entries for rows whose Status cell still leads with "Open" despite the same cell's own later text already recording a resolution (a "RESOLVED"/"SUPERSEDED"/"FOLDED IN" note appended without updating the leading word), plus rows resolved entirely by a separate, later entry with no forward-pointer at all (the #251/#267 pattern flagged in chat 14's sprint sweep).</w:t>
+            </w:r>
+          </w:p>
+        </w:tc>
+        <w:tc>
+          <w:tcPr>
+            <w:tcW w:type="dxa" w:w="1850"/>
+          </w:tcPr>
+          <w:p>
+            <w:r>
+              <w:t>chat 14 sprint-sweep housekeeping request</w:t>
+            </w:r>
+          </w:p>
+        </w:tc>
+        <w:tc>
+          <w:tcPr>
+            <w:tcW w:type="dxa" w:w="2300"/>
+          </w:tcPr>
+          <w:p>
+            <w:r>
+              <w:t>Resolved -- 16 rows corrected: #9 (Superseded, was already SUPERSEDED-by-#26 inline), #38, #135, #136, #169, #170, #174, #201, #204, #206, #207, #208, #251, #267 flipped to Resolved (two of these, #135/#136, are Resolved *design-only* -- their backend/build halves are unstarted and correctly still tracked open under #189/#250 and Sprint 3 respectively, so flipping the leading word does NOT mean the underlying feature is built); #199 and #205 flipped to Partially resolved since each genuinely has one real remaining item (a file-wide audit; a manual Figma-desktop-UI step) that a plain "Resolved" would have hidden. #251 and #267 additionally got the missing forward-pointer to their actual resolving entries (#252, #268) appended, matching the pattern this project already established for #135/#136/#230's own forward-pointers. Open count: 46 -&gt; 30. The remaining 30 are left untouched -- verified each is either a genuine unresolved blocker (#4/#6/#9's live-account action/#38's edge case), a deliberately deferred future item (#2/#3/#5/#133/#141/#143/#145/#181-186/#190-193), or explicitly tracked-open-on-purpose (#189/#199's remaining audit/#205's manual step/#224-226). No Figma, app, or backend code touched -- docx-only.</w:t>
             </w:r>
           </w:p>
         </w:tc>

</xml_diff>

<commit_message>
Design Community Groups in Figma (Sprint 3, Decision Log #1)
figma-screen-builder designed the first-ever Community Groups screens
(browse/discover, individual group page in joined/not-joined states,
create-a-group, both empty states, desktop + mobile) -- confirmed
distinct from Banter Rooms and the existing Community main feed per
Decision Log #1's founder ruling, and confirmed no prior screen existed
before building. No app/backend code touched; no schema exists yet
either, matching the Grassroots precedent of design-then-schema.

Adds Decision Log #281, appends forward-pointers to #1 and Section 6's
Sprint 3 task text, and adds the matching CLAUDE.md status bullet.

Co-Authored-By: Claude Sonnet 5 <noreply@anthropic.com>
</commit_message>
<xml_diff>
--- a/docs/Soccernity_MVP_Build_Plan_v1.7.docx
+++ b/docs/Soccernity_MVP_Build_Plan_v1.7.docx
@@ -6771,7 +6771,7 @@
         <w:spacing w:after="90"/>
       </w:pPr>
       <w:r>
-        <w:t xml:space="preserve">Design and build Community Groups — city-, position-, and career-track-based groups, confirmed as a distinct feature from Banter Rooms per the founder's resolution of Decision Log item #1 (Log Book Section 24.4). No Figma screen exists for this yet, so figma-screen-builder designs it first, the same as the Notification Center below — see Section 11 for the sequencing.</w:t>
+        <w:t>Design and build Community Groups — city-, position-, and career-track-based groups, confirmed as a distinct feature from Banter Rooms per the founder's resolution of Decision Log item #1 (Log Book Section 24.4). No Figma screen exists for this yet, so figma-screen-builder designs it first, the same as the Notification Center below — see Section 11 for the sequencing. [Design half done -- see Decision Log #281: 13 Figma frames built by figma-screen-builder (sprint-3/community-groups-design). Nav placement flagged as an open founder call, same as Grassroots' own DL #258. Not yet converted to code, and no backend/schema exists yet.]</w:t>
       </w:r>
     </w:p>
     <w:p>
@@ -8272,7 +8272,7 @@
                 <w:sz w:val="19"/>
                 <w:szCs w:val="19"/>
               </w:rPr>
-              <w:t xml:space="preserve">Resolved — see Sprint 3, Section 11</w:t>
+              <w:t>Resolved — see Sprint 3, Section 11 -&gt; Design half now done, see DL #281 (sprint-3/community-groups-design): 13 Figma frames built (browse, individual group page, create-a-group), navigation placement left as its own open founder call.</w:t>
             </w:r>
           </w:p>
         </w:tc>
@@ -21526,6 +21526,48 @@
           <w:p>
             <w:r>
               <w:t>Resolved (built). New api/banter.ts + api/messaging.ts clients (mirroring api/grassroots.ts's shape). BanterPage.tsx rewritten to real data (GET /banter-rooms, /search, /mine, join/leave, create) -- search switched from client-side-only to the real server-side ?q= filter for "All" (GET /banter-rooms/search's own filter mechanism), staying client-side over the loaded page for "My Bants" (no q param on that route). New BanterRoomPage.tsx (/banter/:roomId) -- no Figma frame exists for a room's own feed, built plain and flagged, same ClubFanPage/EditProfileModal "no dedicated screen, built plain" precedent -- reuses PostCard.tsx for the room feed (GET /banter-rooms/:id/posts, identical FeedPage shape to GET /posts/feed) and a plain contentText-only composer (POST /banter-rooms/:id/posts, membership-gated). New MessagesPage.tsx (/messages, inbox), NewConversationPage.tsx (/messages/new, the recipient picker converted from Decision Log #139's design -- search is a client-side filter over GET /users/:id/following, since no people-search endpoint exists, labelled accordingly rather than implying a site-wide directory) and ConversationPage.tsx (/messages/:conversationId, thread -- GET/POST /conversations/:id/messages, newest-first reversed to render oldest-first, "Load earlier messages" prepends). Thread header identity is carried via router state from the inbox row / recipient-picker success (there is no GET /conversations/:id and Message carries no displayName), falling back to a generic "Conversation" heading on a direct visit -- flagged, not invented. navigation.ts's Messages item flipped `available: true` (same precedent as Clubs/Grassroots/Settings); Header.tsx's top-bar messages icon is now a real, enabled Link to /messages, closing the messages half of Decision Log #166 (Notifications stays disabled -- separate module, no conversion yet). ALSO closes a real backend gap with founder sign-off: messaging.service.ts's own sendMessage comment flagged that nothing marked the collapsed 'message' Notification read when the conversation itself was opened, and no notifications endpoint exists at all for a frontend to call instead (notifications/README.md is still a placeholder) -- markConversationRead now also runs one additional scoped `notification.updateMany` (userId=caller, type='message', payloadRefId=conversationId, read:false -&gt; true) in the same request ConversationPage.tsx already calls on thread-open, with no new endpoint, no schema change, no Figma. messaging/README.md's stale "No Notification on message send" section (predating DL #278's actual wiring) and its test count (30, drifted since DL #278 added 3) both corrected in the same PR. Verified: services/api mocked suite 52 suites / 738 tests, 0 failures (up from 737 -- 1 new messaging.service.spec.ts case); e2e suite not re-run (no Docker in this session; the change is a second independent updateMany inside an already-e2e-covered request, no new raw SQL/relation/isolation reasoning -- same class of change test/README.md's guiding principle keeps at the mocked layer, matching DL #278's own precedent) -- flagged for whoever next runs the real e2e suite to confirm messaging.e2e-spec.ts still passes unchanged (14 tests, untouched). apps/web: npx tsc --noEmit clean, npm run lint clean, npm run build clean, npx vitest run 36 files / 244 tests, 0 failures (up from 32/215 -- BanterPage.test.tsx rewritten 5 to 8 tests for the real client, new BanterRoomPage.test.tsx +6, MessagesPage.test.tsx +6, NewConversationPage.test.tsx +5, ConversationPage.test.tsx +8, Header.test.tsx +1). Dev-server smoke test: /, /banter, /banter/:roomId, /messages, /messages/new, /messages/:conversationId all HTTP 200, clean log. No real browser/Playwright check available in this environment -- same verification ceiling as every prior apps/web PR. Not merged -- founder's call after review.</w:t>
+            </w:r>
+          </w:p>
+        </w:tc>
+      </w:tr>
+      <w:tr>
+        <w:tc>
+          <w:tcPr>
+            <w:tcW w:type="dxa" w:w="500"/>
+          </w:tcPr>
+          <w:p>
+            <w:r>
+              <w:t>281</w:t>
+            </w:r>
+          </w:p>
+        </w:tc>
+        <w:tc>
+          <w:tcPr>
+            <w:tcW w:type="dxa" w:w="4700"/>
+          </w:tcPr>
+          <w:p>
+            <w:r>
+              <w:t>Design Community Groups (Sprint 3, DL #1) -- city/position/career-track interest groups, confirmed by the founder as distinct from Banter Rooms. No Figma screen or schema existed for this before this task.</w:t>
+            </w:r>
+          </w:p>
+        </w:tc>
+        <w:tc>
+          <w:tcPr>
+            <w:tcW w:type="dxa" w:w="1850"/>
+          </w:tcPr>
+          <w:p>
+            <w:r>
+              <w:t>sprint-3/community-groups-design (figma-screen-builder, 2026-09-13)</w:t>
+            </w:r>
+          </w:p>
+        </w:tc>
+        <w:tc>
+          <w:tcPr>
+            <w:tcW w:type="dxa" w:w="2300"/>
+          </w:tcPr>
+          <w:p>
+            <w:r>
+              <w:t>Resolved (designed, not built). 13 new frames + a Design Notes frame on page 0:1, parked at y &gt;= 37500 (verified 0 overlaps against every existing top-level node on the page). Grouping dimensions: City, Position Played, Career Track -- exactly the three the founder named in Log Book 24.4. "Fantasy league" (named in Log Book Section 6.1's original description) was deliberately NOT added as a 4th dimension -- flagged instead as a real open question, since it's time-boxed with its own standings and reads closer to the Contest/Competition pillar than to a durable-attribute interest group. Visually distinct from both neighbouring features, confirmed by direct comparison rather than assumed: Banter Rooms browses as a full-width room-list with Filter Tabs (All/My Bants) and forum language; the existing Community main feed (DL #152) is a single authenticated feed with a composer and suggestion rails. Community Groups is instead a 3-across card-grid directory with a combinable City/Position/Career-Track filter bar (modelled on Leaderboard's own combinable-filter pattern) plus a name search, and has NO composer anywhere, even on a joined group's own page -- neither Banter nor Community frames/components were opened for edit. Screens: Browse (desktop 6450:18580 / mobile 6455:18580), Browse -- No Groups Match Filter (6452:18580 / 6456:18580), Browse -- No Groups Yet For This City (6452:18692 / 6456:18667), Group Page -- Not Joined (6453:18580 / 6457:18580), Group Page -- Joined (6454:18580 / 6458:18580), Create a Group (6454:18709 / 6458:18701), Design Notes (6459:18580). The individual group page reuses Club -- Fan Page's header+feed+roster layout pattern, but the roster's @handle line was deliberately removed (no User.username column exists, DL #58) rather than reproducing an unbacked field, and Browse's cards carry no Join button (unlike Clubs -- Browse) -- membership lives only on the group page itself. Paint audit: 854 authored paints, 854 bound, 0 unbound, 0 off-palette, 0 brand/green-tint-28, 0 new colours -- a genuine 0 with no disclosed reused-component-debt exception, since the logo-only Top Bar -- Soccernity was used as provisional chrome instead of the shared header 4 navbar (which would have pulled in that navbar's own already-disclosed avatar IMAGE-fill debt). Restricted-pending minors: applied the existing platform default (browse/read is JwtAuthGuard-only; create/join/post would need GuardianConsentGuard) per DL #21/#275/Section 5.7 -- stated explicitly as applying existing precedent, not a new rule. No group post composer was designed, even in the Joined state -- mirrors Club -- Fan Page's own no-composer state (DL #157, no scoped post-creation endpoint exists for this feature either); building one is new backend+design scope, not assumed here. FLAGGED, not decided, all recorded on the Design Notes frame: (1) who may create a group -- designed open to any consent-confirmed user, but the unbounded-user-named-public-groups spam/safeguarding surface (the same category already flagged for Banter Room creation, DL #275) is named as a real concern; (2) content moderation -- ordinary post moderation is assumed for group posts, but group NAMES are a genuinely new surface (user-authored, public, shown in a directory, not attached to a visible author the way a post is) with no existing moderation coverage; (3) group size limits -- none designed or displayed; (4) the fantasy-league 4th-dimension question above; (5) NAVIGATION PLACEMENT was deliberately NOT designed in this task and stays fully open -- there is no existing nav home (the current 7-icon desktop nav + drawer have Community and Bants but nothing for this), screens use the same provisional logo-only Top Bar Clubs -- Browse used before its own nav question was resolved (DL #156), and this needs the same explicit founder call DL #258 got for Grassroots before a figma-to-code pass can wire a nav entry -- nesting under either "Community" or "Bants" would directly contradict the founder's own DL #1 ruling that these are distinct features, so a new top-level entry is the design's own inclination, not a decision. No schema/backend exists yet for this feature -- a future backend-api pass builds the data model from what was designed here, per this project's own Grassroots precedent, not the other way around. Full detail: docs/sprint-3-community-groups-design-report.md.</w:t>
             </w:r>
           </w:p>
         </w:tc>

</xml_diff>